<commit_message>
Prepare R55 consolidation safeguards and current staff guidance
Bind release evidence to all deployment and generated release inputs, verify staged
copies, and use an explicit source inventory that excludes local/private data and
refuses links. Exercise the real packager with synthetic refusal/exclusion tests.

Reconcile inspection and security guidance, regenerate all staff manual editions,
preserve R54 provenance and fixture ownership, and prepare R55/helperBuild 56.
Authoring 12, schema 5, summary 6 and backup 2 remain unchanged.

Validation: complete tools/verify_release.py passes with pinned Chromium
145.0.7632.6: 134 regression suites, 269 axe checks and 69 historical print variants.
Exact evidence matches 75 deployment/release inputs and 469 owned source files.
Actual package-level document links also pass. Only synthetic test packages were
created. City/native/legal acceptance remains open; no release or rollout approval.
</commit_message>
<xml_diff>
--- a/docs/staff/Program_Instruction_Manual.docx
+++ b/docs/staff/Program_Instruction_Manual.docx
@@ -2,7 +2,15 @@
 <file path=word/document.xml><?xml version="1.0" encoding="utf-8"?>
 <w:document xmlns:w="http://schemas.openxmlformats.org/wordprocessingml/2006/main" xmlns:m="http://schemas.openxmlformats.org/officeDocument/2006/math" xmlns:r="http://schemas.openxmlformats.org/officeDocument/2006/relationships" xmlns:o="urn:schemas-microsoft-com:office:office" xmlns:v="urn:schemas-microsoft-com:vml" xmlns:w10="urn:schemas-microsoft-com:office:word" xmlns:a="http://schemas.openxmlformats.org/drawingml/2006/main" xmlns:pic="http://schemas.openxmlformats.org/drawingml/2006/picture" xmlns:wp="http://schemas.openxmlformats.org/drawingml/2006/wordprocessingDrawing">
   <w:body>
-    <w:bookmarkStart w:id="43" w:name="program-instruction-manual"/>
+    <w:p>
+      <w:pPr>
+        <w:pStyle w:val="Title"/>
+      </w:pPr>
+      <w:r>
+        <w:t xml:space="preserve">Program instruction manual</w:t>
+      </w:r>
+    </w:p>
+    <w:bookmarkStart w:id="42" w:name="program-instruction-manual"/>
     <w:p>
       <w:pPr>
         <w:pStyle w:val="Heading1"/>
@@ -24,7 +32,7 @@
         <w:pStyle w:val="BodyText"/>
       </w:pPr>
       <w:r>
-        <w:t xml:space="preserve">Release 2026-10-20 R54 · Helper 2026.10.20.55 · 20 October 2026</w:t>
+        <w:t xml:space="preserve">Release 2026-10-21 R55 · Helper 2026.10.21.56 · 21 October 2026</w:t>
       </w:r>
     </w:p>
     <w:p>
@@ -40,7 +48,7 @@
         <w:pStyle w:val="BodyText"/>
       </w:pPr>
       <w:r>
-        <w:t xml:space="preserve">R54 is a packaged release candidate for City acceptance. Its security checks require the same ordinary document, history and recovery procedures described below. Automated verification does not replace the outstanding City Windows and network tests, staff and assistive technology acceptance, or legal and seasonal policy decisions listed in the carried-forward City acceptance record. New mandatory-appearance citations remain blocked until approved defendant instructions are supplied and integrated. Historical frozen reprints remain available. No live deployment is included in this release.</w:t>
+        <w:t xml:space="preserve">R55 is a development candidate for City acceptance. Its security checks require the same ordinary document, history and recovery procedures described below. Automated verification does not replace the outstanding City Windows and network tests, staff and assistive technology acceptance, or legal and seasonal policy decisions listed in the carried-forward City acceptance record. New mandatory-appearance citations remain blocked until approved defendant instructions are supplied and integrated. Historical frozen reprints remain available. No live deployment is included in this release.</w:t>
       </w:r>
     </w:p>
     <w:bookmarkStart w:id="20" w:name="start-here-and-daily-routine"/>
@@ -93,7 +101,7 @@
         <w:t xml:space="preserve"> </w:t>
       </w:r>
       <w:r>
-        <w:t xml:space="preserve">Run the Document Writer desktop shortcut or installed launcher. Keep one Writer tab open in the same browser profile. Confirm Build 2026-10-20 R54 and helper 2026.10.20.55. Open Workspace and resolve any save confirmation, shared-history or PDF-filing exceptions before creating replacement work. Check pending deadlines and reminders.</w:t>
+        <w:t xml:space="preserve">Run the Document Writer desktop shortcut or installed launcher. Keep one Writer tab open in the same browser profile. Confirm Build 2026-10-21 R55 and helper 2026.10.21.56. Open Workspace and resolve any save confirmation, shared-history or PDF-filing exceptions before creating replacement work. Check pending deadlines and reminders.</w:t>
       </w:r>
     </w:p>
     <w:p>
@@ -158,6 +166,24 @@
         <w:t xml:space="preserve">The five Writer destinations are Import inspection, Workspace, Order language, Reports, and Tools &amp; settings. Reports opens separately. Editing a case remains within Workspace; returning from Reports offers Back to Reports.</w:t>
       </w:r>
     </w:p>
+    <w:p>
+      <w:pPr>
+        <w:pStyle w:val="BodyText"/>
+      </w:pPr>
+      <w:r>
+        <w:rPr>
+          <w:b/>
+          <w:bCs/>
+        </w:rPr>
+        <w:t xml:space="preserve">Warnings.</w:t>
+      </w:r>
+      <w:r>
+        <w:t xml:space="preserve"> </w:t>
+      </w:r>
+      <w:r>
+        <w:t xml:space="preserve">Warnings at the top of the page clear after 15 seconds (hovering or focusing a warning restarts the timer). Cleared warnings remain in Message history. Ongoing conditions stay visible in their own indicator until resolved.</w:t>
+      </w:r>
+    </w:p>
     <w:bookmarkEnd w:id="20"/>
     <w:bookmarkStart w:id="21" w:name="X1f0d517e2eb6f28d173e52b1975ae128be47d46"/>
     <w:p>
@@ -497,12 +523,160 @@
         <w:pStyle w:val="BodyText"/>
       </w:pPr>
       <w:r>
-        <w:t xml:space="preserve">A new case with one unambiguous eligible completed initial inspection may advance directly to its draft. This does not issue a document. When there are multiple eligible inspection results, no inspection is selected automatically. Select the actual unused completed inspection. Scheduled, Pending and Assist inspections are excluded. Pending, missing-date and unsupported rows explain why they cannot be used. Accela result statuses Completed, Official Notice, Citation and Compliance are eligible when the inspection has an actual date and a supported type. Official Notice, Citation and Compliance are inspection results, not proof that this program already issued a document. The program checks its shared record separately to prevent reusing an inspection. Unknown statuses stay blocked and show the source result for correction.</w:t>
+        <w:t xml:space="preserve">Select an eligible unused inspection with an actual date and supported type. If several results qualify, choose explicitly. Completed, Scheduled, Pending, Assist and unlisted results cannot be imported. A result status is not proof that this program issued a document; shared records independently prevent inspection reuse.</w:t>
       </w:r>
     </w:p>
     <w:p>
       <w:pPr>
         <w:pStyle w:val="BodyText"/>
+      </w:pPr>
+      <w:r>
+        <w:t xml:space="preserve">The imported inspection’s</w:t>
+      </w:r>
+      <w:r>
+        <w:t xml:space="preserve"> </w:t>
+      </w:r>
+      <w:r>
+        <w:rPr>
+          <w:b/>
+          <w:bCs/>
+        </w:rPr>
+        <w:t xml:space="preserve">Inspection Type</w:t>
+      </w:r>
+      <w:r>
+        <w:t xml:space="preserve"> </w:t>
+      </w:r>
+      <w:r>
+        <w:t xml:space="preserve">and</w:t>
+      </w:r>
+      <w:r>
+        <w:t xml:space="preserve"> </w:t>
+      </w:r>
+      <w:r>
+        <w:rPr>
+          <w:b/>
+          <w:bCs/>
+        </w:rPr>
+        <w:t xml:space="preserve">Inspection Status</w:t>
+      </w:r>
+      <w:r>
+        <w:t xml:space="preserve"> </w:t>
+      </w:r>
+      <w:r>
+        <w:t xml:space="preserve">decide the document; there is no</w:t>
+      </w:r>
+      <w:r>
+        <w:t xml:space="preserve"> </w:t>
+      </w:r>
+      <w:r>
+        <w:t xml:space="preserve">“</w:t>
+      </w:r>
+      <w:r>
+        <w:t xml:space="preserve">Choose next action</w:t>
+      </w:r>
+      <w:r>
+        <w:t xml:space="preserve">”</w:t>
+      </w:r>
+      <w:r>
+        <w:t xml:space="preserve"> </w:t>
+      </w:r>
+      <w:r>
+        <w:t xml:space="preserve">step.</w:t>
+      </w:r>
+    </w:p>
+    <w:p>
+      <w:pPr>
+        <w:pStyle w:val="Compact"/>
+        <w:numPr>
+          <w:ilvl w:val="0"/>
+          <w:numId w:val="1002"/>
+        </w:numPr>
+      </w:pPr>
+      <w:r>
+        <w:rPr>
+          <w:b/>
+          <w:bCs/>
+        </w:rPr>
+        <w:t xml:space="preserve">Initial Inspection</w:t>
+      </w:r>
+      <w:r>
+        <w:t xml:space="preserve"> </w:t>
+      </w:r>
+      <w:r>
+        <w:t xml:space="preserve">starts a new case only (a case that already exists, including a snow case, is refused). Official Notice → Official Notice; Citation → Citation (at least one item marked for citation); No Occupancy → No Occupancy; Abatement Summary → Summary Abatement; Abatement Non-Summary → Non-Summary Abatement.</w:t>
+      </w:r>
+    </w:p>
+    <w:p>
+      <w:pPr>
+        <w:pStyle w:val="Compact"/>
+        <w:numPr>
+          <w:ilvl w:val="0"/>
+          <w:numId w:val="1002"/>
+        </w:numPr>
+      </w:pPr>
+      <w:r>
+        <w:rPr>
+          <w:b/>
+          <w:bCs/>
+        </w:rPr>
+        <w:t xml:space="preserve">Reinspection</w:t>
+      </w:r>
+      <w:r>
+        <w:t xml:space="preserve"> </w:t>
+      </w:r>
+      <w:r>
+        <w:t xml:space="preserve">needs an existing case. CA Referral or City Attorney Referral → Referral for Prosecution (the case’s first referral); Compliance → Compliance Letter (every item Corrected); Citation → Citation (at least one item cited); Extension Processing → choose Extension, Best Interest Extension or Vacancy Extension; No Occupancy → No Occupancy. On a snow case, Citation records the next snow event.</w:t>
+      </w:r>
+    </w:p>
+    <w:p>
+      <w:pPr>
+        <w:pStyle w:val="Compact"/>
+        <w:numPr>
+          <w:ilvl w:val="0"/>
+          <w:numId w:val="1002"/>
+        </w:numPr>
+      </w:pPr>
+      <w:r>
+        <w:rPr>
+          <w:b/>
+          <w:bCs/>
+        </w:rPr>
+        <w:t xml:space="preserve">CA Reinspection</w:t>
+      </w:r>
+      <w:r>
+        <w:t xml:space="preserve"> </w:t>
+      </w:r>
+      <w:r>
+        <w:t xml:space="preserve">needs an existing case that has been referred. Compliance → Compliance Letter; Non Compliance → Update for Case Referral.</w:t>
+      </w:r>
+    </w:p>
+    <w:p>
+      <w:pPr>
+        <w:pStyle w:val="Compact"/>
+        <w:numPr>
+          <w:ilvl w:val="0"/>
+          <w:numId w:val="1002"/>
+        </w:numPr>
+      </w:pPr>
+      <w:r>
+        <w:t xml:space="preserve">Completed and any other unlisted result cannot be imported: set the specific result in Accela and retrieve it again.</w:t>
+      </w:r>
+    </w:p>
+    <w:p>
+      <w:pPr>
+        <w:pStyle w:val="Compact"/>
+        <w:numPr>
+          <w:ilvl w:val="0"/>
+          <w:numId w:val="1002"/>
+        </w:numPr>
+      </w:pPr>
+      <w:r>
+        <w:t xml:space="preserve">If recorded results contradict the status (for example Compliance with an item not Corrected), the document cannot be issued. Correct the results, or correct the status in Accela and import the same inspection again; the open draft or worksheet is updated without losing your work.</w:t>
+      </w:r>
+    </w:p>
+    <w:p>
+      <w:pPr>
+        <w:pStyle w:val="FirstParagraph"/>
       </w:pPr>
       <w:r>
         <w:rPr>
@@ -593,7 +767,7 @@
         <w:pStyle w:val="Compact"/>
         <w:numPr>
           <w:ilvl w:val="0"/>
-          <w:numId w:val="1002"/>
+          <w:numId w:val="1003"/>
         </w:numPr>
       </w:pPr>
       <w:r>
@@ -605,7 +779,7 @@
         <w:pStyle w:val="Compact"/>
         <w:numPr>
           <w:ilvl w:val="0"/>
-          <w:numId w:val="1002"/>
+          <w:numId w:val="1003"/>
         </w:numPr>
       </w:pPr>
       <w:r>
@@ -617,7 +791,7 @@
         <w:pStyle w:val="Compact"/>
         <w:numPr>
           <w:ilvl w:val="0"/>
-          <w:numId w:val="1002"/>
+          <w:numId w:val="1003"/>
         </w:numPr>
       </w:pPr>
       <w:r>
@@ -629,7 +803,7 @@
         <w:pStyle w:val="Compact"/>
         <w:numPr>
           <w:ilvl w:val="0"/>
-          <w:numId w:val="1002"/>
+          <w:numId w:val="1003"/>
         </w:numPr>
       </w:pPr>
       <w:r>
@@ -641,7 +815,7 @@
         <w:pStyle w:val="Compact"/>
         <w:numPr>
           <w:ilvl w:val="0"/>
-          <w:numId w:val="1002"/>
+          <w:numId w:val="1003"/>
         </w:numPr>
       </w:pPr>
       <w:r>
@@ -653,7 +827,7 @@
         <w:pStyle w:val="Compact"/>
         <w:numPr>
           <w:ilvl w:val="0"/>
-          <w:numId w:val="1002"/>
+          <w:numId w:val="1003"/>
         </w:numPr>
       </w:pPr>
       <w:r>
@@ -1001,7 +1175,7 @@
         <w:pStyle w:val="Compact"/>
         <w:numPr>
           <w:ilvl w:val="0"/>
-          <w:numId w:val="1003"/>
+          <w:numId w:val="1004"/>
         </w:numPr>
       </w:pPr>
       <w:r>
@@ -1013,7 +1187,7 @@
         <w:pStyle w:val="Compact"/>
         <w:numPr>
           <w:ilvl w:val="0"/>
-          <w:numId w:val="1003"/>
+          <w:numId w:val="1004"/>
         </w:numPr>
       </w:pPr>
       <w:r>
@@ -1025,7 +1199,7 @@
         <w:pStyle w:val="Compact"/>
         <w:numPr>
           <w:ilvl w:val="0"/>
-          <w:numId w:val="1003"/>
+          <w:numId w:val="1004"/>
         </w:numPr>
       </w:pPr>
       <w:r>
@@ -1037,7 +1211,7 @@
         <w:pStyle w:val="Compact"/>
         <w:numPr>
           <w:ilvl w:val="0"/>
-          <w:numId w:val="1003"/>
+          <w:numId w:val="1004"/>
         </w:numPr>
       </w:pPr>
       <w:r>
@@ -1049,7 +1223,7 @@
         <w:pStyle w:val="Compact"/>
         <w:numPr>
           <w:ilvl w:val="0"/>
-          <w:numId w:val="1003"/>
+          <w:numId w:val="1004"/>
         </w:numPr>
       </w:pPr>
       <w:r>
@@ -1233,7 +1407,7 @@
         <w:pStyle w:val="Compact"/>
         <w:numPr>
           <w:ilvl w:val="0"/>
-          <w:numId w:val="1004"/>
+          <w:numId w:val="1005"/>
         </w:numPr>
       </w:pPr>
       <w:r>
@@ -1245,7 +1419,7 @@
         <w:pStyle w:val="Compact"/>
         <w:numPr>
           <w:ilvl w:val="0"/>
-          <w:numId w:val="1004"/>
+          <w:numId w:val="1005"/>
         </w:numPr>
       </w:pPr>
       <w:r>
@@ -1257,7 +1431,7 @@
         <w:pStyle w:val="Compact"/>
         <w:numPr>
           <w:ilvl w:val="0"/>
-          <w:numId w:val="1004"/>
+          <w:numId w:val="1005"/>
         </w:numPr>
       </w:pPr>
       <w:r>
@@ -1269,7 +1443,7 @@
         <w:pStyle w:val="Compact"/>
         <w:numPr>
           <w:ilvl w:val="0"/>
-          <w:numId w:val="1004"/>
+          <w:numId w:val="1005"/>
         </w:numPr>
       </w:pPr>
       <w:r>
@@ -1281,7 +1455,7 @@
         <w:pStyle w:val="Compact"/>
         <w:numPr>
           <w:ilvl w:val="0"/>
-          <w:numId w:val="1004"/>
+          <w:numId w:val="1005"/>
         </w:numPr>
       </w:pPr>
       <w:r>
@@ -1293,7 +1467,7 @@
         <w:pStyle w:val="Compact"/>
         <w:numPr>
           <w:ilvl w:val="0"/>
-          <w:numId w:val="1004"/>
+          <w:numId w:val="1005"/>
         </w:numPr>
       </w:pPr>
       <w:r>
@@ -1347,6 +1521,24 @@
     <w:p>
       <w:pPr>
         <w:pStyle w:val="FirstParagraph"/>
+      </w:pPr>
+      <w:r>
+        <w:rPr>
+          <w:b/>
+          <w:bCs/>
+        </w:rPr>
+        <w:t xml:space="preserve">Group due dates on reinspection.</w:t>
+      </w:r>
+      <w:r>
+        <w:t xml:space="preserve"> </w:t>
+      </w:r>
+      <w:r>
+        <w:t xml:space="preserve">On an open reinspection worksheet, Assign due dates lists the items still outstanding; select items, choose a date and Apply to selected. Undo restores the previous dates. The three-date limit and seven-day spacing apply.</w:t>
+      </w:r>
+    </w:p>
+    <w:p>
+      <w:pPr>
+        <w:pStyle w:val="BodyText"/>
       </w:pPr>
       <w:r>
         <w:t xml:space="preserve">Open Reinspect from the case or import an eligible unused completed reinspection. Enter the actual physical inspection date and time and the responsible inspector. Review all items is the entry view. Carried compliance and withdrawn items remain visible and cannot be casually reset. Progress covers active items; withdrawn items are listed separately.</w:t>
@@ -2311,7 +2503,7 @@
         <w:pStyle w:val="Compact"/>
         <w:numPr>
           <w:ilvl w:val="0"/>
-          <w:numId w:val="1005"/>
+          <w:numId w:val="1006"/>
         </w:numPr>
       </w:pPr>
       <w:r>
@@ -2323,7 +2515,7 @@
         <w:pStyle w:val="Compact"/>
         <w:numPr>
           <w:ilvl w:val="0"/>
-          <w:numId w:val="1005"/>
+          <w:numId w:val="1006"/>
         </w:numPr>
       </w:pPr>
       <w:r>
@@ -2335,7 +2527,7 @@
         <w:pStyle w:val="Compact"/>
         <w:numPr>
           <w:ilvl w:val="0"/>
-          <w:numId w:val="1005"/>
+          <w:numId w:val="1006"/>
         </w:numPr>
       </w:pPr>
       <w:r>
@@ -2347,7 +2539,7 @@
         <w:pStyle w:val="Compact"/>
         <w:numPr>
           <w:ilvl w:val="0"/>
-          <w:numId w:val="1005"/>
+          <w:numId w:val="1006"/>
         </w:numPr>
       </w:pPr>
       <w:r>
@@ -2359,7 +2551,7 @@
         <w:pStyle w:val="Compact"/>
         <w:numPr>
           <w:ilvl w:val="0"/>
-          <w:numId w:val="1005"/>
+          <w:numId w:val="1006"/>
         </w:numPr>
       </w:pPr>
       <w:r>
@@ -4336,7 +4528,7 @@
               <w:jc w:val="left"/>
             </w:pPr>
             <w:r>
-              <w:t xml:space="preserve">Open Source and import details and read the result status. Completed, Official Notice, Citation and Compliance are supported; Scheduled, Pending, Assist, unknown statuses and missing actual dates cannot be imported. If valid results are absent, use the complete current installation and retrieve the case again. An already used result requires Continue existing case</w:t>
+              <w:t xml:space="preserve">Open Source and import details and read the result status. Eligibility depends on both Inspection Type and Inspection Status. Completed, Scheduled, Pending, Assist and unlisted results cannot be imported. Missing actual dates also block import; use the type/status rules in section 4. If valid results are absent, use the complete current installation and retrieve the case again. An already used result requires Continue existing case</w:t>
             </w:r>
           </w:p>
         </w:tc>
@@ -5170,201 +5362,7 @@
       </w:r>
     </w:p>
     <w:bookmarkEnd w:id="41"/>
-    <w:bookmarkStart w:id="42" w:name="X23af24b8f0d891e5ccf24f3760ce4cdeafa9c43"/>
-    <w:p>
-      <w:pPr>
-        <w:pStyle w:val="Heading2"/>
-      </w:pPr>
-      <w:r>
-        <w:t xml:space="preserve">Documents follow the Accela inspection result (R53)</w:t>
-      </w:r>
-    </w:p>
-    <w:p>
-      <w:pPr>
-        <w:pStyle w:val="FirstParagraph"/>
-      </w:pPr>
-      <w:r>
-        <w:t xml:space="preserve">The imported inspection’s</w:t>
-      </w:r>
-      <w:r>
-        <w:t xml:space="preserve"> </w:t>
-      </w:r>
-      <w:r>
-        <w:rPr>
-          <w:b/>
-          <w:bCs/>
-        </w:rPr>
-        <w:t xml:space="preserve">Inspection Type</w:t>
-      </w:r>
-      <w:r>
-        <w:t xml:space="preserve"> </w:t>
-      </w:r>
-      <w:r>
-        <w:t xml:space="preserve">and</w:t>
-      </w:r>
-      <w:r>
-        <w:t xml:space="preserve"> </w:t>
-      </w:r>
-      <w:r>
-        <w:rPr>
-          <w:b/>
-          <w:bCs/>
-        </w:rPr>
-        <w:t xml:space="preserve">Inspection Status</w:t>
-      </w:r>
-      <w:r>
-        <w:t xml:space="preserve"> </w:t>
-      </w:r>
-      <w:r>
-        <w:t xml:space="preserve">decide the document; there is no</w:t>
-      </w:r>
-      <w:r>
-        <w:t xml:space="preserve"> </w:t>
-      </w:r>
-      <w:r>
-        <w:t xml:space="preserve">“</w:t>
-      </w:r>
-      <w:r>
-        <w:t xml:space="preserve">Choose next action</w:t>
-      </w:r>
-      <w:r>
-        <w:t xml:space="preserve">”</w:t>
-      </w:r>
-      <w:r>
-        <w:t xml:space="preserve"> </w:t>
-      </w:r>
-      <w:r>
-        <w:t xml:space="preserve">step.</w:t>
-      </w:r>
-    </w:p>
-    <w:p>
-      <w:pPr>
-        <w:pStyle w:val="Compact"/>
-        <w:numPr>
-          <w:ilvl w:val="0"/>
-          <w:numId w:val="1006"/>
-        </w:numPr>
-      </w:pPr>
-      <w:r>
-        <w:rPr>
-          <w:b/>
-          <w:bCs/>
-        </w:rPr>
-        <w:t xml:space="preserve">Initial Inspection</w:t>
-      </w:r>
-      <w:r>
-        <w:t xml:space="preserve"> </w:t>
-      </w:r>
-      <w:r>
-        <w:t xml:space="preserve">starts a new case only (a case that already exists, including a snow case, is refused). Official Notice → Official Notice; Citation → Citation (at least one item marked for citation); No Occupancy → No Occupancy; Abatement Summary → Summary Abatement; Abatement Non-Summary → Non-Summary Abatement.</w:t>
-      </w:r>
-    </w:p>
-    <w:p>
-      <w:pPr>
-        <w:pStyle w:val="Compact"/>
-        <w:numPr>
-          <w:ilvl w:val="0"/>
-          <w:numId w:val="1006"/>
-        </w:numPr>
-      </w:pPr>
-      <w:r>
-        <w:rPr>
-          <w:b/>
-          <w:bCs/>
-        </w:rPr>
-        <w:t xml:space="preserve">Reinspection</w:t>
-      </w:r>
-      <w:r>
-        <w:t xml:space="preserve"> </w:t>
-      </w:r>
-      <w:r>
-        <w:t xml:space="preserve">needs an existing case. CA Referral or City Attorney Referral → Referral for Prosecution (the case’s first referral); Compliance → Compliance Letter (every item Corrected); Citation → Citation (at least one item cited); Extension Processing → choose Extension, Best Interest Extension or Vacancy Extension; No Occupancy → No Occupancy. On a snow case, Citation records the next snow event.</w:t>
-      </w:r>
-    </w:p>
-    <w:p>
-      <w:pPr>
-        <w:pStyle w:val="Compact"/>
-        <w:numPr>
-          <w:ilvl w:val="0"/>
-          <w:numId w:val="1006"/>
-        </w:numPr>
-      </w:pPr>
-      <w:r>
-        <w:rPr>
-          <w:b/>
-          <w:bCs/>
-        </w:rPr>
-        <w:t xml:space="preserve">CA Reinspection</w:t>
-      </w:r>
-      <w:r>
-        <w:t xml:space="preserve"> </w:t>
-      </w:r>
-      <w:r>
-        <w:t xml:space="preserve">needs an existing case that has been referred. Compliance → Compliance Letter; Non Compliance → Update for Case Referral.</w:t>
-      </w:r>
-    </w:p>
-    <w:p>
-      <w:pPr>
-        <w:pStyle w:val="Compact"/>
-        <w:numPr>
-          <w:ilvl w:val="0"/>
-          <w:numId w:val="1006"/>
-        </w:numPr>
-      </w:pPr>
-      <w:r>
-        <w:t xml:space="preserve">Completed and any other unlisted result cannot be imported: set the specific result in Accela and retrieve it again.</w:t>
-      </w:r>
-    </w:p>
-    <w:p>
-      <w:pPr>
-        <w:pStyle w:val="Compact"/>
-        <w:numPr>
-          <w:ilvl w:val="0"/>
-          <w:numId w:val="1006"/>
-        </w:numPr>
-      </w:pPr>
-      <w:r>
-        <w:t xml:space="preserve">If recorded results contradict the status (for example Compliance with an item not Corrected), the document cannot be issued. Correct the results, or correct the status in Accela and import the same inspection again; the open draft or worksheet is updated without losing your work.</w:t>
-      </w:r>
-    </w:p>
-    <w:p>
-      <w:pPr>
-        <w:pStyle w:val="FirstParagraph"/>
-      </w:pPr>
-      <w:r>
-        <w:rPr>
-          <w:b/>
-          <w:bCs/>
-        </w:rPr>
-        <w:t xml:space="preserve">Group due dates on reinspection.</w:t>
-      </w:r>
-      <w:r>
-        <w:t xml:space="preserve"> </w:t>
-      </w:r>
-      <w:r>
-        <w:t xml:space="preserve">On an open reinspection worksheet, Assign due dates lists the items still outstanding; select items, choose a date and Apply to selected. Undo restores the previous dates. The three-date limit and seven-day spacing apply.</w:t>
-      </w:r>
-    </w:p>
-    <w:p>
-      <w:pPr>
-        <w:pStyle w:val="BodyText"/>
-      </w:pPr>
-      <w:r>
-        <w:rPr>
-          <w:b/>
-          <w:bCs/>
-        </w:rPr>
-        <w:t xml:space="preserve">Warnings.</w:t>
-      </w:r>
-      <w:r>
-        <w:t xml:space="preserve"> </w:t>
-      </w:r>
-      <w:r>
-        <w:t xml:space="preserve">Warnings at the top of the page clear after 15 seconds (hovering or focusing a warning restarts the timer). Cleared warnings remain in Message history. Ongoing conditions stay visible in their own indicator until resolved.</w:t>
-      </w:r>
-    </w:p>
     <w:bookmarkEnd w:id="42"/>
-    <w:bookmarkEnd w:id="43"/>
     <w:sectPr>
       <w:headerReference r:id="rId9" w:type="default"/>
       <w:footerReference r:id="rId10" w:type="default"/>
@@ -5905,34 +5903,7 @@
     </w:lvlOverride>
   </w:num>
   <w:num w:numId="1002">
-    <w:abstractNumId w:val="99411"/>
-    <w:lvlOverride w:ilvl="0">
-      <w:startOverride w:val="1"/>
-    </w:lvlOverride>
-    <w:lvlOverride w:ilvl="1">
-      <w:startOverride w:val="1"/>
-    </w:lvlOverride>
-    <w:lvlOverride w:ilvl="2">
-      <w:startOverride w:val="1"/>
-    </w:lvlOverride>
-    <w:lvlOverride w:ilvl="3">
-      <w:startOverride w:val="1"/>
-    </w:lvlOverride>
-    <w:lvlOverride w:ilvl="4">
-      <w:startOverride w:val="1"/>
-    </w:lvlOverride>
-    <w:lvlOverride w:ilvl="5">
-      <w:startOverride w:val="1"/>
-    </w:lvlOverride>
-    <w:lvlOverride w:ilvl="6">
-      <w:startOverride w:val="1"/>
-    </w:lvlOverride>
-    <w:lvlOverride w:ilvl="7">
-      <w:startOverride w:val="1"/>
-    </w:lvlOverride>
-    <w:lvlOverride w:ilvl="8">
-      <w:startOverride w:val="1"/>
-    </w:lvlOverride>
+    <w:abstractNumId w:val="991"/>
   </w:num>
   <w:num w:numId="1003">
     <w:abstractNumId w:val="99411"/>
@@ -6025,7 +5996,34 @@
     </w:lvlOverride>
   </w:num>
   <w:num w:numId="1006">
-    <w:abstractNumId w:val="991"/>
+    <w:abstractNumId w:val="99411"/>
+    <w:lvlOverride w:ilvl="0">
+      <w:startOverride w:val="1"/>
+    </w:lvlOverride>
+    <w:lvlOverride w:ilvl="1">
+      <w:startOverride w:val="1"/>
+    </w:lvlOverride>
+    <w:lvlOverride w:ilvl="2">
+      <w:startOverride w:val="1"/>
+    </w:lvlOverride>
+    <w:lvlOverride w:ilvl="3">
+      <w:startOverride w:val="1"/>
+    </w:lvlOverride>
+    <w:lvlOverride w:ilvl="4">
+      <w:startOverride w:val="1"/>
+    </w:lvlOverride>
+    <w:lvlOverride w:ilvl="5">
+      <w:startOverride w:val="1"/>
+    </w:lvlOverride>
+    <w:lvlOverride w:ilvl="6">
+      <w:startOverride w:val="1"/>
+    </w:lvlOverride>
+    <w:lvlOverride w:ilvl="7">
+      <w:startOverride w:val="1"/>
+    </w:lvlOverride>
+    <w:lvlOverride w:ilvl="8">
+      <w:startOverride w:val="1"/>
+    </w:lvlOverride>
   </w:num>
 </w:numbering>
 </file>
@@ -17883,13 +17881,239 @@
       </w:tcPr>
     </w:tblStylePr>
   </w:style>
-  <w:style w:type="paragraph" w:customStyle="1" w:styleId="SourceCode">
+  <w:style w:customStyle="1" w:styleId="SourceCode" w:type="paragraph">
     <w:name w:val="Source Code"/>
     <w:basedOn w:val="Normal"/>
     <w:link w:val="VerbatimChar"/>
     <w:pPr>
       <w:wordWrap w:val="off"/>
     </w:pPr>
+  </w:style>
+  <w:style w:customStyle="1" w:styleId="KeywordTok" w:type="character">
+    <w:name w:val="KeywordTok"/>
+    <w:basedOn w:val="VerbatimChar"/>
+    <w:rPr>
+      <w:b/>
+      <w:color w:val="007020"/>
+    </w:rPr>
+  </w:style>
+  <w:style w:customStyle="1" w:styleId="DataTypeTok" w:type="character">
+    <w:name w:val="DataTypeTok"/>
+    <w:basedOn w:val="VerbatimChar"/>
+    <w:rPr>
+      <w:color w:val="902000"/>
+    </w:rPr>
+  </w:style>
+  <w:style w:customStyle="1" w:styleId="DecValTok" w:type="character">
+    <w:name w:val="DecValTok"/>
+    <w:basedOn w:val="VerbatimChar"/>
+    <w:rPr>
+      <w:color w:val="40a070"/>
+    </w:rPr>
+  </w:style>
+  <w:style w:customStyle="1" w:styleId="BaseNTok" w:type="character">
+    <w:name w:val="BaseNTok"/>
+    <w:basedOn w:val="VerbatimChar"/>
+    <w:rPr>
+      <w:color w:val="40a070"/>
+    </w:rPr>
+  </w:style>
+  <w:style w:customStyle="1" w:styleId="FloatTok" w:type="character">
+    <w:name w:val="FloatTok"/>
+    <w:basedOn w:val="VerbatimChar"/>
+    <w:rPr>
+      <w:color w:val="40a070"/>
+    </w:rPr>
+  </w:style>
+  <w:style w:customStyle="1" w:styleId="ConstantTok" w:type="character">
+    <w:name w:val="ConstantTok"/>
+    <w:basedOn w:val="VerbatimChar"/>
+    <w:rPr>
+      <w:color w:val="880000"/>
+    </w:rPr>
+  </w:style>
+  <w:style w:customStyle="1" w:styleId="CharTok" w:type="character">
+    <w:name w:val="CharTok"/>
+    <w:basedOn w:val="VerbatimChar"/>
+    <w:rPr>
+      <w:color w:val="4070a0"/>
+    </w:rPr>
+  </w:style>
+  <w:style w:customStyle="1" w:styleId="SpecialCharTok" w:type="character">
+    <w:name w:val="SpecialCharTok"/>
+    <w:basedOn w:val="VerbatimChar"/>
+    <w:rPr>
+      <w:color w:val="4070a0"/>
+    </w:rPr>
+  </w:style>
+  <w:style w:customStyle="1" w:styleId="StringTok" w:type="character">
+    <w:name w:val="StringTok"/>
+    <w:basedOn w:val="VerbatimChar"/>
+    <w:rPr>
+      <w:color w:val="4070a0"/>
+    </w:rPr>
+  </w:style>
+  <w:style w:customStyle="1" w:styleId="VerbatimStringTok" w:type="character">
+    <w:name w:val="VerbatimStringTok"/>
+    <w:basedOn w:val="VerbatimChar"/>
+    <w:rPr>
+      <w:color w:val="4070a0"/>
+    </w:rPr>
+  </w:style>
+  <w:style w:customStyle="1" w:styleId="SpecialStringTok" w:type="character">
+    <w:name w:val="SpecialStringTok"/>
+    <w:basedOn w:val="VerbatimChar"/>
+    <w:rPr>
+      <w:color w:val="bb6688"/>
+    </w:rPr>
+  </w:style>
+  <w:style w:customStyle="1" w:styleId="ImportTok" w:type="character">
+    <w:name w:val="ImportTok"/>
+    <w:basedOn w:val="VerbatimChar"/>
+    <w:rPr>
+      <w:b/>
+      <w:color w:val="008000"/>
+    </w:rPr>
+  </w:style>
+  <w:style w:customStyle="1" w:styleId="CommentTok" w:type="character">
+    <w:name w:val="CommentTok"/>
+    <w:basedOn w:val="VerbatimChar"/>
+    <w:rPr>
+      <w:i/>
+      <w:color w:val="60a0b0"/>
+    </w:rPr>
+  </w:style>
+  <w:style w:customStyle="1" w:styleId="DocumentationTok" w:type="character">
+    <w:name w:val="DocumentationTok"/>
+    <w:basedOn w:val="VerbatimChar"/>
+    <w:rPr>
+      <w:i/>
+      <w:color w:val="ba2121"/>
+    </w:rPr>
+  </w:style>
+  <w:style w:customStyle="1" w:styleId="AnnotationTok" w:type="character">
+    <w:name w:val="AnnotationTok"/>
+    <w:basedOn w:val="VerbatimChar"/>
+    <w:rPr>
+      <w:b/>
+      <w:i/>
+      <w:color w:val="60a0b0"/>
+    </w:rPr>
+  </w:style>
+  <w:style w:customStyle="1" w:styleId="CommentVarTok" w:type="character">
+    <w:name w:val="CommentVarTok"/>
+    <w:basedOn w:val="VerbatimChar"/>
+    <w:rPr>
+      <w:b/>
+      <w:i/>
+      <w:color w:val="60a0b0"/>
+    </w:rPr>
+  </w:style>
+  <w:style w:customStyle="1" w:styleId="OtherTok" w:type="character">
+    <w:name w:val="OtherTok"/>
+    <w:basedOn w:val="VerbatimChar"/>
+    <w:rPr>
+      <w:color w:val="007020"/>
+    </w:rPr>
+  </w:style>
+  <w:style w:customStyle="1" w:styleId="FunctionTok" w:type="character">
+    <w:name w:val="FunctionTok"/>
+    <w:basedOn w:val="VerbatimChar"/>
+    <w:rPr>
+      <w:color w:val="06287e"/>
+    </w:rPr>
+  </w:style>
+  <w:style w:customStyle="1" w:styleId="VariableTok" w:type="character">
+    <w:name w:val="VariableTok"/>
+    <w:basedOn w:val="VerbatimChar"/>
+    <w:rPr>
+      <w:color w:val="19177c"/>
+    </w:rPr>
+  </w:style>
+  <w:style w:customStyle="1" w:styleId="ControlFlowTok" w:type="character">
+    <w:name w:val="ControlFlowTok"/>
+    <w:basedOn w:val="VerbatimChar"/>
+    <w:rPr>
+      <w:b/>
+      <w:color w:val="007020"/>
+    </w:rPr>
+  </w:style>
+  <w:style w:customStyle="1" w:styleId="OperatorTok" w:type="character">
+    <w:name w:val="OperatorTok"/>
+    <w:basedOn w:val="VerbatimChar"/>
+    <w:rPr>
+      <w:color w:val="666666"/>
+    </w:rPr>
+  </w:style>
+  <w:style w:customStyle="1" w:styleId="BuiltInTok" w:type="character">
+    <w:name w:val="BuiltInTok"/>
+    <w:basedOn w:val="VerbatimChar"/>
+    <w:rPr>
+      <w:color w:val="008000"/>
+    </w:rPr>
+  </w:style>
+  <w:style w:customStyle="1" w:styleId="ExtensionTok" w:type="character">
+    <w:name w:val="ExtensionTok"/>
+    <w:basedOn w:val="VerbatimChar"/>
+    <w:rPr/>
+  </w:style>
+  <w:style w:customStyle="1" w:styleId="PreprocessorTok" w:type="character">
+    <w:name w:val="PreprocessorTok"/>
+    <w:basedOn w:val="VerbatimChar"/>
+    <w:rPr>
+      <w:color w:val="bc7a00"/>
+    </w:rPr>
+  </w:style>
+  <w:style w:customStyle="1" w:styleId="AttributeTok" w:type="character">
+    <w:name w:val="AttributeTok"/>
+    <w:basedOn w:val="VerbatimChar"/>
+    <w:rPr>
+      <w:color w:val="7d9029"/>
+    </w:rPr>
+  </w:style>
+  <w:style w:customStyle="1" w:styleId="RegionMarkerTok" w:type="character">
+    <w:name w:val="RegionMarkerTok"/>
+    <w:basedOn w:val="VerbatimChar"/>
+    <w:rPr/>
+  </w:style>
+  <w:style w:customStyle="1" w:styleId="InformationTok" w:type="character">
+    <w:name w:val="InformationTok"/>
+    <w:basedOn w:val="VerbatimChar"/>
+    <w:rPr>
+      <w:b/>
+      <w:i/>
+      <w:color w:val="60a0b0"/>
+    </w:rPr>
+  </w:style>
+  <w:style w:customStyle="1" w:styleId="WarningTok" w:type="character">
+    <w:name w:val="WarningTok"/>
+    <w:basedOn w:val="VerbatimChar"/>
+    <w:rPr>
+      <w:b/>
+      <w:i/>
+      <w:color w:val="60a0b0"/>
+    </w:rPr>
+  </w:style>
+  <w:style w:customStyle="1" w:styleId="AlertTok" w:type="character">
+    <w:name w:val="AlertTok"/>
+    <w:basedOn w:val="VerbatimChar"/>
+    <w:rPr>
+      <w:b/>
+      <w:color w:val="ff0000"/>
+    </w:rPr>
+  </w:style>
+  <w:style w:customStyle="1" w:styleId="ErrorTok" w:type="character">
+    <w:name w:val="ErrorTok"/>
+    <w:basedOn w:val="VerbatimChar"/>
+    <w:rPr>
+      <w:b/>
+      <w:color w:val="ff0000"/>
+    </w:rPr>
+  </w:style>
+  <w:style w:customStyle="1" w:styleId="NormalTok" w:type="character">
+    <w:name w:val="NormalTok"/>
+    <w:basedOn w:val="VerbatimChar"/>
+    <w:rPr/>
   </w:style>
   <w:style w:type="character" w:customStyle="1" w:styleId="KeywordTok">
     <w:name w:val="KeywordTok"/>

</xml_diff>

<commit_message>
Prepare R56: identity, authoring 13, staff guidance and records
Release 2026-10-21 R56, helper 2026.10.21.57, helperBuild 57, authoring
13 (case schema 5, summary 6, backup 2 unchanged). New documents are
created at authoring 13; only Best Interest and Vacancy Extensions
behave differently from authoring 12.

Staff manual (regenerated editions), new-documents and notice/citation
guides describe the Recipients button, the Accela parcel route, Cite
only for a Citation import and item due dates for Best Interest and
Vacancy Extensions; the compatibility note states authoring 13.
Developer docs, R56-REVIEW, changelog, readiness and the living
acceptance record (new S56, extended P7) are updated; the R55 review and
implementation record move to docs/history.

Co-Authored-By: Claude Opus 5.5 <noreply@anthropic.com>
Claude-Session: https://claude.ai/code/session_01WPJAZGfD47jPUEgCNYYSg7
</commit_message>
<xml_diff>
--- a/docs/staff/Program_Instruction_Manual.docx
+++ b/docs/staff/Program_Instruction_Manual.docx
@@ -32,7 +32,7 @@
         <w:pStyle w:val="BodyText"/>
       </w:pPr>
       <w:r>
-        <w:t xml:space="preserve">Release 2026-10-21 R55 · Helper 2026.10.21.56 · 21 October 2026</w:t>
+        <w:t xml:space="preserve">Release 2026-10-21 R56 · Helper 2026.10.21.57 · 21 October 2026</w:t>
       </w:r>
     </w:p>
     <w:p>
@@ -311,7 +311,7 @@
         <w:t xml:space="preserve"> </w:t>
       </w:r>
       <w:r>
-        <w:t xml:space="preserve">This release uses case schema 5, summary version 6, workspace backup version 2 and authoring version 12; R54 introduced authoring 12 for the aligned Best Interest and Vacancy Extension layout. Earlier releases predating schema 5 cannot read schema-5 case files. An earlier release does not know a newer authoring layout: before rollback, finish or discard unfinished drafts and corrections, and afterwards rely on the retained original PDFs for documents issued under the newer release. A runtime rollback changes installed files; it does not reverse issued records or restore workspace data. IT must assess data compatibility and retained requests before rollback. Never replace current operational records with an old backup without an approved recovery plan.</w:t>
+        <w:t xml:space="preserve">This release uses case schema 5, summary version 6, workspace backup version 2 and authoring version 13; R54 introduced authoring 12 for the aligned Best Interest and Vacancy Extension layout, and R56 introduced authoring 13 for their required item due dates. Earlier releases predating schema 5 cannot read schema-5 case files. An earlier release does not know a newer authoring layout: before rollback, finish or discard unfinished drafts and corrections, and afterwards rely on the retained original PDFs for documents issued under the newer release. A runtime rollback changes installed files; it does not reverse issued records or restore workspace data. IT must assess data compatibility and retained requests before rollback. Never replace current operational records with an old backup without an approved recovery plan.</w:t>
       </w:r>
     </w:p>
     <w:p>
@@ -759,7 +759,7 @@
         <w:pStyle w:val="FirstParagraph"/>
       </w:pPr>
       <w:r>
-        <w:t xml:space="preserve">Start from the imported initial inspection. Verify owner, property, parcel, inspector, inspection date and any supplied time. Expand the case details when a check identifies a missing field. Review the mailing block rather than relying on an address parser to establish ownership or service.</w:t>
+        <w:t xml:space="preserve">Start from the imported initial inspection. Verify owner, property, parcel, inspector, inspection date and any supplied time. Expand the case details when a check identifies a missing field. The parcel comes only from the Accela import: if it is missing or not 12 digits, correct it in Accela and import the inspection again; a notice cannot be issued without it. Review the mailing block rather than relying on an address parser to establish ownership or service.</w:t>
       </w:r>
     </w:p>
     <w:p>
@@ -819,7 +819,7 @@
         <w:pStyle w:val="Compact"/>
       </w:pPr>
       <w:r>
-        <w:t xml:space="preserve">Review the whole document, not only the edited sentence. Check recipients, contact details, the mailing date, the item order and all warnings. Use Show checks to jump to the affected field and correct it.</w:t>
+        <w:t xml:space="preserve">Review the whole document, not only the edited sentence. Check recipients (the Recipients button opens copies, email and registered agent), contact details, the mailing date, the item order and all warnings. Use Show checks to jump to the affected field and correct it.</w:t>
       </w:r>
     </w:p>
     <w:p>
@@ -857,7 +857,7 @@
         <w:t xml:space="preserve"> </w:t>
       </w:r>
       <w:r>
-        <w:t xml:space="preserve">Select Cite only for the items actually being charged. Complete Initial-inspection citations before using Issue notice and citations together. The deadline record and citation save atomically; the initial-citation letter carries the notice content. The notice is retained as Delivered within the citation rather than producing an extra owner notice. Each charge has four court copies. No reinspection is invented.</w:t>
+        <w:t xml:space="preserve">The Cite option appears only when the imported Accela inspection status is Citation. Select Cite only for the items actually being charged. Complete Initial-inspection citations before using Issue notice and citations together. The deadline record and citation save atomically; the initial-citation letter carries the notice content. The notice is retained as Delivered within the citation rather than producing an extra owner notice. Each charge has four court copies. No reinspection is invented.</w:t>
       </w:r>
     </w:p>
     <w:p>
@@ -2157,7 +2157,7 @@
         <w:t xml:space="preserve"> </w:t>
       </w:r>
       <w:r>
-        <w:t xml:space="preserve">Identify the prior notice, selected eligible items, owner’s plan and benefit, supervisor review, and factual exclusion of safety or urgent items. Internal supervisory prosecution review is not a City Attorney referral.</w:t>
+        <w:t xml:space="preserve">Identify the prior notice, selected eligible items, owner’s plan and benefit, supervisor review, and factual exclusion of safety or urgent items. Enter each affected item’s new due date in Items and due dates. Internal supervisory prosecution review is not a City Attorney referral.</w:t>
       </w:r>
     </w:p>
     <w:p>
@@ -2175,7 +2175,7 @@
         <w:t xml:space="preserve"> </w:t>
       </w:r>
       <w:r>
-        <w:t xml:space="preserve">Verify vacancy, request, selected items, maintenance/security conditions, review appointment, approved deadline/expiration model and transfer/disclosure wording. Contact-by is calculated seven calendar days before the actual review appointment; short notice needs the approved procedure reference. Conditional; no replacement repair dates retains historical repair dates. Renewal requires a new reviewed action. Apartment scope preserves common-area duties.</w:t>
+        <w:t xml:space="preserve">Verify vacancy, request, selected items, maintenance/security conditions, review appointment, approved expiration model and transfer/disclosure wording. Enter each affected item’s new due date in Items and due dates. Contact-by is calculated seven calendar days before the actual review appointment; short notice needs the approved procedure reference. Renewal requires a new reviewed action. Apartment scope preserves common-area duties.</w:t>
       </w:r>
     </w:p>
     <w:p>
@@ -2193,7 +2193,7 @@
         <w:t xml:space="preserve"> </w:t>
       </w:r>
       <w:r>
-        <w:t xml:space="preserve">Newly authored Best Interest and Vacancy Extensions use the regular Extension’s header, recipient block, items table, continuation headers, footer and copy handling. Their approved language remains unchanged. All items are listed, including corrected items ruled through with the confirmed date. Extended items show the new due date; unselected items keep the existing date. A conditional Vacancy Extension displays</w:t>
+        <w:t xml:space="preserve">Newly authored Best Interest and Vacancy Extensions use the regular Extension’s header, recipient block, items table, continuation headers, footer and copy handling. Their approved language remains unchanged. All items are listed, including corrected items ruled through with the confirmed date. Extended items show the new due date; unselected items keep the existing date. From R56 (authoring 13), every affected item of a new Best Interest or Vacancy Extension needs a later due date, entered in Items and due dates; unaffected items keep their dates. Vacancy Extensions issued before R56 may be conditional: they display</w:t>
       </w:r>
       <w:r>
         <w:t xml:space="preserve"> </w:t>
@@ -2211,7 +2211,7 @@
         <w:t xml:space="preserve"> </w:t>
       </w:r>
       <w:r>
-        <w:t xml:space="preserve">for affected items and does not replace their stored repair dates. Both special types retain their supervisory signer after the table. The regular Extension is unchanged. Previously issued documents and corrections of authoring-11 or earlier documents retain their historical layout.</w:t>
+        <w:t xml:space="preserve">for affected items, keep their stored repair dates and reprint unchanged. Both special types retain their supervisory signer after the table. The regular Extension is unchanged. Previously issued documents and corrections of authoring-11 or earlier documents retain their historical layout.</w:t>
       </w:r>
     </w:p>
     <w:p>
@@ -5355,7 +5355,7 @@
         <w:pStyle w:val="BodyText"/>
       </w:pPr>
       <w:r>
-        <w:t xml:space="preserve">Manual source digest b7aadbb82ee84b94.</w:t>
+        <w:t xml:space="preserve">Manual source digest 1d82eac9c9c7383a.</w:t>
       </w:r>
     </w:p>
     <w:bookmarkEnd w:id="41"/>
@@ -18331,6 +18331,232 @@
     <w:rPr>
       <w:b/>
       <w:color w:val="ff0000"/>
+    </w:rPr>
+  </w:style>
+  <w:style w:customStyle="1" w:styleId="NormalTok" w:type="character">
+    <w:name w:val="NormalTok"/>
+    <w:basedOn w:val="VerbatimChar"/>
+    <w:rPr/>
+  </w:style>
+  <w:style w:customStyle="1" w:styleId="KeywordTok" w:type="character">
+    <w:name w:val="KeywordTok"/>
+    <w:basedOn w:val="VerbatimChar"/>
+    <w:rPr>
+      <w:color w:val="007020"/>
+      <w:b/>
+    </w:rPr>
+  </w:style>
+  <w:style w:customStyle="1" w:styleId="DataTypeTok" w:type="character">
+    <w:name w:val="DataTypeTok"/>
+    <w:basedOn w:val="VerbatimChar"/>
+    <w:rPr>
+      <w:color w:val="902000"/>
+    </w:rPr>
+  </w:style>
+  <w:style w:customStyle="1" w:styleId="DecValTok" w:type="character">
+    <w:name w:val="DecValTok"/>
+    <w:basedOn w:val="VerbatimChar"/>
+    <w:rPr>
+      <w:color w:val="40a070"/>
+    </w:rPr>
+  </w:style>
+  <w:style w:customStyle="1" w:styleId="BaseNTok" w:type="character">
+    <w:name w:val="BaseNTok"/>
+    <w:basedOn w:val="VerbatimChar"/>
+    <w:rPr>
+      <w:color w:val="40a070"/>
+    </w:rPr>
+  </w:style>
+  <w:style w:customStyle="1" w:styleId="FloatTok" w:type="character">
+    <w:name w:val="FloatTok"/>
+    <w:basedOn w:val="VerbatimChar"/>
+    <w:rPr>
+      <w:color w:val="40a070"/>
+    </w:rPr>
+  </w:style>
+  <w:style w:customStyle="1" w:styleId="ConstantTok" w:type="character">
+    <w:name w:val="ConstantTok"/>
+    <w:basedOn w:val="VerbatimChar"/>
+    <w:rPr>
+      <w:color w:val="880000"/>
+    </w:rPr>
+  </w:style>
+  <w:style w:customStyle="1" w:styleId="CharTok" w:type="character">
+    <w:name w:val="CharTok"/>
+    <w:basedOn w:val="VerbatimChar"/>
+    <w:rPr>
+      <w:color w:val="4070a0"/>
+    </w:rPr>
+  </w:style>
+  <w:style w:customStyle="1" w:styleId="SpecialCharTok" w:type="character">
+    <w:name w:val="SpecialCharTok"/>
+    <w:basedOn w:val="VerbatimChar"/>
+    <w:rPr>
+      <w:color w:val="4070a0"/>
+    </w:rPr>
+  </w:style>
+  <w:style w:customStyle="1" w:styleId="StringTok" w:type="character">
+    <w:name w:val="StringTok"/>
+    <w:basedOn w:val="VerbatimChar"/>
+    <w:rPr>
+      <w:color w:val="4070a0"/>
+    </w:rPr>
+  </w:style>
+  <w:style w:customStyle="1" w:styleId="VerbatimStringTok" w:type="character">
+    <w:name w:val="VerbatimStringTok"/>
+    <w:basedOn w:val="VerbatimChar"/>
+    <w:rPr>
+      <w:color w:val="4070a0"/>
+    </w:rPr>
+  </w:style>
+  <w:style w:customStyle="1" w:styleId="SpecialStringTok" w:type="character">
+    <w:name w:val="SpecialStringTok"/>
+    <w:basedOn w:val="VerbatimChar"/>
+    <w:rPr>
+      <w:color w:val="bb6688"/>
+    </w:rPr>
+  </w:style>
+  <w:style w:customStyle="1" w:styleId="ImportTok" w:type="character">
+    <w:name w:val="ImportTok"/>
+    <w:basedOn w:val="VerbatimChar"/>
+    <w:rPr>
+      <w:color w:val="008000"/>
+      <w:b/>
+    </w:rPr>
+  </w:style>
+  <w:style w:customStyle="1" w:styleId="CommentTok" w:type="character">
+    <w:name w:val="CommentTok"/>
+    <w:basedOn w:val="VerbatimChar"/>
+    <w:rPr>
+      <w:color w:val="60a0b0"/>
+      <w:i/>
+    </w:rPr>
+  </w:style>
+  <w:style w:customStyle="1" w:styleId="DocumentationTok" w:type="character">
+    <w:name w:val="DocumentationTok"/>
+    <w:basedOn w:val="VerbatimChar"/>
+    <w:rPr>
+      <w:color w:val="ba2121"/>
+      <w:i/>
+    </w:rPr>
+  </w:style>
+  <w:style w:customStyle="1" w:styleId="AnnotationTok" w:type="character">
+    <w:name w:val="AnnotationTok"/>
+    <w:basedOn w:val="VerbatimChar"/>
+    <w:rPr>
+      <w:color w:val="60a0b0"/>
+      <w:b/>
+      <w:i/>
+    </w:rPr>
+  </w:style>
+  <w:style w:customStyle="1" w:styleId="CommentVarTok" w:type="character">
+    <w:name w:val="CommentVarTok"/>
+    <w:basedOn w:val="VerbatimChar"/>
+    <w:rPr>
+      <w:color w:val="60a0b0"/>
+      <w:b/>
+      <w:i/>
+    </w:rPr>
+  </w:style>
+  <w:style w:customStyle="1" w:styleId="OtherTok" w:type="character">
+    <w:name w:val="OtherTok"/>
+    <w:basedOn w:val="VerbatimChar"/>
+    <w:rPr>
+      <w:color w:val="007020"/>
+    </w:rPr>
+  </w:style>
+  <w:style w:customStyle="1" w:styleId="FunctionTok" w:type="character">
+    <w:name w:val="FunctionTok"/>
+    <w:basedOn w:val="VerbatimChar"/>
+    <w:rPr>
+      <w:color w:val="06287e"/>
+    </w:rPr>
+  </w:style>
+  <w:style w:customStyle="1" w:styleId="VariableTok" w:type="character">
+    <w:name w:val="VariableTok"/>
+    <w:basedOn w:val="VerbatimChar"/>
+    <w:rPr>
+      <w:color w:val="19177c"/>
+    </w:rPr>
+  </w:style>
+  <w:style w:customStyle="1" w:styleId="ControlFlowTok" w:type="character">
+    <w:name w:val="ControlFlowTok"/>
+    <w:basedOn w:val="VerbatimChar"/>
+    <w:rPr>
+      <w:color w:val="007020"/>
+      <w:b/>
+    </w:rPr>
+  </w:style>
+  <w:style w:customStyle="1" w:styleId="OperatorTok" w:type="character">
+    <w:name w:val="OperatorTok"/>
+    <w:basedOn w:val="VerbatimChar"/>
+    <w:rPr>
+      <w:color w:val="666666"/>
+    </w:rPr>
+  </w:style>
+  <w:style w:customStyle="1" w:styleId="BuiltInTok" w:type="character">
+    <w:name w:val="BuiltInTok"/>
+    <w:basedOn w:val="VerbatimChar"/>
+    <w:rPr>
+      <w:color w:val="008000"/>
+    </w:rPr>
+  </w:style>
+  <w:style w:customStyle="1" w:styleId="ExtensionTok" w:type="character">
+    <w:name w:val="ExtensionTok"/>
+    <w:basedOn w:val="VerbatimChar"/>
+    <w:rPr/>
+  </w:style>
+  <w:style w:customStyle="1" w:styleId="PreprocessorTok" w:type="character">
+    <w:name w:val="PreprocessorTok"/>
+    <w:basedOn w:val="VerbatimChar"/>
+    <w:rPr>
+      <w:color w:val="bc7a00"/>
+    </w:rPr>
+  </w:style>
+  <w:style w:customStyle="1" w:styleId="AttributeTok" w:type="character">
+    <w:name w:val="AttributeTok"/>
+    <w:basedOn w:val="VerbatimChar"/>
+    <w:rPr>
+      <w:color w:val="7d9029"/>
+    </w:rPr>
+  </w:style>
+  <w:style w:customStyle="1" w:styleId="RegionMarkerTok" w:type="character">
+    <w:name w:val="RegionMarkerTok"/>
+    <w:basedOn w:val="VerbatimChar"/>
+    <w:rPr/>
+  </w:style>
+  <w:style w:customStyle="1" w:styleId="InformationTok" w:type="character">
+    <w:name w:val="InformationTok"/>
+    <w:basedOn w:val="VerbatimChar"/>
+    <w:rPr>
+      <w:color w:val="60a0b0"/>
+      <w:b/>
+      <w:i/>
+    </w:rPr>
+  </w:style>
+  <w:style w:customStyle="1" w:styleId="WarningTok" w:type="character">
+    <w:name w:val="WarningTok"/>
+    <w:basedOn w:val="VerbatimChar"/>
+    <w:rPr>
+      <w:color w:val="60a0b0"/>
+      <w:b/>
+      <w:i/>
+    </w:rPr>
+  </w:style>
+  <w:style w:customStyle="1" w:styleId="AlertTok" w:type="character">
+    <w:name w:val="AlertTok"/>
+    <w:basedOn w:val="VerbatimChar"/>
+    <w:rPr>
+      <w:color w:val="ff0000"/>
+      <w:b/>
+    </w:rPr>
+  </w:style>
+  <w:style w:customStyle="1" w:styleId="ErrorTok" w:type="character">
+    <w:name w:val="ErrorTok"/>
+    <w:basedOn w:val="VerbatimChar"/>
+    <w:rPr>
+      <w:color w:val="ff0000"/>
+      <w:b/>
     </w:rPr>
   </w:style>
   <w:style w:customStyle="1" w:styleId="NormalTok" w:type="character">

</xml_diff>

<commit_message>
Regenerate the R56 manual editions with pinned Chromium 145
The PDF edition is now printed by the Playwright-pinned Chromium
145.0.7632.6 (Skia/PDF m145) instead of Chromium 141. The Word edition's
text is unchanged; it differs only in its timestamp and styles carried
forward from the reference document. Records how the cloud environment
installs the pinned browser.

Co-Authored-By: Claude Opus 5.5 <noreply@anthropic.com>
Claude-Session: https://claude.ai/code/session_01WPJAZGfD47jPUEgCNYYSg7
</commit_message>
<xml_diff>
--- a/docs/staff/Program_Instruction_Manual.docx
+++ b/docs/staff/Program_Instruction_Manual.docx
@@ -18790,6 +18790,232 @@
     <w:basedOn w:val="VerbatimChar"/>
     <w:rPr/>
   </w:style>
+  <w:style w:customStyle="1" w:styleId="KeywordTok" w:type="character">
+    <w:name w:val="KeywordTok"/>
+    <w:basedOn w:val="VerbatimChar"/>
+    <w:rPr>
+      <w:color w:val="007020"/>
+      <w:b/>
+    </w:rPr>
+  </w:style>
+  <w:style w:customStyle="1" w:styleId="DataTypeTok" w:type="character">
+    <w:name w:val="DataTypeTok"/>
+    <w:basedOn w:val="VerbatimChar"/>
+    <w:rPr>
+      <w:color w:val="902000"/>
+    </w:rPr>
+  </w:style>
+  <w:style w:customStyle="1" w:styleId="DecValTok" w:type="character">
+    <w:name w:val="DecValTok"/>
+    <w:basedOn w:val="VerbatimChar"/>
+    <w:rPr>
+      <w:color w:val="40a070"/>
+    </w:rPr>
+  </w:style>
+  <w:style w:customStyle="1" w:styleId="BaseNTok" w:type="character">
+    <w:name w:val="BaseNTok"/>
+    <w:basedOn w:val="VerbatimChar"/>
+    <w:rPr>
+      <w:color w:val="40a070"/>
+    </w:rPr>
+  </w:style>
+  <w:style w:customStyle="1" w:styleId="FloatTok" w:type="character">
+    <w:name w:val="FloatTok"/>
+    <w:basedOn w:val="VerbatimChar"/>
+    <w:rPr>
+      <w:color w:val="40a070"/>
+    </w:rPr>
+  </w:style>
+  <w:style w:customStyle="1" w:styleId="ConstantTok" w:type="character">
+    <w:name w:val="ConstantTok"/>
+    <w:basedOn w:val="VerbatimChar"/>
+    <w:rPr>
+      <w:color w:val="880000"/>
+    </w:rPr>
+  </w:style>
+  <w:style w:customStyle="1" w:styleId="CharTok" w:type="character">
+    <w:name w:val="CharTok"/>
+    <w:basedOn w:val="VerbatimChar"/>
+    <w:rPr>
+      <w:color w:val="4070a0"/>
+    </w:rPr>
+  </w:style>
+  <w:style w:customStyle="1" w:styleId="SpecialCharTok" w:type="character">
+    <w:name w:val="SpecialCharTok"/>
+    <w:basedOn w:val="VerbatimChar"/>
+    <w:rPr>
+      <w:color w:val="4070a0"/>
+    </w:rPr>
+  </w:style>
+  <w:style w:customStyle="1" w:styleId="StringTok" w:type="character">
+    <w:name w:val="StringTok"/>
+    <w:basedOn w:val="VerbatimChar"/>
+    <w:rPr>
+      <w:color w:val="4070a0"/>
+    </w:rPr>
+  </w:style>
+  <w:style w:customStyle="1" w:styleId="VerbatimStringTok" w:type="character">
+    <w:name w:val="VerbatimStringTok"/>
+    <w:basedOn w:val="VerbatimChar"/>
+    <w:rPr>
+      <w:color w:val="4070a0"/>
+    </w:rPr>
+  </w:style>
+  <w:style w:customStyle="1" w:styleId="SpecialStringTok" w:type="character">
+    <w:name w:val="SpecialStringTok"/>
+    <w:basedOn w:val="VerbatimChar"/>
+    <w:rPr>
+      <w:color w:val="bb6688"/>
+    </w:rPr>
+  </w:style>
+  <w:style w:customStyle="1" w:styleId="ImportTok" w:type="character">
+    <w:name w:val="ImportTok"/>
+    <w:basedOn w:val="VerbatimChar"/>
+    <w:rPr>
+      <w:color w:val="008000"/>
+      <w:b/>
+    </w:rPr>
+  </w:style>
+  <w:style w:customStyle="1" w:styleId="CommentTok" w:type="character">
+    <w:name w:val="CommentTok"/>
+    <w:basedOn w:val="VerbatimChar"/>
+    <w:rPr>
+      <w:color w:val="60a0b0"/>
+      <w:i/>
+    </w:rPr>
+  </w:style>
+  <w:style w:customStyle="1" w:styleId="DocumentationTok" w:type="character">
+    <w:name w:val="DocumentationTok"/>
+    <w:basedOn w:val="VerbatimChar"/>
+    <w:rPr>
+      <w:color w:val="ba2121"/>
+      <w:i/>
+    </w:rPr>
+  </w:style>
+  <w:style w:customStyle="1" w:styleId="AnnotationTok" w:type="character">
+    <w:name w:val="AnnotationTok"/>
+    <w:basedOn w:val="VerbatimChar"/>
+    <w:rPr>
+      <w:color w:val="60a0b0"/>
+      <w:b/>
+      <w:i/>
+    </w:rPr>
+  </w:style>
+  <w:style w:customStyle="1" w:styleId="CommentVarTok" w:type="character">
+    <w:name w:val="CommentVarTok"/>
+    <w:basedOn w:val="VerbatimChar"/>
+    <w:rPr>
+      <w:color w:val="60a0b0"/>
+      <w:b/>
+      <w:i/>
+    </w:rPr>
+  </w:style>
+  <w:style w:customStyle="1" w:styleId="OtherTok" w:type="character">
+    <w:name w:val="OtherTok"/>
+    <w:basedOn w:val="VerbatimChar"/>
+    <w:rPr>
+      <w:color w:val="007020"/>
+    </w:rPr>
+  </w:style>
+  <w:style w:customStyle="1" w:styleId="FunctionTok" w:type="character">
+    <w:name w:val="FunctionTok"/>
+    <w:basedOn w:val="VerbatimChar"/>
+    <w:rPr>
+      <w:color w:val="06287e"/>
+    </w:rPr>
+  </w:style>
+  <w:style w:customStyle="1" w:styleId="VariableTok" w:type="character">
+    <w:name w:val="VariableTok"/>
+    <w:basedOn w:val="VerbatimChar"/>
+    <w:rPr>
+      <w:color w:val="19177c"/>
+    </w:rPr>
+  </w:style>
+  <w:style w:customStyle="1" w:styleId="ControlFlowTok" w:type="character">
+    <w:name w:val="ControlFlowTok"/>
+    <w:basedOn w:val="VerbatimChar"/>
+    <w:rPr>
+      <w:color w:val="007020"/>
+      <w:b/>
+    </w:rPr>
+  </w:style>
+  <w:style w:customStyle="1" w:styleId="OperatorTok" w:type="character">
+    <w:name w:val="OperatorTok"/>
+    <w:basedOn w:val="VerbatimChar"/>
+    <w:rPr>
+      <w:color w:val="666666"/>
+    </w:rPr>
+  </w:style>
+  <w:style w:customStyle="1" w:styleId="BuiltInTok" w:type="character">
+    <w:name w:val="BuiltInTok"/>
+    <w:basedOn w:val="VerbatimChar"/>
+    <w:rPr>
+      <w:color w:val="008000"/>
+    </w:rPr>
+  </w:style>
+  <w:style w:customStyle="1" w:styleId="ExtensionTok" w:type="character">
+    <w:name w:val="ExtensionTok"/>
+    <w:basedOn w:val="VerbatimChar"/>
+    <w:rPr/>
+  </w:style>
+  <w:style w:customStyle="1" w:styleId="PreprocessorTok" w:type="character">
+    <w:name w:val="PreprocessorTok"/>
+    <w:basedOn w:val="VerbatimChar"/>
+    <w:rPr>
+      <w:color w:val="bc7a00"/>
+    </w:rPr>
+  </w:style>
+  <w:style w:customStyle="1" w:styleId="AttributeTok" w:type="character">
+    <w:name w:val="AttributeTok"/>
+    <w:basedOn w:val="VerbatimChar"/>
+    <w:rPr>
+      <w:color w:val="7d9029"/>
+    </w:rPr>
+  </w:style>
+  <w:style w:customStyle="1" w:styleId="RegionMarkerTok" w:type="character">
+    <w:name w:val="RegionMarkerTok"/>
+    <w:basedOn w:val="VerbatimChar"/>
+    <w:rPr/>
+  </w:style>
+  <w:style w:customStyle="1" w:styleId="InformationTok" w:type="character">
+    <w:name w:val="InformationTok"/>
+    <w:basedOn w:val="VerbatimChar"/>
+    <w:rPr>
+      <w:color w:val="60a0b0"/>
+      <w:b/>
+      <w:i/>
+    </w:rPr>
+  </w:style>
+  <w:style w:customStyle="1" w:styleId="WarningTok" w:type="character">
+    <w:name w:val="WarningTok"/>
+    <w:basedOn w:val="VerbatimChar"/>
+    <w:rPr>
+      <w:color w:val="60a0b0"/>
+      <w:b/>
+      <w:i/>
+    </w:rPr>
+  </w:style>
+  <w:style w:customStyle="1" w:styleId="AlertTok" w:type="character">
+    <w:name w:val="AlertTok"/>
+    <w:basedOn w:val="VerbatimChar"/>
+    <w:rPr>
+      <w:color w:val="ff0000"/>
+      <w:b/>
+    </w:rPr>
+  </w:style>
+  <w:style w:customStyle="1" w:styleId="ErrorTok" w:type="character">
+    <w:name w:val="ErrorTok"/>
+    <w:basedOn w:val="VerbatimChar"/>
+    <w:rPr>
+      <w:color w:val="ff0000"/>
+      <w:b/>
+    </w:rPr>
+  </w:style>
+  <w:style w:customStyle="1" w:styleId="NormalTok" w:type="character">
+    <w:name w:val="NormalTok"/>
+    <w:basedOn w:val="VerbatimChar"/>
+    <w:rPr/>
+  </w:style>
   <w:style w:type="character" w:customStyle="1" w:styleId="KeywordTok">
     <w:name w:val="KeywordTok"/>
     <w:basedOn w:val="VerbatimChar"/>

</xml_diff>

<commit_message>
Document the R56 usability follow-up and regenerate the manual
Staff manual and guides use the new action, view, search and mode names;
the manual editions are regenerated together on pinned Chromium 145.
R56-REVIEW records the follow-up, the reviewed screen CSS exception and
deferrals; ACCEPTANCE-RECORD adds open item S56B (staff and real-device
review). Release identity is unchanged.

Co-Authored-By: Claude Opus 5.5 <noreply@anthropic.com>
Claude-Session: https://claude.ai/code/session_01WPJAZGfD47jPUEgCNYYSg7
</commit_message>
<xml_diff>
--- a/docs/staff/Program_Instruction_Manual.docx
+++ b/docs/staff/Program_Instruction_Manual.docx
@@ -48,7 +48,7 @@
         <w:pStyle w:val="BodyText"/>
       </w:pPr>
       <w:r>
-        <w:t xml:space="preserve">R55 is a development candidate for City acceptance. Its security checks require the same ordinary document, history and recovery procedures described below. Automated verification does not replace the outstanding City Windows and network tests, staff and assistive technology acceptance, or legal and seasonal policy decisions listed in the carried-forward City acceptance record. New mandatory-appearance citations remain blocked until approved defendant instructions are supplied and integrated. Historical frozen reprints remain available. No live deployment is included in this release.</w:t>
+        <w:t xml:space="preserve">R56 is a development candidate for City acceptance. Its security checks require the same ordinary document, history and recovery procedures described below. Automated verification does not replace the outstanding City Windows and network tests, staff and assistive technology acceptance, or legal and seasonal policy decisions listed in the carried-forward City acceptance record. New mandatory-appearance citations remain blocked until approved defendant instructions are supplied and integrated. Historical frozen reprints remain available. No live deployment is included in this release.</w:t>
       </w:r>
     </w:p>
     <w:bookmarkStart w:id="20" w:name="start-here-and-daily-routine"/>
@@ -101,7 +101,7 @@
         <w:t xml:space="preserve"> </w:t>
       </w:r>
       <w:r>
-        <w:t xml:space="preserve">Run the Document Writer desktop shortcut or installed launcher. Keep one Writer tab open in the same browser profile. Confirm Build 2026-10-21 R55 and helper 2026.10.21.56. Open Workspace and resolve any save confirmation, shared-history or PDF-filing exceptions before creating replacement work. Check pending deadlines and reminders.</w:t>
+        <w:t xml:space="preserve">Run the Document Writer desktop shortcut or installed launcher. Keep one Writer tab open in the same browser profile. Confirm Build 2026-10-21 R56 and helper 2026.10.21.57. Open Workspace and resolve any save confirmation, shared-history or PDF-filing exceptions before creating replacement work. Check pending deadlines and reminders.</w:t>
       </w:r>
     </w:p>
     <w:p>
@@ -119,7 +119,7 @@
         <w:t xml:space="preserve"> </w:t>
       </w:r>
       <w:r>
-        <w:t xml:space="preserve">Use Import inspection for a new case or unused completed inspection. Use Workspace to continue a retained document or worksheet. Add the appropriate language, fill all case-specific details and assign required deadlines deliberately. Use Show checks or Inspection checks to find incomplete fields. Saving an unfinished draft is permitted even when issuance checks are unresolved.</w:t>
+        <w:t xml:space="preserve">Use Import inspection for a new case or unused completed inspection. Use Workspace to continue a retained document or worksheet. Add the appropriate language, fill all case-specific details and assign required deadlines deliberately. Use the readiness summary at the top of a document (Go to first required field, Open full checklist) or a worksheet’s Inspection checks to find incomplete fields. Saving an unfinished draft is permitted even when issuance checks are unresolved.</w:t>
       </w:r>
     </w:p>
     <w:p>
@@ -155,7 +155,7 @@
         <w:t xml:space="preserve"> </w:t>
       </w:r>
       <w:r>
-        <w:t xml:space="preserve">Use Save &amp; continue later and verify device saving. Resolve or preserve queued work through Saved work &amp; connection. Download a workspace backup when moving profiles or when recovery is needed. Close Writer and the helper when instructed for an update. Do not clear browser site data while unfinished work exists.</w:t>
+        <w:t xml:space="preserve">Use Save draft &amp; return to Workspace and verify device saving. Resolve or preserve queued work through Saved work &amp; connection. Download a workspace backup when moving profiles or when recovery is needed. Close Writer and the helper when instructed for an update. Do not clear browser site data while unfinished work exists.</w:t>
       </w:r>
     </w:p>
     <w:p>
@@ -163,7 +163,7 @@
         <w:pStyle w:val="BodyText"/>
       </w:pPr>
       <w:r>
-        <w:t xml:space="preserve">The five Writer destinations are Import inspection, Workspace, Order language, Reports, and Tools &amp; settings. Reports opens separately. Editing a case remains within Workspace; returning from Reports offers Back to Reports.</w:t>
+        <w:t xml:space="preserve">The five Writer destinations are Import inspection, Workspace, Order language, Reports, and Tools &amp; settings. Open Reports ↗ opens Reports in a new tab. Editing a case remains within Workspace. When Open case in Writer brings a case from Reports, the Writer rail shows Back to Reports instead, which returns to the same report.</w:t>
       </w:r>
     </w:p>
     <w:p>
@@ -409,7 +409,7 @@
         <w:pStyle w:val="FirstParagraph"/>
       </w:pPr>
       <w:r>
-        <w:t xml:space="preserve">Workspace is the queue for cases loaded on this device. It starts in Needs attention. Continue work, Deadlines, Needs resolution and All cases provide other views of the same loaded cases. Counts represent cases rather than individual tasks within a view; a case may appear in more than one view. Summary buttons clear the search and inspector filters. Check the View selector when the expected case is not visible.</w:t>
+        <w:t xml:space="preserve">Workspace is the queue for cases loaded on this device. It starts in Needs attention. The quick views Needs attention, Continue work, Deadlines, Needs resolution and All cases are the main filter; More views adds Due within 7 days, Past due, Open and Closed. Counts represent cases rather than individual tasks within a view; a case may appear in more than one view. Choosing a quick view clears the search and inspector filters; More views keeps them, and returning it to More views… shows Needs attention again. Needs resolution lists cases with unconfirmed or queued saves, PDF filing and transfers, record problems and other blockers; device save and connection problems appear in the Saved work &amp; connection banner. Check All cases and More views when the expected case is not visible.</w:t>
       </w:r>
     </w:p>
     <w:p>
@@ -427,7 +427,25 @@
         <w:t xml:space="preserve"> </w:t>
       </w:r>
       <w:r>
-        <w:t xml:space="preserve">Search this workspace by address, case number, owner or parcel. Apply the inspector filter if useful. Use the main action beside the case to continue its next task. It may say Continue import, Continue document, Continue reinspection, Complete recorded visit, Reinspect or View case. An uncertain shared save takes priority over starting another draft. A record verification problem takes priority over editing.</w:t>
+        <w:t xml:space="preserve">Search this workspace by address, case number, owner or parcel. Apply the inspector filter if useful. When a workspace search finds nothing, Search shared case records for</w:t>
+      </w:r>
+      <w:r>
+        <w:t xml:space="preserve"> </w:t>
+      </w:r>
+      <w:r>
+        <w:t xml:space="preserve">“</w:t>
+      </w:r>
+      <w:r>
+        <w:t xml:space="preserve">…</w:t>
+      </w:r>
+      <w:r>
+        <w:t xml:space="preserve">”</w:t>
+      </w:r>
+      <w:r>
+        <w:t xml:space="preserve"> </w:t>
+      </w:r>
+      <w:r>
+        <w:t xml:space="preserve">opens the shared search with the same text; it searches only when you submit it. Use the main action beside the case to continue its next task. It may say Continue import, Continue document, Continue reinspection, Complete recorded visit, Reinspect or View case. An uncertain shared save takes priority over starting another draft. A record verification problem takes priority over editing.</w:t>
       </w:r>
     </w:p>
     <w:p>
@@ -435,7 +453,7 @@
         <w:pStyle w:val="BodyText"/>
       </w:pPr>
       <w:r>
-        <w:t xml:space="preserve">Open Case details and history for secondary actions, the document list, timeline, case export and Put away. Put away removes a case from this device’s queue after the relevant safeguards; it does not delete the shared case. Use Search all cases in Tools &amp; settings to locate records outside the current device workspace. Open saved case can load an exported case record, subject to the program’s shared-history checks.</w:t>
+        <w:t xml:space="preserve">Open Case details and history for secondary actions, the document list, timeline, case export and Remove from this workspace. Removing a case from this workspace takes it off this device’s queue after the relevant safeguards; the shared case record is not deleted. A case with unsaved or unconfirmed work is refused or asks before that work is lost. Remove cases from this workspace, below the list, removes several cases and separates those that are safe to remove. Use Search shared case records (Workspace toolbar or Tools &amp; settings) to locate records outside the current device workspace. Open saved case can load an exported case record, subject to the program’s shared-history checks.</w:t>
       </w:r>
     </w:p>
     <w:p>
@@ -479,7 +497,7 @@
         <w:t xml:space="preserve"> </w:t>
       </w:r>
       <w:r>
-        <w:t xml:space="preserve">Open the named case action rather than making a replacement case. Confirm save uses the retained original request. Review shared changes compares the current shared record. File issued PDF completes original filing after issuance. Saved work &amp; connection explains whether the remaining work concerns this device, shared cases or PDFs.</w:t>
+        <w:t xml:space="preserve">Open the named case action rather than making a replacement case. Confirm save uses the retained original request. Review shared changes compares the current shared record. Save case to shared folder saves a queued case file after shared history is checked; it is also among an issued document’s actions. File issued PDF completes original filing after issuance. Saved work &amp; connection explains whether the remaining work concerns this device, shared cases or PDFs.</w:t>
       </w:r>
     </w:p>
     <w:p>
@@ -515,7 +533,7 @@
         <w:t xml:space="preserve"> </w:t>
       </w:r>
       <w:r>
-        <w:t xml:space="preserve">Open Import inspection, enter the complete case number and choose Find case or press Enter. The Windows helper runs the supplied read-only SQL query with the signed-in Windows account. Inspectors do not enter SQL, passwords or server settings. The initial default server is sqlelam; IT can set the approved database and server in shared Case Lookup/settings.json.</w:t>
+        <w:t xml:space="preserve">Open Import inspection, enter the complete case number and choose Find Accela inspection or press Enter. The Windows helper runs the supplied read-only SQL query with the signed-in Windows account. Inspectors do not enter SQL, passwords or server settings. The initial default server is sqlelam; IT can set the approved database and server in shared Case Lookup/settings.json.</w:t>
       </w:r>
     </w:p>
     <w:p>
@@ -733,7 +751,7 @@
         <w:t xml:space="preserve"> </w:t>
       </w:r>
       <w:r>
-        <w:t xml:space="preserve">Save &amp; continue later retains the lookup or review on this device. A retained review is a snapshot with its retrieval time; use Find case again for fresh information. Cancel lookup suppresses its result. A failed or empty lookup preserves prior work. If the shared case changed, review the refreshed comparison and confirm again. A delayed earlier result must not replace the current case or reopen Import after navigation.</w:t>
+        <w:t xml:space="preserve">Save draft &amp; return to Workspace retains the lookup or review on this device. A retained review is a snapshot with its retrieval time; use Find Accela inspection again for fresh information. Cancel lookup suppresses its result. A failed or empty lookup preserves prior work. If the shared case changed, review the refreshed comparison and confirm again. A delayed earlier result must not replace the current case or reopen Import after navigation.</w:t>
       </w:r>
     </w:p>
     <w:p>
@@ -759,7 +777,7 @@
         <w:pStyle w:val="FirstParagraph"/>
       </w:pPr>
       <w:r>
-        <w:t xml:space="preserve">Start from the imported initial inspection. Verify owner, property, parcel, inspector, inspection date and any supplied time. Expand the case details when a check identifies a missing field. The parcel comes only from the Accela import: if it is missing or not 12 digits, correct it in Accela and import the inspection again; a notice cannot be issued without it. Review the mailing block rather than relying on an address parser to establish ownership or service.</w:t>
+        <w:t xml:space="preserve">Start from the imported initial inspection. Verify owner, property, parcel, inspector, inspection date and any supplied time. When a check identifies a missing field, use Go to first required field or the check’s link to reach it on the working document. The Inspection section appears only when there is something to act on there, such as special-document details, snow facts or a correction. The parcel comes only from the Accela import: if it is missing or not 12 digits, correct it in Accela and import the inspection again; a notice cannot be issued without it. Review the mailing block rather than relying on an address parser to establish ownership or service.</w:t>
       </w:r>
     </w:p>
     <w:p>
@@ -771,7 +789,7 @@
         <w:pStyle w:val="Compact"/>
       </w:pPr>
       <w:r>
-        <w:t xml:space="preserve">Open Add items. Find the appropriate selectable order language and select it once. A checkmark means it is already on this notice. Select it again to remove it from the unissued draft. The same library entry cannot be added twice.</w:t>
+        <w:t xml:space="preserve">In Items and due dates, choose + Select violations. In the Select for this notice picker, find the appropriate selectable order language and select it once. A checkmark means it is already on this notice. Select it again to remove it from the unissued draft. The same library entry cannot be added twice.</w:t>
       </w:r>
     </w:p>
     <w:p>
@@ -795,7 +813,7 @@
         <w:pStyle w:val="Compact"/>
       </w:pPr>
       <w:r>
-        <w:t xml:space="preserve">In Assign due dates below the document, select the items sharing a deadline, enter the date and choose Apply to selected. Use Select all when appropriate. Repeat for other groups. New items begin without an automatic deadline.</w:t>
+        <w:t xml:space="preserve">Tick the checkbox beside each due date that shares a deadline (Select item N for a shared due date). In Assign due dates below the document, which counts the selected items, enter the date and choose Apply date to selected items. Use Select all or Clear when appropriate. Repeat for other groups. New items begin without an automatic deadline.</w:t>
       </w:r>
     </w:p>
     <w:p>
@@ -819,7 +837,7 @@
         <w:pStyle w:val="Compact"/>
       </w:pPr>
       <w:r>
-        <w:t xml:space="preserve">Review the whole document, not only the edited sentence. Check recipients (the Recipients button opens copies, email and registered agent), contact details, the mailing date, the item order and all warnings. Use Show checks to jump to the affected field and correct it.</w:t>
+        <w:t xml:space="preserve">Review the whole document, not only the edited sentence. Check recipients (the Recipients button opens copies, email and registered agent; Done closes it once the entries are valid), contact details, the mailing date, the item order and all warnings. The readiness summary at the top counts required fixes and advisories; Go to first required field jumps to the affected field, and Open full checklist shows every check in the Review section.</w:t>
       </w:r>
     </w:p>
     <w:p>
@@ -831,7 +849,7 @@
         <w:pStyle w:val="Compact"/>
       </w:pPr>
       <w:r>
-        <w:t xml:space="preserve">Choose Save &amp; continue later to retain unfinished work, or Review &amp; issue when ready. Verify the resulting save state.</w:t>
+        <w:t xml:space="preserve">Choose Save draft &amp; return to Workspace to retain unfinished work, or Review &amp; issue when ready. Verify the resulting save state.</w:t>
       </w:r>
     </w:p>
     <w:p>
@@ -883,7 +901,7 @@
         <w:pStyle w:val="FirstParagraph"/>
       </w:pPr>
       <w:r>
-        <w:t xml:space="preserve">Order language and the Add items picker use Approved language by default. Search ordinary words, a title, an ordinance or a catalog identifier across checklists. Multiple terms narrow the results. Trash, garbage, rubbish and refuse are related search terms; handrail, railing and banister are also related.</w:t>
+        <w:t xml:space="preserve">Order language (Browse language) and the Select for this notice picker use Approved language by default. Search ordinary words, a title, an ordinance or a catalog identifier across checklists. Multiple terms narrow the results. Trash, garbage, rubbish and refuse are related search terms; handrail, railing and banister are also related.</w:t>
       </w:r>
     </w:p>
     <w:p>
@@ -1118,13 +1136,13 @@
           <w:bCs/>
           <w:b/>
         </w:rPr>
-        <w:t xml:space="preserve">Review administration.</w:t>
+        <w:t xml:space="preserve">Review catalog.</w:t>
       </w:r>
       <w:r>
         <w:t xml:space="preserve"> </w:t>
       </w:r>
       <w:r>
-        <w:t xml:space="preserve">An authorized reviewer opens Review administration within Order language, or Order language review in Tools. Select the entry, compare bundled/current/unsubmitted wording, and supply the actual reviewer, corrective action, ordinance references and source or authority. Identify a replaced entry where applicable. Confirm the intended review explicitly.</w:t>
+        <w:t xml:space="preserve">An authorized reviewer opens Review catalog within Order language, or Tools &amp; settings → Administrator tools → Review catalog; Browse language returns to search. Select the entry, compare bundled/current/unsubmitted wording, and supply the actual reviewer, corrective action, ordinance references and source or authority. Identify a replaced entry where applicable. Confirm the intended review explicitly.</w:t>
       </w:r>
     </w:p>
     <w:p>
@@ -1531,7 +1549,7 @@
         <w:t xml:space="preserve"> </w:t>
       </w:r>
       <w:r>
-        <w:t xml:space="preserve">On an open reinspection worksheet, Assign due dates lists the items still outstanding; select items, choose a date and Apply to selected. Undo restores the previous dates. The three-date limit and seven-day spacing apply.</w:t>
+        <w:t xml:space="preserve">On an open reinspection worksheet, Assign due dates lists the items still outstanding; select items, choose a date and Apply date to selected items. Undo restores the previous dates. The three-date limit and seven-day spacing apply.</w:t>
       </w:r>
     </w:p>
     <w:p>
@@ -1539,7 +1557,7 @@
         <w:pStyle w:val="BodyText"/>
       </w:pPr>
       <w:r>
-        <w:t xml:space="preserve">Open Reinspect from the case or import an eligible unused completed reinspection. Enter the actual physical inspection date and time and the responsible inspector. Review all items is the entry view. Carried compliance and withdrawn items remain visible and cannot be casually reset. Progress covers active items; withdrawn items are listed separately.</w:t>
+        <w:t xml:space="preserve">Open Reinspect from the case or import an eligible unused completed reinspection. Enter the actual physical inspection date and time and the responsible inspector. Review all items, which shows every item, is the entry view. Carried compliance and withdrawn items remain visible and cannot be casually reset. Progress covers active items; withdrawn items are listed separately.</w:t>
       </w:r>
     </w:p>
     <w:p>
@@ -1551,13 +1569,13 @@
           <w:bCs/>
           <w:b/>
         </w:rPr>
-        <w:t xml:space="preserve">Walk through items.</w:t>
+        <w:t xml:space="preserve">One item at a time.</w:t>
       </w:r>
       <w:r>
         <w:t xml:space="preserve"> </w:t>
       </w:r>
       <w:r>
-        <w:t xml:space="preserve">Choose Start walk-through. The current item shows its original number, wording and original deadline. Choose 1 Corrected, 2 Progress, 3 No change or 4 No access. Quick mode advances to the next unresolved item. Complete details, then next holds the item for dates and notes. Skip for now leaves details unfinished; Return to unfinished details finds them again. Review all items pauses the walk-through and exposes the complete worksheet.</w:t>
+        <w:t xml:space="preserve">Choose One item at a time to bring the next unanswered item into focus; Review all items returns to the complete worksheet at any time. Four steps show progress: record the outcome, complete required details, continue to the next item, then review the inspection and permitted follow-up. The current item shows its original number, wording and original deadline. Choose 1 Corrected, 2 Progress made, 3 No change or 4 No access. Under After an outcome, Go to next unanswered item moves on at once; Complete details first keeps the item open for its date, notes and any new due date. Previous item goes back. Skip for now leaves details unfinished; Return to unfinished details finds them again. Keyboard shortcuts and tips, collapsed below, lists the keys. Nothing is recorded until you choose an outcome.</w:t>
       </w:r>
     </w:p>
     <w:tbl>
@@ -1708,7 +1726,7 @@
         <w:pStyle w:val="BodyText"/>
       </w:pPr>
       <w:r>
-        <w:t xml:space="preserve">Save &amp; continue later retains incomplete or invalid work only after device saving succeeds. A draft’s Review inspection action returns to the worksheet and retains its previous draft. Restore previous draft and inspection recovers that exact paired state, including private wording. A pending issuance must be confirmed through its retained attempt before changing the worksheet.</w:t>
+        <w:t xml:space="preserve">Save draft &amp; return to Workspace retains incomplete or invalid work only after device saving succeeds. A draft’s Review inspection action returns to the worksheet and retains its previous draft. Restore previous draft and inspection recovers that exact paired state, including private wording. A pending issuance must be confirmed through its retained attempt before changing the worksheet.</w:t>
       </w:r>
     </w:p>
     <w:p>
@@ -2157,7 +2175,7 @@
         <w:t xml:space="preserve"> </w:t>
       </w:r>
       <w:r>
-        <w:t xml:space="preserve">Identify the prior notice, selected eligible items, owner’s plan and benefit, supervisor review, and factual exclusion of safety or urgent items. Enter each affected item’s new due date in Items and due dates. Internal supervisory prosecution review is not a City Attorney referral.</w:t>
+        <w:t xml:space="preserve">Identify the prior notice, selected eligible items, owner’s plan and benefit, supervisor review, and factual exclusion of safety or urgent items. In Items and due dates, tick Affected beside each affected item’s due date and enter its new due date. Internal supervisory prosecution review is not a City Attorney referral.</w:t>
       </w:r>
     </w:p>
     <w:p>
@@ -2175,7 +2193,7 @@
         <w:t xml:space="preserve"> </w:t>
       </w:r>
       <w:r>
-        <w:t xml:space="preserve">Verify vacancy, request, selected items, maintenance/security conditions, review appointment, approved expiration model and transfer/disclosure wording. Enter each affected item’s new due date in Items and due dates. Contact-by is calculated seven calendar days before the actual review appointment; short notice needs the approved procedure reference. Renewal requires a new reviewed action. Apartment scope preserves common-area duties.</w:t>
+        <w:t xml:space="preserve">Verify vacancy, request, selected items, maintenance/security conditions, review appointment, approved expiration model and transfer/disclosure wording. In Items and due dates, tick Affected beside each affected item’s due date and enter its new due date. Contact-by is calculated seven calendar days before the actual review appointment; short notice needs the approved procedure reference. Renewal requires a new reviewed action. Apartment scope preserves common-area duties.</w:t>
       </w:r>
     </w:p>
     <w:p>
@@ -2193,7 +2211,7 @@
         <w:t xml:space="preserve"> </w:t>
       </w:r>
       <w:r>
-        <w:t xml:space="preserve">Newly authored Best Interest and Vacancy Extensions use the regular Extension’s header, recipient block, items table, continuation headers, footer and copy handling. Their approved language remains unchanged. All items are listed, including corrected items ruled through with the confirmed date. Extended items show the new due date; unselected items keep the existing date. From R56 (authoring 13), every affected item of a new Best Interest or Vacancy Extension needs a later due date, entered in Items and due dates; unaffected items keep their dates. Vacancy Extensions issued before R56 may be conditional: they display</w:t>
+        <w:t xml:space="preserve">Newly authored Best Interest and Vacancy Extensions use the regular Extension’s header, recipient block, items table, continuation headers, footer and copy handling. Their approved language remains unchanged. All items are listed, including corrected items ruled through with the confirmed date. Extended items show the new due date; unselected items keep the existing date. From R56 (authoring 13), every affected item of a new Best Interest or Vacancy Extension needs a later due date, marked Affected and entered in Items and due dates; unaffected items keep their dates. Authoring-12 and earlier drafts keep the Affected outstanding items list in their details. Vacancy Extensions issued before R56 may be conditional: they display</w:t>
       </w:r>
       <w:r>
         <w:t xml:space="preserve"> </w:t>
@@ -2255,7 +2273,7 @@
         <w:t xml:space="preserve"> </w:t>
       </w:r>
       <w:r>
-        <w:t xml:space="preserve">Open Review &amp; issue, read the summary and confirm the intended action. Writer first retains the exact issue request on this device. The helper validates and publishes the document and any new visit together to the shared record. Initial notice/citation companions use their atomic batch. Only confirmed shared publication establishes issued status.</w:t>
+        <w:t xml:space="preserve">Open Review &amp; issue, read the summary and confirm the intended action. The dialog lists only checks that block issuance or advise, each linked to its field; passed checks stay in the Review section’s Full checklist. Confirming validates the current document again. Writer first retains the exact issue request on this device. The helper validates and publishes the document and any new visit together to the shared record. Initial notice/citation companions use their atomic batch. Only confirmed shared publication establishes issued status.</w:t>
       </w:r>
     </w:p>
     <w:tbl>
@@ -2855,7 +2873,7 @@
         <w:pStyle w:val="BodyText"/>
       </w:pPr>
       <w:r>
-        <w:t xml:space="preserve">Expand Backups and recovery for one-case recovery, a new unfinished-work recovery copy, a workspace download or empty-workspace restore. Expand Connection checks and technical details for helper/share/SQL information, Storage diagnostics, Inspect a case lock and catalog checks. These are diagnostic actions, not permission to force an uncertain save or remove a remote lock.</w:t>
+        <w:t xml:space="preserve">Expand Backups and recovery. Recovery on this device holds Recover an unfinished case and Create recovery copy on this device; Download or restore a workspace holds Download workspace backup and Restore workspace backup (into an empty workspace). Expand Connection checks and technical details for helper/share/SQL information, Storage diagnostics, Inspect a case lock and catalog checks. These are diagnostic actions, not permission to force an uncertain save or remove a remote lock.</w:t>
       </w:r>
     </w:p>
     <w:bookmarkEnd w:id="33"/>
@@ -2977,7 +2995,7 @@
               <w:jc w:val="left"/>
             </w:pPr>
             <w:r>
-              <w:t xml:space="preserve">Back up unfinished work now</w:t>
+              <w:t xml:space="preserve">Create recovery copy on this device</w:t>
             </w:r>
           </w:p>
         </w:tc>
@@ -3088,7 +3106,7 @@
         <w:t xml:space="preserve"> </w:t>
       </w:r>
       <w:r>
-        <w:t xml:space="preserve">Open Saved work &amp; connection → Backups and recovery → Recover an unfinished case. Select the intended recovery copy and check the case and capture time. Compare the current shared record. Preserve any differing local work before explicitly replacing it. Resume the recovered draft and confirm device saving; resolve retained pending requests through their original confirmation actions.</w:t>
+        <w:t xml:space="preserve">Open Saved work &amp; connection → Backups and recovery → Recovery on this device → Recover an unfinished case. Select the intended recovery copy and check the case and capture time. Compare the current shared record. Preserve any differing local work before explicitly replacing it. Resume the recovered draft and confirm device saving; resolve retained pending requests through their original confirmation actions.</w:t>
       </w:r>
     </w:p>
     <w:p>
@@ -3609,7 +3627,7 @@
         <w:t xml:space="preserve"> </w:t>
       </w:r>
       <w:r>
-        <w:t xml:space="preserve">Open a count or case link to inspect its underlying cases. Open a case in Writer to continue its existing work. Back to Reports restores the retained report context and sort. Check dates and filters after a return or data refresh, especially when a source record has changed.</w:t>
+        <w:t xml:space="preserve">Open a count or case link to inspect its underlying cases. Open case in Writer continues its existing work in Writer. Back to Reports in the Writer rail restores the retained report, filters, view, date mode and sort; relative date choices recalculate for today. Check dates and filters after a return or data refresh, especially when a source record has changed.</w:t>
       </w:r>
     </w:p>
     <w:p>
@@ -3627,7 +3645,7 @@
         <w:t xml:space="preserve"> </w:t>
       </w:r>
       <w:r>
-        <w:t xml:space="preserve">Expand the export controls. CSV downloads the active report rows. Workbook downloads the collection of named sheets, including the matching report sheet with numeric/date values where appropriate. Print uses the active report presentation. Check the title, date range, applied filters, row order and coverage statement before distributing an export. An invalid date range clears stale report results so an earlier table is not exported as the new request.</w:t>
+        <w:t xml:space="preserve">Expand the export controls. Current report — CSV contains exactly the rows and columns of this table, with its filters, dates and sort. Reports workbook — Excel contains an About sheet, record sheets (Cases, Violations, Visits, Citations, Referrals, Corrections) and a sheet for every named report, with numeric/date values where appropriate. All sheets use the same filters and dates, but each applies them through its own definition (an as-of date or a period measured by that sheet’s own date, as listed on the About sheet); this report’s sheet keeps the table sort and other report sheets use their default order. Print uses the active report presentation. Check the title, date range, applied filters, row order and coverage statement before distributing an export. An invalid date range clears stale report results so an earlier table is not exported as the new request.</w:t>
       </w:r>
     </w:p>
     <w:p>
@@ -3681,7 +3699,7 @@
         <w:pStyle w:val="FirstParagraph"/>
       </w:pPr>
       <w:r>
-        <w:t xml:space="preserve">Tools &amp; settings groups actions by purpose. Cases &amp; planning contains Search all cases, Reminders and Batch draft due dates. Saved work &amp; connection and Open saved case handle persistence. Administration contains Order language review, Administrator deposit override and Review snow-letter content. Display and help contains theme, message history and shortcut help. Program instructions opens this manual and its printable PDF.</w:t>
+        <w:t xml:space="preserve">Tools &amp; settings groups actions by purpose. Cases &amp; planning contains Search shared case records, Reminders and Batch draft due dates. Saved work &amp; connection and Open saved case handle persistence. Program instructions opens this manual and its printable PDF. Display &amp; help contains theme, message history and keyboard shortcuts. Administrator tools, collapsed at the end, contains Review catalog, Administrator deposit override and Review snow-letter content; each keeps its own administrator checks, and the grouping grants no authorization.</w:t>
       </w:r>
     </w:p>
     <w:p>
@@ -3693,13 +3711,13 @@
           <w:bCs/>
           <w:b/>
         </w:rPr>
-        <w:t xml:space="preserve">Search all cases.</w:t>
+        <w:t xml:space="preserve">Search shared case records.</w:t>
       </w:r>
       <w:r>
         <w:t xml:space="preserve"> </w:t>
       </w:r>
       <w:r>
-        <w:t xml:space="preserve">Use the shared search when a case is not loaded in Workspace. Review identity and open it through the existing shared-history checks. A search result does not override a conflict, active draft or unreadable record.</w:t>
+        <w:t xml:space="preserve">Use the shared search, also on the Workspace toolbar, when a case is not loaded in Workspace. Review identity and open it through the existing shared-history checks. A search result does not override a conflict, active draft or unreadable record.</w:t>
       </w:r>
     </w:p>
     <w:p>
@@ -3807,7 +3825,7 @@
         <w:t xml:space="preserve"> </w:t>
       </w:r>
       <w:r>
-        <w:t xml:space="preserve">Only an operator acting under actual division authority should use Administrator deposit override. Supply the actual named administrator, reason, source and required confirmation. The helper records authorization and Reports exposes overridden deposits. This does not change the master schedule, establish court authority or approve unrelated citations.</w:t>
+        <w:t xml:space="preserve">Only an operator acting under actual division authority should use Administrator deposit override. Open it from Tools &amp; settings → Administrator tools. Supply the actual named administrator, reason, source and required confirmation. The helper records authorization and Reports exposes overridden deposits. This does not change the master schedule, establish court authority or approve unrelated citations.</w:t>
       </w:r>
     </w:p>
     <w:p>
@@ -4155,7 +4173,7 @@
               <w:jc w:val="left"/>
             </w:pPr>
             <w:r>
-              <w:t xml:space="preserve">In the reinspection walk-through outside fields, selects Corrected, Progress, No change or No access</w:t>
+              <w:t xml:space="preserve">In One item at a time, outside fields, selects Corrected, Progress made, No change or No access</w:t>
             </w:r>
           </w:p>
         </w:tc>
@@ -4210,7 +4228,7 @@
         <w:t xml:space="preserve"> </w:t>
       </w:r>
       <w:r>
-        <w:t xml:space="preserve">Review all items provides an alternative to one-item walk-through. Reports provides tables alongside supported maps. Expand Full wording and guidance for complete language rather than depending on a truncated preview. Program instructions provides an accessible HTML manual as well as the printable copy.</w:t>
+        <w:t xml:space="preserve">Review all items provides an alternative to One item at a time. Reports provides tables alongside supported maps. Expand Full wording and guidance for complete language rather than depending on a truncated preview. Program instructions provides an accessible HTML manual as well as the printable copy.</w:t>
       </w:r>
     </w:p>
     <w:p>
@@ -4228,7 +4246,7 @@
         <w:t xml:space="preserve"> </w:t>
       </w:r>
       <w:r>
-        <w:t xml:space="preserve">The five Writer destinations remain available. Use vertical scrolling and the applicable table’s own scroll area when a wide data table needs it. At high zoom, inspect the actual field labels and current action rather than relying on desktop positions. The HTML manual reflows at 320 CSS pixels and supports browser zoom and find.</w:t>
+        <w:t xml:space="preserve">The five Writer destinations remain available. On a narrow screen (760 CSS pixels or less) the document editor uses a compact header and one task bar at the bottom with the save state, Next required field, Review and the primary action; the bar hides while you type in a field or a dialog is open and is never printed. Use vertical scrolling and the applicable table’s own scroll area when a wide data table needs it. At high zoom, inspect the actual field labels and current action rather than relying on desktop positions. The HTML manual reflows at 320 CSS pixels and supports browser zoom and find.</w:t>
       </w:r>
     </w:p>
     <w:p>
@@ -4570,7 +4588,7 @@
               <w:jc w:val="left"/>
             </w:pPr>
             <w:r>
-              <w:t xml:space="preserve">Clear workspace search/inspector filters, inspect All cases, then use Search all cases for the share</w:t>
+              <w:t xml:space="preserve">Choose Clear search and inspector, inspect All cases and More views, then use Search shared case records for the share</w:t>
             </w:r>
           </w:p>
         </w:tc>
@@ -5028,7 +5046,7 @@
         <w:t xml:space="preserve"> </w:t>
       </w:r>
       <w:r>
-        <w:t xml:space="preserve">Open a retained notice, use each outcome on a test item, undo one, pause to review all and resume unfinished details. Enter distinct physical/result/deadline dates correctly. Choose an eligible document; return to the worksheet and restore its paired previous draft. Confirm only one visit when adding a compatible scoped action.</w:t>
+        <w:t xml:space="preserve">Open a retained notice, use each outcome on a test item in One item at a time, undo one, switch to Review all items and resume unfinished details. Enter distinct physical/result/deadline dates correctly. Choose an eligible document; return to the worksheet and restore its paired previous draft. Confirm only one visit when adding a compatible scoped action.</w:t>
       </w:r>
     </w:p>
     <w:p>
@@ -5064,7 +5082,7 @@
         <w:t xml:space="preserve"> </w:t>
       </w:r>
       <w:r>
-        <w:t xml:space="preserve">Find a report, apply and reset filters, sort it, export CSV/workbook and compare the matching rows. Open a case and return. Explain exclusions and unlocated map points. Repeat core navigation using keyboard, touch and the approved screen reader; record problems, help requests and actual timings.</w:t>
+        <w:t xml:space="preserve">Find a report, apply and reset filters, sort it, export Current report — CSV and Reports workbook — Excel and compare the matching rows. Open case in Writer and return with Back to Reports. Explain exclusions and unlocated map points. Repeat core navigation using keyboard, touch and the approved screen reader; record problems, help requests and actual timings.</w:t>
       </w:r>
     </w:p>
     <w:tbl>
@@ -5355,7 +5373,7 @@
         <w:pStyle w:val="BodyText"/>
       </w:pPr>
       <w:r>
-        <w:t xml:space="preserve">Manual source digest 1d82eac9c9c7383a.</w:t>
+        <w:t xml:space="preserve">Manual source digest 4392904fcee378a3.</w:t>
       </w:r>
     </w:p>
     <w:bookmarkEnd w:id="41"/>
@@ -18331,6 +18349,232 @@
     <w:rPr>
       <w:b/>
       <w:color w:val="ff0000"/>
+    </w:rPr>
+  </w:style>
+  <w:style w:customStyle="1" w:styleId="NormalTok" w:type="character">
+    <w:name w:val="NormalTok"/>
+    <w:basedOn w:val="VerbatimChar"/>
+    <w:rPr/>
+  </w:style>
+  <w:style w:customStyle="1" w:styleId="KeywordTok" w:type="character">
+    <w:name w:val="KeywordTok"/>
+    <w:basedOn w:val="VerbatimChar"/>
+    <w:rPr>
+      <w:color w:val="007020"/>
+      <w:b/>
+    </w:rPr>
+  </w:style>
+  <w:style w:customStyle="1" w:styleId="DataTypeTok" w:type="character">
+    <w:name w:val="DataTypeTok"/>
+    <w:basedOn w:val="VerbatimChar"/>
+    <w:rPr>
+      <w:color w:val="902000"/>
+    </w:rPr>
+  </w:style>
+  <w:style w:customStyle="1" w:styleId="DecValTok" w:type="character">
+    <w:name w:val="DecValTok"/>
+    <w:basedOn w:val="VerbatimChar"/>
+    <w:rPr>
+      <w:color w:val="40a070"/>
+    </w:rPr>
+  </w:style>
+  <w:style w:customStyle="1" w:styleId="BaseNTok" w:type="character">
+    <w:name w:val="BaseNTok"/>
+    <w:basedOn w:val="VerbatimChar"/>
+    <w:rPr>
+      <w:color w:val="40a070"/>
+    </w:rPr>
+  </w:style>
+  <w:style w:customStyle="1" w:styleId="FloatTok" w:type="character">
+    <w:name w:val="FloatTok"/>
+    <w:basedOn w:val="VerbatimChar"/>
+    <w:rPr>
+      <w:color w:val="40a070"/>
+    </w:rPr>
+  </w:style>
+  <w:style w:customStyle="1" w:styleId="ConstantTok" w:type="character">
+    <w:name w:val="ConstantTok"/>
+    <w:basedOn w:val="VerbatimChar"/>
+    <w:rPr>
+      <w:color w:val="880000"/>
+    </w:rPr>
+  </w:style>
+  <w:style w:customStyle="1" w:styleId="CharTok" w:type="character">
+    <w:name w:val="CharTok"/>
+    <w:basedOn w:val="VerbatimChar"/>
+    <w:rPr>
+      <w:color w:val="4070a0"/>
+    </w:rPr>
+  </w:style>
+  <w:style w:customStyle="1" w:styleId="SpecialCharTok" w:type="character">
+    <w:name w:val="SpecialCharTok"/>
+    <w:basedOn w:val="VerbatimChar"/>
+    <w:rPr>
+      <w:color w:val="4070a0"/>
+    </w:rPr>
+  </w:style>
+  <w:style w:customStyle="1" w:styleId="StringTok" w:type="character">
+    <w:name w:val="StringTok"/>
+    <w:basedOn w:val="VerbatimChar"/>
+    <w:rPr>
+      <w:color w:val="4070a0"/>
+    </w:rPr>
+  </w:style>
+  <w:style w:customStyle="1" w:styleId="VerbatimStringTok" w:type="character">
+    <w:name w:val="VerbatimStringTok"/>
+    <w:basedOn w:val="VerbatimChar"/>
+    <w:rPr>
+      <w:color w:val="4070a0"/>
+    </w:rPr>
+  </w:style>
+  <w:style w:customStyle="1" w:styleId="SpecialStringTok" w:type="character">
+    <w:name w:val="SpecialStringTok"/>
+    <w:basedOn w:val="VerbatimChar"/>
+    <w:rPr>
+      <w:color w:val="bb6688"/>
+    </w:rPr>
+  </w:style>
+  <w:style w:customStyle="1" w:styleId="ImportTok" w:type="character">
+    <w:name w:val="ImportTok"/>
+    <w:basedOn w:val="VerbatimChar"/>
+    <w:rPr>
+      <w:color w:val="008000"/>
+      <w:b/>
+    </w:rPr>
+  </w:style>
+  <w:style w:customStyle="1" w:styleId="CommentTok" w:type="character">
+    <w:name w:val="CommentTok"/>
+    <w:basedOn w:val="VerbatimChar"/>
+    <w:rPr>
+      <w:color w:val="60a0b0"/>
+      <w:i/>
+    </w:rPr>
+  </w:style>
+  <w:style w:customStyle="1" w:styleId="DocumentationTok" w:type="character">
+    <w:name w:val="DocumentationTok"/>
+    <w:basedOn w:val="VerbatimChar"/>
+    <w:rPr>
+      <w:color w:val="ba2121"/>
+      <w:i/>
+    </w:rPr>
+  </w:style>
+  <w:style w:customStyle="1" w:styleId="AnnotationTok" w:type="character">
+    <w:name w:val="AnnotationTok"/>
+    <w:basedOn w:val="VerbatimChar"/>
+    <w:rPr>
+      <w:color w:val="60a0b0"/>
+      <w:b/>
+      <w:i/>
+    </w:rPr>
+  </w:style>
+  <w:style w:customStyle="1" w:styleId="CommentVarTok" w:type="character">
+    <w:name w:val="CommentVarTok"/>
+    <w:basedOn w:val="VerbatimChar"/>
+    <w:rPr>
+      <w:color w:val="60a0b0"/>
+      <w:b/>
+      <w:i/>
+    </w:rPr>
+  </w:style>
+  <w:style w:customStyle="1" w:styleId="OtherTok" w:type="character">
+    <w:name w:val="OtherTok"/>
+    <w:basedOn w:val="VerbatimChar"/>
+    <w:rPr>
+      <w:color w:val="007020"/>
+    </w:rPr>
+  </w:style>
+  <w:style w:customStyle="1" w:styleId="FunctionTok" w:type="character">
+    <w:name w:val="FunctionTok"/>
+    <w:basedOn w:val="VerbatimChar"/>
+    <w:rPr>
+      <w:color w:val="06287e"/>
+    </w:rPr>
+  </w:style>
+  <w:style w:customStyle="1" w:styleId="VariableTok" w:type="character">
+    <w:name w:val="VariableTok"/>
+    <w:basedOn w:val="VerbatimChar"/>
+    <w:rPr>
+      <w:color w:val="19177c"/>
+    </w:rPr>
+  </w:style>
+  <w:style w:customStyle="1" w:styleId="ControlFlowTok" w:type="character">
+    <w:name w:val="ControlFlowTok"/>
+    <w:basedOn w:val="VerbatimChar"/>
+    <w:rPr>
+      <w:color w:val="007020"/>
+      <w:b/>
+    </w:rPr>
+  </w:style>
+  <w:style w:customStyle="1" w:styleId="OperatorTok" w:type="character">
+    <w:name w:val="OperatorTok"/>
+    <w:basedOn w:val="VerbatimChar"/>
+    <w:rPr>
+      <w:color w:val="666666"/>
+    </w:rPr>
+  </w:style>
+  <w:style w:customStyle="1" w:styleId="BuiltInTok" w:type="character">
+    <w:name w:val="BuiltInTok"/>
+    <w:basedOn w:val="VerbatimChar"/>
+    <w:rPr>
+      <w:color w:val="008000"/>
+    </w:rPr>
+  </w:style>
+  <w:style w:customStyle="1" w:styleId="ExtensionTok" w:type="character">
+    <w:name w:val="ExtensionTok"/>
+    <w:basedOn w:val="VerbatimChar"/>
+    <w:rPr/>
+  </w:style>
+  <w:style w:customStyle="1" w:styleId="PreprocessorTok" w:type="character">
+    <w:name w:val="PreprocessorTok"/>
+    <w:basedOn w:val="VerbatimChar"/>
+    <w:rPr>
+      <w:color w:val="bc7a00"/>
+    </w:rPr>
+  </w:style>
+  <w:style w:customStyle="1" w:styleId="AttributeTok" w:type="character">
+    <w:name w:val="AttributeTok"/>
+    <w:basedOn w:val="VerbatimChar"/>
+    <w:rPr>
+      <w:color w:val="7d9029"/>
+    </w:rPr>
+  </w:style>
+  <w:style w:customStyle="1" w:styleId="RegionMarkerTok" w:type="character">
+    <w:name w:val="RegionMarkerTok"/>
+    <w:basedOn w:val="VerbatimChar"/>
+    <w:rPr/>
+  </w:style>
+  <w:style w:customStyle="1" w:styleId="InformationTok" w:type="character">
+    <w:name w:val="InformationTok"/>
+    <w:basedOn w:val="VerbatimChar"/>
+    <w:rPr>
+      <w:color w:val="60a0b0"/>
+      <w:b/>
+      <w:i/>
+    </w:rPr>
+  </w:style>
+  <w:style w:customStyle="1" w:styleId="WarningTok" w:type="character">
+    <w:name w:val="WarningTok"/>
+    <w:basedOn w:val="VerbatimChar"/>
+    <w:rPr>
+      <w:color w:val="60a0b0"/>
+      <w:b/>
+      <w:i/>
+    </w:rPr>
+  </w:style>
+  <w:style w:customStyle="1" w:styleId="AlertTok" w:type="character">
+    <w:name w:val="AlertTok"/>
+    <w:basedOn w:val="VerbatimChar"/>
+    <w:rPr>
+      <w:color w:val="ff0000"/>
+      <w:b/>
+    </w:rPr>
+  </w:style>
+  <w:style w:customStyle="1" w:styleId="ErrorTok" w:type="character">
+    <w:name w:val="ErrorTok"/>
+    <w:basedOn w:val="VerbatimChar"/>
+    <w:rPr>
+      <w:color w:val="ff0000"/>
+      <w:b/>
     </w:rPr>
   </w:style>
   <w:style w:customStyle="1" w:styleId="NormalTok" w:type="character">

</xml_diff>

<commit_message>
Correct save labels, view filters, report return and export scope
Addresses review issues #22 (findings 1-2), #24 and #27:
- An issued document without a linked shared folder offers Download
  workspace backup with a note and Connect shared folder, instead of
  promising a shared save its handler cannot make.
- Switching Workspace views keeps the search and inspector filter; only
  Clear search and inspector removes them.
- Back to Reports restores the saved report context in an already open
  Reports tab before acknowledging the return.
- The export note, the workbook About sheet (new Sheet scope block) and
  the Reporting guide and manual state each sheet's date basis and filter
  exceptions; export calculations are unchanged (asserted).
Manual editions regenerated on pinned Chromium 145.

Co-Authored-By: Claude Opus 5.5 <noreply@anthropic.com>
Claude-Session: https://claude.ai/code/session_01WPJAZGfD47jPUEgCNYYSg7
</commit_message>
<xml_diff>
--- a/docs/staff/Program_Instruction_Manual.docx
+++ b/docs/staff/Program_Instruction_Manual.docx
@@ -409,7 +409,7 @@
         <w:pStyle w:val="FirstParagraph"/>
       </w:pPr>
       <w:r>
-        <w:t xml:space="preserve">Workspace is the queue for cases loaded on this device. It starts in Needs attention. The quick views Needs attention, Continue work, Deadlines, Needs resolution and All cases are the main filter; More views adds Due within 7 days, Past due, Open and Closed. Counts represent cases rather than individual tasks within a view; a case may appear in more than one view. Choosing a quick view clears the search and inspector filters; More views keeps them, and returning it to More views… shows Needs attention again. Needs resolution lists cases with unconfirmed or queued saves, PDF filing and transfers, record problems and other blockers; device save and connection problems appear in the Saved work &amp; connection banner. Check All cases and More views when the expected case is not visible.</w:t>
+        <w:t xml:space="preserve">Workspace is the queue for cases loaded on this device. It starts in Needs attention. The quick views Needs attention, Continue work, Deadlines, Needs resolution and All cases are the main filter; More views adds Due within 7 days, Past due, Open and Closed. Counts represent cases rather than individual tasks within a view; a case may appear in more than one view. Quick views and More views keep the workspace search and inspector filter, so the rows shown match all three; only Clear search and inspector removes them. Returning More views to More views… shows Needs attention again. Needs resolution lists cases with unconfirmed or queued saves, PDF filing and transfers, record problems and other blockers; device save and connection problems appear in the Saved work &amp; connection banner. Check All cases and More views when the expected case is not visible.</w:t>
       </w:r>
     </w:p>
     <w:p>
@@ -497,7 +497,7 @@
         <w:t xml:space="preserve"> </w:t>
       </w:r>
       <w:r>
-        <w:t xml:space="preserve">Open the named case action rather than making a replacement case. Confirm save uses the retained original request. Review shared changes compares the current shared record. Save case to shared folder saves a queued case file after shared history is checked; it is also among an issued document’s actions. File issued PDF completes original filing after issuance. Saved work &amp; connection explains whether the remaining work concerns this device, shared cases or PDFs.</w:t>
+        <w:t xml:space="preserve">Open the named case action rather than making a replacement case. Confirm save uses the retained original request. Review shared changes compares the current shared record. Save case to shared folder saves a queued case file after shared history is checked; it is also among an issued document’s actions while the shared folder is connected. Without a connection that action reads Download workspace backup: it downloads a backup and does not save the shared case record. Connect shared folder beside it opens the connection settings. File issued PDF completes original filing after issuance. Saved work &amp; connection explains whether the remaining work concerns this device, shared cases or PDFs.</w:t>
       </w:r>
     </w:p>
     <w:p>
@@ -3627,7 +3627,7 @@
         <w:t xml:space="preserve"> </w:t>
       </w:r>
       <w:r>
-        <w:t xml:space="preserve">Open a count or case link to inspect its underlying cases. Open case in Writer continues its existing work in Writer. Back to Reports in the Writer rail restores the retained report, filters, view, date mode and sort; relative date choices recalculate for today. Check dates and filters after a return or data refresh, especially when a source record has changed.</w:t>
+        <w:t xml:space="preserve">Open a count or case link to inspect its underlying cases. Open case in Writer continues its existing work in Writer. Back to Reports in the Writer rail returns to the open Reports tab, or opens Reports in this tab when none answers, and restores the report, filters, view, date mode and sort retained when the case was opened; relative date choices recalculate for today. Check dates and filters after a return or data refresh, especially when a source record has changed.</w:t>
       </w:r>
     </w:p>
     <w:p>
@@ -3645,7 +3645,7 @@
         <w:t xml:space="preserve"> </w:t>
       </w:r>
       <w:r>
-        <w:t xml:space="preserve">Expand the export controls. Current report — CSV contains exactly the rows and columns of this table, with its filters, dates and sort. Reports workbook — Excel contains an About sheet, record sheets (Cases, Violations, Visits, Citations, Referrals, Corrections) and a sheet for every named report, with numeric/date values where appropriate. All sheets use the same filters and dates, but each applies them through its own definition (an as-of date or a period measured by that sheet’s own date, as listed on the About sheet); this report’s sheet keeps the table sort and other report sheets use their default order. Print uses the active report presentation. Check the title, date range, applied filters, row order and coverage statement before distributing an export. An invalid date range clears stale report results so an earlier table is not exported as the new request.</w:t>
+        <w:t xml:space="preserve">Expand the export controls. Current report — CSV contains exactly the rows and columns of this table, with its filters, dates and sort. Reports workbook — Excel contains an About sheet, record sheets (Cases, Violations, Visits, Citations, Referrals, Corrections) and a sheet for every named report, with numeric/date values where appropriate. Sheets do not all apply the filters the same way; the About sheet’s Sheet scope lists each one. Cases, Violations and Visits contain cases opened in the period; Visits lists every visit on those cases, so a visit date can fall outside the period. Citations and Referrals use the date issued on any counted case, and the inspector filter means the issuing or referring inspector; Citations does not apply the violation type filter. Corrections uses the date each correction was recorded, so it can list cases opened before the period. Violations applies violation type and ordinance to each item; other sheets apply them to the case (any matching item), except Citations, which applies the ordinance to the citation. Area, owner and status always apply to the case, and status is its current status. Numbered report sheets match each report on screen: reports 1 and 3 use the As of date, reports 2 and 4–7 the case opening date, and reports 8–11 the date issued. This report’s sheet keeps the table sort and other report sheets use their default order. Print uses the active report presentation. Check the title, date range, applied filters, row order and coverage statement before distributing an export. An invalid date range clears stale report results so an earlier table is not exported as the new request.</w:t>
       </w:r>
     </w:p>
     <w:p>
@@ -5373,7 +5373,7 @@
         <w:pStyle w:val="BodyText"/>
       </w:pPr>
       <w:r>
-        <w:t xml:space="preserve">Manual source digest 4392904fcee378a3.</w:t>
+        <w:t xml:space="preserve">Manual source digest fbca2edb33d6b3aa.</w:t>
       </w:r>
     </w:p>
     <w:bookmarkEnd w:id="41"/>
@@ -18349,6 +18349,232 @@
     <w:rPr>
       <w:b/>
       <w:color w:val="ff0000"/>
+    </w:rPr>
+  </w:style>
+  <w:style w:customStyle="1" w:styleId="NormalTok" w:type="character">
+    <w:name w:val="NormalTok"/>
+    <w:basedOn w:val="VerbatimChar"/>
+    <w:rPr/>
+  </w:style>
+  <w:style w:customStyle="1" w:styleId="KeywordTok" w:type="character">
+    <w:name w:val="KeywordTok"/>
+    <w:basedOn w:val="VerbatimChar"/>
+    <w:rPr>
+      <w:color w:val="007020"/>
+      <w:b/>
+    </w:rPr>
+  </w:style>
+  <w:style w:customStyle="1" w:styleId="DataTypeTok" w:type="character">
+    <w:name w:val="DataTypeTok"/>
+    <w:basedOn w:val="VerbatimChar"/>
+    <w:rPr>
+      <w:color w:val="902000"/>
+    </w:rPr>
+  </w:style>
+  <w:style w:customStyle="1" w:styleId="DecValTok" w:type="character">
+    <w:name w:val="DecValTok"/>
+    <w:basedOn w:val="VerbatimChar"/>
+    <w:rPr>
+      <w:color w:val="40a070"/>
+    </w:rPr>
+  </w:style>
+  <w:style w:customStyle="1" w:styleId="BaseNTok" w:type="character">
+    <w:name w:val="BaseNTok"/>
+    <w:basedOn w:val="VerbatimChar"/>
+    <w:rPr>
+      <w:color w:val="40a070"/>
+    </w:rPr>
+  </w:style>
+  <w:style w:customStyle="1" w:styleId="FloatTok" w:type="character">
+    <w:name w:val="FloatTok"/>
+    <w:basedOn w:val="VerbatimChar"/>
+    <w:rPr>
+      <w:color w:val="40a070"/>
+    </w:rPr>
+  </w:style>
+  <w:style w:customStyle="1" w:styleId="ConstantTok" w:type="character">
+    <w:name w:val="ConstantTok"/>
+    <w:basedOn w:val="VerbatimChar"/>
+    <w:rPr>
+      <w:color w:val="880000"/>
+    </w:rPr>
+  </w:style>
+  <w:style w:customStyle="1" w:styleId="CharTok" w:type="character">
+    <w:name w:val="CharTok"/>
+    <w:basedOn w:val="VerbatimChar"/>
+    <w:rPr>
+      <w:color w:val="4070a0"/>
+    </w:rPr>
+  </w:style>
+  <w:style w:customStyle="1" w:styleId="SpecialCharTok" w:type="character">
+    <w:name w:val="SpecialCharTok"/>
+    <w:basedOn w:val="VerbatimChar"/>
+    <w:rPr>
+      <w:color w:val="4070a0"/>
+    </w:rPr>
+  </w:style>
+  <w:style w:customStyle="1" w:styleId="StringTok" w:type="character">
+    <w:name w:val="StringTok"/>
+    <w:basedOn w:val="VerbatimChar"/>
+    <w:rPr>
+      <w:color w:val="4070a0"/>
+    </w:rPr>
+  </w:style>
+  <w:style w:customStyle="1" w:styleId="VerbatimStringTok" w:type="character">
+    <w:name w:val="VerbatimStringTok"/>
+    <w:basedOn w:val="VerbatimChar"/>
+    <w:rPr>
+      <w:color w:val="4070a0"/>
+    </w:rPr>
+  </w:style>
+  <w:style w:customStyle="1" w:styleId="SpecialStringTok" w:type="character">
+    <w:name w:val="SpecialStringTok"/>
+    <w:basedOn w:val="VerbatimChar"/>
+    <w:rPr>
+      <w:color w:val="bb6688"/>
+    </w:rPr>
+  </w:style>
+  <w:style w:customStyle="1" w:styleId="ImportTok" w:type="character">
+    <w:name w:val="ImportTok"/>
+    <w:basedOn w:val="VerbatimChar"/>
+    <w:rPr>
+      <w:color w:val="008000"/>
+      <w:b/>
+    </w:rPr>
+  </w:style>
+  <w:style w:customStyle="1" w:styleId="CommentTok" w:type="character">
+    <w:name w:val="CommentTok"/>
+    <w:basedOn w:val="VerbatimChar"/>
+    <w:rPr>
+      <w:color w:val="60a0b0"/>
+      <w:i/>
+    </w:rPr>
+  </w:style>
+  <w:style w:customStyle="1" w:styleId="DocumentationTok" w:type="character">
+    <w:name w:val="DocumentationTok"/>
+    <w:basedOn w:val="VerbatimChar"/>
+    <w:rPr>
+      <w:color w:val="ba2121"/>
+      <w:i/>
+    </w:rPr>
+  </w:style>
+  <w:style w:customStyle="1" w:styleId="AnnotationTok" w:type="character">
+    <w:name w:val="AnnotationTok"/>
+    <w:basedOn w:val="VerbatimChar"/>
+    <w:rPr>
+      <w:color w:val="60a0b0"/>
+      <w:b/>
+      <w:i/>
+    </w:rPr>
+  </w:style>
+  <w:style w:customStyle="1" w:styleId="CommentVarTok" w:type="character">
+    <w:name w:val="CommentVarTok"/>
+    <w:basedOn w:val="VerbatimChar"/>
+    <w:rPr>
+      <w:color w:val="60a0b0"/>
+      <w:b/>
+      <w:i/>
+    </w:rPr>
+  </w:style>
+  <w:style w:customStyle="1" w:styleId="OtherTok" w:type="character">
+    <w:name w:val="OtherTok"/>
+    <w:basedOn w:val="VerbatimChar"/>
+    <w:rPr>
+      <w:color w:val="007020"/>
+    </w:rPr>
+  </w:style>
+  <w:style w:customStyle="1" w:styleId="FunctionTok" w:type="character">
+    <w:name w:val="FunctionTok"/>
+    <w:basedOn w:val="VerbatimChar"/>
+    <w:rPr>
+      <w:color w:val="06287e"/>
+    </w:rPr>
+  </w:style>
+  <w:style w:customStyle="1" w:styleId="VariableTok" w:type="character">
+    <w:name w:val="VariableTok"/>
+    <w:basedOn w:val="VerbatimChar"/>
+    <w:rPr>
+      <w:color w:val="19177c"/>
+    </w:rPr>
+  </w:style>
+  <w:style w:customStyle="1" w:styleId="ControlFlowTok" w:type="character">
+    <w:name w:val="ControlFlowTok"/>
+    <w:basedOn w:val="VerbatimChar"/>
+    <w:rPr>
+      <w:color w:val="007020"/>
+      <w:b/>
+    </w:rPr>
+  </w:style>
+  <w:style w:customStyle="1" w:styleId="OperatorTok" w:type="character">
+    <w:name w:val="OperatorTok"/>
+    <w:basedOn w:val="VerbatimChar"/>
+    <w:rPr>
+      <w:color w:val="666666"/>
+    </w:rPr>
+  </w:style>
+  <w:style w:customStyle="1" w:styleId="BuiltInTok" w:type="character">
+    <w:name w:val="BuiltInTok"/>
+    <w:basedOn w:val="VerbatimChar"/>
+    <w:rPr>
+      <w:color w:val="008000"/>
+    </w:rPr>
+  </w:style>
+  <w:style w:customStyle="1" w:styleId="ExtensionTok" w:type="character">
+    <w:name w:val="ExtensionTok"/>
+    <w:basedOn w:val="VerbatimChar"/>
+    <w:rPr/>
+  </w:style>
+  <w:style w:customStyle="1" w:styleId="PreprocessorTok" w:type="character">
+    <w:name w:val="PreprocessorTok"/>
+    <w:basedOn w:val="VerbatimChar"/>
+    <w:rPr>
+      <w:color w:val="bc7a00"/>
+    </w:rPr>
+  </w:style>
+  <w:style w:customStyle="1" w:styleId="AttributeTok" w:type="character">
+    <w:name w:val="AttributeTok"/>
+    <w:basedOn w:val="VerbatimChar"/>
+    <w:rPr>
+      <w:color w:val="7d9029"/>
+    </w:rPr>
+  </w:style>
+  <w:style w:customStyle="1" w:styleId="RegionMarkerTok" w:type="character">
+    <w:name w:val="RegionMarkerTok"/>
+    <w:basedOn w:val="VerbatimChar"/>
+    <w:rPr/>
+  </w:style>
+  <w:style w:customStyle="1" w:styleId="InformationTok" w:type="character">
+    <w:name w:val="InformationTok"/>
+    <w:basedOn w:val="VerbatimChar"/>
+    <w:rPr>
+      <w:color w:val="60a0b0"/>
+      <w:b/>
+      <w:i/>
+    </w:rPr>
+  </w:style>
+  <w:style w:customStyle="1" w:styleId="WarningTok" w:type="character">
+    <w:name w:val="WarningTok"/>
+    <w:basedOn w:val="VerbatimChar"/>
+    <w:rPr>
+      <w:color w:val="60a0b0"/>
+      <w:b/>
+      <w:i/>
+    </w:rPr>
+  </w:style>
+  <w:style w:customStyle="1" w:styleId="AlertTok" w:type="character">
+    <w:name w:val="AlertTok"/>
+    <w:basedOn w:val="VerbatimChar"/>
+    <w:rPr>
+      <w:color w:val="ff0000"/>
+      <w:b/>
+    </w:rPr>
+  </w:style>
+  <w:style w:customStyle="1" w:styleId="ErrorTok" w:type="character">
+    <w:name w:val="ErrorTok"/>
+    <w:basedOn w:val="VerbatimChar"/>
+    <w:rPr>
+      <w:color w:val="ff0000"/>
+      <w:b/>
     </w:rPr>
   </w:style>
   <w:style w:customStyle="1" w:styleId="NormalTok" w:type="character">

</xml_diff>

<commit_message>
Prepare R57: identity, review record and manual
Release 2026-10-22 R57, helper 2026.10.22.58, helperBuild 58 (authoring
13, case schema 5, summary 6 and backup 2 unchanged), as authorized by
the requester on 2026-10-22 for the usability follow-up merged in #26.
R57-REVIEW records the follow-up and its review corrections; the R56
review moves to docs/history. The changelog gains the R57 entry, the
acceptance record notes S56B accepted by the requester (not an automated
result), and the manual editions are regenerated with the new identity
on pinned Chromium 145.

Co-Authored-By: Claude Opus 5.5 <noreply@anthropic.com>
Claude-Session: https://claude.ai/code/session_01WPJAZGfD47jPUEgCNYYSg7
</commit_message>
<xml_diff>
--- a/docs/staff/Program_Instruction_Manual.docx
+++ b/docs/staff/Program_Instruction_Manual.docx
@@ -32,7 +32,7 @@
         <w:pStyle w:val="BodyText"/>
       </w:pPr>
       <w:r>
-        <w:t xml:space="preserve">Release 2026-10-21 R56 · Helper 2026.10.21.57 · 21 October 2026</w:t>
+        <w:t xml:space="preserve">Release 2026-10-22 R57 · Helper 2026.10.22.58 · 22 October 2026</w:t>
       </w:r>
     </w:p>
     <w:p>
@@ -48,7 +48,7 @@
         <w:pStyle w:val="BodyText"/>
       </w:pPr>
       <w:r>
-        <w:t xml:space="preserve">R56 is a development candidate for City acceptance. Its security checks require the same ordinary document, history and recovery procedures described below. Automated verification does not replace the outstanding City Windows and network tests, staff and assistive technology acceptance, or legal and seasonal policy decisions listed in the carried-forward City acceptance record. New mandatory-appearance citations remain blocked until approved defendant instructions are supplied and integrated. Historical frozen reprints remain available. No live deployment is included in this release.</w:t>
+        <w:t xml:space="preserve">R57 is a development candidate for City acceptance. Its security checks require the same ordinary document, history and recovery procedures described below. Automated verification does not replace the outstanding City Windows and network tests, staff and assistive technology acceptance, or legal and seasonal policy decisions listed in the carried-forward City acceptance record. New mandatory-appearance citations remain blocked until approved defendant instructions are supplied and integrated. Historical frozen reprints remain available. No live deployment is included in this release.</w:t>
       </w:r>
     </w:p>
     <w:bookmarkStart w:id="20" w:name="start-here-and-daily-routine"/>
@@ -101,7 +101,7 @@
         <w:t xml:space="preserve"> </w:t>
       </w:r>
       <w:r>
-        <w:t xml:space="preserve">Run the Document Writer desktop shortcut or installed launcher. Keep one Writer tab open in the same browser profile. Confirm Build 2026-10-21 R56 and helper 2026.10.21.57. Open Workspace and resolve any save confirmation, shared-history or PDF-filing exceptions before creating replacement work. Check pending deadlines and reminders.</w:t>
+        <w:t xml:space="preserve">Run the Document Writer desktop shortcut or installed launcher. Keep one Writer tab open in the same browser profile. Confirm Build 2026-10-22 R57 and helper 2026.10.22.58. Open Workspace and resolve any save confirmation, shared-history or PDF-filing exceptions before creating replacement work. Check pending deadlines and reminders.</w:t>
       </w:r>
     </w:p>
     <w:p>
@@ -5373,7 +5373,7 @@
         <w:pStyle w:val="BodyText"/>
       </w:pPr>
       <w:r>
-        <w:t xml:space="preserve">Manual source digest fbca2edb33d6b3aa.</w:t>
+        <w:t xml:space="preserve">Manual source digest b852ce09cf4f71c7.</w:t>
       </w:r>
     </w:p>
     <w:bookmarkEnd w:id="41"/>
@@ -18349,6 +18349,232 @@
     <w:rPr>
       <w:b/>
       <w:color w:val="ff0000"/>
+    </w:rPr>
+  </w:style>
+  <w:style w:customStyle="1" w:styleId="NormalTok" w:type="character">
+    <w:name w:val="NormalTok"/>
+    <w:basedOn w:val="VerbatimChar"/>
+    <w:rPr/>
+  </w:style>
+  <w:style w:customStyle="1" w:styleId="KeywordTok" w:type="character">
+    <w:name w:val="KeywordTok"/>
+    <w:basedOn w:val="VerbatimChar"/>
+    <w:rPr>
+      <w:color w:val="007020"/>
+      <w:b/>
+    </w:rPr>
+  </w:style>
+  <w:style w:customStyle="1" w:styleId="DataTypeTok" w:type="character">
+    <w:name w:val="DataTypeTok"/>
+    <w:basedOn w:val="VerbatimChar"/>
+    <w:rPr>
+      <w:color w:val="902000"/>
+    </w:rPr>
+  </w:style>
+  <w:style w:customStyle="1" w:styleId="DecValTok" w:type="character">
+    <w:name w:val="DecValTok"/>
+    <w:basedOn w:val="VerbatimChar"/>
+    <w:rPr>
+      <w:color w:val="40a070"/>
+    </w:rPr>
+  </w:style>
+  <w:style w:customStyle="1" w:styleId="BaseNTok" w:type="character">
+    <w:name w:val="BaseNTok"/>
+    <w:basedOn w:val="VerbatimChar"/>
+    <w:rPr>
+      <w:color w:val="40a070"/>
+    </w:rPr>
+  </w:style>
+  <w:style w:customStyle="1" w:styleId="FloatTok" w:type="character">
+    <w:name w:val="FloatTok"/>
+    <w:basedOn w:val="VerbatimChar"/>
+    <w:rPr>
+      <w:color w:val="40a070"/>
+    </w:rPr>
+  </w:style>
+  <w:style w:customStyle="1" w:styleId="ConstantTok" w:type="character">
+    <w:name w:val="ConstantTok"/>
+    <w:basedOn w:val="VerbatimChar"/>
+    <w:rPr>
+      <w:color w:val="880000"/>
+    </w:rPr>
+  </w:style>
+  <w:style w:customStyle="1" w:styleId="CharTok" w:type="character">
+    <w:name w:val="CharTok"/>
+    <w:basedOn w:val="VerbatimChar"/>
+    <w:rPr>
+      <w:color w:val="4070a0"/>
+    </w:rPr>
+  </w:style>
+  <w:style w:customStyle="1" w:styleId="SpecialCharTok" w:type="character">
+    <w:name w:val="SpecialCharTok"/>
+    <w:basedOn w:val="VerbatimChar"/>
+    <w:rPr>
+      <w:color w:val="4070a0"/>
+    </w:rPr>
+  </w:style>
+  <w:style w:customStyle="1" w:styleId="StringTok" w:type="character">
+    <w:name w:val="StringTok"/>
+    <w:basedOn w:val="VerbatimChar"/>
+    <w:rPr>
+      <w:color w:val="4070a0"/>
+    </w:rPr>
+  </w:style>
+  <w:style w:customStyle="1" w:styleId="VerbatimStringTok" w:type="character">
+    <w:name w:val="VerbatimStringTok"/>
+    <w:basedOn w:val="VerbatimChar"/>
+    <w:rPr>
+      <w:color w:val="4070a0"/>
+    </w:rPr>
+  </w:style>
+  <w:style w:customStyle="1" w:styleId="SpecialStringTok" w:type="character">
+    <w:name w:val="SpecialStringTok"/>
+    <w:basedOn w:val="VerbatimChar"/>
+    <w:rPr>
+      <w:color w:val="bb6688"/>
+    </w:rPr>
+  </w:style>
+  <w:style w:customStyle="1" w:styleId="ImportTok" w:type="character">
+    <w:name w:val="ImportTok"/>
+    <w:basedOn w:val="VerbatimChar"/>
+    <w:rPr>
+      <w:color w:val="008000"/>
+      <w:b/>
+    </w:rPr>
+  </w:style>
+  <w:style w:customStyle="1" w:styleId="CommentTok" w:type="character">
+    <w:name w:val="CommentTok"/>
+    <w:basedOn w:val="VerbatimChar"/>
+    <w:rPr>
+      <w:color w:val="60a0b0"/>
+      <w:i/>
+    </w:rPr>
+  </w:style>
+  <w:style w:customStyle="1" w:styleId="DocumentationTok" w:type="character">
+    <w:name w:val="DocumentationTok"/>
+    <w:basedOn w:val="VerbatimChar"/>
+    <w:rPr>
+      <w:color w:val="ba2121"/>
+      <w:i/>
+    </w:rPr>
+  </w:style>
+  <w:style w:customStyle="1" w:styleId="AnnotationTok" w:type="character">
+    <w:name w:val="AnnotationTok"/>
+    <w:basedOn w:val="VerbatimChar"/>
+    <w:rPr>
+      <w:color w:val="60a0b0"/>
+      <w:b/>
+      <w:i/>
+    </w:rPr>
+  </w:style>
+  <w:style w:customStyle="1" w:styleId="CommentVarTok" w:type="character">
+    <w:name w:val="CommentVarTok"/>
+    <w:basedOn w:val="VerbatimChar"/>
+    <w:rPr>
+      <w:color w:val="60a0b0"/>
+      <w:b/>
+      <w:i/>
+    </w:rPr>
+  </w:style>
+  <w:style w:customStyle="1" w:styleId="OtherTok" w:type="character">
+    <w:name w:val="OtherTok"/>
+    <w:basedOn w:val="VerbatimChar"/>
+    <w:rPr>
+      <w:color w:val="007020"/>
+    </w:rPr>
+  </w:style>
+  <w:style w:customStyle="1" w:styleId="FunctionTok" w:type="character">
+    <w:name w:val="FunctionTok"/>
+    <w:basedOn w:val="VerbatimChar"/>
+    <w:rPr>
+      <w:color w:val="06287e"/>
+    </w:rPr>
+  </w:style>
+  <w:style w:customStyle="1" w:styleId="VariableTok" w:type="character">
+    <w:name w:val="VariableTok"/>
+    <w:basedOn w:val="VerbatimChar"/>
+    <w:rPr>
+      <w:color w:val="19177c"/>
+    </w:rPr>
+  </w:style>
+  <w:style w:customStyle="1" w:styleId="ControlFlowTok" w:type="character">
+    <w:name w:val="ControlFlowTok"/>
+    <w:basedOn w:val="VerbatimChar"/>
+    <w:rPr>
+      <w:color w:val="007020"/>
+      <w:b/>
+    </w:rPr>
+  </w:style>
+  <w:style w:customStyle="1" w:styleId="OperatorTok" w:type="character">
+    <w:name w:val="OperatorTok"/>
+    <w:basedOn w:val="VerbatimChar"/>
+    <w:rPr>
+      <w:color w:val="666666"/>
+    </w:rPr>
+  </w:style>
+  <w:style w:customStyle="1" w:styleId="BuiltInTok" w:type="character">
+    <w:name w:val="BuiltInTok"/>
+    <w:basedOn w:val="VerbatimChar"/>
+    <w:rPr>
+      <w:color w:val="008000"/>
+    </w:rPr>
+  </w:style>
+  <w:style w:customStyle="1" w:styleId="ExtensionTok" w:type="character">
+    <w:name w:val="ExtensionTok"/>
+    <w:basedOn w:val="VerbatimChar"/>
+    <w:rPr/>
+  </w:style>
+  <w:style w:customStyle="1" w:styleId="PreprocessorTok" w:type="character">
+    <w:name w:val="PreprocessorTok"/>
+    <w:basedOn w:val="VerbatimChar"/>
+    <w:rPr>
+      <w:color w:val="bc7a00"/>
+    </w:rPr>
+  </w:style>
+  <w:style w:customStyle="1" w:styleId="AttributeTok" w:type="character">
+    <w:name w:val="AttributeTok"/>
+    <w:basedOn w:val="VerbatimChar"/>
+    <w:rPr>
+      <w:color w:val="7d9029"/>
+    </w:rPr>
+  </w:style>
+  <w:style w:customStyle="1" w:styleId="RegionMarkerTok" w:type="character">
+    <w:name w:val="RegionMarkerTok"/>
+    <w:basedOn w:val="VerbatimChar"/>
+    <w:rPr/>
+  </w:style>
+  <w:style w:customStyle="1" w:styleId="InformationTok" w:type="character">
+    <w:name w:val="InformationTok"/>
+    <w:basedOn w:val="VerbatimChar"/>
+    <w:rPr>
+      <w:color w:val="60a0b0"/>
+      <w:b/>
+      <w:i/>
+    </w:rPr>
+  </w:style>
+  <w:style w:customStyle="1" w:styleId="WarningTok" w:type="character">
+    <w:name w:val="WarningTok"/>
+    <w:basedOn w:val="VerbatimChar"/>
+    <w:rPr>
+      <w:color w:val="60a0b0"/>
+      <w:b/>
+      <w:i/>
+    </w:rPr>
+  </w:style>
+  <w:style w:customStyle="1" w:styleId="AlertTok" w:type="character">
+    <w:name w:val="AlertTok"/>
+    <w:basedOn w:val="VerbatimChar"/>
+    <w:rPr>
+      <w:color w:val="ff0000"/>
+      <w:b/>
+    </w:rPr>
+  </w:style>
+  <w:style w:customStyle="1" w:styleId="ErrorTok" w:type="character">
+    <w:name w:val="ErrorTok"/>
+    <w:basedOn w:val="VerbatimChar"/>
+    <w:rPr>
+      <w:color w:val="ff0000"/>
+      <w:b/>
     </w:rPr>
   </w:style>
   <w:style w:customStyle="1" w:styleId="NormalTok" w:type="character">

</xml_diff>

<commit_message>
Prepare R58: identity, review record, deploy guide and manual
Release 2026-10-22 R58, helper 2026.10.22.59, helperBuild 59 (authoring
13, case schema 5, summary 6, backup 2 unchanged), as authorized by the
requester, for the desktop launch and safe exit in #29. R58-REVIEW
records the change, the corrective review and upgrade notes; the R57
review moves to docs/history. The changelog entry, readiness and the
acceptance record (L58-1 to L58-9, open) name R58.

The deploy guide, DESKTOP-LAUNCH and the acceptance record now say that
after upgrading from R57 or earlier the first start still runs the
previously installed launcher (command window) and the desktop shortcut
is migrated at the following start. Manual editions are regenerated on
pinned Chromium 145 with the R58 identity.

Co-Authored-By: Claude Opus 5.5 <noreply@anthropic.com>
Claude-Session: https://claude.ai/code/session_01WPJAZGfD47jPUEgCNYYSg7
</commit_message>
<xml_diff>
--- a/docs/staff/Program_Instruction_Manual.docx
+++ b/docs/staff/Program_Instruction_Manual.docx
@@ -32,7 +32,7 @@
         <w:pStyle w:val="BodyText"/>
       </w:pPr>
       <w:r>
-        <w:t xml:space="preserve">Release 2026-10-22 R57 · Helper 2026.10.22.58 · 22 October 2026</w:t>
+        <w:t xml:space="preserve">Release 2026-10-22 R58 · Helper 2026.10.22.59 · 22 October 2026</w:t>
       </w:r>
     </w:p>
     <w:p>
@@ -48,7 +48,7 @@
         <w:pStyle w:val="BodyText"/>
       </w:pPr>
       <w:r>
-        <w:t xml:space="preserve">R57 is a development candidate for City acceptance. Its security checks require the same ordinary document, history and recovery procedures described below. Automated verification does not replace the outstanding City Windows and network tests, staff and assistive technology acceptance, or legal and seasonal policy decisions listed in the carried-forward City acceptance record. New mandatory-appearance citations remain blocked until approved defendant instructions are supplied and integrated. Historical frozen reprints remain available. No live deployment is included in this release.</w:t>
+        <w:t xml:space="preserve">R58 is a development candidate for City acceptance. Its security checks require the same ordinary document, history and recovery procedures described below. Automated verification does not replace the outstanding City Windows and network tests, staff and assistive technology acceptance, or legal and seasonal policy decisions listed in the carried-forward City acceptance record. New mandatory-appearance citations remain blocked until approved defendant instructions are supplied and integrated. Historical frozen reprints remain available. No live deployment is included in this release.</w:t>
       </w:r>
     </w:p>
     <w:bookmarkStart w:id="20" w:name="start-here-and-daily-routine"/>
@@ -101,7 +101,7 @@
         <w:t xml:space="preserve"> </w:t>
       </w:r>
       <w:r>
-        <w:t xml:space="preserve">Double-click the Document Writer icon on the desktop. It starts the program without a command window and opens Writer in its own Chrome or Edge window; if Document Writer is already running, the icon opens Writer again. Keep one Writer window open in the same browser profile. Confirm Build 2026-10-22 R57 and helper 2026.10.22.58. Open Workspace and resolve any save confirmation, shared-history or PDF-filing exceptions before creating replacement work. Check pending deadlines and reminders.</w:t>
+        <w:t xml:space="preserve">Double-click the Document Writer icon on the desktop. It starts the program without a command window and opens Writer in its own Chrome or Edge window; if Document Writer is already running, the icon opens Writer again. Keep one Writer window open in the same browser profile. Confirm Build 2026-10-22 R58 and helper 2026.10.22.59. Open Workspace and resolve any save confirmation, shared-history or PDF-filing exceptions before creating replacement work. Check pending deadlines and reminders.</w:t>
       </w:r>
     </w:p>
     <w:p>
@@ -5443,7 +5443,7 @@
         <w:pStyle w:val="BodyText"/>
       </w:pPr>
       <w:r>
-        <w:t xml:space="preserve">Manual source digest d34926afcd22cd37.</w:t>
+        <w:t xml:space="preserve">Manual source digest 7053c0db8a9cd4dc.</w:t>
       </w:r>
     </w:p>
     <w:bookmarkEnd w:id="41"/>
@@ -18419,6 +18419,458 @@
     <w:rPr>
       <w:b/>
       <w:color w:val="ff0000"/>
+    </w:rPr>
+  </w:style>
+  <w:style w:customStyle="1" w:styleId="NormalTok" w:type="character">
+    <w:name w:val="NormalTok"/>
+    <w:basedOn w:val="VerbatimChar"/>
+    <w:rPr/>
+  </w:style>
+  <w:style w:customStyle="1" w:styleId="KeywordTok" w:type="character">
+    <w:name w:val="KeywordTok"/>
+    <w:basedOn w:val="VerbatimChar"/>
+    <w:rPr>
+      <w:color w:val="007020"/>
+      <w:b/>
+    </w:rPr>
+  </w:style>
+  <w:style w:customStyle="1" w:styleId="DataTypeTok" w:type="character">
+    <w:name w:val="DataTypeTok"/>
+    <w:basedOn w:val="VerbatimChar"/>
+    <w:rPr>
+      <w:color w:val="902000"/>
+    </w:rPr>
+  </w:style>
+  <w:style w:customStyle="1" w:styleId="DecValTok" w:type="character">
+    <w:name w:val="DecValTok"/>
+    <w:basedOn w:val="VerbatimChar"/>
+    <w:rPr>
+      <w:color w:val="40a070"/>
+    </w:rPr>
+  </w:style>
+  <w:style w:customStyle="1" w:styleId="BaseNTok" w:type="character">
+    <w:name w:val="BaseNTok"/>
+    <w:basedOn w:val="VerbatimChar"/>
+    <w:rPr>
+      <w:color w:val="40a070"/>
+    </w:rPr>
+  </w:style>
+  <w:style w:customStyle="1" w:styleId="FloatTok" w:type="character">
+    <w:name w:val="FloatTok"/>
+    <w:basedOn w:val="VerbatimChar"/>
+    <w:rPr>
+      <w:color w:val="40a070"/>
+    </w:rPr>
+  </w:style>
+  <w:style w:customStyle="1" w:styleId="ConstantTok" w:type="character">
+    <w:name w:val="ConstantTok"/>
+    <w:basedOn w:val="VerbatimChar"/>
+    <w:rPr>
+      <w:color w:val="880000"/>
+    </w:rPr>
+  </w:style>
+  <w:style w:customStyle="1" w:styleId="CharTok" w:type="character">
+    <w:name w:val="CharTok"/>
+    <w:basedOn w:val="VerbatimChar"/>
+    <w:rPr>
+      <w:color w:val="4070a0"/>
+    </w:rPr>
+  </w:style>
+  <w:style w:customStyle="1" w:styleId="SpecialCharTok" w:type="character">
+    <w:name w:val="SpecialCharTok"/>
+    <w:basedOn w:val="VerbatimChar"/>
+    <w:rPr>
+      <w:color w:val="4070a0"/>
+    </w:rPr>
+  </w:style>
+  <w:style w:customStyle="1" w:styleId="StringTok" w:type="character">
+    <w:name w:val="StringTok"/>
+    <w:basedOn w:val="VerbatimChar"/>
+    <w:rPr>
+      <w:color w:val="4070a0"/>
+    </w:rPr>
+  </w:style>
+  <w:style w:customStyle="1" w:styleId="VerbatimStringTok" w:type="character">
+    <w:name w:val="VerbatimStringTok"/>
+    <w:basedOn w:val="VerbatimChar"/>
+    <w:rPr>
+      <w:color w:val="4070a0"/>
+    </w:rPr>
+  </w:style>
+  <w:style w:customStyle="1" w:styleId="SpecialStringTok" w:type="character">
+    <w:name w:val="SpecialStringTok"/>
+    <w:basedOn w:val="VerbatimChar"/>
+    <w:rPr>
+      <w:color w:val="bb6688"/>
+    </w:rPr>
+  </w:style>
+  <w:style w:customStyle="1" w:styleId="ImportTok" w:type="character">
+    <w:name w:val="ImportTok"/>
+    <w:basedOn w:val="VerbatimChar"/>
+    <w:rPr>
+      <w:color w:val="008000"/>
+      <w:b/>
+    </w:rPr>
+  </w:style>
+  <w:style w:customStyle="1" w:styleId="CommentTok" w:type="character">
+    <w:name w:val="CommentTok"/>
+    <w:basedOn w:val="VerbatimChar"/>
+    <w:rPr>
+      <w:color w:val="60a0b0"/>
+      <w:i/>
+    </w:rPr>
+  </w:style>
+  <w:style w:customStyle="1" w:styleId="DocumentationTok" w:type="character">
+    <w:name w:val="DocumentationTok"/>
+    <w:basedOn w:val="VerbatimChar"/>
+    <w:rPr>
+      <w:color w:val="ba2121"/>
+      <w:i/>
+    </w:rPr>
+  </w:style>
+  <w:style w:customStyle="1" w:styleId="AnnotationTok" w:type="character">
+    <w:name w:val="AnnotationTok"/>
+    <w:basedOn w:val="VerbatimChar"/>
+    <w:rPr>
+      <w:color w:val="60a0b0"/>
+      <w:b/>
+      <w:i/>
+    </w:rPr>
+  </w:style>
+  <w:style w:customStyle="1" w:styleId="CommentVarTok" w:type="character">
+    <w:name w:val="CommentVarTok"/>
+    <w:basedOn w:val="VerbatimChar"/>
+    <w:rPr>
+      <w:color w:val="60a0b0"/>
+      <w:b/>
+      <w:i/>
+    </w:rPr>
+  </w:style>
+  <w:style w:customStyle="1" w:styleId="OtherTok" w:type="character">
+    <w:name w:val="OtherTok"/>
+    <w:basedOn w:val="VerbatimChar"/>
+    <w:rPr>
+      <w:color w:val="007020"/>
+    </w:rPr>
+  </w:style>
+  <w:style w:customStyle="1" w:styleId="FunctionTok" w:type="character">
+    <w:name w:val="FunctionTok"/>
+    <w:basedOn w:val="VerbatimChar"/>
+    <w:rPr>
+      <w:color w:val="06287e"/>
+    </w:rPr>
+  </w:style>
+  <w:style w:customStyle="1" w:styleId="VariableTok" w:type="character">
+    <w:name w:val="VariableTok"/>
+    <w:basedOn w:val="VerbatimChar"/>
+    <w:rPr>
+      <w:color w:val="19177c"/>
+    </w:rPr>
+  </w:style>
+  <w:style w:customStyle="1" w:styleId="ControlFlowTok" w:type="character">
+    <w:name w:val="ControlFlowTok"/>
+    <w:basedOn w:val="VerbatimChar"/>
+    <w:rPr>
+      <w:color w:val="007020"/>
+      <w:b/>
+    </w:rPr>
+  </w:style>
+  <w:style w:customStyle="1" w:styleId="OperatorTok" w:type="character">
+    <w:name w:val="OperatorTok"/>
+    <w:basedOn w:val="VerbatimChar"/>
+    <w:rPr>
+      <w:color w:val="666666"/>
+    </w:rPr>
+  </w:style>
+  <w:style w:customStyle="1" w:styleId="BuiltInTok" w:type="character">
+    <w:name w:val="BuiltInTok"/>
+    <w:basedOn w:val="VerbatimChar"/>
+    <w:rPr>
+      <w:color w:val="008000"/>
+    </w:rPr>
+  </w:style>
+  <w:style w:customStyle="1" w:styleId="ExtensionTok" w:type="character">
+    <w:name w:val="ExtensionTok"/>
+    <w:basedOn w:val="VerbatimChar"/>
+    <w:rPr/>
+  </w:style>
+  <w:style w:customStyle="1" w:styleId="PreprocessorTok" w:type="character">
+    <w:name w:val="PreprocessorTok"/>
+    <w:basedOn w:val="VerbatimChar"/>
+    <w:rPr>
+      <w:color w:val="bc7a00"/>
+    </w:rPr>
+  </w:style>
+  <w:style w:customStyle="1" w:styleId="AttributeTok" w:type="character">
+    <w:name w:val="AttributeTok"/>
+    <w:basedOn w:val="VerbatimChar"/>
+    <w:rPr>
+      <w:color w:val="7d9029"/>
+    </w:rPr>
+  </w:style>
+  <w:style w:customStyle="1" w:styleId="RegionMarkerTok" w:type="character">
+    <w:name w:val="RegionMarkerTok"/>
+    <w:basedOn w:val="VerbatimChar"/>
+    <w:rPr/>
+  </w:style>
+  <w:style w:customStyle="1" w:styleId="InformationTok" w:type="character">
+    <w:name w:val="InformationTok"/>
+    <w:basedOn w:val="VerbatimChar"/>
+    <w:rPr>
+      <w:color w:val="60a0b0"/>
+      <w:b/>
+      <w:i/>
+    </w:rPr>
+  </w:style>
+  <w:style w:customStyle="1" w:styleId="WarningTok" w:type="character">
+    <w:name w:val="WarningTok"/>
+    <w:basedOn w:val="VerbatimChar"/>
+    <w:rPr>
+      <w:color w:val="60a0b0"/>
+      <w:b/>
+      <w:i/>
+    </w:rPr>
+  </w:style>
+  <w:style w:customStyle="1" w:styleId="AlertTok" w:type="character">
+    <w:name w:val="AlertTok"/>
+    <w:basedOn w:val="VerbatimChar"/>
+    <w:rPr>
+      <w:color w:val="ff0000"/>
+      <w:b/>
+    </w:rPr>
+  </w:style>
+  <w:style w:customStyle="1" w:styleId="ErrorTok" w:type="character">
+    <w:name w:val="ErrorTok"/>
+    <w:basedOn w:val="VerbatimChar"/>
+    <w:rPr>
+      <w:color w:val="ff0000"/>
+      <w:b/>
+    </w:rPr>
+  </w:style>
+  <w:style w:customStyle="1" w:styleId="NormalTok" w:type="character">
+    <w:name w:val="NormalTok"/>
+    <w:basedOn w:val="VerbatimChar"/>
+    <w:rPr/>
+  </w:style>
+  <w:style w:customStyle="1" w:styleId="KeywordTok" w:type="character">
+    <w:name w:val="KeywordTok"/>
+    <w:basedOn w:val="VerbatimChar"/>
+    <w:rPr>
+      <w:color w:val="007020"/>
+      <w:b/>
+    </w:rPr>
+  </w:style>
+  <w:style w:customStyle="1" w:styleId="DataTypeTok" w:type="character">
+    <w:name w:val="DataTypeTok"/>
+    <w:basedOn w:val="VerbatimChar"/>
+    <w:rPr>
+      <w:color w:val="902000"/>
+    </w:rPr>
+  </w:style>
+  <w:style w:customStyle="1" w:styleId="DecValTok" w:type="character">
+    <w:name w:val="DecValTok"/>
+    <w:basedOn w:val="VerbatimChar"/>
+    <w:rPr>
+      <w:color w:val="40a070"/>
+    </w:rPr>
+  </w:style>
+  <w:style w:customStyle="1" w:styleId="BaseNTok" w:type="character">
+    <w:name w:val="BaseNTok"/>
+    <w:basedOn w:val="VerbatimChar"/>
+    <w:rPr>
+      <w:color w:val="40a070"/>
+    </w:rPr>
+  </w:style>
+  <w:style w:customStyle="1" w:styleId="FloatTok" w:type="character">
+    <w:name w:val="FloatTok"/>
+    <w:basedOn w:val="VerbatimChar"/>
+    <w:rPr>
+      <w:color w:val="40a070"/>
+    </w:rPr>
+  </w:style>
+  <w:style w:customStyle="1" w:styleId="ConstantTok" w:type="character">
+    <w:name w:val="ConstantTok"/>
+    <w:basedOn w:val="VerbatimChar"/>
+    <w:rPr>
+      <w:color w:val="880000"/>
+    </w:rPr>
+  </w:style>
+  <w:style w:customStyle="1" w:styleId="CharTok" w:type="character">
+    <w:name w:val="CharTok"/>
+    <w:basedOn w:val="VerbatimChar"/>
+    <w:rPr>
+      <w:color w:val="4070a0"/>
+    </w:rPr>
+  </w:style>
+  <w:style w:customStyle="1" w:styleId="SpecialCharTok" w:type="character">
+    <w:name w:val="SpecialCharTok"/>
+    <w:basedOn w:val="VerbatimChar"/>
+    <w:rPr>
+      <w:color w:val="4070a0"/>
+    </w:rPr>
+  </w:style>
+  <w:style w:customStyle="1" w:styleId="StringTok" w:type="character">
+    <w:name w:val="StringTok"/>
+    <w:basedOn w:val="VerbatimChar"/>
+    <w:rPr>
+      <w:color w:val="4070a0"/>
+    </w:rPr>
+  </w:style>
+  <w:style w:customStyle="1" w:styleId="VerbatimStringTok" w:type="character">
+    <w:name w:val="VerbatimStringTok"/>
+    <w:basedOn w:val="VerbatimChar"/>
+    <w:rPr>
+      <w:color w:val="4070a0"/>
+    </w:rPr>
+  </w:style>
+  <w:style w:customStyle="1" w:styleId="SpecialStringTok" w:type="character">
+    <w:name w:val="SpecialStringTok"/>
+    <w:basedOn w:val="VerbatimChar"/>
+    <w:rPr>
+      <w:color w:val="bb6688"/>
+    </w:rPr>
+  </w:style>
+  <w:style w:customStyle="1" w:styleId="ImportTok" w:type="character">
+    <w:name w:val="ImportTok"/>
+    <w:basedOn w:val="VerbatimChar"/>
+    <w:rPr>
+      <w:color w:val="008000"/>
+      <w:b/>
+    </w:rPr>
+  </w:style>
+  <w:style w:customStyle="1" w:styleId="CommentTok" w:type="character">
+    <w:name w:val="CommentTok"/>
+    <w:basedOn w:val="VerbatimChar"/>
+    <w:rPr>
+      <w:color w:val="60a0b0"/>
+      <w:i/>
+    </w:rPr>
+  </w:style>
+  <w:style w:customStyle="1" w:styleId="DocumentationTok" w:type="character">
+    <w:name w:val="DocumentationTok"/>
+    <w:basedOn w:val="VerbatimChar"/>
+    <w:rPr>
+      <w:color w:val="ba2121"/>
+      <w:i/>
+    </w:rPr>
+  </w:style>
+  <w:style w:customStyle="1" w:styleId="AnnotationTok" w:type="character">
+    <w:name w:val="AnnotationTok"/>
+    <w:basedOn w:val="VerbatimChar"/>
+    <w:rPr>
+      <w:color w:val="60a0b0"/>
+      <w:b/>
+      <w:i/>
+    </w:rPr>
+  </w:style>
+  <w:style w:customStyle="1" w:styleId="CommentVarTok" w:type="character">
+    <w:name w:val="CommentVarTok"/>
+    <w:basedOn w:val="VerbatimChar"/>
+    <w:rPr>
+      <w:color w:val="60a0b0"/>
+      <w:b/>
+      <w:i/>
+    </w:rPr>
+  </w:style>
+  <w:style w:customStyle="1" w:styleId="OtherTok" w:type="character">
+    <w:name w:val="OtherTok"/>
+    <w:basedOn w:val="VerbatimChar"/>
+    <w:rPr>
+      <w:color w:val="007020"/>
+    </w:rPr>
+  </w:style>
+  <w:style w:customStyle="1" w:styleId="FunctionTok" w:type="character">
+    <w:name w:val="FunctionTok"/>
+    <w:basedOn w:val="VerbatimChar"/>
+    <w:rPr>
+      <w:color w:val="06287e"/>
+    </w:rPr>
+  </w:style>
+  <w:style w:customStyle="1" w:styleId="VariableTok" w:type="character">
+    <w:name w:val="VariableTok"/>
+    <w:basedOn w:val="VerbatimChar"/>
+    <w:rPr>
+      <w:color w:val="19177c"/>
+    </w:rPr>
+  </w:style>
+  <w:style w:customStyle="1" w:styleId="ControlFlowTok" w:type="character">
+    <w:name w:val="ControlFlowTok"/>
+    <w:basedOn w:val="VerbatimChar"/>
+    <w:rPr>
+      <w:color w:val="007020"/>
+      <w:b/>
+    </w:rPr>
+  </w:style>
+  <w:style w:customStyle="1" w:styleId="OperatorTok" w:type="character">
+    <w:name w:val="OperatorTok"/>
+    <w:basedOn w:val="VerbatimChar"/>
+    <w:rPr>
+      <w:color w:val="666666"/>
+    </w:rPr>
+  </w:style>
+  <w:style w:customStyle="1" w:styleId="BuiltInTok" w:type="character">
+    <w:name w:val="BuiltInTok"/>
+    <w:basedOn w:val="VerbatimChar"/>
+    <w:rPr>
+      <w:color w:val="008000"/>
+    </w:rPr>
+  </w:style>
+  <w:style w:customStyle="1" w:styleId="ExtensionTok" w:type="character">
+    <w:name w:val="ExtensionTok"/>
+    <w:basedOn w:val="VerbatimChar"/>
+    <w:rPr/>
+  </w:style>
+  <w:style w:customStyle="1" w:styleId="PreprocessorTok" w:type="character">
+    <w:name w:val="PreprocessorTok"/>
+    <w:basedOn w:val="VerbatimChar"/>
+    <w:rPr>
+      <w:color w:val="bc7a00"/>
+    </w:rPr>
+  </w:style>
+  <w:style w:customStyle="1" w:styleId="AttributeTok" w:type="character">
+    <w:name w:val="AttributeTok"/>
+    <w:basedOn w:val="VerbatimChar"/>
+    <w:rPr>
+      <w:color w:val="7d9029"/>
+    </w:rPr>
+  </w:style>
+  <w:style w:customStyle="1" w:styleId="RegionMarkerTok" w:type="character">
+    <w:name w:val="RegionMarkerTok"/>
+    <w:basedOn w:val="VerbatimChar"/>
+    <w:rPr/>
+  </w:style>
+  <w:style w:customStyle="1" w:styleId="InformationTok" w:type="character">
+    <w:name w:val="InformationTok"/>
+    <w:basedOn w:val="VerbatimChar"/>
+    <w:rPr>
+      <w:color w:val="60a0b0"/>
+      <w:b/>
+      <w:i/>
+    </w:rPr>
+  </w:style>
+  <w:style w:customStyle="1" w:styleId="WarningTok" w:type="character">
+    <w:name w:val="WarningTok"/>
+    <w:basedOn w:val="VerbatimChar"/>
+    <w:rPr>
+      <w:color w:val="60a0b0"/>
+      <w:b/>
+      <w:i/>
+    </w:rPr>
+  </w:style>
+  <w:style w:customStyle="1" w:styleId="AlertTok" w:type="character">
+    <w:name w:val="AlertTok"/>
+    <w:basedOn w:val="VerbatimChar"/>
+    <w:rPr>
+      <w:color w:val="ff0000"/>
+      <w:b/>
+    </w:rPr>
+  </w:style>
+  <w:style w:customStyle="1" w:styleId="ErrorTok" w:type="character">
+    <w:name w:val="ErrorTok"/>
+    <w:basedOn w:val="VerbatimChar"/>
+    <w:rPr>
+      <w:color w:val="ff0000"/>
+      <w:b/>
     </w:rPr>
   </w:style>
   <w:style w:customStyle="1" w:styleId="NormalTok" w:type="character">

</xml_diff>

<commit_message>
Build R60 Workspace entry and item-specific referral history
</commit_message>
<xml_diff>
--- a/docs/staff/Program_Instruction_Manual.docx
+++ b/docs/staff/Program_Instruction_Manual.docx
@@ -10,7 +10,7 @@
         <w:t xml:space="preserve">Program instruction manual</w:t>
       </w:r>
     </w:p>
-    <w:bookmarkStart w:id="42" w:name="program-instruction-manual"/>
+    <w:bookmarkStart w:id="43" w:name="program-instruction-manual"/>
     <w:p>
       <w:pPr>
         <w:pStyle w:val="Heading1"/>
@@ -32,7 +32,7 @@
         <w:pStyle w:val="BodyText"/>
       </w:pPr>
       <w:r>
-        <w:t xml:space="preserve">Release 2026-10-22 R59 · Helper 2026.10.22.60 · 22 October 2026</w:t>
+        <w:t xml:space="preserve">Release 2026-10-22 R60 · Helper 2026.10.22.61 · 22 October 2026</w:t>
       </w:r>
     </w:p>
     <w:p>
@@ -48,7 +48,7 @@
         <w:pStyle w:val="BodyText"/>
       </w:pPr>
       <w:r>
-        <w:t xml:space="preserve">R59 is a development candidate for City acceptance. Its security checks require the same ordinary document, history and recovery procedures described below. Automated verification does not replace the outstanding City Windows and network tests, staff and assistive technology acceptance, or legal and seasonal policy decisions listed in the carried-forward City acceptance record. New mandatory-appearance citations remain blocked until approved defendant instructions are supplied and integrated. Historical frozen reprints remain available. No live deployment is included in this release.</w:t>
+        <w:t xml:space="preserve">R60 is a development candidate for City acceptance. Its security checks require the same ordinary document, history and recovery procedures described below. Automated verification does not replace the outstanding City Windows and network tests, staff and assistive technology acceptance, or legal and seasonal policy decisions listed in the carried-forward City acceptance record. New mandatory-appearance citations remain blocked until approved defendant instructions are supplied and integrated. Historical frozen reprints remain available. No live deployment is included in this release.</w:t>
       </w:r>
     </w:p>
     <w:bookmarkStart w:id="20" w:name="start-here-and-daily-routine"/>
@@ -74,8 +74,8 @@
       </w:pPr>
       <w:r>
         <w:rPr>
+          <w:b/>
           <w:bCs/>
-          <w:b/>
         </w:rPr>
         <w:t xml:space="preserve">Before using operational cases.</w:t>
       </w:r>
@@ -92,8 +92,8 @@
       </w:pPr>
       <w:r>
         <w:rPr>
+          <w:b/>
           <w:bCs/>
-          <w:b/>
         </w:rPr>
         <w:t xml:space="preserve">Start a working day.</w:t>
       </w:r>
@@ -101,7 +101,7 @@
         <w:t xml:space="preserve"> </w:t>
       </w:r>
       <w:r>
-        <w:t xml:space="preserve">Double-click the Document Writer icon on the desktop. It starts the program without a command window and opens Writer in its own Chrome or Edge window; if Document Writer is already running, the icon opens Writer again. Keep one Writer window open in the same browser profile. Confirm Build 2026-10-22 R59 and helper 2026.10.22.60. Open Workspace and resolve any save confirmation, shared-history or PDF-filing exceptions before creating replacement work. Check pending deadlines and reminders.</w:t>
+        <w:t xml:space="preserve">Double-click the Document Writer icon on the desktop. It starts the program without a command window and opens Writer in its own Chrome or Edge window; if Document Writer is already running, the icon opens Writer again. Keep one Writer window open in the same browser profile. Confirm Build 2026-10-22 R60 and helper 2026.10.22.61. Open Workspace and resolve any save confirmation, shared-history or PDF-filing exceptions before creating replacement work. Check pending deadlines and reminders.</w:t>
       </w:r>
     </w:p>
     <w:p>
@@ -110,8 +110,8 @@
       </w:pPr>
       <w:r>
         <w:rPr>
+          <w:b/>
           <w:bCs/>
-          <w:b/>
         </w:rPr>
         <w:t xml:space="preserve">Prepare work.</w:t>
       </w:r>
@@ -128,8 +128,8 @@
       </w:pPr>
       <w:r>
         <w:rPr>
+          <w:b/>
           <w:bCs/>
-          <w:b/>
         </w:rPr>
         <w:t xml:space="preserve">Finish an action.</w:t>
       </w:r>
@@ -146,8 +146,8 @@
       </w:pPr>
       <w:r>
         <w:rPr>
+          <w:b/>
           <w:bCs/>
-          <w:b/>
         </w:rPr>
         <w:t xml:space="preserve">End a working day.</w:t>
       </w:r>
@@ -164,8 +164,8 @@
       </w:pPr>
       <w:r>
         <w:rPr>
+          <w:b/>
           <w:bCs/>
-          <w:b/>
         </w:rPr>
         <w:t xml:space="preserve">Stop Document Writer.</w:t>
       </w:r>
@@ -181,7 +181,7 @@
         <w:pStyle w:val="BodyText"/>
       </w:pPr>
       <w:r>
-        <w:t xml:space="preserve">The five Writer destinations are Import inspection, Workspace, Order language, Reports, and Tools &amp; settings. Open Reports ↗ opens Reports in a new tab. Editing a case remains within Workspace. When Open case in Writer brings a case from Reports, the Writer rail shows Back to Reports instead, which returns to the same report.</w:t>
+        <w:t xml:space="preserve">The four Writer destinations are Workspace, Order language, Reports, and Tools &amp; settings. Writer normally opens in Workspace. Its Start or find case work area contains Import inspection for unused Accela inspections and Search shared case records for existing work. Open Reports ↗ opens Reports in a new tab. Editing a case remains within Workspace. When Open case in Writer brings a case from Reports, the Writer rail shows Back to Reports instead, which returns to the same report.</w:t>
       </w:r>
     </w:p>
     <w:p>
@@ -190,8 +190,8 @@
       </w:pPr>
       <w:r>
         <w:rPr>
+          <w:b/>
           <w:bCs/>
-          <w:b/>
         </w:rPr>
         <w:t xml:space="preserve">Warnings and errors.</w:t>
       </w:r>
@@ -218,8 +218,8 @@
       </w:pPr>
       <w:r>
         <w:rPr>
+          <w:b/>
           <w:bCs/>
-          <w:b/>
         </w:rPr>
         <w:t xml:space="preserve">Administrator procedure.</w:t>
       </w:r>
@@ -232,11 +232,11 @@
     </w:p>
     <w:p>
       <w:pPr>
+        <w:pStyle w:val="Compact"/>
         <w:numPr>
           <w:ilvl w:val="0"/>
           <w:numId w:val="1001"/>
         </w:numPr>
-        <w:pStyle w:val="Compact"/>
       </w:pPr>
       <w:r>
         <w:t xml:space="preserve">Back up the existing program, case folder, PDF folder, GIS folder, configuration and integrity evidence. Ask every user to save and sync work, then stop the program with Exit Document Writer in Tools &amp; settings. An older version without Exit Document Writer in Tools &amp; settings stops another way: close its command window if it was started with Start Document Writer.bat, otherwise sign out of Windows and back in.</w:t>
@@ -244,11 +244,11 @@
     </w:p>
     <w:p>
       <w:pPr>
+        <w:pStyle w:val="Compact"/>
         <w:numPr>
           <w:ilvl w:val="0"/>
           <w:numId w:val="1001"/>
         </w:numPr>
-        <w:pStyle w:val="Compact"/>
       </w:pPr>
       <w:r>
         <w:t xml:space="preserve">Before extraction, compare the package SHA-256 with the digest obtained independently from the release owner. Use Get-FileHash -Algorithm SHA256 in PowerShell. Keep verified prior packages separately for deliberate IT rollback and test acceptance in isolation.</w:t>
@@ -256,11 +256,11 @@
     </w:p>
     <w:p>
       <w:pPr>
+        <w:pStyle w:val="Compact"/>
         <w:numPr>
           <w:ilvl w:val="0"/>
           <w:numId w:val="1001"/>
         </w:numPr>
-        <w:pStyle w:val="Compact"/>
       </w:pPr>
       <w:r>
         <w:t xml:space="preserve">Place all deploy files and the vendor folder in a division-owned program folder. Preserve operational folders and settings. Grant inspectors read-only program access and grant write access to the release owner only; grant case, PDF and GIS write access as required. Keep these permissions distinct. Restrict administration and independent anchor permissions through IT.</w:t>
@@ -268,11 +268,11 @@
     </w:p>
     <w:p>
       <w:pPr>
+        <w:pStyle w:val="Compact"/>
         <w:numPr>
           <w:ilvl w:val="0"/>
           <w:numId w:val="1001"/>
         </w:numPr>
-        <w:pStyle w:val="Compact"/>
       </w:pPr>
       <w:r>
         <w:t xml:space="preserve">Have IT check the deploy ZIP’s SHA-256 against the value the release owner publishes separately, then run Start Document Writer.bat (the diagnostic launcher) once on each PC from that checked deployment. It installs the local runtime and creates or updates the Document Writer desktop icon; an existing Document Writer shortcut is changed to start without a command window.</w:t>
@@ -280,11 +280,11 @@
     </w:p>
     <w:p>
       <w:pPr>
+        <w:pStyle w:val="Compact"/>
         <w:numPr>
           <w:ilvl w:val="0"/>
           <w:numId w:val="1001"/>
         </w:numPr>
-        <w:pStyle w:val="Compact"/>
       </w:pPr>
       <w:r>
         <w:t xml:space="preserve">Confirm the build and helper versions shown in the install guide. If a message says an older version is still running, stop it as the message explains (Exit Document Writer when it offers one; otherwise close its command window or sign out of Windows), then double-click the Document Writer icon again.</w:t>
@@ -292,11 +292,11 @@
     </w:p>
     <w:p>
       <w:pPr>
+        <w:pStyle w:val="Compact"/>
         <w:numPr>
           <w:ilvl w:val="0"/>
           <w:numId w:val="1001"/>
         </w:numPr>
-        <w:pStyle w:val="Compact"/>
       </w:pPr>
       <w:r>
         <w:t xml:space="preserve">Open Tools &amp; settings → Saved work &amp; connection. Expand Connection checks and technical details, then open connection checks and Storage diagnostics. Confirm the intended shared paths, helper health and permissions. Use Rebuild reporting index in Storage diagnostics when an administrator has confirmed a rebuild is appropriate.</w:t>
@@ -304,11 +304,11 @@
     </w:p>
     <w:p>
       <w:pPr>
+        <w:pStyle w:val="Compact"/>
         <w:numPr>
           <w:ilvl w:val="0"/>
           <w:numId w:val="1001"/>
         </w:numPr>
-        <w:pStyle w:val="Compact"/>
       </w:pPr>
       <w:r>
         <w:t xml:space="preserve">Open Reports → Data and definitions. Review coverage and excluded records. Test an approved synthetic case through save, exact PDF retrieval and recovery before operational use.</w:t>
@@ -320,8 +320,8 @@
       </w:pPr>
       <w:r>
         <w:rPr>
+          <w:b/>
           <w:bCs/>
-          <w:b/>
         </w:rPr>
         <w:t xml:space="preserve">Compatibility.</w:t>
       </w:r>
@@ -329,7 +329,7 @@
         <w:t xml:space="preserve"> </w:t>
       </w:r>
       <w:r>
-        <w:t xml:space="preserve">This release uses case schema 5, summary version 6, workspace backup version 2 and authoring version 13; R54 introduced authoring 12 for the aligned Best Interest and Vacancy Extension layout, and R56 introduced authoring 13 for their required item due dates. Earlier releases predating schema 5 cannot read schema-5 case files. An earlier release does not know a newer authoring layout: before rollback, finish or discard unfinished drafts and corrections, and afterwards rely on the retained original PDFs for documents issued under the newer release. A runtime rollback changes installed files; it does not reverse issued records or restore workspace data. IT must assess data compatibility and retained requests before rollback. Never replace current operational records with an old backup without an approved recovery plan.</w:t>
+        <w:t xml:space="preserve">This release uses case schema 5, summary version 6, workspace backup version 2 and current authoring version 14; new referrals use item-specific history and Days Outstanding, while earlier issued formats and existing special-document layouts retain their versions; R54 introduced authoring 12 for the aligned Best Interest and Vacancy Extension layout, and R56 introduced authoring 13 for their required item due dates. Earlier releases predating schema 5 cannot read schema-5 case files. An earlier release does not know a newer authoring layout: before rollback, finish or discard unfinished drafts and corrections, and afterwards rely on the retained original PDFs for documents issued under the newer release. A runtime rollback changes installed files; it does not reverse issued records or restore workspace data. IT must assess data compatibility and retained requests before rollback. Never replace current operational records with an old backup without an approved recovery plan.</w:t>
       </w:r>
     </w:p>
     <w:p>
@@ -338,8 +338,8 @@
       </w:pPr>
       <w:r>
         <w:rPr>
+          <w:b/>
           <w:bCs/>
-          <w:b/>
         </w:rPr>
         <w:t xml:space="preserve">Checked updates.</w:t>
       </w:r>
@@ -356,8 +356,8 @@
       </w:pPr>
       <w:r>
         <w:rPr>
+          <w:b/>
           <w:bCs/>
-          <w:b/>
         </w:rPr>
         <w:t xml:space="preserve">Browser session.</w:t>
       </w:r>
@@ -374,8 +374,8 @@
       </w:pPr>
       <w:r>
         <w:rPr>
+          <w:b/>
           <w:bCs/>
-          <w:b/>
         </w:rPr>
         <w:t xml:space="preserve">After a helper restart.</w:t>
       </w:r>
@@ -392,8 +392,8 @@
       </w:pPr>
       <w:r>
         <w:rPr>
+          <w:b/>
           <w:bCs/>
-          <w:b/>
         </w:rPr>
         <w:t xml:space="preserve">Deliberate rollback.</w:t>
       </w:r>
@@ -436,8 +436,8 @@
       </w:pPr>
       <w:r>
         <w:rPr>
+          <w:b/>
           <w:bCs/>
-          <w:b/>
         </w:rPr>
         <w:t xml:space="preserve">Find and continue a case.</w:t>
       </w:r>
@@ -480,8 +480,8 @@
       </w:pPr>
       <w:r>
         <w:rPr>
+          <w:b/>
           <w:bCs/>
-          <w:b/>
         </w:rPr>
         <w:t xml:space="preserve">Understand the record.</w:t>
       </w:r>
@@ -506,8 +506,8 @@
       </w:pPr>
       <w:r>
         <w:rPr>
+          <w:b/>
           <w:bCs/>
-          <w:b/>
         </w:rPr>
         <w:t xml:space="preserve">Resolve attention states.</w:t>
       </w:r>
@@ -542,8 +542,8 @@
       </w:pPr>
       <w:r>
         <w:rPr>
+          <w:b/>
           <w:bCs/>
-          <w:b/>
         </w:rPr>
         <w:t xml:space="preserve">Direct lookup.</w:t>
       </w:r>
@@ -551,7 +551,7 @@
         <w:t xml:space="preserve"> </w:t>
       </w:r>
       <w:r>
-        <w:t xml:space="preserve">Open Import inspection, enter the complete case number and choose Find Accela inspection or press Enter. The Windows helper runs the supplied read-only SQL query with the signed-in Windows account. Inspectors do not enter SQL, passwords or server settings. The initial default server is sqlelam; IT can set the approved database and server in shared Case Lookup/settings.json.</w:t>
+        <w:t xml:space="preserve">In Workspace choose Import inspection, enter the complete case number and choose Find Accela inspection or press Enter. The Windows helper runs the supplied read-only SQL query with the signed-in Windows account. Inspectors do not enter SQL, passwords or server settings. The initial default server is sqlelam; IT can set the approved database and server in shared Case Lookup/settings.json.</w:t>
       </w:r>
     </w:p>
     <w:p>
@@ -574,8 +574,8 @@
       </w:r>
       <w:r>
         <w:rPr>
+          <w:b/>
           <w:bCs/>
-          <w:b/>
         </w:rPr>
         <w:t xml:space="preserve">Inspection Type</w:t>
       </w:r>
@@ -590,8 +590,8 @@
       </w:r>
       <w:r>
         <w:rPr>
+          <w:b/>
           <w:bCs/>
-          <w:b/>
         </w:rPr>
         <w:t xml:space="preserve">Inspection Status</w:t>
       </w:r>
@@ -622,16 +622,16 @@
     </w:p>
     <w:p>
       <w:pPr>
+        <w:pStyle w:val="Compact"/>
         <w:numPr>
           <w:ilvl w:val="0"/>
           <w:numId w:val="1002"/>
         </w:numPr>
-        <w:pStyle w:val="Compact"/>
       </w:pPr>
       <w:r>
         <w:rPr>
+          <w:b/>
           <w:bCs/>
-          <w:b/>
         </w:rPr>
         <w:t xml:space="preserve">Initial Inspection</w:t>
       </w:r>
@@ -644,16 +644,16 @@
     </w:p>
     <w:p>
       <w:pPr>
+        <w:pStyle w:val="Compact"/>
         <w:numPr>
           <w:ilvl w:val="0"/>
           <w:numId w:val="1002"/>
         </w:numPr>
-        <w:pStyle w:val="Compact"/>
       </w:pPr>
       <w:r>
         <w:rPr>
+          <w:b/>
           <w:bCs/>
-          <w:b/>
         </w:rPr>
         <w:t xml:space="preserve">Reinspection</w:t>
       </w:r>
@@ -666,16 +666,16 @@
     </w:p>
     <w:p>
       <w:pPr>
+        <w:pStyle w:val="Compact"/>
         <w:numPr>
           <w:ilvl w:val="0"/>
           <w:numId w:val="1002"/>
         </w:numPr>
-        <w:pStyle w:val="Compact"/>
       </w:pPr>
       <w:r>
         <w:rPr>
+          <w:b/>
           <w:bCs/>
-          <w:b/>
         </w:rPr>
         <w:t xml:space="preserve">CA Reinspection</w:t>
       </w:r>
@@ -688,11 +688,11 @@
     </w:p>
     <w:p>
       <w:pPr>
+        <w:pStyle w:val="Compact"/>
         <w:numPr>
           <w:ilvl w:val="0"/>
           <w:numId w:val="1002"/>
         </w:numPr>
-        <w:pStyle w:val="Compact"/>
       </w:pPr>
       <w:r>
         <w:t xml:space="preserve">Completed and any other unlisted result cannot be imported: set the specific result in Accela and retrieve it again.</w:t>
@@ -700,11 +700,11 @@
     </w:p>
     <w:p>
       <w:pPr>
+        <w:pStyle w:val="Compact"/>
         <w:numPr>
           <w:ilvl w:val="0"/>
           <w:numId w:val="1002"/>
         </w:numPr>
-        <w:pStyle w:val="Compact"/>
       </w:pPr>
       <w:r>
         <w:t xml:space="preserve">If recorded results contradict the status (for example Compliance with an item not Corrected), the document cannot be issued. Correct the results, or correct the status in Accela and import the same inspection again; the open draft or worksheet is updated without losing your work.</w:t>
@@ -716,8 +716,8 @@
       </w:pPr>
       <w:r>
         <w:rPr>
+          <w:b/>
           <w:bCs/>
-          <w:b/>
         </w:rPr>
         <w:t xml:space="preserve">Review an existing case.</w:t>
       </w:r>
@@ -734,8 +734,8 @@
       </w:pPr>
       <w:r>
         <w:rPr>
+          <w:b/>
           <w:bCs/>
-          <w:b/>
         </w:rPr>
         <w:t xml:space="preserve">Excel alternative.</w:t>
       </w:r>
@@ -760,8 +760,8 @@
       </w:pPr>
       <w:r>
         <w:rPr>
+          <w:b/>
           <w:bCs/>
-          <w:b/>
         </w:rPr>
         <w:t xml:space="preserve">Pause or retry.</w:t>
       </w:r>
@@ -800,11 +800,11 @@
     </w:p>
     <w:p>
       <w:pPr>
+        <w:pStyle w:val="Compact"/>
         <w:numPr>
           <w:ilvl w:val="0"/>
           <w:numId w:val="1003"/>
         </w:numPr>
-        <w:pStyle w:val="Compact"/>
       </w:pPr>
       <w:r>
         <w:t xml:space="preserve">Choose Violation Items at the top of the document. In the Select for this notice picker, find the appropriate selectable order language and select it once. A checkmark means it is already on this notice. Select it again to remove it from the unissued draft. The same library entry cannot be added twice.</w:t>
@@ -812,11 +812,11 @@
     </w:p>
     <w:p>
       <w:pPr>
+        <w:pStyle w:val="Compact"/>
         <w:numPr>
           <w:ilvl w:val="0"/>
           <w:numId w:val="1003"/>
         </w:numPr>
-        <w:pStyle w:val="Compact"/>
       </w:pPr>
       <w:r>
         <w:t xml:space="preserve">Choose Done adding. Review each item’s ordinance, corrective action, location and case-specific details. Outlined fill-in bubbles identify missing details. Click a bubble or focus it and press Enter, enter the factual detail, and review the sentence afterward.</w:t>
@@ -824,11 +824,11 @@
     </w:p>
     <w:p>
       <w:pPr>
+        <w:pStyle w:val="Compact"/>
         <w:numPr>
           <w:ilvl w:val="0"/>
           <w:numId w:val="1003"/>
         </w:numPr>
-        <w:pStyle w:val="Compact"/>
       </w:pPr>
       <w:r>
         <w:t xml:space="preserve">Tick the checkbox beside each due date that shares a deadline (Select item N for a shared due date). In Assign due dates below the document, which counts the selected items, enter the date and choose Apply date to selected items. Use Select all or Clear when appropriate. Repeat for other groups. New items begin without an automatic deadline.</w:t>
@@ -836,11 +836,11 @@
     </w:p>
     <w:p>
       <w:pPr>
+        <w:pStyle w:val="Compact"/>
         <w:numPr>
           <w:ilvl w:val="0"/>
           <w:numId w:val="1003"/>
         </w:numPr>
-        <w:pStyle w:val="Compact"/>
       </w:pPr>
       <w:r>
         <w:t xml:space="preserve">Keep no more than three distinct outstanding-item deadlines under the existing notice rules. A batch that would create a fourth is rejected without changing the items. An invalid individual edit may be saved as work in progress but blocks issuance.</w:t>
@@ -848,11 +848,11 @@
     </w:p>
     <w:p>
       <w:pPr>
+        <w:pStyle w:val="Compact"/>
         <w:numPr>
           <w:ilvl w:val="0"/>
           <w:numId w:val="1003"/>
         </w:numPr>
-        <w:pStyle w:val="Compact"/>
       </w:pPr>
       <w:r>
         <w:t xml:space="preserve">Review the whole document, not only the edited sentence. Check recipients (the Recipients button opens copies, email and registered agent; Done closes it once the entries are valid), contact details, the mailing date, the item order and all warnings. The readiness summary at the top counts required fixes and advisories; Go to first required field jumps to the affected field, and Review (or Open full checklist) opens the Review dialog: checks that must be fixed before issuing, then advisories, or a statement that there are no concerns. Each check links to its field; closing the dialog returns you to where you were.</w:t>
@@ -860,11 +860,11 @@
     </w:p>
     <w:p>
       <w:pPr>
+        <w:pStyle w:val="Compact"/>
         <w:numPr>
           <w:ilvl w:val="0"/>
           <w:numId w:val="1003"/>
         </w:numPr>
-        <w:pStyle w:val="Compact"/>
       </w:pPr>
       <w:r>
         <w:t xml:space="preserve">Choose Save draft &amp; return to Workspace to retain unfinished work, or Issue when ready. After a confirmed shared save, Writer returns to Workspace with the issued case highlighted; if the save is refused or not confirmed, the document stays open. Verify the resulting save state.</w:t>
@@ -884,8 +884,8 @@
       </w:pPr>
       <w:r>
         <w:rPr>
+          <w:b/>
           <w:bCs/>
-          <w:b/>
         </w:rPr>
         <w:t xml:space="preserve">Initial citations.</w:t>
       </w:r>
@@ -970,8 +970,9 @@
       <w:tblPr>
         <w:tblStyle w:val="Table"/>
         <w:tblW w:type="pct" w:w="5000"/>
+        <w:jc w:val="left"/>
+        <w:tblLayout w:type="fixed"/>
         <w:tblLook w:firstRow="1" w:lastRow="0" w:firstColumn="0" w:lastColumn="0" w:noHBand="0" w:noVBand="0" w:val="0020"/>
-        <w:jc w:val="start"/>
       </w:tblPr>
       <w:tblGrid>
         <w:gridCol w:w="3960"/>
@@ -979,7 +980,7 @@
       </w:tblGrid>
       <w:tr>
         <w:trPr>
-          <w:tblHeader w:val="true"/>
+          <w:tblHeader w:val="on"/>
         </w:trPr>
         <w:tc>
           <w:tcPr/>
@@ -1151,8 +1152,8 @@
       </w:pPr>
       <w:r>
         <w:rPr>
+          <w:b/>
           <w:bCs/>
-          <w:b/>
         </w:rPr>
         <w:t xml:space="preserve">Review catalog.</w:t>
       </w:r>
@@ -1207,11 +1208,11 @@
     </w:p>
     <w:p>
       <w:pPr>
+        <w:pStyle w:val="Compact"/>
         <w:numPr>
           <w:ilvl w:val="0"/>
           <w:numId w:val="1004"/>
         </w:numPr>
-        <w:pStyle w:val="Compact"/>
       </w:pPr>
       <w:r>
         <w:t xml:space="preserve">Select one actual charged ordinance for each item. An item with several listed sections shows a Charged ordinance select with exactly those sections and nothing chosen; choose the section actually charged (saved drafts show the select unchosen and cannot be issued until a section is chosen). The deposit fields then fill from the configured schedule for the pricing date; changing the choice clears the previous charge’s values and prices the new one. If no single schedule entry applies, a blocking concern explains it rather than guessing an amount. Charging a section that is not listed on the item is a different charge and needs an approved source. Multiple offenses under one ordinance require the appropriate offense selection.</w:t>
@@ -1219,11 +1220,11 @@
     </w:p>
     <w:p>
       <w:pPr>
+        <w:pStyle w:val="Compact"/>
         <w:numPr>
           <w:ilvl w:val="0"/>
           <w:numId w:val="1004"/>
         </w:numPr>
-        <w:pStyle w:val="Compact"/>
       </w:pPr>
       <w:r>
         <w:t xml:space="preserve">Verify the description, citation number, officer or department identifier, issue date, violation date and time, court date and session. Court suggestions are not reservations; use the division’s current court and numbering instructions.</w:t>
@@ -1231,11 +1232,11 @@
     </w:p>
     <w:p>
       <w:pPr>
+        <w:pStyle w:val="Compact"/>
         <w:numPr>
           <w:ilvl w:val="0"/>
           <w:numId w:val="1004"/>
         </w:numPr>
-        <w:pStyle w:val="Compact"/>
       </w:pPr>
       <w:r>
         <w:t xml:space="preserve">Complete any required measurements in that charge card. Conditional or unmapped entries require review; the program must not borrow an unrelated amount.</w:t>
@@ -1243,11 +1244,11 @@
     </w:p>
     <w:p>
       <w:pPr>
+        <w:pStyle w:val="Compact"/>
         <w:numPr>
           <w:ilvl w:val="0"/>
           <w:numId w:val="1004"/>
         </w:numPr>
-        <w:pStyle w:val="Compact"/>
       </w:pPr>
       <w:r>
         <w:t xml:space="preserve">Complete the deposit method and its source. Choose Complete charge after the required fields are valid. Other unfinished charge cards remain unfinished.</w:t>
@@ -1255,11 +1256,11 @@
     </w:p>
     <w:p>
       <w:pPr>
+        <w:pStyle w:val="Compact"/>
         <w:numPr>
           <w:ilvl w:val="0"/>
           <w:numId w:val="1004"/>
         </w:numPr>
-        <w:pStyle w:val="Compact"/>
       </w:pPr>
       <w:r>
         <w:t xml:space="preserve">Review all four court copies for every charge and the complete letter before issuance. Confirm shared pricing/history checks. Changed history or a changed charge may require another deliberate pricing review.</w:t>
@@ -1269,8 +1270,9 @@
       <w:tblPr>
         <w:tblStyle w:val="Table"/>
         <w:tblW w:type="pct" w:w="5000"/>
+        <w:jc w:val="left"/>
+        <w:tblLayout w:type="fixed"/>
         <w:tblLook w:firstRow="1" w:lastRow="0" w:firstColumn="0" w:lastColumn="0" w:noHBand="0" w:noVBand="0" w:val="0020"/>
-        <w:jc w:val="start"/>
       </w:tblPr>
       <w:tblGrid>
         <w:gridCol w:w="3960"/>
@@ -1278,7 +1280,7 @@
       </w:tblGrid>
       <w:tr>
         <w:trPr>
-          <w:tblHeader w:val="true"/>
+          <w:tblHeader w:val="on"/>
         </w:trPr>
         <w:tc>
           <w:tcPr/>
@@ -1406,8 +1408,8 @@
       </w:pPr>
       <w:r>
         <w:rPr>
+          <w:b/>
           <w:bCs/>
-          <w:b/>
         </w:rPr>
         <w:t xml:space="preserve">Mandatory appearance.</w:t>
       </w:r>
@@ -1438,11 +1440,11 @@
     </w:p>
     <w:p>
       <w:pPr>
+        <w:pStyle w:val="Compact"/>
         <w:numPr>
           <w:ilvl w:val="0"/>
           <w:numId w:val="1005"/>
         </w:numPr>
-        <w:pStyle w:val="Compact"/>
       </w:pPr>
       <w:r>
         <w:t xml:space="preserve">Import the actual completed snow inspection. Verify parcel/site, respondent, mailing address, inspector, date and time.</w:t>
@@ -1450,11 +1452,11 @@
     </w:p>
     <w:p>
       <w:pPr>
+        <w:pStyle w:val="Compact"/>
         <w:numPr>
           <w:ilvl w:val="0"/>
           <w:numId w:val="1005"/>
         </w:numPr>
-        <w:pStyle w:val="Compact"/>
       </w:pPr>
       <w:r>
         <w:t xml:space="preserve">Enter the accumulation date, a positive decimal depth in inches and the observed condition: snow covered, ice covered, or snow and ice covered. Confirm photographs and select the corner-lot/curb-ramp option when factually applicable.</w:t>
@@ -1462,11 +1464,11 @@
     </w:p>
     <w:p>
       <w:pPr>
+        <w:pStyle w:val="Compact"/>
         <w:numPr>
           <w:ilvl w:val="0"/>
           <w:numId w:val="1005"/>
         </w:numPr>
-        <w:pStyle w:val="Compact"/>
       </w:pPr>
       <w:r>
         <w:t xml:space="preserve">Check the timing message. The supplied rule allows until noon City time on the day after accumulation. An observation before that point is blocked. Use actual facts; never adjust the date or time to pass a check.</w:t>
@@ -1474,11 +1476,11 @@
     </w:p>
     <w:p>
       <w:pPr>
+        <w:pStyle w:val="Compact"/>
         <w:numPr>
           <w:ilvl w:val="0"/>
           <w:numId w:val="1005"/>
         </w:numPr>
-        <w:pStyle w:val="Compact"/>
       </w:pPr>
       <w:r>
         <w:t xml:space="preserve">Review ordinance 10.28, number, description, comment, counted property history, deposit and court session. Refresh citation history if prompted. Missing parcels use the existing normalized address fallback, which requires particular attention to source identity.</w:t>
@@ -1486,11 +1488,11 @@
     </w:p>
     <w:p>
       <w:pPr>
+        <w:pStyle w:val="Compact"/>
         <w:numPr>
           <w:ilvl w:val="0"/>
           <w:numId w:val="1005"/>
         </w:numPr>
-        <w:pStyle w:val="Compact"/>
       </w:pPr>
       <w:r>
         <w:t xml:space="preserve">Review seasonal letter content. After an authorized administrator changes it, choose Refresh seasonal letter and review the new content. Stale shared content prevents issuance until reconciled.</w:t>
@@ -1498,11 +1500,11 @@
     </w:p>
     <w:p>
       <w:pPr>
+        <w:pStyle w:val="Compact"/>
         <w:numPr>
           <w:ilvl w:val="0"/>
           <w:numId w:val="1005"/>
         </w:numPr>
-        <w:pStyle w:val="Compact"/>
       </w:pPr>
       <w:r>
         <w:t xml:space="preserve">Issue, confirm the shared save (Writer returns to Workspace with the case highlighted) and verify the original PDF. The standard authoring-11 packet includes the snow cover and retained language-access continuation plus four MC-2000 copies; a cover may continue onto another page. Do not force a five-page total or remove language to shorten the packet.</w:t>
@@ -1522,8 +1524,8 @@
       </w:pPr>
       <w:r>
         <w:rPr>
+          <w:b/>
           <w:bCs/>
-          <w:b/>
         </w:rPr>
         <w:t xml:space="preserve">Division policy decisions.</w:t>
       </w:r>
@@ -1558,8 +1560,8 @@
       </w:pPr>
       <w:r>
         <w:rPr>
+          <w:b/>
           <w:bCs/>
-          <w:b/>
         </w:rPr>
         <w:t xml:space="preserve">Group due dates on reinspection.</w:t>
       </w:r>
@@ -1567,7 +1569,7 @@
         <w:t xml:space="preserve"> </w:t>
       </w:r>
       <w:r>
-        <w:t xml:space="preserve">On an open reinspection worksheet, Assign due dates lists the items still outstanding; select items, choose a date and Apply date to selected items. Undo restores the previous dates. The three-date limit and seven-day spacing apply.</w:t>
+        <w:t xml:space="preserve">On an open reinspection worksheet with an extension or citation intent (or before choosing an intent), Assign due dates appears beside item review, outside collapsed Inspection checks. It lists the items still outstanding; select items, choose a date and Apply date to selected items. The selected-item count shows the scope within this reinspection only. Corrected, withdrawn and carried results are excluded. Undo restores the previous dates while the worksheet remains editable. The three-date limit and seven-day spacing apply.</w:t>
       </w:r>
     </w:p>
     <w:p>
@@ -1584,8 +1586,8 @@
       </w:pPr>
       <w:r>
         <w:rPr>
+          <w:b/>
           <w:bCs/>
-          <w:b/>
         </w:rPr>
         <w:t xml:space="preserve">One item at a time.</w:t>
       </w:r>
@@ -1600,8 +1602,9 @@
       <w:tblPr>
         <w:tblStyle w:val="Table"/>
         <w:tblW w:type="pct" w:w="5000"/>
+        <w:jc w:val="left"/>
+        <w:tblLayout w:type="fixed"/>
         <w:tblLook w:firstRow="1" w:lastRow="0" w:firstColumn="0" w:lastColumn="0" w:noHBand="0" w:noVBand="0" w:val="0020"/>
-        <w:jc w:val="start"/>
       </w:tblPr>
       <w:tblGrid>
         <w:gridCol w:w="3960"/>
@@ -1609,7 +1612,7 @@
       </w:tblGrid>
       <w:tr>
         <w:trPr>
-          <w:tblHeader w:val="true"/>
+          <w:tblHeader w:val="on"/>
         </w:trPr>
         <w:tc>
           <w:tcPr/>
@@ -1777,8 +1780,9 @@
       <w:tblPr>
         <w:tblStyle w:val="Table"/>
         <w:tblW w:type="pct" w:w="5000"/>
+        <w:jc w:val="left"/>
+        <w:tblLayout w:type="fixed"/>
         <w:tblLook w:firstRow="1" w:lastRow="0" w:firstColumn="0" w:lastColumn="0" w:noHBand="0" w:noVBand="0" w:val="0020"/>
-        <w:jc w:val="start"/>
       </w:tblPr>
       <w:tblGrid>
         <w:gridCol w:w="3960"/>
@@ -1786,7 +1790,7 @@
       </w:tblGrid>
       <w:tr>
         <w:trPr>
-          <w:tblHeader w:val="true"/>
+          <w:tblHeader w:val="on"/>
         </w:trPr>
         <w:tc>
           <w:tcPr/>
@@ -2130,8 +2134,8 @@
       </w:pPr>
       <w:r>
         <w:rPr>
+          <w:b/>
           <w:bCs/>
-          <w:b/>
         </w:rPr>
         <w:t xml:space="preserve">Summary Abatement.</w:t>
       </w:r>
@@ -2148,8 +2152,8 @@
       </w:pPr>
       <w:r>
         <w:rPr>
+          <w:b/>
           <w:bCs/>
-          <w:b/>
         </w:rPr>
         <w:t xml:space="preserve">Non-Summary Abatement.</w:t>
       </w:r>
@@ -2166,8 +2170,8 @@
       </w:pPr>
       <w:r>
         <w:rPr>
+          <w:b/>
           <w:bCs/>
-          <w:b/>
         </w:rPr>
         <w:t xml:space="preserve">No Occupancy.</w:t>
       </w:r>
@@ -2184,8 +2188,8 @@
       </w:pPr>
       <w:r>
         <w:rPr>
+          <w:b/>
           <w:bCs/>
-          <w:b/>
         </w:rPr>
         <w:t xml:space="preserve">Best Interest Extension.</w:t>
       </w:r>
@@ -2202,8 +2206,8 @@
       </w:pPr>
       <w:r>
         <w:rPr>
+          <w:b/>
           <w:bCs/>
-          <w:b/>
         </w:rPr>
         <w:t xml:space="preserve">Vacancy Extension.</w:t>
       </w:r>
@@ -2220,8 +2224,8 @@
       </w:pPr>
       <w:r>
         <w:rPr>
+          <w:b/>
           <w:bCs/>
-          <w:b/>
         </w:rPr>
         <w:t xml:space="preserve">R54 extension layout.</w:t>
       </w:r>
@@ -2282,8 +2286,8 @@
       </w:pPr>
       <w:r>
         <w:rPr>
+          <w:b/>
           <w:bCs/>
-          <w:b/>
         </w:rPr>
         <w:t xml:space="preserve">Issue deliberately.</w:t>
       </w:r>
@@ -2298,8 +2302,9 @@
       <w:tblPr>
         <w:tblStyle w:val="Table"/>
         <w:tblW w:type="pct" w:w="5000"/>
+        <w:jc w:val="left"/>
+        <w:tblLayout w:type="fixed"/>
         <w:tblLook w:firstRow="1" w:lastRow="0" w:firstColumn="0" w:lastColumn="0" w:noHBand="0" w:noVBand="0" w:val="0020"/>
-        <w:jc w:val="start"/>
       </w:tblPr>
       <w:tblGrid>
         <w:gridCol w:w="3960"/>
@@ -2307,7 +2312,7 @@
       </w:tblGrid>
       <w:tr>
         <w:trPr>
-          <w:tblHeader w:val="true"/>
+          <w:tblHeader w:val="on"/>
         </w:trPr>
         <w:tc>
           <w:tcPr/>
@@ -2445,8 +2450,8 @@
       </w:pPr>
       <w:r>
         <w:rPr>
+          <w:b/>
           <w:bCs/>
-          <w:b/>
         </w:rPr>
         <w:t xml:space="preserve">Original PDFs.</w:t>
       </w:r>
@@ -2463,8 +2468,8 @@
       </w:pPr>
       <w:r>
         <w:rPr>
+          <w:b/>
           <w:bCs/>
-          <w:b/>
         </w:rPr>
         <w:t xml:space="preserve">Print and mail.</w:t>
       </w:r>
@@ -2481,8 +2486,8 @@
       </w:pPr>
       <w:r>
         <w:rPr>
+          <w:b/>
           <w:bCs/>
-          <w:b/>
         </w:rPr>
         <w:t xml:space="preserve">Email.</w:t>
       </w:r>
@@ -2499,8 +2504,8 @@
       </w:pPr>
       <w:r>
         <w:rPr>
+          <w:b/>
           <w:bCs/>
-          <w:b/>
         </w:rPr>
         <w:t xml:space="preserve">Outside records.</w:t>
       </w:r>
@@ -2531,11 +2536,11 @@
     </w:p>
     <w:p>
       <w:pPr>
+        <w:pStyle w:val="Compact"/>
         <w:numPr>
           <w:ilvl w:val="0"/>
           <w:numId w:val="1006"/>
         </w:numPr>
-        <w:pStyle w:val="Compact"/>
       </w:pPr>
       <w:r>
         <w:t xml:space="preserve">Open the issued document from case history and choose Correct document.</w:t>
@@ -2543,11 +2548,11 @@
     </w:p>
     <w:p>
       <w:pPr>
+        <w:pStyle w:val="Compact"/>
         <w:numPr>
           <w:ilvl w:val="0"/>
           <w:numId w:val="1006"/>
         </w:numPr>
-        <w:pStyle w:val="Compact"/>
       </w:pPr>
       <w:r>
         <w:t xml:space="preserve">State the recording error and reason. For a citation or referral, record the actual receiving court or City Attorney amendment instructions/reference where required. The program does not issue those instructions for you.</w:t>
@@ -2555,11 +2560,11 @@
     </w:p>
     <w:p>
       <w:pPr>
+        <w:pStyle w:val="Compact"/>
         <w:numPr>
           <w:ilvl w:val="0"/>
           <w:numId w:val="1006"/>
         </w:numPr>
-        <w:pStyle w:val="Compact"/>
       </w:pPr>
       <w:r>
         <w:t xml:space="preserve">Make the permitted correction. Review the before/after comparison, affected case facts and linked worksheet facts. Keep the original document, item, root, visit and citation identities.</w:t>
@@ -2567,11 +2572,11 @@
     </w:p>
     <w:p>
       <w:pPr>
+        <w:pStyle w:val="Compact"/>
         <w:numPr>
           <w:ilvl w:val="0"/>
           <w:numId w:val="1006"/>
         </w:numPr>
-        <w:pStyle w:val="Compact"/>
       </w:pPr>
       <w:r>
         <w:t xml:space="preserve">Review and issue the linked revision. Until its shared save is confirmed, the earlier issued version remains effective in the program.</w:t>
@@ -2579,11 +2584,11 @@
     </w:p>
     <w:p>
       <w:pPr>
+        <w:pStyle w:val="Compact"/>
         <w:numPr>
           <w:ilvl w:val="0"/>
           <w:numId w:val="1006"/>
         </w:numPr>
-        <w:pStyle w:val="Compact"/>
       </w:pPr>
       <w:r>
         <w:t xml:space="preserve">Confirm the correction’s original PDF and complete outside amendment, mailing and recording steps under the actual procedure.</w:t>
@@ -2595,8 +2600,8 @@
       </w:pPr>
       <w:r>
         <w:rPr>
+          <w:b/>
           <w:bCs/>
-          <w:b/>
         </w:rPr>
         <w:t xml:space="preserve">Withdraw an item.</w:t>
       </w:r>
@@ -2613,8 +2618,8 @@
       </w:pPr>
       <w:r>
         <w:rPr>
+          <w:b/>
           <w:bCs/>
-          <w:b/>
         </w:rPr>
         <w:t xml:space="preserve">Correct a visit.</w:t>
       </w:r>
@@ -2631,8 +2636,8 @@
       </w:pPr>
       <w:r>
         <w:rPr>
+          <w:b/>
           <w:bCs/>
-          <w:b/>
         </w:rPr>
         <w:t xml:space="preserve">Citation prices and dates.</w:t>
       </w:r>
@@ -2649,8 +2654,8 @@
       </w:pPr>
       <w:r>
         <w:rPr>
+          <w:b/>
           <w:bCs/>
-          <w:b/>
         </w:rPr>
         <w:t xml:space="preserve">Restrictions and release.</w:t>
       </w:r>
@@ -2691,8 +2696,9 @@
       <w:tblPr>
         <w:tblStyle w:val="Table"/>
         <w:tblW w:type="pct" w:w="5000"/>
+        <w:jc w:val="left"/>
+        <w:tblLayout w:type="fixed"/>
         <w:tblLook w:firstRow="1" w:lastRow="0" w:firstColumn="0" w:lastColumn="0" w:noHBand="0" w:noVBand="0" w:val="0020"/>
-        <w:jc w:val="start"/>
       </w:tblPr>
       <w:tblGrid>
         <w:gridCol w:w="3960"/>
@@ -2700,7 +2706,7 @@
       </w:tblGrid>
       <w:tr>
         <w:trPr>
-          <w:tblHeader w:val="true"/>
+          <w:tblHeader w:val="on"/>
         </w:trPr>
         <w:tc>
           <w:tcPr/>
@@ -2812,8 +2818,8 @@
       </w:pPr>
       <w:r>
         <w:rPr>
+          <w:b/>
           <w:bCs/>
-          <w:b/>
         </w:rPr>
         <w:t xml:space="preserve">Device save failure.</w:t>
       </w:r>
@@ -2830,8 +2836,8 @@
       </w:pPr>
       <w:r>
         <w:rPr>
+          <w:b/>
           <w:bCs/>
-          <w:b/>
         </w:rPr>
         <w:t xml:space="preserve">Uncertain shared save.</w:t>
       </w:r>
@@ -2848,8 +2854,8 @@
       </w:pPr>
       <w:r>
         <w:rPr>
+          <w:b/>
           <w:bCs/>
-          <w:b/>
         </w:rPr>
         <w:t xml:space="preserve">Shared changes.</w:t>
       </w:r>
@@ -2866,8 +2872,8 @@
       </w:pPr>
       <w:r>
         <w:rPr>
+          <w:b/>
           <w:bCs/>
-          <w:b/>
         </w:rPr>
         <w:t xml:space="preserve">PDF exceptions.</w:t>
       </w:r>
@@ -2916,8 +2922,9 @@
       <w:tblPr>
         <w:tblStyle w:val="Table"/>
         <w:tblW w:type="pct" w:w="5000"/>
+        <w:jc w:val="left"/>
+        <w:tblLayout w:type="fixed"/>
         <w:tblLook w:firstRow="1" w:lastRow="0" w:firstColumn="0" w:lastColumn="0" w:noHBand="0" w:noVBand="0" w:val="0020"/>
-        <w:jc w:val="start"/>
       </w:tblPr>
       <w:tblGrid>
         <w:gridCol w:w="3960"/>
@@ -2925,7 +2932,7 @@
       </w:tblGrid>
       <w:tr>
         <w:trPr>
-          <w:tblHeader w:val="true"/>
+          <w:tblHeader w:val="on"/>
         </w:trPr>
         <w:tc>
           <w:tcPr/>
@@ -3115,8 +3122,8 @@
       </w:pPr>
       <w:r>
         <w:rPr>
+          <w:b/>
           <w:bCs/>
-          <w:b/>
         </w:rPr>
         <w:t xml:space="preserve">Recover one case.</w:t>
       </w:r>
@@ -3133,8 +3140,8 @@
       </w:pPr>
       <w:r>
         <w:rPr>
+          <w:b/>
           <w:bCs/>
-          <w:b/>
         </w:rPr>
         <w:t xml:space="preserve">Restore a workspace.</w:t>
       </w:r>
@@ -3151,8 +3158,8 @@
       </w:pPr>
       <w:r>
         <w:rPr>
+          <w:b/>
           <w:bCs/>
-          <w:b/>
         </w:rPr>
         <w:t xml:space="preserve">Change PCs or browser profiles.</w:t>
       </w:r>
@@ -3169,8 +3176,8 @@
       </w:pPr>
       <w:r>
         <w:rPr>
+          <w:b/>
           <w:bCs/>
-          <w:b/>
         </w:rPr>
         <w:t xml:space="preserve">After an update interruption.</w:t>
       </w:r>
@@ -3187,8 +3194,8 @@
       </w:pPr>
       <w:r>
         <w:rPr>
+          <w:b/>
           <w:bCs/>
-          <w:b/>
         </w:rPr>
         <w:t xml:space="preserve">Test recovery.</w:t>
       </w:r>
@@ -3221,8 +3228,9 @@
       <w:tblPr>
         <w:tblStyle w:val="Table"/>
         <w:tblW w:type="pct" w:w="5000"/>
+        <w:jc w:val="left"/>
+        <w:tblLayout w:type="fixed"/>
         <w:tblLook w:firstRow="1" w:lastRow="0" w:firstColumn="0" w:lastColumn="0" w:noHBand="0" w:noVBand="0" w:val="0020"/>
-        <w:jc w:val="start"/>
       </w:tblPr>
       <w:tblGrid>
         <w:gridCol w:w="3960"/>
@@ -3230,7 +3238,7 @@
       </w:tblGrid>
       <w:tr>
         <w:trPr>
-          <w:tblHeader w:val="true"/>
+          <w:tblHeader w:val="on"/>
         </w:trPr>
         <w:tc>
           <w:tcPr/>
@@ -3592,8 +3600,8 @@
       </w:pPr>
       <w:r>
         <w:rPr>
+          <w:b/>
           <w:bCs/>
-          <w:b/>
         </w:rPr>
         <w:t xml:space="preserve">Check coverage first.</w:t>
       </w:r>
@@ -3618,8 +3626,8 @@
       </w:pPr>
       <w:r>
         <w:rPr>
+          <w:b/>
           <w:bCs/>
-          <w:b/>
         </w:rPr>
         <w:t xml:space="preserve">Maps.</w:t>
       </w:r>
@@ -3636,8 +3644,8 @@
       </w:pPr>
       <w:r>
         <w:rPr>
+          <w:b/>
           <w:bCs/>
-          <w:b/>
         </w:rPr>
         <w:t xml:space="preserve">Drill into data.</w:t>
       </w:r>
@@ -3654,8 +3662,8 @@
       </w:pPr>
       <w:r>
         <w:rPr>
+          <w:b/>
           <w:bCs/>
-          <w:b/>
         </w:rPr>
         <w:t xml:space="preserve">Export.</w:t>
       </w:r>
@@ -3672,8 +3680,8 @@
       </w:pPr>
       <w:r>
         <w:rPr>
+          <w:b/>
           <w:bCs/>
-          <w:b/>
         </w:rPr>
         <w:t xml:space="preserve">Deposit schedule.</w:t>
       </w:r>
@@ -3690,8 +3698,8 @@
       </w:pPr>
       <w:r>
         <w:rPr>
+          <w:b/>
           <w:bCs/>
-          <w:b/>
         </w:rPr>
         <w:t xml:space="preserve">Refresh speed.</w:t>
       </w:r>
@@ -3726,8 +3734,8 @@
       </w:pPr>
       <w:r>
         <w:rPr>
+          <w:b/>
           <w:bCs/>
-          <w:b/>
         </w:rPr>
         <w:t xml:space="preserve">Search shared case records.</w:t>
       </w:r>
@@ -3735,7 +3743,7 @@
         <w:t xml:space="preserve"> </w:t>
       </w:r>
       <w:r>
-        <w:t xml:space="preserve">Use the shared search, also on the Workspace toolbar, when a case is not loaded in Workspace. Review identity and open it through the existing shared-history checks. A search result does not override a conflict, active draft or unreadable record.</w:t>
+        <w:t xml:space="preserve">Use the shared search, also in Workspace’s Start or find case work area, when a case is not loaded in Workspace. Review identity and open it through the existing shared-history checks. A search result does not override a conflict, active draft or unreadable record.</w:t>
       </w:r>
     </w:p>
     <w:p>
@@ -3744,8 +3752,8 @@
       </w:pPr>
       <w:r>
         <w:rPr>
+          <w:b/>
           <w:bCs/>
-          <w:b/>
         </w:rPr>
         <w:t xml:space="preserve">Reminders.</w:t>
       </w:r>
@@ -3762,8 +3770,8 @@
       </w:pPr>
       <w:r>
         <w:rPr>
+          <w:b/>
           <w:bCs/>
-          <w:b/>
         </w:rPr>
         <w:t xml:space="preserve">Batch draft due dates.</w:t>
       </w:r>
@@ -3780,8 +3788,8 @@
       </w:pPr>
       <w:r>
         <w:rPr>
+          <w:b/>
           <w:bCs/>
-          <w:b/>
         </w:rPr>
         <w:t xml:space="preserve">Open saved case.</w:t>
       </w:r>
@@ -3798,8 +3806,8 @@
       </w:pPr>
       <w:r>
         <w:rPr>
+          <w:b/>
           <w:bCs/>
-          <w:b/>
         </w:rPr>
         <w:t xml:space="preserve">Display.</w:t>
       </w:r>
@@ -3816,8 +3824,8 @@
       </w:pPr>
       <w:r>
         <w:rPr>
+          <w:b/>
           <w:bCs/>
-          <w:b/>
         </w:rPr>
         <w:t xml:space="preserve">Messages.</w:t>
       </w:r>
@@ -3834,8 +3842,8 @@
       </w:pPr>
       <w:r>
         <w:rPr>
+          <w:b/>
           <w:bCs/>
-          <w:b/>
         </w:rPr>
         <w:t xml:space="preserve">Administrative deposit exceptions.</w:t>
       </w:r>
@@ -3878,8 +3886,8 @@
       </w:pPr>
       <w:r>
         <w:rPr>
+          <w:b/>
           <w:bCs/>
-          <w:b/>
         </w:rPr>
         <w:t xml:space="preserve">Shared folders.</w:t>
       </w:r>
@@ -3896,8 +3904,8 @@
       </w:pPr>
       <w:r>
         <w:rPr>
+          <w:b/>
           <w:bCs/>
-          <w:b/>
         </w:rPr>
         <w:t xml:space="preserve">Protected anchor.</w:t>
       </w:r>
@@ -3914,8 +3922,8 @@
       </w:pPr>
       <w:r>
         <w:rPr>
+          <w:b/>
           <w:bCs/>
-          <w:b/>
         </w:rPr>
         <w:t xml:space="preserve">Record holds.</w:t>
       </w:r>
@@ -3932,8 +3940,8 @@
       </w:pPr>
       <w:r>
         <w:rPr>
+          <w:b/>
           <w:bCs/>
-          <w:b/>
         </w:rPr>
         <w:t xml:space="preserve">Locks.</w:t>
       </w:r>
@@ -3950,8 +3958,8 @@
       </w:pPr>
       <w:r>
         <w:rPr>
+          <w:b/>
           <w:bCs/>
-          <w:b/>
         </w:rPr>
         <w:t xml:space="preserve">Approved connections.</w:t>
       </w:r>
@@ -3968,8 +3976,8 @@
       </w:pPr>
       <w:r>
         <w:rPr>
+          <w:b/>
           <w:bCs/>
-          <w:b/>
         </w:rPr>
         <w:t xml:space="preserve">SQL.</w:t>
       </w:r>
@@ -3986,8 +3994,8 @@
       </w:pPr>
       <w:r>
         <w:rPr>
+          <w:b/>
           <w:bCs/>
-          <w:b/>
         </w:rPr>
         <w:t xml:space="preserve">Policy and catalog.</w:t>
       </w:r>
@@ -4004,8 +4012,8 @@
       </w:pPr>
       <w:r>
         <w:rPr>
+          <w:b/>
           <w:bCs/>
-          <w:b/>
         </w:rPr>
         <w:t xml:space="preserve">Retention.</w:t>
       </w:r>
@@ -4022,8 +4030,8 @@
       </w:pPr>
       <w:r>
         <w:rPr>
+          <w:b/>
           <w:bCs/>
-          <w:b/>
         </w:rPr>
         <w:t xml:space="preserve">Release ownership.</w:t>
       </w:r>
@@ -4056,8 +4064,9 @@
       <w:tblPr>
         <w:tblStyle w:val="Table"/>
         <w:tblW w:type="pct" w:w="5000"/>
+        <w:jc w:val="left"/>
+        <w:tblLayout w:type="fixed"/>
         <w:tblLook w:firstRow="1" w:lastRow="0" w:firstColumn="0" w:lastColumn="0" w:noHBand="0" w:noVBand="0" w:val="0020"/>
-        <w:jc w:val="start"/>
       </w:tblPr>
       <w:tblGrid>
         <w:gridCol w:w="3960"/>
@@ -4065,7 +4074,7 @@
       </w:tblGrid>
       <w:tr>
         <w:trPr>
-          <w:tblHeader w:val="true"/>
+          <w:tblHeader w:val="on"/>
         </w:trPr>
         <w:tc>
           <w:tcPr/>
@@ -4237,8 +4246,8 @@
       </w:pPr>
       <w:r>
         <w:rPr>
+          <w:b/>
           <w:bCs/>
-          <w:b/>
         </w:rPr>
         <w:t xml:space="preserve">Read the whole task.</w:t>
       </w:r>
@@ -4255,8 +4264,8 @@
       </w:pPr>
       <w:r>
         <w:rPr>
+          <w:b/>
           <w:bCs/>
-          <w:b/>
         </w:rPr>
         <w:t xml:space="preserve">Small screens and zoom.</w:t>
       </w:r>
@@ -4264,7 +4273,7 @@
         <w:t xml:space="preserve"> </w:t>
       </w:r>
       <w:r>
-        <w:t xml:space="preserve">The five Writer destinations remain available. On a narrow screen (760 CSS pixels or less) the document editor uses a compact header and one task bar at the bottom with the save state, Next required field, Review and the primary action; Review opens the Review dialog; the bar hides while you type in a field or a dialog is open and is never printed. Use vertical scrolling and the applicable table’s own scroll area when a wide data table needs it. At high zoom, inspect the actual field labels and current action rather than relying on desktop positions. The HTML manual reflows at 320 CSS pixels and supports browser zoom and find.</w:t>
+        <w:t xml:space="preserve">The four Writer destinations remain available; open Import inspection from Workspace. On a narrow screen (760 CSS pixels or less) the document editor uses a compact header and one task bar at the bottom with the save state, Next required field, Review and the primary action; Review opens the Review dialog; the bar hides while you type in a field or a dialog is open and is never printed. Use vertical scrolling and the applicable table’s own scroll area when a wide data table needs it. At high zoom, inspect the actual field labels and current action rather than relying on desktop positions. The HTML manual reflows at 320 CSS pixels and supports browser zoom and find.</w:t>
       </w:r>
     </w:p>
     <w:p>
@@ -4273,8 +4282,8 @@
       </w:pPr>
       <w:r>
         <w:rPr>
+          <w:b/>
           <w:bCs/>
-          <w:b/>
         </w:rPr>
         <w:t xml:space="preserve">Display preferences.</w:t>
       </w:r>
@@ -4315,8 +4324,9 @@
       <w:tblPr>
         <w:tblStyle w:val="Table"/>
         <w:tblW w:type="pct" w:w="5000"/>
+        <w:jc w:val="left"/>
+        <w:tblLayout w:type="fixed"/>
         <w:tblLook w:firstRow="1" w:lastRow="0" w:firstColumn="0" w:lastColumn="0" w:noHBand="0" w:noVBand="0" w:val="0020"/>
-        <w:jc w:val="start"/>
       </w:tblPr>
       <w:tblGrid>
         <w:gridCol w:w="3960"/>
@@ -4324,7 +4334,7 @@
       </w:tblGrid>
       <w:tr>
         <w:trPr>
-          <w:tblHeader w:val="true"/>
+          <w:tblHeader w:val="on"/>
         </w:trPr>
         <w:tc>
           <w:tcPr/>
@@ -5048,7 +5058,7 @@
       </w:r>
     </w:p>
     <w:bookmarkEnd w:id="40"/>
-    <w:bookmarkStart w:id="41" w:name="practice-tasks-and-reference-terms"/>
+    <w:bookmarkStart w:id="42" w:name="practice-tasks-and-reference-terms"/>
     <w:p>
       <w:pPr>
         <w:pStyle w:val="Heading2"/>
@@ -5071,8 +5081,8 @@
       </w:pPr>
       <w:r>
         <w:rPr>
+          <w:b/>
           <w:bCs/>
-          <w:b/>
         </w:rPr>
         <w:t xml:space="preserve">Import and notice.</w:t>
       </w:r>
@@ -5089,8 +5099,8 @@
       </w:pPr>
       <w:r>
         <w:rPr>
+          <w:b/>
           <w:bCs/>
-          <w:b/>
         </w:rPr>
         <w:t xml:space="preserve">Snow.</w:t>
       </w:r>
@@ -5107,8 +5117,8 @@
       </w:pPr>
       <w:r>
         <w:rPr>
+          <w:b/>
           <w:bCs/>
-          <w:b/>
         </w:rPr>
         <w:t xml:space="preserve">Reinspection.</w:t>
       </w:r>
@@ -5125,8 +5135,8 @@
       </w:pPr>
       <w:r>
         <w:rPr>
+          <w:b/>
           <w:bCs/>
-          <w:b/>
         </w:rPr>
         <w:t xml:space="preserve">Correction and recovery.</w:t>
       </w:r>
@@ -5143,8 +5153,8 @@
       </w:pPr>
       <w:r>
         <w:rPr>
+          <w:b/>
           <w:bCs/>
-          <w:b/>
         </w:rPr>
         <w:t xml:space="preserve">Reports and accessibility.</w:t>
       </w:r>
@@ -5159,8 +5169,9 @@
       <w:tblPr>
         <w:tblStyle w:val="Table"/>
         <w:tblW w:type="pct" w:w="5000"/>
+        <w:jc w:val="left"/>
+        <w:tblLayout w:type="fixed"/>
         <w:tblLook w:firstRow="1" w:lastRow="0" w:firstColumn="0" w:lastColumn="0" w:noHBand="0" w:noVBand="0" w:val="0020"/>
-        <w:jc w:val="start"/>
       </w:tblPr>
       <w:tblGrid>
         <w:gridCol w:w="3960"/>
@@ -5168,7 +5179,7 @@
       </w:tblGrid>
       <w:tr>
         <w:trPr>
-          <w:tblHeader w:val="true"/>
+          <w:tblHeader w:val="on"/>
         </w:trPr>
         <w:tc>
           <w:tcPr/>
@@ -5438,16 +5449,58 @@
         <w:t xml:space="preserve">The release package records technical verification and remaining City acceptance. Use the City acceptance record (Rnn-ACCEPTANCE-RECORD.md) to record the remaining City tests and approvals. Historical release reviews explain development provenance and do not override this manual.</w:t>
       </w:r>
     </w:p>
+    <w:bookmarkStart w:id="41" w:name="X7f8bc2be8e057229ddb3e0d5af6d4d1dbcfc12e"/>
     <w:p>
       <w:pPr>
+        <w:pStyle w:val="Heading3"/>
+      </w:pPr>
+      <w:r>
+        <w:t xml:space="preserve">Current Workspace and referral improvements</w:t>
+      </w:r>
+    </w:p>
+    <w:p>
+      <w:pPr>
+        <w:pStyle w:val="FirstParagraph"/>
+      </w:pPr>
+      <w:r>
+        <w:t xml:space="preserve">To fill a missing corrective-action detail, activate its fill-in bubble, enter text in Add corrective-action detail and choose Save. Cancel or Escape leaves the bubble unchanged. The dialog returns focus to the item and uses the ordinary draft-saving process.</w:t>
+      </w:r>
+    </w:p>
+    <w:p>
+      <w:pPr>
         <w:pStyle w:val="BodyText"/>
       </w:pPr>
       <w:r>
-        <w:t xml:space="preserve">Manual source digest 1a1d3399f0ace3ef.</w:t>
+        <w:t xml:space="preserve">Citation editors initially show representative court copies to keep editing compact. Choose Show all four citation copies to inspect Court, Agency, Inspector and Defendant copies. Every final citation packet contains all four distinct approved copies for each charge; longer packets may contain additional letter or continuation pages. Verify the issued PDF, not only the compact editor view.</w:t>
+      </w:r>
+    </w:p>
+    <w:p>
+      <w:pPr>
+        <w:pStyle w:val="BodyText"/>
+      </w:pPr>
+      <w:r>
+        <w:t xml:space="preserve">New City Attorney referrals and updates show each item’s recorded inspection observations, including corrected items. Days Outstanding starts at that item’s first observation and stops at correction; an outstanding item uses its latest recorded observation. Later inspections do not increase a corrected item’s duration. Unrelated visits and carried findings are excluded. Missing or inconsistent dates display Unavailable; investigate the source record rather than assuming zero days. Previously issued referrals keep their historical format.</w:t>
+      </w:r>
+    </w:p>
+    <w:p>
+      <w:pPr>
+        <w:pStyle w:val="BodyText"/>
+      </w:pPr>
+      <w:r>
+        <w:t xml:space="preserve">In the editor, mailing addresses flow below the header to prevent overlap when interactive fields expand. Issued PDFs retain their existing approved left-window positioning. Native envelope and printer acceptance remains required.</w:t>
+      </w:r>
+    </w:p>
+    <w:p>
+      <w:pPr>
+        <w:pStyle w:val="BodyText"/>
+      </w:pPr>
+      <w:r>
+        <w:t xml:space="preserve">Manual source digest 0c79cfc774f2c333.</w:t>
       </w:r>
     </w:p>
     <w:bookmarkEnd w:id="41"/>
     <w:bookmarkEnd w:id="42"/>
+    <w:bookmarkEnd w:id="43"/>
     <w:sectPr>
       <w:headerReference r:id="rId9" w:type="default"/>
       <w:footerReference r:id="rId10" w:type="default"/>
@@ -5691,7 +5744,7 @@
     </w:lvl>
   </w:abstractNum>
   <w:abstractNum w:abstractNumId="990">
-    <w:nsid w:val="A990"/>
+    <w:nsid w:val="0000A990"/>
     <w:multiLevelType w:val="multilevel"/>
     <w:lvl w:ilvl="0">
       <w:numFmt w:val="bullet"/>
@@ -5767,7 +5820,7 @@
     </w:lvl>
   </w:abstractNum>
   <w:abstractNum w:abstractNumId="99411">
-    <w:nsid w:val="A99411"/>
+    <w:nsid w:val="00A99411"/>
     <w:multiLevelType w:val="multilevel"/>
     <w:lvl w:ilvl="0">
       <w:start w:val="1"/>
@@ -5852,7 +5905,7 @@
     </w:lvl>
   </w:abstractNum>
   <w:abstractNum w:abstractNumId="991">
-    <w:nsid w:val="A991"/>
+    <w:nsid w:val="0000A991"/>
     <w:multiLevelType w:val="multilevel"/>
     <w:lvl w:ilvl="0">
       <w:numFmt w:val="bullet"/>
@@ -20686,7 +20739,7 @@
     <w:basedOn w:val="VerbatimChar"/>
     <w:rPr/>
   </w:style>
-  <w:style w:type="character" w:customStyle="1" w:styleId="KeywordTok">
+  <w:style w:customStyle="1" w:styleId="KeywordTok" w:type="character">
     <w:name w:val="KeywordTok"/>
     <w:basedOn w:val="VerbatimChar"/>
     <w:rPr>
@@ -20694,77 +20747,77 @@
       <w:b/>
     </w:rPr>
   </w:style>
-  <w:style w:type="character" w:customStyle="1" w:styleId="DataTypeTok">
+  <w:style w:customStyle="1" w:styleId="DataTypeTok" w:type="character">
     <w:name w:val="DataTypeTok"/>
     <w:basedOn w:val="VerbatimChar"/>
     <w:rPr>
       <w:color w:val="902000"/>
     </w:rPr>
   </w:style>
-  <w:style w:type="character" w:customStyle="1" w:styleId="DecValTok">
+  <w:style w:customStyle="1" w:styleId="DecValTok" w:type="character">
     <w:name w:val="DecValTok"/>
     <w:basedOn w:val="VerbatimChar"/>
     <w:rPr>
       <w:color w:val="40a070"/>
     </w:rPr>
   </w:style>
-  <w:style w:type="character" w:customStyle="1" w:styleId="BaseNTok">
+  <w:style w:customStyle="1" w:styleId="BaseNTok" w:type="character">
     <w:name w:val="BaseNTok"/>
     <w:basedOn w:val="VerbatimChar"/>
     <w:rPr>
       <w:color w:val="40a070"/>
     </w:rPr>
   </w:style>
-  <w:style w:type="character" w:customStyle="1" w:styleId="FloatTok">
+  <w:style w:customStyle="1" w:styleId="FloatTok" w:type="character">
     <w:name w:val="FloatTok"/>
     <w:basedOn w:val="VerbatimChar"/>
     <w:rPr>
       <w:color w:val="40a070"/>
     </w:rPr>
   </w:style>
-  <w:style w:type="character" w:customStyle="1" w:styleId="ConstantTok">
+  <w:style w:customStyle="1" w:styleId="ConstantTok" w:type="character">
     <w:name w:val="ConstantTok"/>
     <w:basedOn w:val="VerbatimChar"/>
     <w:rPr>
       <w:color w:val="880000"/>
     </w:rPr>
   </w:style>
-  <w:style w:type="character" w:customStyle="1" w:styleId="CharTok">
+  <w:style w:customStyle="1" w:styleId="CharTok" w:type="character">
     <w:name w:val="CharTok"/>
     <w:basedOn w:val="VerbatimChar"/>
     <w:rPr>
       <w:color w:val="4070a0"/>
     </w:rPr>
   </w:style>
-  <w:style w:type="character" w:customStyle="1" w:styleId="SpecialCharTok">
+  <w:style w:customStyle="1" w:styleId="SpecialCharTok" w:type="character">
     <w:name w:val="SpecialCharTok"/>
     <w:basedOn w:val="VerbatimChar"/>
     <w:rPr>
       <w:color w:val="4070a0"/>
     </w:rPr>
   </w:style>
-  <w:style w:type="character" w:customStyle="1" w:styleId="StringTok">
+  <w:style w:customStyle="1" w:styleId="StringTok" w:type="character">
     <w:name w:val="StringTok"/>
     <w:basedOn w:val="VerbatimChar"/>
     <w:rPr>
       <w:color w:val="4070a0"/>
     </w:rPr>
   </w:style>
-  <w:style w:type="character" w:customStyle="1" w:styleId="VerbatimStringTok">
+  <w:style w:customStyle="1" w:styleId="VerbatimStringTok" w:type="character">
     <w:name w:val="VerbatimStringTok"/>
     <w:basedOn w:val="VerbatimChar"/>
     <w:rPr>
       <w:color w:val="4070a0"/>
     </w:rPr>
   </w:style>
-  <w:style w:type="character" w:customStyle="1" w:styleId="SpecialStringTok">
+  <w:style w:customStyle="1" w:styleId="SpecialStringTok" w:type="character">
     <w:name w:val="SpecialStringTok"/>
     <w:basedOn w:val="VerbatimChar"/>
     <w:rPr>
       <w:color w:val="bb6688"/>
     </w:rPr>
   </w:style>
-  <w:style w:type="character" w:customStyle="1" w:styleId="ImportTok">
+  <w:style w:customStyle="1" w:styleId="ImportTok" w:type="character">
     <w:name w:val="ImportTok"/>
     <w:basedOn w:val="VerbatimChar"/>
     <w:rPr>
@@ -20772,7 +20825,7 @@
       <w:b/>
     </w:rPr>
   </w:style>
-  <w:style w:type="character" w:customStyle="1" w:styleId="CommentTok">
+  <w:style w:customStyle="1" w:styleId="CommentTok" w:type="character">
     <w:name w:val="CommentTok"/>
     <w:basedOn w:val="VerbatimChar"/>
     <w:rPr>
@@ -20780,7 +20833,7 @@
       <w:i/>
     </w:rPr>
   </w:style>
-  <w:style w:type="character" w:customStyle="1" w:styleId="DocumentationTok">
+  <w:style w:customStyle="1" w:styleId="DocumentationTok" w:type="character">
     <w:name w:val="DocumentationTok"/>
     <w:basedOn w:val="VerbatimChar"/>
     <w:rPr>
@@ -20788,7 +20841,7 @@
       <w:i/>
     </w:rPr>
   </w:style>
-  <w:style w:type="character" w:customStyle="1" w:styleId="AnnotationTok">
+  <w:style w:customStyle="1" w:styleId="AnnotationTok" w:type="character">
     <w:name w:val="AnnotationTok"/>
     <w:basedOn w:val="VerbatimChar"/>
     <w:rPr>
@@ -20797,7 +20850,7 @@
       <w:i/>
     </w:rPr>
   </w:style>
-  <w:style w:type="character" w:customStyle="1" w:styleId="CommentVarTok">
+  <w:style w:customStyle="1" w:styleId="CommentVarTok" w:type="character">
     <w:name w:val="CommentVarTok"/>
     <w:basedOn w:val="VerbatimChar"/>
     <w:rPr>
@@ -20806,28 +20859,28 @@
       <w:i/>
     </w:rPr>
   </w:style>
-  <w:style w:type="character" w:customStyle="1" w:styleId="OtherTok">
+  <w:style w:customStyle="1" w:styleId="OtherTok" w:type="character">
     <w:name w:val="OtherTok"/>
     <w:basedOn w:val="VerbatimChar"/>
     <w:rPr>
       <w:color w:val="007020"/>
     </w:rPr>
   </w:style>
-  <w:style w:type="character" w:customStyle="1" w:styleId="FunctionTok">
+  <w:style w:customStyle="1" w:styleId="FunctionTok" w:type="character">
     <w:name w:val="FunctionTok"/>
     <w:basedOn w:val="VerbatimChar"/>
     <w:rPr>
       <w:color w:val="06287e"/>
     </w:rPr>
   </w:style>
-  <w:style w:type="character" w:customStyle="1" w:styleId="VariableTok">
+  <w:style w:customStyle="1" w:styleId="VariableTok" w:type="character">
     <w:name w:val="VariableTok"/>
     <w:basedOn w:val="VerbatimChar"/>
     <w:rPr>
       <w:color w:val="19177c"/>
     </w:rPr>
   </w:style>
-  <w:style w:type="character" w:customStyle="1" w:styleId="ControlFlowTok">
+  <w:style w:customStyle="1" w:styleId="ControlFlowTok" w:type="character">
     <w:name w:val="ControlFlowTok"/>
     <w:basedOn w:val="VerbatimChar"/>
     <w:rPr>
@@ -20835,45 +20888,45 @@
       <w:b/>
     </w:rPr>
   </w:style>
-  <w:style w:type="character" w:customStyle="1" w:styleId="OperatorTok">
+  <w:style w:customStyle="1" w:styleId="OperatorTok" w:type="character">
     <w:name w:val="OperatorTok"/>
     <w:basedOn w:val="VerbatimChar"/>
     <w:rPr>
       <w:color w:val="666666"/>
     </w:rPr>
   </w:style>
-  <w:style w:type="character" w:customStyle="1" w:styleId="BuiltInTok">
+  <w:style w:customStyle="1" w:styleId="BuiltInTok" w:type="character">
     <w:name w:val="BuiltInTok"/>
     <w:basedOn w:val="VerbatimChar"/>
     <w:rPr>
       <w:color w:val="008000"/>
     </w:rPr>
   </w:style>
-  <w:style w:type="character" w:customStyle="1" w:styleId="ExtensionTok">
+  <w:style w:customStyle="1" w:styleId="ExtensionTok" w:type="character">
     <w:name w:val="ExtensionTok"/>
     <w:basedOn w:val="VerbatimChar"/>
     <w:rPr/>
   </w:style>
-  <w:style w:type="character" w:customStyle="1" w:styleId="PreprocessorTok">
+  <w:style w:customStyle="1" w:styleId="PreprocessorTok" w:type="character">
     <w:name w:val="PreprocessorTok"/>
     <w:basedOn w:val="VerbatimChar"/>
     <w:rPr>
       <w:color w:val="bc7a00"/>
     </w:rPr>
   </w:style>
-  <w:style w:type="character" w:customStyle="1" w:styleId="AttributeTok">
+  <w:style w:customStyle="1" w:styleId="AttributeTok" w:type="character">
     <w:name w:val="AttributeTok"/>
     <w:basedOn w:val="VerbatimChar"/>
     <w:rPr>
       <w:color w:val="7d9029"/>
     </w:rPr>
   </w:style>
-  <w:style w:type="character" w:customStyle="1" w:styleId="RegionMarkerTok">
+  <w:style w:customStyle="1" w:styleId="RegionMarkerTok" w:type="character">
     <w:name w:val="RegionMarkerTok"/>
     <w:basedOn w:val="VerbatimChar"/>
     <w:rPr/>
   </w:style>
-  <w:style w:type="character" w:customStyle="1" w:styleId="InformationTok">
+  <w:style w:customStyle="1" w:styleId="InformationTok" w:type="character">
     <w:name w:val="InformationTok"/>
     <w:basedOn w:val="VerbatimChar"/>
     <w:rPr>
@@ -20882,7 +20935,7 @@
       <w:i/>
     </w:rPr>
   </w:style>
-  <w:style w:type="character" w:customStyle="1" w:styleId="WarningTok">
+  <w:style w:customStyle="1" w:styleId="WarningTok" w:type="character">
     <w:name w:val="WarningTok"/>
     <w:basedOn w:val="VerbatimChar"/>
     <w:rPr>
@@ -20891,20 +20944,246 @@
       <w:i/>
     </w:rPr>
   </w:style>
+  <w:style w:customStyle="1" w:styleId="AlertTok" w:type="character">
+    <w:name w:val="AlertTok"/>
+    <w:basedOn w:val="VerbatimChar"/>
+    <w:rPr>
+      <w:color w:val="ff0000"/>
+      <w:b/>
+    </w:rPr>
+  </w:style>
+  <w:style w:customStyle="1" w:styleId="ErrorTok" w:type="character">
+    <w:name w:val="ErrorTok"/>
+    <w:basedOn w:val="VerbatimChar"/>
+    <w:rPr>
+      <w:color w:val="ff0000"/>
+      <w:b/>
+    </w:rPr>
+  </w:style>
+  <w:style w:customStyle="1" w:styleId="NormalTok" w:type="character">
+    <w:name w:val="NormalTok"/>
+    <w:basedOn w:val="VerbatimChar"/>
+    <w:rPr/>
+  </w:style>
+  <w:style w:type="character" w:customStyle="1" w:styleId="KeywordTok">
+    <w:name w:val="KeywordTok"/>
+    <w:basedOn w:val="VerbatimChar"/>
+    <w:rPr>
+      <w:b/>
+      <w:color w:val="007020"/>
+    </w:rPr>
+  </w:style>
+  <w:style w:type="character" w:customStyle="1" w:styleId="DataTypeTok">
+    <w:name w:val="DataTypeTok"/>
+    <w:basedOn w:val="VerbatimChar"/>
+    <w:rPr>
+      <w:color w:val="902000"/>
+    </w:rPr>
+  </w:style>
+  <w:style w:type="character" w:customStyle="1" w:styleId="DecValTok">
+    <w:name w:val="DecValTok"/>
+    <w:basedOn w:val="VerbatimChar"/>
+    <w:rPr>
+      <w:color w:val="40a070"/>
+    </w:rPr>
+  </w:style>
+  <w:style w:type="character" w:customStyle="1" w:styleId="BaseNTok">
+    <w:name w:val="BaseNTok"/>
+    <w:basedOn w:val="VerbatimChar"/>
+    <w:rPr>
+      <w:color w:val="40a070"/>
+    </w:rPr>
+  </w:style>
+  <w:style w:type="character" w:customStyle="1" w:styleId="FloatTok">
+    <w:name w:val="FloatTok"/>
+    <w:basedOn w:val="VerbatimChar"/>
+    <w:rPr>
+      <w:color w:val="40a070"/>
+    </w:rPr>
+  </w:style>
+  <w:style w:type="character" w:customStyle="1" w:styleId="ConstantTok">
+    <w:name w:val="ConstantTok"/>
+    <w:basedOn w:val="VerbatimChar"/>
+    <w:rPr>
+      <w:color w:val="880000"/>
+    </w:rPr>
+  </w:style>
+  <w:style w:type="character" w:customStyle="1" w:styleId="CharTok">
+    <w:name w:val="CharTok"/>
+    <w:basedOn w:val="VerbatimChar"/>
+    <w:rPr>
+      <w:color w:val="4070a0"/>
+    </w:rPr>
+  </w:style>
+  <w:style w:type="character" w:customStyle="1" w:styleId="SpecialCharTok">
+    <w:name w:val="SpecialCharTok"/>
+    <w:basedOn w:val="VerbatimChar"/>
+    <w:rPr>
+      <w:color w:val="4070a0"/>
+    </w:rPr>
+  </w:style>
+  <w:style w:type="character" w:customStyle="1" w:styleId="StringTok">
+    <w:name w:val="StringTok"/>
+    <w:basedOn w:val="VerbatimChar"/>
+    <w:rPr>
+      <w:color w:val="4070a0"/>
+    </w:rPr>
+  </w:style>
+  <w:style w:type="character" w:customStyle="1" w:styleId="VerbatimStringTok">
+    <w:name w:val="VerbatimStringTok"/>
+    <w:basedOn w:val="VerbatimChar"/>
+    <w:rPr>
+      <w:color w:val="4070a0"/>
+    </w:rPr>
+  </w:style>
+  <w:style w:type="character" w:customStyle="1" w:styleId="SpecialStringTok">
+    <w:name w:val="SpecialStringTok"/>
+    <w:basedOn w:val="VerbatimChar"/>
+    <w:rPr>
+      <w:color w:val="bb6688"/>
+    </w:rPr>
+  </w:style>
+  <w:style w:type="character" w:customStyle="1" w:styleId="ImportTok">
+    <w:name w:val="ImportTok"/>
+    <w:basedOn w:val="VerbatimChar"/>
+    <w:rPr>
+      <w:b/>
+      <w:color w:val="008000"/>
+    </w:rPr>
+  </w:style>
+  <w:style w:type="character" w:customStyle="1" w:styleId="CommentTok">
+    <w:name w:val="CommentTok"/>
+    <w:basedOn w:val="VerbatimChar"/>
+    <w:rPr>
+      <w:i/>
+      <w:color w:val="60a0b0"/>
+    </w:rPr>
+  </w:style>
+  <w:style w:type="character" w:customStyle="1" w:styleId="DocumentationTok">
+    <w:name w:val="DocumentationTok"/>
+    <w:basedOn w:val="VerbatimChar"/>
+    <w:rPr>
+      <w:i/>
+      <w:color w:val="ba2121"/>
+    </w:rPr>
+  </w:style>
+  <w:style w:type="character" w:customStyle="1" w:styleId="AnnotationTok">
+    <w:name w:val="AnnotationTok"/>
+    <w:basedOn w:val="VerbatimChar"/>
+    <w:rPr>
+      <w:b/>
+      <w:i/>
+      <w:color w:val="60a0b0"/>
+    </w:rPr>
+  </w:style>
+  <w:style w:type="character" w:customStyle="1" w:styleId="CommentVarTok">
+    <w:name w:val="CommentVarTok"/>
+    <w:basedOn w:val="VerbatimChar"/>
+    <w:rPr>
+      <w:b/>
+      <w:i/>
+      <w:color w:val="60a0b0"/>
+    </w:rPr>
+  </w:style>
+  <w:style w:type="character" w:customStyle="1" w:styleId="OtherTok">
+    <w:name w:val="OtherTok"/>
+    <w:basedOn w:val="VerbatimChar"/>
+    <w:rPr>
+      <w:color w:val="007020"/>
+    </w:rPr>
+  </w:style>
+  <w:style w:type="character" w:customStyle="1" w:styleId="FunctionTok">
+    <w:name w:val="FunctionTok"/>
+    <w:basedOn w:val="VerbatimChar"/>
+    <w:rPr>
+      <w:color w:val="06287e"/>
+    </w:rPr>
+  </w:style>
+  <w:style w:type="character" w:customStyle="1" w:styleId="VariableTok">
+    <w:name w:val="VariableTok"/>
+    <w:basedOn w:val="VerbatimChar"/>
+    <w:rPr>
+      <w:color w:val="19177c"/>
+    </w:rPr>
+  </w:style>
+  <w:style w:type="character" w:customStyle="1" w:styleId="ControlFlowTok">
+    <w:name w:val="ControlFlowTok"/>
+    <w:basedOn w:val="VerbatimChar"/>
+    <w:rPr>
+      <w:b/>
+      <w:color w:val="007020"/>
+    </w:rPr>
+  </w:style>
+  <w:style w:type="character" w:customStyle="1" w:styleId="OperatorTok">
+    <w:name w:val="OperatorTok"/>
+    <w:basedOn w:val="VerbatimChar"/>
+    <w:rPr>
+      <w:color w:val="666666"/>
+    </w:rPr>
+  </w:style>
+  <w:style w:type="character" w:customStyle="1" w:styleId="BuiltInTok">
+    <w:name w:val="BuiltInTok"/>
+    <w:basedOn w:val="VerbatimChar"/>
+    <w:rPr>
+      <w:color w:val="008000"/>
+    </w:rPr>
+  </w:style>
+  <w:style w:type="character" w:customStyle="1" w:styleId="ExtensionTok">
+    <w:name w:val="ExtensionTok"/>
+    <w:basedOn w:val="VerbatimChar"/>
+    <w:rPr/>
+  </w:style>
+  <w:style w:type="character" w:customStyle="1" w:styleId="PreprocessorTok">
+    <w:name w:val="PreprocessorTok"/>
+    <w:basedOn w:val="VerbatimChar"/>
+    <w:rPr>
+      <w:color w:val="bc7a00"/>
+    </w:rPr>
+  </w:style>
+  <w:style w:type="character" w:customStyle="1" w:styleId="AttributeTok">
+    <w:name w:val="AttributeTok"/>
+    <w:basedOn w:val="VerbatimChar"/>
+    <w:rPr>
+      <w:color w:val="7d9029"/>
+    </w:rPr>
+  </w:style>
+  <w:style w:type="character" w:customStyle="1" w:styleId="RegionMarkerTok">
+    <w:name w:val="RegionMarkerTok"/>
+    <w:basedOn w:val="VerbatimChar"/>
+    <w:rPr/>
+  </w:style>
+  <w:style w:type="character" w:customStyle="1" w:styleId="InformationTok">
+    <w:name w:val="InformationTok"/>
+    <w:basedOn w:val="VerbatimChar"/>
+    <w:rPr>
+      <w:b/>
+      <w:i/>
+      <w:color w:val="60a0b0"/>
+    </w:rPr>
+  </w:style>
+  <w:style w:type="character" w:customStyle="1" w:styleId="WarningTok">
+    <w:name w:val="WarningTok"/>
+    <w:basedOn w:val="VerbatimChar"/>
+    <w:rPr>
+      <w:b/>
+      <w:i/>
+      <w:color w:val="60a0b0"/>
+    </w:rPr>
+  </w:style>
   <w:style w:type="character" w:customStyle="1" w:styleId="AlertTok">
     <w:name w:val="AlertTok"/>
     <w:basedOn w:val="VerbatimChar"/>
     <w:rPr>
+      <w:b/>
       <w:color w:val="ff0000"/>
-      <w:b/>
     </w:rPr>
   </w:style>
   <w:style w:type="character" w:customStyle="1" w:styleId="ErrorTok">
     <w:name w:val="ErrorTok"/>
     <w:basedOn w:val="VerbatimChar"/>
     <w:rPr>
+      <w:b/>
       <w:color w:val="ff0000"/>
-      <w:b/>
     </w:rPr>
   </w:style>
   <w:style w:type="character" w:customStyle="1" w:styleId="NormalTok">

</xml_diff>

<commit_message>
Implement R61 Development 2 histories, citation packets and simplified extensions
</commit_message>
<xml_diff>
--- a/docs/staff/Program_Instruction_Manual.docx
+++ b/docs/staff/Program_Instruction_Manual.docx
@@ -10,7 +10,7 @@
         <w:t xml:space="preserve">Program instruction manual</w:t>
       </w:r>
     </w:p>
-    <w:bookmarkStart w:id="43" w:name="program-instruction-manual"/>
+    <w:bookmarkStart w:id="44" w:name="program-instruction-manual"/>
     <w:p>
       <w:pPr>
         <w:pStyle w:val="Heading1"/>
@@ -32,7 +32,7 @@
         <w:pStyle w:val="BodyText"/>
       </w:pPr>
       <w:r>
-        <w:t xml:space="preserve">Release 2026-10-22 R60 · Helper 2026.10.22.61 · 22 October 2026</w:t>
+        <w:t xml:space="preserve">Release 2026-10-23 R61 · Helper 2026.10.23.62 · 23 October 2026</w:t>
       </w:r>
     </w:p>
     <w:p>
@@ -48,7 +48,7 @@
         <w:pStyle w:val="BodyText"/>
       </w:pPr>
       <w:r>
-        <w:t xml:space="preserve">R60 is a development candidate for City acceptance. Its security checks require the same ordinary document, history and recovery procedures described below. Automated verification does not replace the outstanding City Windows and network tests, staff and assistive technology acceptance, or legal and seasonal policy decisions listed in the carried-forward City acceptance record. New mandatory-appearance citations remain blocked until approved defendant instructions are supplied and integrated. Historical frozen reprints remain available. No live deployment is included in this release.</w:t>
+        <w:t xml:space="preserve">R61 is a development candidate for City acceptance. Its security checks require the same ordinary document, history and recovery procedures described below. Automated verification does not replace the outstanding City Windows and network tests, staff and assistive technology acceptance, or legal and seasonal policy decisions listed in the carried-forward City acceptance record. New mandatory-appearance citations remain blocked until approved defendant instructions are supplied and integrated. Historical frozen reprints remain available. No live deployment is included in this release.</w:t>
       </w:r>
     </w:p>
     <w:bookmarkStart w:id="20" w:name="start-here-and-daily-routine"/>
@@ -101,7 +101,7 @@
         <w:t xml:space="preserve"> </w:t>
       </w:r>
       <w:r>
-        <w:t xml:space="preserve">Double-click the Document Writer icon on the desktop. It starts the program without a command window and opens Writer in its own Chrome or Edge window; if Document Writer is already running, the icon opens Writer again. Keep one Writer window open in the same browser profile. Confirm Build 2026-10-22 R60 and helper 2026.10.22.61. Open Workspace and resolve any save confirmation, shared-history or PDF-filing exceptions before creating replacement work. Check pending deadlines and reminders.</w:t>
+        <w:t xml:space="preserve">Double-click the Document Writer icon on the desktop. It starts the program without a command window and opens Writer in its own Chrome or Edge window; if Document Writer is already running, the icon opens Writer again. Keep one Writer window open in the same browser profile. Confirm Build 2026-10-23 R61 and helper 2026.10.23.62. Open Workspace and resolve any save confirmation, shared-history or PDF-filing exceptions before creating replacement work. Check pending deadlines and reminders.</w:t>
       </w:r>
     </w:p>
     <w:p>
@@ -725,7 +725,7 @@
         <w:t xml:space="preserve"> </w:t>
       </w:r>
       <w:r>
-        <w:t xml:space="preserve">Check the case number, address, selected inspection and proposed property or owner changes. Expand source details if needed. Choose Continue existing case to open its retained draft, worksheet or latest effective issued source without importing the proposed changes. Choose Import later inspection only for an eligible unused physical inspection after the shared preflight succeeds. Existing unfinished work and reused observations must be resolved first.</w:t>
+        <w:t xml:space="preserve">Check the case number, address, selected inspection and proposed property or owner changes. Expand source details if needed. Choose Continue existing case to open its retained draft, worksheet or latest effective issued source without importing the proposed changes. Choose Import inspection only for an eligible unused physical inspection after the shared preflight succeeds. Existing unfinished work and reused observations must be resolved first.</w:t>
       </w:r>
     </w:p>
     <w:p>
@@ -2046,7 +2046,7 @@
               <w:jc w:val="left"/>
             </w:pPr>
             <w:r>
-              <w:t xml:space="preserve">A reviewed supervisory extension with its own plan and exclusions</w:t>
+              <w:t xml:space="preserve">Additional time for selected eligible items, with recorded reasons</w:t>
             </w:r>
           </w:p>
         </w:tc>
@@ -2125,7 +2125,7 @@
         <w:pStyle w:val="FirstParagraph"/>
       </w:pPr>
       <w:r>
-        <w:t xml:space="preserve">The five scoped order and administrative families begin without legal approval. Drafting is possible while review is incomplete. Before issuance, supply the actual division reviewer, current-code source, revision or effective date, amendment review, current-code review date, approved authority/wording/procedure reference, signer and delegation. Assigned inspector, authorized signer and issuing operator are separate retained facts.</w:t>
+        <w:t xml:space="preserve">Scoped orders and administrative families begin without legal approval. The new authoring-15 Best Interest Extension uses the simplified entry described below; other scoped families and historical Best Interest formats retain their review requirements. Drafting is possible while review is incomplete. Where Authority, wording and signer review is required, supply the actual division reviewer, current-code source, revision or effective date, amendment review, current-code review date, approved authority/wording/procedure reference, signer and delegation. Assigned inspector, authorized signer and issuing operator are separate retained facts.</w:t>
       </w:r>
     </w:p>
     <w:p>
@@ -2197,7 +2197,7 @@
         <w:t xml:space="preserve"> </w:t>
       </w:r>
       <w:r>
-        <w:t xml:space="preserve">Identify the prior notice, selected eligible items, owner’s plan and benefit, supervisor review, and factual exclusion of safety or urgent items. In the violation items table, tick Affected beside each affected item’s due date and enter its new due date. Internal supervisory prosecution review is not a City Attorney referral.</w:t>
+        <w:t xml:space="preserve">New authoring-15 documents use Reasons for Additional Time without a signer block. Ordinary case/recipient facts and selected-item deadline rules remain. In Violation items, tick Affected beside each eligible item’s due date and enter its later date; other items retain their dates. Do not extend safety, security or urgent obligations. Confirm Affected items exclude safety, security and urgent obligations. This checkbox remains required; the separate factual-basis and authority/signer entry sections are removed only for this new Best Interest format. Older unissued drafts keep their earlier format unless Use simplified Reasons-only format is chosen; this retains their earlier review data. Issued historical formats and their corrections remain unchanged. This extension is not a City Attorney referral.</w:t>
       </w:r>
     </w:p>
     <w:p>
@@ -2233,7 +2233,7 @@
         <w:t xml:space="preserve"> </w:t>
       </w:r>
       <w:r>
-        <w:t xml:space="preserve">Newly authored Best Interest and Vacancy Extensions use the regular Extension’s header, recipient block, items table, continuation headers, footer and copy handling. Their approved language remains unchanged. All items are listed, including corrected items ruled through with the confirmed date. Extended items show the new due date; unselected items keep the existing date. From R56 (authoring 13), every affected item of a new Best Interest or Vacancy Extension needs a later due date, marked Affected and entered in the violation items table; unaffected items keep their dates. Authoring-12 and earlier drafts keep the Affected outstanding items list in their details. Vacancy Extensions issued before R56 may be conditional: they display</w:t>
+        <w:t xml:space="preserve">Newly authored Best Interest and Vacancy Extensions use the regular Extension’s header, recipient block, items table, continuation headers, footer and copy handling. Authoring-14 and earlier retain their approved language; R61 simplifies the new Best Interest narrative as described above. All items are listed, including corrected items ruled through with the confirmed date. Extended items show the new due date; unselected items keep the existing date. From R56 (authoring 13), every affected item of a new Best Interest or Vacancy Extension needs a later due date, marked Affected and entered in the violation items table; unaffected items keep their dates. Authoring-12 and earlier drafts keep the Affected outstanding items list in their details. Vacancy Extensions issued before R56 may be conditional: they display</w:t>
       </w:r>
       <w:r>
         <w:t xml:space="preserve"> </w:t>
@@ -2251,7 +2251,7 @@
         <w:t xml:space="preserve"> </w:t>
       </w:r>
       <w:r>
-        <w:t xml:space="preserve">for affected items, keep their stored repair dates and reprint unchanged. Both special types retain their supervisory signer after the table. The regular Extension is unchanged. Previously issued documents and corrections of authoring-11 or earlier documents retain their historical layout.</w:t>
+        <w:t xml:space="preserve">for affected items, keep their stored repair dates and reprint unchanged. Vacancy Extensions and authoring-14 and earlier Best Interest Extensions retain their supervisory signer after the table; new authoring-15 Best Interest Extensions have no signer block. The regular Extension is unchanged. Previously issued documents and corrections of authoring-11 or earlier documents retain their historical layout.</w:t>
       </w:r>
     </w:p>
     <w:p>
@@ -5471,7 +5471,7 @@
         <w:pStyle w:val="BodyText"/>
       </w:pPr>
       <w:r>
-        <w:t xml:space="preserve">Citation editors initially show representative court copies to keep editing compact. Choose Show all four citation copies to inspect Court, Agency, Inspector and Defendant copies. Every final citation packet contains all four distinct approved copies for each charge; longer packets may contain additional letter or continuation pages. Verify the issued PDF, not only the compact editor view.</w:t>
+        <w:t xml:space="preserve">Citation editors initially show all four distinct Court, Agency, Inspector and Defendant copies per charge. Show representative court copies optionally switches to a compact preview; Show all four citation copies restores the complete preview. Every final citation packet contains all four distinct approved copies for each charge; longer packets may contain additional letter or continuation pages. Verify the issued PDF, not only the compact editor view.</w:t>
       </w:r>
     </w:p>
     <w:p>
@@ -5488,19 +5488,53 @@
       </w:pPr>
       <w:r>
         <w:t xml:space="preserve">In the editor, mailing addresses flow below the header to prevent overlap when interactive fields expand. Issued PDFs retain their existing approved left-window positioning. Native envelope and printer acceptance remains required.</w:t>
-      </w:r>
-    </w:p>
-    <w:p>
-      <w:pPr>
-        <w:pStyle w:val="BodyText"/>
-      </w:pPr>
-      <w:r>
-        <w:t xml:space="preserve">Manual source digest 0c79cfc774f2c333.</w:t>
       </w:r>
     </w:p>
     <w:bookmarkEnd w:id="41"/>
     <w:bookmarkEnd w:id="42"/>
+    <w:bookmarkStart w:id="43" w:name="r61-document-presentation"/>
+    <w:p>
+      <w:pPr>
+        <w:pStyle w:val="Heading2"/>
+      </w:pPr>
+      <w:r>
+        <w:t xml:space="preserve">R61 document presentation</w:t>
+      </w:r>
+    </w:p>
+    <w:p>
+      <w:pPr>
+        <w:pStyle w:val="FirstParagraph"/>
+      </w:pPr>
+      <w:r>
+        <w:t xml:space="preserve">New authoring-15 referrals and compliance letters show each item’s actual inspection history and observation notes. A corrected observation displays its date once, with CORRECTED beneath it. Days Outstanding ends at correction; unrelated or carried observations do not create additional visits. Compliance letters retain Abate Yes/No; missing legacy information is labeled Unavailable rather than invented. Issued histories remain frozen.</w:t>
+      </w:r>
+    </w:p>
+    <w:p>
+      <w:pPr>
+        <w:pStyle w:val="BodyText"/>
+      </w:pPr>
+      <w:r>
+        <w:t xml:space="preserve">Citation correction review displays dollars and cents consistently, including assessment components stored as integer cents. It does not recalculate the recorded correction values. Current order language displays 27.05(2)(g)2 without changing its canonical charge identity or pricing.</w:t>
+      </w:r>
+    </w:p>
+    <w:p>
+      <w:pPr>
+        <w:pStyle w:val="BodyText"/>
+      </w:pPr>
+      <w:r>
+        <w:t xml:space="preserve">The Best Interest signer placeholders are separate from document footers. Removing the new Best Interest signer block removes those bubbles. Existing single-page and continuation footer conventions and approved citation forms are retained. Verify the actual PDF and City print settings; incomplete new citation packets are refused instead of silently filed.</w:t>
+      </w:r>
+    </w:p>
+    <w:p>
+      <w:pPr>
+        <w:pStyle w:val="BodyText"/>
+      </w:pPr>
+      <w:r>
+        <w:t xml:space="preserve">Manual source digest 3d9a9202eadcf036.</w:t>
+      </w:r>
+    </w:p>
     <w:bookmarkEnd w:id="43"/>
+    <w:bookmarkEnd w:id="44"/>
     <w:sectPr>
       <w:headerReference r:id="rId9" w:type="default"/>
       <w:footerReference r:id="rId10" w:type="default"/>
@@ -20958,6 +20992,458 @@
     <w:rPr>
       <w:color w:val="ff0000"/>
       <w:b/>
+    </w:rPr>
+  </w:style>
+  <w:style w:customStyle="1" w:styleId="NormalTok" w:type="character">
+    <w:name w:val="NormalTok"/>
+    <w:basedOn w:val="VerbatimChar"/>
+    <w:rPr/>
+  </w:style>
+  <w:style w:customStyle="1" w:styleId="KeywordTok" w:type="character">
+    <w:name w:val="KeywordTok"/>
+    <w:basedOn w:val="VerbatimChar"/>
+    <w:rPr>
+      <w:b/>
+      <w:color w:val="007020"/>
+    </w:rPr>
+  </w:style>
+  <w:style w:customStyle="1" w:styleId="DataTypeTok" w:type="character">
+    <w:name w:val="DataTypeTok"/>
+    <w:basedOn w:val="VerbatimChar"/>
+    <w:rPr>
+      <w:color w:val="902000"/>
+    </w:rPr>
+  </w:style>
+  <w:style w:customStyle="1" w:styleId="DecValTok" w:type="character">
+    <w:name w:val="DecValTok"/>
+    <w:basedOn w:val="VerbatimChar"/>
+    <w:rPr>
+      <w:color w:val="40a070"/>
+    </w:rPr>
+  </w:style>
+  <w:style w:customStyle="1" w:styleId="BaseNTok" w:type="character">
+    <w:name w:val="BaseNTok"/>
+    <w:basedOn w:val="VerbatimChar"/>
+    <w:rPr>
+      <w:color w:val="40a070"/>
+    </w:rPr>
+  </w:style>
+  <w:style w:customStyle="1" w:styleId="FloatTok" w:type="character">
+    <w:name w:val="FloatTok"/>
+    <w:basedOn w:val="VerbatimChar"/>
+    <w:rPr>
+      <w:color w:val="40a070"/>
+    </w:rPr>
+  </w:style>
+  <w:style w:customStyle="1" w:styleId="ConstantTok" w:type="character">
+    <w:name w:val="ConstantTok"/>
+    <w:basedOn w:val="VerbatimChar"/>
+    <w:rPr>
+      <w:color w:val="880000"/>
+    </w:rPr>
+  </w:style>
+  <w:style w:customStyle="1" w:styleId="CharTok" w:type="character">
+    <w:name w:val="CharTok"/>
+    <w:basedOn w:val="VerbatimChar"/>
+    <w:rPr>
+      <w:color w:val="4070a0"/>
+    </w:rPr>
+  </w:style>
+  <w:style w:customStyle="1" w:styleId="SpecialCharTok" w:type="character">
+    <w:name w:val="SpecialCharTok"/>
+    <w:basedOn w:val="VerbatimChar"/>
+    <w:rPr>
+      <w:color w:val="4070a0"/>
+    </w:rPr>
+  </w:style>
+  <w:style w:customStyle="1" w:styleId="StringTok" w:type="character">
+    <w:name w:val="StringTok"/>
+    <w:basedOn w:val="VerbatimChar"/>
+    <w:rPr>
+      <w:color w:val="4070a0"/>
+    </w:rPr>
+  </w:style>
+  <w:style w:customStyle="1" w:styleId="VerbatimStringTok" w:type="character">
+    <w:name w:val="VerbatimStringTok"/>
+    <w:basedOn w:val="VerbatimChar"/>
+    <w:rPr>
+      <w:color w:val="4070a0"/>
+    </w:rPr>
+  </w:style>
+  <w:style w:customStyle="1" w:styleId="SpecialStringTok" w:type="character">
+    <w:name w:val="SpecialStringTok"/>
+    <w:basedOn w:val="VerbatimChar"/>
+    <w:rPr>
+      <w:color w:val="bb6688"/>
+    </w:rPr>
+  </w:style>
+  <w:style w:customStyle="1" w:styleId="ImportTok" w:type="character">
+    <w:name w:val="ImportTok"/>
+    <w:basedOn w:val="VerbatimChar"/>
+    <w:rPr>
+      <w:b/>
+      <w:color w:val="008000"/>
+    </w:rPr>
+  </w:style>
+  <w:style w:customStyle="1" w:styleId="CommentTok" w:type="character">
+    <w:name w:val="CommentTok"/>
+    <w:basedOn w:val="VerbatimChar"/>
+    <w:rPr>
+      <w:i/>
+      <w:color w:val="60a0b0"/>
+    </w:rPr>
+  </w:style>
+  <w:style w:customStyle="1" w:styleId="DocumentationTok" w:type="character">
+    <w:name w:val="DocumentationTok"/>
+    <w:basedOn w:val="VerbatimChar"/>
+    <w:rPr>
+      <w:i/>
+      <w:color w:val="ba2121"/>
+    </w:rPr>
+  </w:style>
+  <w:style w:customStyle="1" w:styleId="AnnotationTok" w:type="character">
+    <w:name w:val="AnnotationTok"/>
+    <w:basedOn w:val="VerbatimChar"/>
+    <w:rPr>
+      <w:b/>
+      <w:i/>
+      <w:color w:val="60a0b0"/>
+    </w:rPr>
+  </w:style>
+  <w:style w:customStyle="1" w:styleId="CommentVarTok" w:type="character">
+    <w:name w:val="CommentVarTok"/>
+    <w:basedOn w:val="VerbatimChar"/>
+    <w:rPr>
+      <w:b/>
+      <w:i/>
+      <w:color w:val="60a0b0"/>
+    </w:rPr>
+  </w:style>
+  <w:style w:customStyle="1" w:styleId="OtherTok" w:type="character">
+    <w:name w:val="OtherTok"/>
+    <w:basedOn w:val="VerbatimChar"/>
+    <w:rPr>
+      <w:color w:val="007020"/>
+    </w:rPr>
+  </w:style>
+  <w:style w:customStyle="1" w:styleId="FunctionTok" w:type="character">
+    <w:name w:val="FunctionTok"/>
+    <w:basedOn w:val="VerbatimChar"/>
+    <w:rPr>
+      <w:color w:val="06287e"/>
+    </w:rPr>
+  </w:style>
+  <w:style w:customStyle="1" w:styleId="VariableTok" w:type="character">
+    <w:name w:val="VariableTok"/>
+    <w:basedOn w:val="VerbatimChar"/>
+    <w:rPr>
+      <w:color w:val="19177c"/>
+    </w:rPr>
+  </w:style>
+  <w:style w:customStyle="1" w:styleId="ControlFlowTok" w:type="character">
+    <w:name w:val="ControlFlowTok"/>
+    <w:basedOn w:val="VerbatimChar"/>
+    <w:rPr>
+      <w:b/>
+      <w:color w:val="007020"/>
+    </w:rPr>
+  </w:style>
+  <w:style w:customStyle="1" w:styleId="OperatorTok" w:type="character">
+    <w:name w:val="OperatorTok"/>
+    <w:basedOn w:val="VerbatimChar"/>
+    <w:rPr>
+      <w:color w:val="666666"/>
+    </w:rPr>
+  </w:style>
+  <w:style w:customStyle="1" w:styleId="BuiltInTok" w:type="character">
+    <w:name w:val="BuiltInTok"/>
+    <w:basedOn w:val="VerbatimChar"/>
+    <w:rPr>
+      <w:color w:val="008000"/>
+    </w:rPr>
+  </w:style>
+  <w:style w:customStyle="1" w:styleId="ExtensionTok" w:type="character">
+    <w:name w:val="ExtensionTok"/>
+    <w:basedOn w:val="VerbatimChar"/>
+    <w:rPr/>
+  </w:style>
+  <w:style w:customStyle="1" w:styleId="PreprocessorTok" w:type="character">
+    <w:name w:val="PreprocessorTok"/>
+    <w:basedOn w:val="VerbatimChar"/>
+    <w:rPr>
+      <w:color w:val="bc7a00"/>
+    </w:rPr>
+  </w:style>
+  <w:style w:customStyle="1" w:styleId="AttributeTok" w:type="character">
+    <w:name w:val="AttributeTok"/>
+    <w:basedOn w:val="VerbatimChar"/>
+    <w:rPr>
+      <w:color w:val="7d9029"/>
+    </w:rPr>
+  </w:style>
+  <w:style w:customStyle="1" w:styleId="RegionMarkerTok" w:type="character">
+    <w:name w:val="RegionMarkerTok"/>
+    <w:basedOn w:val="VerbatimChar"/>
+    <w:rPr/>
+  </w:style>
+  <w:style w:customStyle="1" w:styleId="InformationTok" w:type="character">
+    <w:name w:val="InformationTok"/>
+    <w:basedOn w:val="VerbatimChar"/>
+    <w:rPr>
+      <w:b/>
+      <w:i/>
+      <w:color w:val="60a0b0"/>
+    </w:rPr>
+  </w:style>
+  <w:style w:customStyle="1" w:styleId="WarningTok" w:type="character">
+    <w:name w:val="WarningTok"/>
+    <w:basedOn w:val="VerbatimChar"/>
+    <w:rPr>
+      <w:b/>
+      <w:i/>
+      <w:color w:val="60a0b0"/>
+    </w:rPr>
+  </w:style>
+  <w:style w:customStyle="1" w:styleId="AlertTok" w:type="character">
+    <w:name w:val="AlertTok"/>
+    <w:basedOn w:val="VerbatimChar"/>
+    <w:rPr>
+      <w:b/>
+      <w:color w:val="ff0000"/>
+    </w:rPr>
+  </w:style>
+  <w:style w:customStyle="1" w:styleId="ErrorTok" w:type="character">
+    <w:name w:val="ErrorTok"/>
+    <w:basedOn w:val="VerbatimChar"/>
+    <w:rPr>
+      <w:b/>
+      <w:color w:val="ff0000"/>
+    </w:rPr>
+  </w:style>
+  <w:style w:customStyle="1" w:styleId="NormalTok" w:type="character">
+    <w:name w:val="NormalTok"/>
+    <w:basedOn w:val="VerbatimChar"/>
+    <w:rPr/>
+  </w:style>
+  <w:style w:customStyle="1" w:styleId="KeywordTok" w:type="character">
+    <w:name w:val="KeywordTok"/>
+    <w:basedOn w:val="VerbatimChar"/>
+    <w:rPr>
+      <w:b/>
+      <w:color w:val="007020"/>
+    </w:rPr>
+  </w:style>
+  <w:style w:customStyle="1" w:styleId="DataTypeTok" w:type="character">
+    <w:name w:val="DataTypeTok"/>
+    <w:basedOn w:val="VerbatimChar"/>
+    <w:rPr>
+      <w:color w:val="902000"/>
+    </w:rPr>
+  </w:style>
+  <w:style w:customStyle="1" w:styleId="DecValTok" w:type="character">
+    <w:name w:val="DecValTok"/>
+    <w:basedOn w:val="VerbatimChar"/>
+    <w:rPr>
+      <w:color w:val="40a070"/>
+    </w:rPr>
+  </w:style>
+  <w:style w:customStyle="1" w:styleId="BaseNTok" w:type="character">
+    <w:name w:val="BaseNTok"/>
+    <w:basedOn w:val="VerbatimChar"/>
+    <w:rPr>
+      <w:color w:val="40a070"/>
+    </w:rPr>
+  </w:style>
+  <w:style w:customStyle="1" w:styleId="FloatTok" w:type="character">
+    <w:name w:val="FloatTok"/>
+    <w:basedOn w:val="VerbatimChar"/>
+    <w:rPr>
+      <w:color w:val="40a070"/>
+    </w:rPr>
+  </w:style>
+  <w:style w:customStyle="1" w:styleId="ConstantTok" w:type="character">
+    <w:name w:val="ConstantTok"/>
+    <w:basedOn w:val="VerbatimChar"/>
+    <w:rPr>
+      <w:color w:val="880000"/>
+    </w:rPr>
+  </w:style>
+  <w:style w:customStyle="1" w:styleId="CharTok" w:type="character">
+    <w:name w:val="CharTok"/>
+    <w:basedOn w:val="VerbatimChar"/>
+    <w:rPr>
+      <w:color w:val="4070a0"/>
+    </w:rPr>
+  </w:style>
+  <w:style w:customStyle="1" w:styleId="SpecialCharTok" w:type="character">
+    <w:name w:val="SpecialCharTok"/>
+    <w:basedOn w:val="VerbatimChar"/>
+    <w:rPr>
+      <w:color w:val="4070a0"/>
+    </w:rPr>
+  </w:style>
+  <w:style w:customStyle="1" w:styleId="StringTok" w:type="character">
+    <w:name w:val="StringTok"/>
+    <w:basedOn w:val="VerbatimChar"/>
+    <w:rPr>
+      <w:color w:val="4070a0"/>
+    </w:rPr>
+  </w:style>
+  <w:style w:customStyle="1" w:styleId="VerbatimStringTok" w:type="character">
+    <w:name w:val="VerbatimStringTok"/>
+    <w:basedOn w:val="VerbatimChar"/>
+    <w:rPr>
+      <w:color w:val="4070a0"/>
+    </w:rPr>
+  </w:style>
+  <w:style w:customStyle="1" w:styleId="SpecialStringTok" w:type="character">
+    <w:name w:val="SpecialStringTok"/>
+    <w:basedOn w:val="VerbatimChar"/>
+    <w:rPr>
+      <w:color w:val="bb6688"/>
+    </w:rPr>
+  </w:style>
+  <w:style w:customStyle="1" w:styleId="ImportTok" w:type="character">
+    <w:name w:val="ImportTok"/>
+    <w:basedOn w:val="VerbatimChar"/>
+    <w:rPr>
+      <w:b/>
+      <w:color w:val="008000"/>
+    </w:rPr>
+  </w:style>
+  <w:style w:customStyle="1" w:styleId="CommentTok" w:type="character">
+    <w:name w:val="CommentTok"/>
+    <w:basedOn w:val="VerbatimChar"/>
+    <w:rPr>
+      <w:i/>
+      <w:color w:val="60a0b0"/>
+    </w:rPr>
+  </w:style>
+  <w:style w:customStyle="1" w:styleId="DocumentationTok" w:type="character">
+    <w:name w:val="DocumentationTok"/>
+    <w:basedOn w:val="VerbatimChar"/>
+    <w:rPr>
+      <w:i/>
+      <w:color w:val="ba2121"/>
+    </w:rPr>
+  </w:style>
+  <w:style w:customStyle="1" w:styleId="AnnotationTok" w:type="character">
+    <w:name w:val="AnnotationTok"/>
+    <w:basedOn w:val="VerbatimChar"/>
+    <w:rPr>
+      <w:b/>
+      <w:i/>
+      <w:color w:val="60a0b0"/>
+    </w:rPr>
+  </w:style>
+  <w:style w:customStyle="1" w:styleId="CommentVarTok" w:type="character">
+    <w:name w:val="CommentVarTok"/>
+    <w:basedOn w:val="VerbatimChar"/>
+    <w:rPr>
+      <w:b/>
+      <w:i/>
+      <w:color w:val="60a0b0"/>
+    </w:rPr>
+  </w:style>
+  <w:style w:customStyle="1" w:styleId="OtherTok" w:type="character">
+    <w:name w:val="OtherTok"/>
+    <w:basedOn w:val="VerbatimChar"/>
+    <w:rPr>
+      <w:color w:val="007020"/>
+    </w:rPr>
+  </w:style>
+  <w:style w:customStyle="1" w:styleId="FunctionTok" w:type="character">
+    <w:name w:val="FunctionTok"/>
+    <w:basedOn w:val="VerbatimChar"/>
+    <w:rPr>
+      <w:color w:val="06287e"/>
+    </w:rPr>
+  </w:style>
+  <w:style w:customStyle="1" w:styleId="VariableTok" w:type="character">
+    <w:name w:val="VariableTok"/>
+    <w:basedOn w:val="VerbatimChar"/>
+    <w:rPr>
+      <w:color w:val="19177c"/>
+    </w:rPr>
+  </w:style>
+  <w:style w:customStyle="1" w:styleId="ControlFlowTok" w:type="character">
+    <w:name w:val="ControlFlowTok"/>
+    <w:basedOn w:val="VerbatimChar"/>
+    <w:rPr>
+      <w:b/>
+      <w:color w:val="007020"/>
+    </w:rPr>
+  </w:style>
+  <w:style w:customStyle="1" w:styleId="OperatorTok" w:type="character">
+    <w:name w:val="OperatorTok"/>
+    <w:basedOn w:val="VerbatimChar"/>
+    <w:rPr>
+      <w:color w:val="666666"/>
+    </w:rPr>
+  </w:style>
+  <w:style w:customStyle="1" w:styleId="BuiltInTok" w:type="character">
+    <w:name w:val="BuiltInTok"/>
+    <w:basedOn w:val="VerbatimChar"/>
+    <w:rPr>
+      <w:color w:val="008000"/>
+    </w:rPr>
+  </w:style>
+  <w:style w:customStyle="1" w:styleId="ExtensionTok" w:type="character">
+    <w:name w:val="ExtensionTok"/>
+    <w:basedOn w:val="VerbatimChar"/>
+    <w:rPr/>
+  </w:style>
+  <w:style w:customStyle="1" w:styleId="PreprocessorTok" w:type="character">
+    <w:name w:val="PreprocessorTok"/>
+    <w:basedOn w:val="VerbatimChar"/>
+    <w:rPr>
+      <w:color w:val="bc7a00"/>
+    </w:rPr>
+  </w:style>
+  <w:style w:customStyle="1" w:styleId="AttributeTok" w:type="character">
+    <w:name w:val="AttributeTok"/>
+    <w:basedOn w:val="VerbatimChar"/>
+    <w:rPr>
+      <w:color w:val="7d9029"/>
+    </w:rPr>
+  </w:style>
+  <w:style w:customStyle="1" w:styleId="RegionMarkerTok" w:type="character">
+    <w:name w:val="RegionMarkerTok"/>
+    <w:basedOn w:val="VerbatimChar"/>
+    <w:rPr/>
+  </w:style>
+  <w:style w:customStyle="1" w:styleId="InformationTok" w:type="character">
+    <w:name w:val="InformationTok"/>
+    <w:basedOn w:val="VerbatimChar"/>
+    <w:rPr>
+      <w:b/>
+      <w:i/>
+      <w:color w:val="60a0b0"/>
+    </w:rPr>
+  </w:style>
+  <w:style w:customStyle="1" w:styleId="WarningTok" w:type="character">
+    <w:name w:val="WarningTok"/>
+    <w:basedOn w:val="VerbatimChar"/>
+    <w:rPr>
+      <w:b/>
+      <w:i/>
+      <w:color w:val="60a0b0"/>
+    </w:rPr>
+  </w:style>
+  <w:style w:customStyle="1" w:styleId="AlertTok" w:type="character">
+    <w:name w:val="AlertTok"/>
+    <w:basedOn w:val="VerbatimChar"/>
+    <w:rPr>
+      <w:b/>
+      <w:color w:val="ff0000"/>
+    </w:rPr>
+  </w:style>
+  <w:style w:customStyle="1" w:styleId="ErrorTok" w:type="character">
+    <w:name w:val="ErrorTok"/>
+    <w:basedOn w:val="VerbatimChar"/>
+    <w:rPr>
+      <w:b/>
+      <w:color w:val="ff0000"/>
     </w:rPr>
   </w:style>
   <w:style w:customStyle="1" w:styleId="NormalTok" w:type="character">

</xml_diff>

<commit_message>
R62 documentation, acceptance items and regenerated manual
Changelog, developer guides, R62 review, S62-1 to S62-5 acceptance
items, staff guides and the program manual describe the R62 import
rules, authoring-16 extensions, history notes and referred-case
options; manual editions are regenerated with tools/build_manual.py.
Registers the R62 suites in the test index and source inventory.

Co-Authored-By: Claude Opus 5.5 <noreply@anthropic.com>
Claude-Session: https://claude.ai/code/session_01WPJAZGfD47jPUEgCNYYSg7
</commit_message>
<xml_diff>
--- a/docs/staff/Program_Instruction_Manual.docx
+++ b/docs/staff/Program_Instruction_Manual.docx
@@ -10,7 +10,7 @@
         <w:t xml:space="preserve">Program instruction manual</w:t>
       </w:r>
     </w:p>
-    <w:bookmarkStart w:id="44" w:name="program-instruction-manual"/>
+    <w:bookmarkStart w:id="45" w:name="program-instruction-manual"/>
     <w:p>
       <w:pPr>
         <w:pStyle w:val="Heading1"/>
@@ -32,7 +32,7 @@
         <w:pStyle w:val="BodyText"/>
       </w:pPr>
       <w:r>
-        <w:t xml:space="preserve">Release 2026-10-23 R61 · Helper 2026.10.23.62 · 23 October 2026</w:t>
+        <w:t xml:space="preserve">Release 2026-10-23 R62 · Helper 2026.10.23.63 · 23 October 2026</w:t>
       </w:r>
     </w:p>
     <w:p>
@@ -48,7 +48,7 @@
         <w:pStyle w:val="BodyText"/>
       </w:pPr>
       <w:r>
-        <w:t xml:space="preserve">R61 is a development candidate for City acceptance. Its security checks require the same ordinary document, history and recovery procedures described below. Automated verification does not replace the outstanding City Windows and network tests, staff and assistive technology acceptance, or legal and seasonal policy decisions listed in the carried-forward City acceptance record. New mandatory-appearance citations remain blocked until approved defendant instructions are supplied and integrated. Historical frozen reprints remain available. No live deployment is included in this release.</w:t>
+        <w:t xml:space="preserve">R62 is a development candidate for City acceptance. Its security checks require the same ordinary document, history and recovery procedures described below. Automated verification does not replace the outstanding City Windows and network tests, staff and assistive technology acceptance, or legal and seasonal policy decisions listed in the carried-forward City acceptance record. New mandatory-appearance citations remain blocked until approved defendant instructions are supplied and integrated. Historical frozen reprints remain available. No live deployment is included in this release.</w:t>
       </w:r>
     </w:p>
     <w:bookmarkStart w:id="20" w:name="start-here-and-daily-routine"/>
@@ -74,8 +74,8 @@
       </w:pPr>
       <w:r>
         <w:rPr>
+          <w:bCs/>
           <w:b/>
-          <w:bCs/>
         </w:rPr>
         <w:t xml:space="preserve">Before using operational cases.</w:t>
       </w:r>
@@ -92,8 +92,8 @@
       </w:pPr>
       <w:r>
         <w:rPr>
+          <w:bCs/>
           <w:b/>
-          <w:bCs/>
         </w:rPr>
         <w:t xml:space="preserve">Start a working day.</w:t>
       </w:r>
@@ -101,7 +101,7 @@
         <w:t xml:space="preserve"> </w:t>
       </w:r>
       <w:r>
-        <w:t xml:space="preserve">Double-click the Document Writer icon on the desktop. It starts the program without a command window and opens Writer in its own Chrome or Edge window; if Document Writer is already running, the icon opens Writer again. Keep one Writer window open in the same browser profile. Confirm Build 2026-10-23 R61 and helper 2026.10.23.62. Open Workspace and resolve any save confirmation, shared-history or PDF-filing exceptions before creating replacement work. Check pending deadlines and reminders.</w:t>
+        <w:t xml:space="preserve">Double-click the Document Writer icon on the desktop. It starts the program without a command window and opens Writer in its own Chrome or Edge window; if Document Writer is already running, the icon opens Writer again. Keep one Writer window open in the same browser profile. Confirm Build 2026-10-23 R62 and helper 2026.10.23.63. Open Workspace and resolve any save confirmation, shared-history or PDF-filing exceptions before creating replacement work. Check pending deadlines and reminders.</w:t>
       </w:r>
     </w:p>
     <w:p>
@@ -110,8 +110,8 @@
       </w:pPr>
       <w:r>
         <w:rPr>
+          <w:bCs/>
           <w:b/>
-          <w:bCs/>
         </w:rPr>
         <w:t xml:space="preserve">Prepare work.</w:t>
       </w:r>
@@ -128,8 +128,8 @@
       </w:pPr>
       <w:r>
         <w:rPr>
+          <w:bCs/>
           <w:b/>
-          <w:bCs/>
         </w:rPr>
         <w:t xml:space="preserve">Finish an action.</w:t>
       </w:r>
@@ -146,8 +146,8 @@
       </w:pPr>
       <w:r>
         <w:rPr>
+          <w:bCs/>
           <w:b/>
-          <w:bCs/>
         </w:rPr>
         <w:t xml:space="preserve">End a working day.</w:t>
       </w:r>
@@ -164,8 +164,8 @@
       </w:pPr>
       <w:r>
         <w:rPr>
+          <w:bCs/>
           <w:b/>
-          <w:bCs/>
         </w:rPr>
         <w:t xml:space="preserve">Stop Document Writer.</w:t>
       </w:r>
@@ -190,8 +190,8 @@
       </w:pPr>
       <w:r>
         <w:rPr>
+          <w:bCs/>
           <w:b/>
-          <w:bCs/>
         </w:rPr>
         <w:t xml:space="preserve">Warnings and errors.</w:t>
       </w:r>
@@ -218,8 +218,8 @@
       </w:pPr>
       <w:r>
         <w:rPr>
+          <w:bCs/>
           <w:b/>
-          <w:bCs/>
         </w:rPr>
         <w:t xml:space="preserve">Administrator procedure.</w:t>
       </w:r>
@@ -232,11 +232,11 @@
     </w:p>
     <w:p>
       <w:pPr>
-        <w:pStyle w:val="Compact"/>
         <w:numPr>
           <w:ilvl w:val="0"/>
           <w:numId w:val="1001"/>
         </w:numPr>
+        <w:pStyle w:val="Compact"/>
       </w:pPr>
       <w:r>
         <w:t xml:space="preserve">Back up the existing program, case folder, PDF folder, GIS folder, configuration and integrity evidence. Ask every user to save and sync work, then stop the program with Exit Document Writer in Tools &amp; settings. An older version without Exit Document Writer in Tools &amp; settings stops another way: close its command window if it was started with Start Document Writer.bat, otherwise sign out of Windows and back in.</w:t>
@@ -244,11 +244,11 @@
     </w:p>
     <w:p>
       <w:pPr>
-        <w:pStyle w:val="Compact"/>
         <w:numPr>
           <w:ilvl w:val="0"/>
           <w:numId w:val="1001"/>
         </w:numPr>
+        <w:pStyle w:val="Compact"/>
       </w:pPr>
       <w:r>
         <w:t xml:space="preserve">Before extraction, compare the package SHA-256 with the digest obtained independently from the release owner. Use Get-FileHash -Algorithm SHA256 in PowerShell. Keep verified prior packages separately for deliberate IT rollback and test acceptance in isolation.</w:t>
@@ -256,11 +256,11 @@
     </w:p>
     <w:p>
       <w:pPr>
-        <w:pStyle w:val="Compact"/>
         <w:numPr>
           <w:ilvl w:val="0"/>
           <w:numId w:val="1001"/>
         </w:numPr>
+        <w:pStyle w:val="Compact"/>
       </w:pPr>
       <w:r>
         <w:t xml:space="preserve">Place all deploy files and the vendor folder in a division-owned program folder. Preserve operational folders and settings. Grant inspectors read-only program access and grant write access to the release owner only; grant case, PDF and GIS write access as required. Keep these permissions distinct. Restrict administration and independent anchor permissions through IT.</w:t>
@@ -268,11 +268,11 @@
     </w:p>
     <w:p>
       <w:pPr>
-        <w:pStyle w:val="Compact"/>
         <w:numPr>
           <w:ilvl w:val="0"/>
           <w:numId w:val="1001"/>
         </w:numPr>
+        <w:pStyle w:val="Compact"/>
       </w:pPr>
       <w:r>
         <w:t xml:space="preserve">Have IT check the deploy ZIP’s SHA-256 against the value the release owner publishes separately, then run Start Document Writer.bat (the diagnostic launcher) once on each PC from that checked deployment. It installs the local runtime and creates or updates the Document Writer desktop icon; an existing Document Writer shortcut is changed to start without a command window.</w:t>
@@ -280,11 +280,11 @@
     </w:p>
     <w:p>
       <w:pPr>
-        <w:pStyle w:val="Compact"/>
         <w:numPr>
           <w:ilvl w:val="0"/>
           <w:numId w:val="1001"/>
         </w:numPr>
+        <w:pStyle w:val="Compact"/>
       </w:pPr>
       <w:r>
         <w:t xml:space="preserve">Confirm the build and helper versions shown in the install guide. If a message says an older version is still running, stop it as the message explains (Exit Document Writer when it offers one; otherwise close its command window or sign out of Windows), then double-click the Document Writer icon again.</w:t>
@@ -292,11 +292,11 @@
     </w:p>
     <w:p>
       <w:pPr>
-        <w:pStyle w:val="Compact"/>
         <w:numPr>
           <w:ilvl w:val="0"/>
           <w:numId w:val="1001"/>
         </w:numPr>
+        <w:pStyle w:val="Compact"/>
       </w:pPr>
       <w:r>
         <w:t xml:space="preserve">Open Tools &amp; settings → Saved work &amp; connection. Expand Connection checks and technical details, then open connection checks and Storage diagnostics. Confirm the intended shared paths, helper health and permissions. Use Rebuild reporting index in Storage diagnostics when an administrator has confirmed a rebuild is appropriate.</w:t>
@@ -304,11 +304,11 @@
     </w:p>
     <w:p>
       <w:pPr>
-        <w:pStyle w:val="Compact"/>
         <w:numPr>
           <w:ilvl w:val="0"/>
           <w:numId w:val="1001"/>
         </w:numPr>
+        <w:pStyle w:val="Compact"/>
       </w:pPr>
       <w:r>
         <w:t xml:space="preserve">Open Reports → Data and definitions. Review coverage and excluded records. Test an approved synthetic case through save, exact PDF retrieval and recovery before operational use.</w:t>
@@ -320,8 +320,8 @@
       </w:pPr>
       <w:r>
         <w:rPr>
+          <w:bCs/>
           <w:b/>
-          <w:bCs/>
         </w:rPr>
         <w:t xml:space="preserve">Compatibility.</w:t>
       </w:r>
@@ -329,7 +329,7 @@
         <w:t xml:space="preserve"> </w:t>
       </w:r>
       <w:r>
-        <w:t xml:space="preserve">This release uses case schema 5, summary version 6, workspace backup version 2 and current authoring version 14; new referrals use item-specific history and Days Outstanding, while earlier issued formats and existing special-document layouts retain their versions; R54 introduced authoring 12 for the aligned Best Interest and Vacancy Extension layout, and R56 introduced authoring 13 for their required item due dates. Earlier releases predating schema 5 cannot read schema-5 case files. An earlier release does not know a newer authoring layout: before rollback, finish or discard unfinished drafts and corrections, and afterwards rely on the retained original PDFs for documents issued under the newer release. A runtime rollback changes installed files; it does not reverse issued records or restore workspace data. IT must assess data compatibility and retained requests before rollback. Never replace current operational records with an old backup without an approved recovery plan.</w:t>
+        <w:t xml:space="preserve">This release uses case schema 5, summary version 6, workspace backup version 2 and current authoring version 16; new referrals use item-specific history and Days Outstanding, R62 authoring 16 changes the Best Interest, Vacancy and history-note presentation, while earlier issued formats and existing special-document layouts retain their versions; R54 introduced authoring 12 for the aligned Best Interest and Vacancy Extension layout, and R56 introduced authoring 13 for their required item due dates. Earlier releases predating schema 5 cannot read schema-5 case files. An earlier release does not know a newer authoring layout: before rollback, finish or discard unfinished drafts and corrections, and afterwards rely on the retained original PDFs for documents issued under the newer release. A runtime rollback changes installed files; it does not reverse issued records or restore workspace data. IT must assess data compatibility and retained requests before rollback. Never replace current operational records with an old backup without an approved recovery plan.</w:t>
       </w:r>
     </w:p>
     <w:p>
@@ -338,8 +338,8 @@
       </w:pPr>
       <w:r>
         <w:rPr>
+          <w:bCs/>
           <w:b/>
-          <w:bCs/>
         </w:rPr>
         <w:t xml:space="preserve">Checked updates.</w:t>
       </w:r>
@@ -356,8 +356,8 @@
       </w:pPr>
       <w:r>
         <w:rPr>
+          <w:bCs/>
           <w:b/>
-          <w:bCs/>
         </w:rPr>
         <w:t xml:space="preserve">Browser session.</w:t>
       </w:r>
@@ -374,8 +374,8 @@
       </w:pPr>
       <w:r>
         <w:rPr>
+          <w:bCs/>
           <w:b/>
-          <w:bCs/>
         </w:rPr>
         <w:t xml:space="preserve">After a helper restart.</w:t>
       </w:r>
@@ -392,8 +392,8 @@
       </w:pPr>
       <w:r>
         <w:rPr>
+          <w:bCs/>
           <w:b/>
-          <w:bCs/>
         </w:rPr>
         <w:t xml:space="preserve">Deliberate rollback.</w:t>
       </w:r>
@@ -436,8 +436,8 @@
       </w:pPr>
       <w:r>
         <w:rPr>
+          <w:bCs/>
           <w:b/>
-          <w:bCs/>
         </w:rPr>
         <w:t xml:space="preserve">Find and continue a case.</w:t>
       </w:r>
@@ -480,8 +480,8 @@
       </w:pPr>
       <w:r>
         <w:rPr>
+          <w:bCs/>
           <w:b/>
-          <w:bCs/>
         </w:rPr>
         <w:t xml:space="preserve">Understand the record.</w:t>
       </w:r>
@@ -506,8 +506,8 @@
       </w:pPr>
       <w:r>
         <w:rPr>
+          <w:bCs/>
           <w:b/>
-          <w:bCs/>
         </w:rPr>
         <w:t xml:space="preserve">Resolve attention states.</w:t>
       </w:r>
@@ -542,8 +542,8 @@
       </w:pPr>
       <w:r>
         <w:rPr>
+          <w:bCs/>
           <w:b/>
-          <w:bCs/>
         </w:rPr>
         <w:t xml:space="preserve">Direct lookup.</w:t>
       </w:r>
@@ -559,7 +559,7 @@
         <w:pStyle w:val="BodyText"/>
       </w:pPr>
       <w:r>
-        <w:t xml:space="preserve">Select an eligible unused inspection with an actual date and supported type. If several results qualify, choose explicitly: each result shows its Inspection type, Date (with time), Inspector and Status, and the one you choose is highlighted. An inspection already recorded on any document or visit of the case, including drafts, withdrawn and corrected documents, can still be selected; it then explains that it was already used and cannot be imported again. Completed, Scheduled, Pending, Assist and unlisted results cannot be imported. A result status is not proof that this program issued a document; shared records independently prevent inspection reuse.</w:t>
+        <w:t xml:space="preserve">Select an eligible unused inspection with an actual date and supported type. If several results qualify, choose explicitly: each result shows its Inspection type, Date (with time), Inspector and Status, and the one you choose is highlighted. Scheduled, Pending, Completed, Inspection, No Violation, Reinspection and No Fee Reinspection results, Initial Inspection results with No Entry, Assist inspections, undated rows and inspections already used on the case are not listed. An inspection already recorded on any document or visit of the case, including drafts, withdrawn and corrected documents, counts as used; re-importing the inspection of an unfinished draft or worksheet still refreshes it. Any other type and status combination is listed under Not available for import, greyed with its reason, and cannot be selected. When nothing can be listed, the review explains which kinds of rows the report returned. A result status is not proof that this program issued a document; shared records independently prevent inspection reuse.</w:t>
       </w:r>
     </w:p>
     <w:p>
@@ -574,8 +574,8 @@
       </w:r>
       <w:r>
         <w:rPr>
+          <w:bCs/>
           <w:b/>
-          <w:bCs/>
         </w:rPr>
         <w:t xml:space="preserve">Inspection Type</w:t>
       </w:r>
@@ -590,8 +590,8 @@
       </w:r>
       <w:r>
         <w:rPr>
+          <w:bCs/>
           <w:b/>
-          <w:bCs/>
         </w:rPr>
         <w:t xml:space="preserve">Inspection Status</w:t>
       </w:r>
@@ -622,16 +622,16 @@
     </w:p>
     <w:p>
       <w:pPr>
-        <w:pStyle w:val="Compact"/>
         <w:numPr>
           <w:ilvl w:val="0"/>
           <w:numId w:val="1002"/>
         </w:numPr>
+        <w:pStyle w:val="Compact"/>
       </w:pPr>
       <w:r>
         <w:rPr>
+          <w:bCs/>
           <w:b/>
-          <w:bCs/>
         </w:rPr>
         <w:t xml:space="preserve">Initial Inspection</w:t>
       </w:r>
@@ -644,16 +644,16 @@
     </w:p>
     <w:p>
       <w:pPr>
-        <w:pStyle w:val="Compact"/>
         <w:numPr>
           <w:ilvl w:val="0"/>
           <w:numId w:val="1002"/>
         </w:numPr>
+        <w:pStyle w:val="Compact"/>
       </w:pPr>
       <w:r>
         <w:rPr>
+          <w:bCs/>
           <w:b/>
-          <w:bCs/>
         </w:rPr>
         <w:t xml:space="preserve">Reinspection</w:t>
       </w:r>
@@ -661,21 +661,21 @@
         <w:t xml:space="preserve"> </w:t>
       </w:r>
       <w:r>
-        <w:t xml:space="preserve">needs an existing case. CA Referral or City Attorney Referral → Referral for Prosecution (the case’s first referral); Compliance → Compliance Letter (every item Corrected); Citation → Citation (at least one item cited); Extension Processing → choose Extension, Best Interest Extension or Vacancy Extension; No Occupancy → No Occupancy. On a snow case, Citation records the next snow event.</w:t>
+        <w:t xml:space="preserve">needs an existing case. CA Referral or City Attorney Referral → Referral for Prosecution (the case’s first referral); Compliance → Compliance Letter (every item Corrected); Citation → Citation (at least one item cited); Extension Processing or No Fee Extension Processing → choose Extension, Best Interest Extension or Vacancy Extension; No Occupancy or No Fee No Occupancy → No Occupancy. On a snow case, Citation records the next snow event.</w:t>
       </w:r>
     </w:p>
     <w:p>
       <w:pPr>
-        <w:pStyle w:val="Compact"/>
         <w:numPr>
           <w:ilvl w:val="0"/>
           <w:numId w:val="1002"/>
         </w:numPr>
+        <w:pStyle w:val="Compact"/>
       </w:pPr>
       <w:r>
         <w:rPr>
+          <w:bCs/>
           <w:b/>
-          <w:bCs/>
         </w:rPr>
         <w:t xml:space="preserve">CA Reinspection</w:t>
       </w:r>
@@ -688,36 +688,48 @@
     </w:p>
     <w:p>
       <w:pPr>
-        <w:pStyle w:val="Compact"/>
         <w:numPr>
           <w:ilvl w:val="0"/>
           <w:numId w:val="1002"/>
         </w:numPr>
-      </w:pPr>
-      <w:r>
-        <w:t xml:space="preserve">Completed and any other unlisted result cannot be imported: set the specific result in Accela and retrieve it again.</w:t>
+        <w:pStyle w:val="Compact"/>
+      </w:pPr>
+      <w:r>
+        <w:t xml:space="preserve">Any other combination cannot be imported: set the specific result in Accela and retrieve it again.</w:t>
       </w:r>
     </w:p>
     <w:p>
       <w:pPr>
-        <w:pStyle w:val="Compact"/>
         <w:numPr>
           <w:ilvl w:val="0"/>
           <w:numId w:val="1002"/>
         </w:numPr>
-      </w:pPr>
-      <w:r>
-        <w:t xml:space="preserve">If recorded results contradict the status (for example Compliance with an item not Corrected), the document cannot be issued. Correct the results, or correct the status in Accela and import the same inspection again; the open draft or worksheet is updated without losing your work.</w:t>
+        <w:pStyle w:val="Compact"/>
+      </w:pPr>
+      <w:r>
+        <w:t xml:space="preserve">On a case already referred to the City Attorney, only results that lead to an Update for Case Referral or a Compliance Letter can be imported.</w:t>
       </w:r>
     </w:p>
     <w:p>
       <w:pPr>
+        <w:numPr>
+          <w:ilvl w:val="0"/>
+          <w:numId w:val="1002"/>
+        </w:numPr>
+        <w:pStyle w:val="Compact"/>
+      </w:pPr>
+      <w:r>
+        <w:t xml:space="preserve">If recorded results contradict the status (for example Compliance with an item not Corrected), the document cannot be issued. Correct the results, or correct the status in Accela and import the same inspection again; the open draft or worksheet is updated without losing your work.</w:t>
+      </w:r>
+    </w:p>
+    <w:p>
+      <w:pPr>
         <w:pStyle w:val="FirstParagraph"/>
       </w:pPr>
       <w:r>
         <w:rPr>
+          <w:bCs/>
           <w:b/>
-          <w:bCs/>
         </w:rPr>
         <w:t xml:space="preserve">Review an existing case.</w:t>
       </w:r>
@@ -734,8 +746,8 @@
       </w:pPr>
       <w:r>
         <w:rPr>
+          <w:bCs/>
           <w:b/>
-          <w:bCs/>
         </w:rPr>
         <w:t xml:space="preserve">Excel alternative.</w:t>
       </w:r>
@@ -760,8 +772,8 @@
       </w:pPr>
       <w:r>
         <w:rPr>
+          <w:bCs/>
           <w:b/>
-          <w:bCs/>
         </w:rPr>
         <w:t xml:space="preserve">Pause or retry.</w:t>
       </w:r>
@@ -800,11 +812,11 @@
     </w:p>
     <w:p>
       <w:pPr>
-        <w:pStyle w:val="Compact"/>
         <w:numPr>
           <w:ilvl w:val="0"/>
           <w:numId w:val="1003"/>
         </w:numPr>
+        <w:pStyle w:val="Compact"/>
       </w:pPr>
       <w:r>
         <w:t xml:space="preserve">Choose Violation Items at the top of the document. In the Select for this notice picker, find the appropriate selectable order language and select it once. A checkmark means it is already on this notice. Select it again to remove it from the unissued draft. The same library entry cannot be added twice.</w:t>
@@ -812,11 +824,11 @@
     </w:p>
     <w:p>
       <w:pPr>
-        <w:pStyle w:val="Compact"/>
         <w:numPr>
           <w:ilvl w:val="0"/>
           <w:numId w:val="1003"/>
         </w:numPr>
+        <w:pStyle w:val="Compact"/>
       </w:pPr>
       <w:r>
         <w:t xml:space="preserve">Choose Done adding. Review each item’s ordinance, corrective action, location and case-specific details. Outlined fill-in bubbles identify missing details. Click a bubble or focus it and press Enter, enter the factual detail, and review the sentence afterward.</w:t>
@@ -824,11 +836,11 @@
     </w:p>
     <w:p>
       <w:pPr>
-        <w:pStyle w:val="Compact"/>
         <w:numPr>
           <w:ilvl w:val="0"/>
           <w:numId w:val="1003"/>
         </w:numPr>
+        <w:pStyle w:val="Compact"/>
       </w:pPr>
       <w:r>
         <w:t xml:space="preserve">Tick the checkbox beside each due date that shares a deadline (Select item N for a shared due date). In Assign due dates below the document, which counts the selected items, enter the date and choose Apply date to selected items. Use Select all or Clear when appropriate. Repeat for other groups. New items begin without an automatic deadline.</w:t>
@@ -836,11 +848,11 @@
     </w:p>
     <w:p>
       <w:pPr>
-        <w:pStyle w:val="Compact"/>
         <w:numPr>
           <w:ilvl w:val="0"/>
           <w:numId w:val="1003"/>
         </w:numPr>
+        <w:pStyle w:val="Compact"/>
       </w:pPr>
       <w:r>
         <w:t xml:space="preserve">Keep no more than three distinct outstanding-item deadlines under the existing notice rules. A batch that would create a fourth is rejected without changing the items. An invalid individual edit may be saved as work in progress but blocks issuance.</w:t>
@@ -848,11 +860,11 @@
     </w:p>
     <w:p>
       <w:pPr>
-        <w:pStyle w:val="Compact"/>
         <w:numPr>
           <w:ilvl w:val="0"/>
           <w:numId w:val="1003"/>
         </w:numPr>
+        <w:pStyle w:val="Compact"/>
       </w:pPr>
       <w:r>
         <w:t xml:space="preserve">Review the whole document, not only the edited sentence. Check recipients (the Recipients button opens copies, email and registered agent; Done closes it once the entries are valid), contact details, the mailing date, the item order and all warnings. The readiness summary at the top counts required fixes and advisories; Go to first required field jumps to the affected field, and Review (or Open full checklist) opens the Review dialog: checks that must be fixed before issuing, then advisories, or a statement that there are no concerns. Each check links to its field; closing the dialog returns you to where you were.</w:t>
@@ -860,11 +872,11 @@
     </w:p>
     <w:p>
       <w:pPr>
-        <w:pStyle w:val="Compact"/>
         <w:numPr>
           <w:ilvl w:val="0"/>
           <w:numId w:val="1003"/>
         </w:numPr>
+        <w:pStyle w:val="Compact"/>
       </w:pPr>
       <w:r>
         <w:t xml:space="preserve">Choose Save draft &amp; return to Workspace to retain unfinished work, or Issue when ready. After a confirmed shared save, Writer returns to Workspace with the issued case highlighted; if the save is refused or not confirmed, the document stays open. Verify the resulting save state.</w:t>
@@ -884,8 +896,8 @@
       </w:pPr>
       <w:r>
         <w:rPr>
+          <w:bCs/>
           <w:b/>
-          <w:bCs/>
         </w:rPr>
         <w:t xml:space="preserve">Initial citations.</w:t>
       </w:r>
@@ -970,9 +982,8 @@
       <w:tblPr>
         <w:tblStyle w:val="Table"/>
         <w:tblW w:type="pct" w:w="5000"/>
-        <w:jc w:val="left"/>
-        <w:tblLayout w:type="fixed"/>
         <w:tblLook w:firstRow="1" w:lastRow="0" w:firstColumn="0" w:lastColumn="0" w:noHBand="0" w:noVBand="0" w:val="0020"/>
+        <w:jc w:val="start"/>
       </w:tblPr>
       <w:tblGrid>
         <w:gridCol w:w="3960"/>
@@ -980,7 +991,7 @@
       </w:tblGrid>
       <w:tr>
         <w:trPr>
-          <w:tblHeader w:val="on"/>
+          <w:tblHeader w:val="true"/>
         </w:trPr>
         <w:tc>
           <w:tcPr/>
@@ -1152,8 +1163,8 @@
       </w:pPr>
       <w:r>
         <w:rPr>
+          <w:bCs/>
           <w:b/>
-          <w:bCs/>
         </w:rPr>
         <w:t xml:space="preserve">Review catalog.</w:t>
       </w:r>
@@ -1208,11 +1219,11 @@
     </w:p>
     <w:p>
       <w:pPr>
-        <w:pStyle w:val="Compact"/>
         <w:numPr>
           <w:ilvl w:val="0"/>
           <w:numId w:val="1004"/>
         </w:numPr>
+        <w:pStyle w:val="Compact"/>
       </w:pPr>
       <w:r>
         <w:t xml:space="preserve">Select one actual charged ordinance for each item. An item with several listed sections shows a Charged ordinance select with exactly those sections and nothing chosen; choose the section actually charged (saved drafts show the select unchosen and cannot be issued until a section is chosen). The deposit fields then fill from the configured schedule for the pricing date; changing the choice clears the previous charge’s values and prices the new one. If no single schedule entry applies, a blocking concern explains it rather than guessing an amount. Charging a section that is not listed on the item is a different charge and needs an approved source. Multiple offenses under one ordinance require the appropriate offense selection.</w:t>
@@ -1220,11 +1231,11 @@
     </w:p>
     <w:p>
       <w:pPr>
-        <w:pStyle w:val="Compact"/>
         <w:numPr>
           <w:ilvl w:val="0"/>
           <w:numId w:val="1004"/>
         </w:numPr>
+        <w:pStyle w:val="Compact"/>
       </w:pPr>
       <w:r>
         <w:t xml:space="preserve">Verify the description, citation number, officer or department identifier, issue date, violation date and time, court date and session. Court suggestions are not reservations; use the division’s current court and numbering instructions.</w:t>
@@ -1232,11 +1243,11 @@
     </w:p>
     <w:p>
       <w:pPr>
-        <w:pStyle w:val="Compact"/>
         <w:numPr>
           <w:ilvl w:val="0"/>
           <w:numId w:val="1004"/>
         </w:numPr>
+        <w:pStyle w:val="Compact"/>
       </w:pPr>
       <w:r>
         <w:t xml:space="preserve">Complete any required measurements in that charge card. Conditional or unmapped entries require review; the program must not borrow an unrelated amount.</w:t>
@@ -1244,11 +1255,11 @@
     </w:p>
     <w:p>
       <w:pPr>
-        <w:pStyle w:val="Compact"/>
         <w:numPr>
           <w:ilvl w:val="0"/>
           <w:numId w:val="1004"/>
         </w:numPr>
+        <w:pStyle w:val="Compact"/>
       </w:pPr>
       <w:r>
         <w:t xml:space="preserve">Complete the deposit method and its source. Choose Complete charge after the required fields are valid. Other unfinished charge cards remain unfinished.</w:t>
@@ -1256,11 +1267,11 @@
     </w:p>
     <w:p>
       <w:pPr>
-        <w:pStyle w:val="Compact"/>
         <w:numPr>
           <w:ilvl w:val="0"/>
           <w:numId w:val="1004"/>
         </w:numPr>
+        <w:pStyle w:val="Compact"/>
       </w:pPr>
       <w:r>
         <w:t xml:space="preserve">Review all four court copies for every charge and the complete letter before issuance. Confirm shared pricing/history checks. Changed history or a changed charge may require another deliberate pricing review.</w:t>
@@ -1270,9 +1281,8 @@
       <w:tblPr>
         <w:tblStyle w:val="Table"/>
         <w:tblW w:type="pct" w:w="5000"/>
-        <w:jc w:val="left"/>
-        <w:tblLayout w:type="fixed"/>
         <w:tblLook w:firstRow="1" w:lastRow="0" w:firstColumn="0" w:lastColumn="0" w:noHBand="0" w:noVBand="0" w:val="0020"/>
+        <w:jc w:val="start"/>
       </w:tblPr>
       <w:tblGrid>
         <w:gridCol w:w="3960"/>
@@ -1280,7 +1290,7 @@
       </w:tblGrid>
       <w:tr>
         <w:trPr>
-          <w:tblHeader w:val="on"/>
+          <w:tblHeader w:val="true"/>
         </w:trPr>
         <w:tc>
           <w:tcPr/>
@@ -1408,8 +1418,8 @@
       </w:pPr>
       <w:r>
         <w:rPr>
+          <w:bCs/>
           <w:b/>
-          <w:bCs/>
         </w:rPr>
         <w:t xml:space="preserve">Mandatory appearance.</w:t>
       </w:r>
@@ -1440,11 +1450,11 @@
     </w:p>
     <w:p>
       <w:pPr>
-        <w:pStyle w:val="Compact"/>
         <w:numPr>
           <w:ilvl w:val="0"/>
           <w:numId w:val="1005"/>
         </w:numPr>
+        <w:pStyle w:val="Compact"/>
       </w:pPr>
       <w:r>
         <w:t xml:space="preserve">Import the actual completed snow inspection. Verify parcel/site, respondent, mailing address, inspector, date and time.</w:t>
@@ -1452,11 +1462,11 @@
     </w:p>
     <w:p>
       <w:pPr>
-        <w:pStyle w:val="Compact"/>
         <w:numPr>
           <w:ilvl w:val="0"/>
           <w:numId w:val="1005"/>
         </w:numPr>
+        <w:pStyle w:val="Compact"/>
       </w:pPr>
       <w:r>
         <w:t xml:space="preserve">Enter the accumulation date, a positive decimal depth in inches and the observed condition: snow covered, ice covered, or snow and ice covered. Confirm photographs and select the corner-lot/curb-ramp option when factually applicable.</w:t>
@@ -1464,11 +1474,11 @@
     </w:p>
     <w:p>
       <w:pPr>
-        <w:pStyle w:val="Compact"/>
         <w:numPr>
           <w:ilvl w:val="0"/>
           <w:numId w:val="1005"/>
         </w:numPr>
+        <w:pStyle w:val="Compact"/>
       </w:pPr>
       <w:r>
         <w:t xml:space="preserve">Check the timing message. The supplied rule allows until noon City time on the day after accumulation. An observation before that point is blocked. Use actual facts; never adjust the date or time to pass a check.</w:t>
@@ -1476,11 +1486,11 @@
     </w:p>
     <w:p>
       <w:pPr>
-        <w:pStyle w:val="Compact"/>
         <w:numPr>
           <w:ilvl w:val="0"/>
           <w:numId w:val="1005"/>
         </w:numPr>
+        <w:pStyle w:val="Compact"/>
       </w:pPr>
       <w:r>
         <w:t xml:space="preserve">Review ordinance 10.28, number, description, comment, counted property history, deposit and court session. Refresh citation history if prompted. Missing parcels use the existing normalized address fallback, which requires particular attention to source identity.</w:t>
@@ -1488,11 +1498,11 @@
     </w:p>
     <w:p>
       <w:pPr>
-        <w:pStyle w:val="Compact"/>
         <w:numPr>
           <w:ilvl w:val="0"/>
           <w:numId w:val="1005"/>
         </w:numPr>
+        <w:pStyle w:val="Compact"/>
       </w:pPr>
       <w:r>
         <w:t xml:space="preserve">Review seasonal letter content. After an authorized administrator changes it, choose Refresh seasonal letter and review the new content. Stale shared content prevents issuance until reconciled.</w:t>
@@ -1500,11 +1510,11 @@
     </w:p>
     <w:p>
       <w:pPr>
-        <w:pStyle w:val="Compact"/>
         <w:numPr>
           <w:ilvl w:val="0"/>
           <w:numId w:val="1005"/>
         </w:numPr>
+        <w:pStyle w:val="Compact"/>
       </w:pPr>
       <w:r>
         <w:t xml:space="preserve">Issue, confirm the shared save (Writer returns to Workspace with the case highlighted) and verify the original PDF. The standard authoring-11 packet includes the snow cover and retained language-access continuation plus four MC-2000 copies; a cover may continue onto another page. Do not force a five-page total or remove language to shorten the packet.</w:t>
@@ -1524,8 +1534,8 @@
       </w:pPr>
       <w:r>
         <w:rPr>
+          <w:bCs/>
           <w:b/>
-          <w:bCs/>
         </w:rPr>
         <w:t xml:space="preserve">Division policy decisions.</w:t>
       </w:r>
@@ -1560,8 +1570,8 @@
       </w:pPr>
       <w:r>
         <w:rPr>
+          <w:bCs/>
           <w:b/>
-          <w:bCs/>
         </w:rPr>
         <w:t xml:space="preserve">Group due dates on reinspection.</w:t>
       </w:r>
@@ -1586,8 +1596,8 @@
       </w:pPr>
       <w:r>
         <w:rPr>
+          <w:bCs/>
           <w:b/>
-          <w:bCs/>
         </w:rPr>
         <w:t xml:space="preserve">One item at a time.</w:t>
       </w:r>
@@ -1602,9 +1612,8 @@
       <w:tblPr>
         <w:tblStyle w:val="Table"/>
         <w:tblW w:type="pct" w:w="5000"/>
-        <w:jc w:val="left"/>
-        <w:tblLayout w:type="fixed"/>
         <w:tblLook w:firstRow="1" w:lastRow="0" w:firstColumn="0" w:lastColumn="0" w:noHBand="0" w:noVBand="0" w:val="0020"/>
+        <w:jc w:val="start"/>
       </w:tblPr>
       <w:tblGrid>
         <w:gridCol w:w="3960"/>
@@ -1612,7 +1621,7 @@
       </w:tblGrid>
       <w:tr>
         <w:trPr>
-          <w:tblHeader w:val="on"/>
+          <w:tblHeader w:val="true"/>
         </w:trPr>
         <w:tc>
           <w:tcPr/>
@@ -1780,9 +1789,8 @@
       <w:tblPr>
         <w:tblStyle w:val="Table"/>
         <w:tblW w:type="pct" w:w="5000"/>
-        <w:jc w:val="left"/>
-        <w:tblLayout w:type="fixed"/>
         <w:tblLook w:firstRow="1" w:lastRow="0" w:firstColumn="0" w:lastColumn="0" w:noHBand="0" w:noVBand="0" w:val="0020"/>
+        <w:jc w:val="start"/>
       </w:tblPr>
       <w:tblGrid>
         <w:gridCol w:w="3960"/>
@@ -1790,7 +1798,7 @@
       </w:tblGrid>
       <w:tr>
         <w:trPr>
-          <w:tblHeader w:val="on"/>
+          <w:tblHeader w:val="true"/>
         </w:trPr>
         <w:tc>
           <w:tcPr/>
@@ -2046,7 +2054,7 @@
               <w:jc w:val="left"/>
             </w:pPr>
             <w:r>
-              <w:t xml:space="preserve">Additional time for selected eligible items, with recorded reasons</w:t>
+              <w:t xml:space="preserve">Additional time for every uncorrected item, with recorded reasons and new due dates</w:t>
             </w:r>
           </w:p>
         </w:tc>
@@ -2072,7 +2080,7 @@
               <w:jc w:val="left"/>
             </w:pPr>
             <w:r>
-              <w:t xml:space="preserve">A reviewed vacancy model with appointment, repair and expiration facts</w:t>
+              <w:t xml:space="preserve">Time for every uncorrected item while the building or unit remains vacant, with a review inspection</w:t>
             </w:r>
           </w:p>
         </w:tc>
@@ -2083,7 +2091,7 @@
         <w:pStyle w:val="BodyText"/>
       </w:pPr>
       <w:r>
-        <w:t xml:space="preserve">An extension changes selected deadlines, not the historical original deadlines. A citation charges selected outstanding items; all carried items remain accounted for. A referral does not invent a new repair deadline. After City Attorney referral, ordinary new extensions and citations are unavailable through this path. A referral update or applicable compliance action preserves the referral history.</w:t>
+        <w:t xml:space="preserve">An extension changes selected deadlines, not the historical original deadlines. A citation charges selected outstanding items; all carried items remain accounted for. A referral does not invent a new repair deadline. After City Attorney referral, the only documents offered or allowed are Update for Case Referral and Compliance Letter; extensions, citations and scoped orders are unavailable. A referral update or applicable compliance action preserves the referral history. Corrections of documents issued before the referral remain available.</w:t>
       </w:r>
     </w:p>
     <w:p>
@@ -2125,7 +2133,7 @@
         <w:pStyle w:val="FirstParagraph"/>
       </w:pPr>
       <w:r>
-        <w:t xml:space="preserve">Scoped orders and administrative families begin without legal approval. The new authoring-15 Best Interest Extension uses the simplified entry described below; other scoped families and historical Best Interest formats retain their review requirements. Drafting is possible while review is incomplete. Where Authority, wording and signer review is required, supply the actual division reviewer, current-code source, revision or effective date, amendment review, current-code review date, approved authority/wording/procedure reference, signer and delegation. Assigned inspector, authorized signer and issuing operator are separate retained facts.</w:t>
+        <w:t xml:space="preserve">Scoped orders and administrative families begin without legal approval. New Best Interest and Vacancy Extensions (authoring 16) use the simplified entry described below; other scoped families and historical extension formats retain their review requirements. Drafting is possible while review is incomplete. Where Authority, wording and signer review is required, supply the actual division reviewer, current-code source, revision or effective date, amendment review, current-code review date, approved authority/wording/procedure reference, signer and delegation. Assigned inspector, authorized signer and issuing operator are separate retained facts.</w:t>
       </w:r>
     </w:p>
     <w:p>
@@ -2134,8 +2142,8 @@
       </w:pPr>
       <w:r>
         <w:rPr>
+          <w:bCs/>
           <w:b/>
-          <w:bCs/>
         </w:rPr>
         <w:t xml:space="preserve">Summary Abatement.</w:t>
       </w:r>
@@ -2152,8 +2160,8 @@
       </w:pPr>
       <w:r>
         <w:rPr>
+          <w:bCs/>
           <w:b/>
-          <w:bCs/>
         </w:rPr>
         <w:t xml:space="preserve">Non-Summary Abatement.</w:t>
       </w:r>
@@ -2170,8 +2178,8 @@
       </w:pPr>
       <w:r>
         <w:rPr>
+          <w:bCs/>
           <w:b/>
-          <w:bCs/>
         </w:rPr>
         <w:t xml:space="preserve">No Occupancy.</w:t>
       </w:r>
@@ -2188,8 +2196,8 @@
       </w:pPr>
       <w:r>
         <w:rPr>
+          <w:bCs/>
           <w:b/>
-          <w:bCs/>
         </w:rPr>
         <w:t xml:space="preserve">Best Interest Extension.</w:t>
       </w:r>
@@ -2197,7 +2205,22 @@
         <w:t xml:space="preserve"> </w:t>
       </w:r>
       <w:r>
-        <w:t xml:space="preserve">New authoring-15 documents use Reasons for Additional Time without a signer block. Ordinary case/recipient facts and selected-item deadline rules remain. In Violation items, tick Affected beside each eligible item’s due date and enter its later date; other items retain their dates. Do not extend safety, security or urgent obligations. Confirm Affected items exclude safety, security and urgent obligations. This checkbox remains required; the separate factual-basis and authority/signer entry sections are removed only for this new Best Interest format. Older unissued drafts keep their earlier format unless Use simplified Reasons-only format is chosen; this retains their earlier review data. Issued historical formats and their corrections remain unchanged. This extension is not a City Attorney referral.</w:t>
+        <w:t xml:space="preserve">New authoring-16 documents extend every uncorrected item and use Reasons for Additional Time without a signer block. There are no affected-item checkboxes and no safety confirmation. Due dates work as on a normal Extension: on the reinspection worksheet, enter each outstanding item’s Next due date; the document takes those dates, and you can change them in Violation items. Use a future date for each uncorrected item, at most three distinct dates, at least seven days apart. Corrected items keep their dates. The letter reads</w:t>
+      </w:r>
+      <w:r>
+        <w:t xml:space="preserve"> </w:t>
+      </w:r>
+      <w:r>
+        <w:t xml:space="preserve">“</w:t>
+      </w:r>
+      <w:r>
+        <w:t xml:space="preserve">Additional time is granted for the uncorrected items for the following reasons: …</w:t>
+      </w:r>
+      <w:r>
+        <w:t xml:space="preserve">”</w:t>
+      </w:r>
+      <w:r>
+        <w:t xml:space="preserve">. Older unissued drafts keep their earlier format unless Use simplified Reasons-only format is chosen, which moves them to this format and retains their earlier review data. Authoring-15 drafts keep their R61 format with its safety checkbox. Issued historical formats and their corrections remain unchanged. This extension is not a City Attorney referral.</w:t>
       </w:r>
     </w:p>
     <w:p>
@@ -2206,8 +2229,8 @@
       </w:pPr>
       <w:r>
         <w:rPr>
+          <w:bCs/>
           <w:b/>
-          <w:bCs/>
         </w:rPr>
         <w:t xml:space="preserve">Vacancy Extension.</w:t>
       </w:r>
@@ -2215,7 +2238,40 @@
         <w:t xml:space="preserve"> </w:t>
       </w:r>
       <w:r>
-        <w:t xml:space="preserve">Verify vacancy, request, selected items, maintenance/security conditions, review appointment, approved expiration model and transfer/disclosure wording. In the violation items table, tick Affected beside each affected item’s due date and enter its new due date. Contact-by is calculated seven calendar days before the actual review appointment; short notice needs the approved procedure reference. Renewal requires a new reviewed action. Apartment scope preserves common-area duties.</w:t>
+        <w:t xml:space="preserve">New authoring-16 documents extend every uncorrected item while the building or apartment / unit remains vacant. Enter only Scope (and the apartment / unit identifier) and the Next scheduled review inspection, which must be at least seven days after the mailing date; contact-by is calculated seven calendar days before it. Uncorrected items print no due date; corrected items keep their dates. The letter reads</w:t>
+      </w:r>
+      <w:r>
+        <w:t xml:space="preserve"> </w:t>
+      </w:r>
+      <w:r>
+        <w:t xml:space="preserve">“</w:t>
+      </w:r>
+      <w:r>
+        <w:t xml:space="preserve">While the apartment / unit remains vacant and the conditions below are met, we grant an extension for the uncorrected item(s).</w:t>
+      </w:r>
+      <w:r>
+        <w:t xml:space="preserve">”</w:t>
+      </w:r>
+      <w:r>
+        <w:t xml:space="preserve"> </w:t>
+      </w:r>
+      <w:r>
+        <w:t xml:space="preserve">(or</w:t>
+      </w:r>
+      <w:r>
+        <w:t xml:space="preserve"> </w:t>
+      </w:r>
+      <w:r>
+        <w:t xml:space="preserve">“</w:t>
+      </w:r>
+      <w:r>
+        <w:t xml:space="preserve">the building</w:t>
+      </w:r>
+      <w:r>
+        <w:t xml:space="preserve">”</w:t>
+      </w:r>
+      <w:r>
+        <w:t xml:space="preserve">). The affected-item checkboxes, safety confirmation and basis, extension request reference, verified vacancy basis, approved continuing conditions, expiration / review model, sale / transfer wording, short-notice procedure and the Authority, wording and signer review are removed, as is the signer block. Renewal requires a new action. Apartment scope preserves common-area duties. Earlier Vacancy Extensions reprint unchanged.</w:t>
       </w:r>
     </w:p>
     <w:p>
@@ -2224,8 +2280,8 @@
       </w:pPr>
       <w:r>
         <w:rPr>
+          <w:bCs/>
           <w:b/>
-          <w:bCs/>
         </w:rPr>
         <w:t xml:space="preserve">R54 extension layout.</w:t>
       </w:r>
@@ -2251,7 +2307,7 @@
         <w:t xml:space="preserve"> </w:t>
       </w:r>
       <w:r>
-        <w:t xml:space="preserve">for affected items, keep their stored repair dates and reprint unchanged. Vacancy Extensions and authoring-14 and earlier Best Interest Extensions retain their supervisory signer after the table; new authoring-15 Best Interest Extensions have no signer block. The regular Extension is unchanged. Previously issued documents and corrections of authoring-11 or earlier documents retain their historical layout.</w:t>
+        <w:t xml:space="preserve">for affected items, keep their stored repair dates and reprint unchanged. Authoring-15 and earlier Vacancy Extensions and authoring-14 and earlier Best Interest Extensions retain their supervisory signer after the table; new Best Interest (authoring 15 and later) and Vacancy (authoring 16) Extensions have no signer block. From R62 (authoring 16) both cover every uncorrected item without Affected checkboxes. The regular Extension is unchanged. Previously issued documents and corrections of authoring-11 or earlier documents retain their historical layout.</w:t>
       </w:r>
     </w:p>
     <w:p>
@@ -2259,7 +2315,7 @@
         <w:pStyle w:val="BodyText"/>
       </w:pPr>
       <w:r>
-        <w:t xml:space="preserve">A referred case needs an explicit reviewed exception and City Attorney coordination for an otherwise eligible emergency or occupancy action. Draft wording, supplied templates and synthetic test approvals are not proof of current law. Use the division’s actual review; current-code and procedure approval remain documented acceptance items.</w:t>
+        <w:t xml:space="preserve">A referred case allows only an Update for Case Referral or a Compliance Letter; the former reviewed emergency / occupancy exception is removed. Draft wording, supplied templates and synthetic test approvals are not proof of current law. Use the division’s actual review; current-code and procedure approval remain documented acceptance items.</w:t>
       </w:r>
     </w:p>
     <w:bookmarkEnd w:id="30"/>
@@ -2286,8 +2342,8 @@
       </w:pPr>
       <w:r>
         <w:rPr>
+          <w:bCs/>
           <w:b/>
-          <w:bCs/>
         </w:rPr>
         <w:t xml:space="preserve">Issue deliberately.</w:t>
       </w:r>
@@ -2302,9 +2358,8 @@
       <w:tblPr>
         <w:tblStyle w:val="Table"/>
         <w:tblW w:type="pct" w:w="5000"/>
-        <w:jc w:val="left"/>
-        <w:tblLayout w:type="fixed"/>
         <w:tblLook w:firstRow="1" w:lastRow="0" w:firstColumn="0" w:lastColumn="0" w:noHBand="0" w:noVBand="0" w:val="0020"/>
+        <w:jc w:val="start"/>
       </w:tblPr>
       <w:tblGrid>
         <w:gridCol w:w="3960"/>
@@ -2312,7 +2367,7 @@
       </w:tblGrid>
       <w:tr>
         <w:trPr>
-          <w:tblHeader w:val="on"/>
+          <w:tblHeader w:val="true"/>
         </w:trPr>
         <w:tc>
           <w:tcPr/>
@@ -2450,8 +2505,8 @@
       </w:pPr>
       <w:r>
         <w:rPr>
+          <w:bCs/>
           <w:b/>
-          <w:bCs/>
         </w:rPr>
         <w:t xml:space="preserve">Original PDFs.</w:t>
       </w:r>
@@ -2468,8 +2523,8 @@
       </w:pPr>
       <w:r>
         <w:rPr>
+          <w:bCs/>
           <w:b/>
-          <w:bCs/>
         </w:rPr>
         <w:t xml:space="preserve">Print and mail.</w:t>
       </w:r>
@@ -2486,8 +2541,8 @@
       </w:pPr>
       <w:r>
         <w:rPr>
+          <w:bCs/>
           <w:b/>
-          <w:bCs/>
         </w:rPr>
         <w:t xml:space="preserve">Email.</w:t>
       </w:r>
@@ -2504,8 +2559,8 @@
       </w:pPr>
       <w:r>
         <w:rPr>
+          <w:bCs/>
           <w:b/>
-          <w:bCs/>
         </w:rPr>
         <w:t xml:space="preserve">Outside records.</w:t>
       </w:r>
@@ -2536,11 +2591,11 @@
     </w:p>
     <w:p>
       <w:pPr>
-        <w:pStyle w:val="Compact"/>
         <w:numPr>
           <w:ilvl w:val="0"/>
           <w:numId w:val="1006"/>
         </w:numPr>
+        <w:pStyle w:val="Compact"/>
       </w:pPr>
       <w:r>
         <w:t xml:space="preserve">Open the issued document from case history and choose Correct document.</w:t>
@@ -2548,11 +2603,11 @@
     </w:p>
     <w:p>
       <w:pPr>
-        <w:pStyle w:val="Compact"/>
         <w:numPr>
           <w:ilvl w:val="0"/>
           <w:numId w:val="1006"/>
         </w:numPr>
+        <w:pStyle w:val="Compact"/>
       </w:pPr>
       <w:r>
         <w:t xml:space="preserve">State the recording error and reason. For a citation or referral, record the actual receiving court or City Attorney amendment instructions/reference where required. The program does not issue those instructions for you.</w:t>
@@ -2560,11 +2615,11 @@
     </w:p>
     <w:p>
       <w:pPr>
-        <w:pStyle w:val="Compact"/>
         <w:numPr>
           <w:ilvl w:val="0"/>
           <w:numId w:val="1006"/>
         </w:numPr>
+        <w:pStyle w:val="Compact"/>
       </w:pPr>
       <w:r>
         <w:t xml:space="preserve">Make the permitted correction. Review the before/after comparison, affected case facts and linked worksheet facts. Keep the original document, item, root, visit and citation identities.</w:t>
@@ -2572,11 +2627,11 @@
     </w:p>
     <w:p>
       <w:pPr>
-        <w:pStyle w:val="Compact"/>
         <w:numPr>
           <w:ilvl w:val="0"/>
           <w:numId w:val="1006"/>
         </w:numPr>
+        <w:pStyle w:val="Compact"/>
       </w:pPr>
       <w:r>
         <w:t xml:space="preserve">Review and issue the linked revision. Until its shared save is confirmed, the earlier issued version remains effective in the program.</w:t>
@@ -2584,11 +2639,11 @@
     </w:p>
     <w:p>
       <w:pPr>
-        <w:pStyle w:val="Compact"/>
         <w:numPr>
           <w:ilvl w:val="0"/>
           <w:numId w:val="1006"/>
         </w:numPr>
+        <w:pStyle w:val="Compact"/>
       </w:pPr>
       <w:r>
         <w:t xml:space="preserve">Confirm the correction’s original PDF and complete outside amendment, mailing and recording steps under the actual procedure.</w:t>
@@ -2600,8 +2655,8 @@
       </w:pPr>
       <w:r>
         <w:rPr>
+          <w:bCs/>
           <w:b/>
-          <w:bCs/>
         </w:rPr>
         <w:t xml:space="preserve">Withdraw an item.</w:t>
       </w:r>
@@ -2618,8 +2673,8 @@
       </w:pPr>
       <w:r>
         <w:rPr>
+          <w:bCs/>
           <w:b/>
-          <w:bCs/>
         </w:rPr>
         <w:t xml:space="preserve">Correct a visit.</w:t>
       </w:r>
@@ -2636,8 +2691,8 @@
       </w:pPr>
       <w:r>
         <w:rPr>
+          <w:bCs/>
           <w:b/>
-          <w:bCs/>
         </w:rPr>
         <w:t xml:space="preserve">Citation prices and dates.</w:t>
       </w:r>
@@ -2654,8 +2709,8 @@
       </w:pPr>
       <w:r>
         <w:rPr>
+          <w:bCs/>
           <w:b/>
-          <w:bCs/>
         </w:rPr>
         <w:t xml:space="preserve">Restrictions and release.</w:t>
       </w:r>
@@ -2696,9 +2751,8 @@
       <w:tblPr>
         <w:tblStyle w:val="Table"/>
         <w:tblW w:type="pct" w:w="5000"/>
-        <w:jc w:val="left"/>
-        <w:tblLayout w:type="fixed"/>
         <w:tblLook w:firstRow="1" w:lastRow="0" w:firstColumn="0" w:lastColumn="0" w:noHBand="0" w:noVBand="0" w:val="0020"/>
+        <w:jc w:val="start"/>
       </w:tblPr>
       <w:tblGrid>
         <w:gridCol w:w="3960"/>
@@ -2706,7 +2760,7 @@
       </w:tblGrid>
       <w:tr>
         <w:trPr>
-          <w:tblHeader w:val="on"/>
+          <w:tblHeader w:val="true"/>
         </w:trPr>
         <w:tc>
           <w:tcPr/>
@@ -2818,8 +2872,8 @@
       </w:pPr>
       <w:r>
         <w:rPr>
+          <w:bCs/>
           <w:b/>
-          <w:bCs/>
         </w:rPr>
         <w:t xml:space="preserve">Device save failure.</w:t>
       </w:r>
@@ -2836,8 +2890,8 @@
       </w:pPr>
       <w:r>
         <w:rPr>
+          <w:bCs/>
           <w:b/>
-          <w:bCs/>
         </w:rPr>
         <w:t xml:space="preserve">Uncertain shared save.</w:t>
       </w:r>
@@ -2854,8 +2908,8 @@
       </w:pPr>
       <w:r>
         <w:rPr>
+          <w:bCs/>
           <w:b/>
-          <w:bCs/>
         </w:rPr>
         <w:t xml:space="preserve">Shared changes.</w:t>
       </w:r>
@@ -2872,8 +2926,8 @@
       </w:pPr>
       <w:r>
         <w:rPr>
+          <w:bCs/>
           <w:b/>
-          <w:bCs/>
         </w:rPr>
         <w:t xml:space="preserve">PDF exceptions.</w:t>
       </w:r>
@@ -2922,9 +2976,8 @@
       <w:tblPr>
         <w:tblStyle w:val="Table"/>
         <w:tblW w:type="pct" w:w="5000"/>
-        <w:jc w:val="left"/>
-        <w:tblLayout w:type="fixed"/>
         <w:tblLook w:firstRow="1" w:lastRow="0" w:firstColumn="0" w:lastColumn="0" w:noHBand="0" w:noVBand="0" w:val="0020"/>
+        <w:jc w:val="start"/>
       </w:tblPr>
       <w:tblGrid>
         <w:gridCol w:w="3960"/>
@@ -2932,7 +2985,7 @@
       </w:tblGrid>
       <w:tr>
         <w:trPr>
-          <w:tblHeader w:val="on"/>
+          <w:tblHeader w:val="true"/>
         </w:trPr>
         <w:tc>
           <w:tcPr/>
@@ -3122,8 +3175,8 @@
       </w:pPr>
       <w:r>
         <w:rPr>
+          <w:bCs/>
           <w:b/>
-          <w:bCs/>
         </w:rPr>
         <w:t xml:space="preserve">Recover one case.</w:t>
       </w:r>
@@ -3140,8 +3193,8 @@
       </w:pPr>
       <w:r>
         <w:rPr>
+          <w:bCs/>
           <w:b/>
-          <w:bCs/>
         </w:rPr>
         <w:t xml:space="preserve">Restore a workspace.</w:t>
       </w:r>
@@ -3158,8 +3211,8 @@
       </w:pPr>
       <w:r>
         <w:rPr>
+          <w:bCs/>
           <w:b/>
-          <w:bCs/>
         </w:rPr>
         <w:t xml:space="preserve">Change PCs or browser profiles.</w:t>
       </w:r>
@@ -3176,8 +3229,8 @@
       </w:pPr>
       <w:r>
         <w:rPr>
+          <w:bCs/>
           <w:b/>
-          <w:bCs/>
         </w:rPr>
         <w:t xml:space="preserve">After an update interruption.</w:t>
       </w:r>
@@ -3194,8 +3247,8 @@
       </w:pPr>
       <w:r>
         <w:rPr>
+          <w:bCs/>
           <w:b/>
-          <w:bCs/>
         </w:rPr>
         <w:t xml:space="preserve">Test recovery.</w:t>
       </w:r>
@@ -3228,9 +3281,8 @@
       <w:tblPr>
         <w:tblStyle w:val="Table"/>
         <w:tblW w:type="pct" w:w="5000"/>
-        <w:jc w:val="left"/>
-        <w:tblLayout w:type="fixed"/>
         <w:tblLook w:firstRow="1" w:lastRow="0" w:firstColumn="0" w:lastColumn="0" w:noHBand="0" w:noVBand="0" w:val="0020"/>
+        <w:jc w:val="start"/>
       </w:tblPr>
       <w:tblGrid>
         <w:gridCol w:w="3960"/>
@@ -3238,7 +3290,7 @@
       </w:tblGrid>
       <w:tr>
         <w:trPr>
-          <w:tblHeader w:val="on"/>
+          <w:tblHeader w:val="true"/>
         </w:trPr>
         <w:tc>
           <w:tcPr/>
@@ -3600,8 +3652,8 @@
       </w:pPr>
       <w:r>
         <w:rPr>
+          <w:bCs/>
           <w:b/>
-          <w:bCs/>
         </w:rPr>
         <w:t xml:space="preserve">Check coverage first.</w:t>
       </w:r>
@@ -3626,8 +3678,8 @@
       </w:pPr>
       <w:r>
         <w:rPr>
+          <w:bCs/>
           <w:b/>
-          <w:bCs/>
         </w:rPr>
         <w:t xml:space="preserve">Maps.</w:t>
       </w:r>
@@ -3644,8 +3696,8 @@
       </w:pPr>
       <w:r>
         <w:rPr>
+          <w:bCs/>
           <w:b/>
-          <w:bCs/>
         </w:rPr>
         <w:t xml:space="preserve">Drill into data.</w:t>
       </w:r>
@@ -3662,8 +3714,8 @@
       </w:pPr>
       <w:r>
         <w:rPr>
+          <w:bCs/>
           <w:b/>
-          <w:bCs/>
         </w:rPr>
         <w:t xml:space="preserve">Export.</w:t>
       </w:r>
@@ -3680,8 +3732,8 @@
       </w:pPr>
       <w:r>
         <w:rPr>
+          <w:bCs/>
           <w:b/>
-          <w:bCs/>
         </w:rPr>
         <w:t xml:space="preserve">Deposit schedule.</w:t>
       </w:r>
@@ -3698,8 +3750,8 @@
       </w:pPr>
       <w:r>
         <w:rPr>
+          <w:bCs/>
           <w:b/>
-          <w:bCs/>
         </w:rPr>
         <w:t xml:space="preserve">Refresh speed.</w:t>
       </w:r>
@@ -3734,8 +3786,8 @@
       </w:pPr>
       <w:r>
         <w:rPr>
+          <w:bCs/>
           <w:b/>
-          <w:bCs/>
         </w:rPr>
         <w:t xml:space="preserve">Search shared case records.</w:t>
       </w:r>
@@ -3752,8 +3804,8 @@
       </w:pPr>
       <w:r>
         <w:rPr>
+          <w:bCs/>
           <w:b/>
-          <w:bCs/>
         </w:rPr>
         <w:t xml:space="preserve">Reminders.</w:t>
       </w:r>
@@ -3770,8 +3822,8 @@
       </w:pPr>
       <w:r>
         <w:rPr>
+          <w:bCs/>
           <w:b/>
-          <w:bCs/>
         </w:rPr>
         <w:t xml:space="preserve">Batch draft due dates.</w:t>
       </w:r>
@@ -3788,8 +3840,8 @@
       </w:pPr>
       <w:r>
         <w:rPr>
+          <w:bCs/>
           <w:b/>
-          <w:bCs/>
         </w:rPr>
         <w:t xml:space="preserve">Open saved case.</w:t>
       </w:r>
@@ -3806,8 +3858,8 @@
       </w:pPr>
       <w:r>
         <w:rPr>
+          <w:bCs/>
           <w:b/>
-          <w:bCs/>
         </w:rPr>
         <w:t xml:space="preserve">Display.</w:t>
       </w:r>
@@ -3824,8 +3876,8 @@
       </w:pPr>
       <w:r>
         <w:rPr>
+          <w:bCs/>
           <w:b/>
-          <w:bCs/>
         </w:rPr>
         <w:t xml:space="preserve">Messages.</w:t>
       </w:r>
@@ -3842,8 +3894,8 @@
       </w:pPr>
       <w:r>
         <w:rPr>
+          <w:bCs/>
           <w:b/>
-          <w:bCs/>
         </w:rPr>
         <w:t xml:space="preserve">Administrative deposit exceptions.</w:t>
       </w:r>
@@ -3886,8 +3938,8 @@
       </w:pPr>
       <w:r>
         <w:rPr>
+          <w:bCs/>
           <w:b/>
-          <w:bCs/>
         </w:rPr>
         <w:t xml:space="preserve">Shared folders.</w:t>
       </w:r>
@@ -3904,8 +3956,8 @@
       </w:pPr>
       <w:r>
         <w:rPr>
+          <w:bCs/>
           <w:b/>
-          <w:bCs/>
         </w:rPr>
         <w:t xml:space="preserve">Protected anchor.</w:t>
       </w:r>
@@ -3922,8 +3974,8 @@
       </w:pPr>
       <w:r>
         <w:rPr>
+          <w:bCs/>
           <w:b/>
-          <w:bCs/>
         </w:rPr>
         <w:t xml:space="preserve">Record holds.</w:t>
       </w:r>
@@ -3940,8 +3992,8 @@
       </w:pPr>
       <w:r>
         <w:rPr>
+          <w:bCs/>
           <w:b/>
-          <w:bCs/>
         </w:rPr>
         <w:t xml:space="preserve">Locks.</w:t>
       </w:r>
@@ -3958,8 +4010,8 @@
       </w:pPr>
       <w:r>
         <w:rPr>
+          <w:bCs/>
           <w:b/>
-          <w:bCs/>
         </w:rPr>
         <w:t xml:space="preserve">Approved connections.</w:t>
       </w:r>
@@ -3976,8 +4028,8 @@
       </w:pPr>
       <w:r>
         <w:rPr>
+          <w:bCs/>
           <w:b/>
-          <w:bCs/>
         </w:rPr>
         <w:t xml:space="preserve">SQL.</w:t>
       </w:r>
@@ -3994,8 +4046,8 @@
       </w:pPr>
       <w:r>
         <w:rPr>
+          <w:bCs/>
           <w:b/>
-          <w:bCs/>
         </w:rPr>
         <w:t xml:space="preserve">Policy and catalog.</w:t>
       </w:r>
@@ -4012,8 +4064,8 @@
       </w:pPr>
       <w:r>
         <w:rPr>
+          <w:bCs/>
           <w:b/>
-          <w:bCs/>
         </w:rPr>
         <w:t xml:space="preserve">Retention.</w:t>
       </w:r>
@@ -4030,8 +4082,8 @@
       </w:pPr>
       <w:r>
         <w:rPr>
+          <w:bCs/>
           <w:b/>
-          <w:bCs/>
         </w:rPr>
         <w:t xml:space="preserve">Release ownership.</w:t>
       </w:r>
@@ -4064,9 +4116,8 @@
       <w:tblPr>
         <w:tblStyle w:val="Table"/>
         <w:tblW w:type="pct" w:w="5000"/>
-        <w:jc w:val="left"/>
-        <w:tblLayout w:type="fixed"/>
         <w:tblLook w:firstRow="1" w:lastRow="0" w:firstColumn="0" w:lastColumn="0" w:noHBand="0" w:noVBand="0" w:val="0020"/>
+        <w:jc w:val="start"/>
       </w:tblPr>
       <w:tblGrid>
         <w:gridCol w:w="3960"/>
@@ -4074,7 +4125,7 @@
       </w:tblGrid>
       <w:tr>
         <w:trPr>
-          <w:tblHeader w:val="on"/>
+          <w:tblHeader w:val="true"/>
         </w:trPr>
         <w:tc>
           <w:tcPr/>
@@ -4246,8 +4297,8 @@
       </w:pPr>
       <w:r>
         <w:rPr>
+          <w:bCs/>
           <w:b/>
-          <w:bCs/>
         </w:rPr>
         <w:t xml:space="preserve">Read the whole task.</w:t>
       </w:r>
@@ -4264,8 +4315,8 @@
       </w:pPr>
       <w:r>
         <w:rPr>
+          <w:bCs/>
           <w:b/>
-          <w:bCs/>
         </w:rPr>
         <w:t xml:space="preserve">Small screens and zoom.</w:t>
       </w:r>
@@ -4282,8 +4333,8 @@
       </w:pPr>
       <w:r>
         <w:rPr>
+          <w:bCs/>
           <w:b/>
-          <w:bCs/>
         </w:rPr>
         <w:t xml:space="preserve">Display preferences.</w:t>
       </w:r>
@@ -4324,9 +4375,8 @@
       <w:tblPr>
         <w:tblStyle w:val="Table"/>
         <w:tblW w:type="pct" w:w="5000"/>
-        <w:jc w:val="left"/>
-        <w:tblLayout w:type="fixed"/>
         <w:tblLook w:firstRow="1" w:lastRow="0" w:firstColumn="0" w:lastColumn="0" w:noHBand="0" w:noVBand="0" w:val="0020"/>
+        <w:jc w:val="start"/>
       </w:tblPr>
       <w:tblGrid>
         <w:gridCol w:w="3960"/>
@@ -4334,7 +4384,7 @@
       </w:tblGrid>
       <w:tr>
         <w:trPr>
-          <w:tblHeader w:val="on"/>
+          <w:tblHeader w:val="true"/>
         </w:trPr>
         <w:tc>
           <w:tcPr/>
@@ -4564,7 +4614,7 @@
               <w:jc w:val="left"/>
             </w:pPr>
             <w:r>
-              <w:t xml:space="preserve">Open Source and import details and read the result status. Eligibility depends on both Inspection Type and Inspection Status. Completed, Scheduled, Pending, Assist and unlisted results cannot be imported. Missing actual dates also block import; use the type/status rules in section 4. If valid results are absent, use the complete current installation and retrieve the case again. An already used result requires Continue existing case</w:t>
+              <w:t xml:space="preserve">Open Source and import details and read the result status. Eligibility depends on both Inspection Type and Inspection Status. Scheduled, Pending, Completed, Inspection, No Violation, Reinspection and No Fee Reinspection results, Initial Inspection results with No Entry, Assist inspections, undated rows and inspections already used on the case are not listed. Other combinations are listed as not available with their reason; use the type/status rules in section 4. If valid results are absent, use the complete current installation and retrieve the case again. An already used result requires Continue existing case</w:t>
             </w:r>
           </w:p>
         </w:tc>
@@ -5081,8 +5131,8 @@
       </w:pPr>
       <w:r>
         <w:rPr>
+          <w:bCs/>
           <w:b/>
-          <w:bCs/>
         </w:rPr>
         <w:t xml:space="preserve">Import and notice.</w:t>
       </w:r>
@@ -5099,8 +5149,8 @@
       </w:pPr>
       <w:r>
         <w:rPr>
+          <w:bCs/>
           <w:b/>
-          <w:bCs/>
         </w:rPr>
         <w:t xml:space="preserve">Snow.</w:t>
       </w:r>
@@ -5117,8 +5167,8 @@
       </w:pPr>
       <w:r>
         <w:rPr>
+          <w:bCs/>
           <w:b/>
-          <w:bCs/>
         </w:rPr>
         <w:t xml:space="preserve">Reinspection.</w:t>
       </w:r>
@@ -5135,8 +5185,8 @@
       </w:pPr>
       <w:r>
         <w:rPr>
+          <w:bCs/>
           <w:b/>
-          <w:bCs/>
         </w:rPr>
         <w:t xml:space="preserve">Correction and recovery.</w:t>
       </w:r>
@@ -5153,8 +5203,8 @@
       </w:pPr>
       <w:r>
         <w:rPr>
+          <w:bCs/>
           <w:b/>
-          <w:bCs/>
         </w:rPr>
         <w:t xml:space="preserve">Reports and accessibility.</w:t>
       </w:r>
@@ -5169,9 +5219,8 @@
       <w:tblPr>
         <w:tblStyle w:val="Table"/>
         <w:tblW w:type="pct" w:w="5000"/>
-        <w:jc w:val="left"/>
-        <w:tblLayout w:type="fixed"/>
         <w:tblLook w:firstRow="1" w:lastRow="0" w:firstColumn="0" w:lastColumn="0" w:noHBand="0" w:noVBand="0" w:val="0020"/>
+        <w:jc w:val="start"/>
       </w:tblPr>
       <w:tblGrid>
         <w:gridCol w:w="3960"/>
@@ -5179,7 +5228,7 @@
       </w:tblGrid>
       <w:tr>
         <w:trPr>
-          <w:tblHeader w:val="on"/>
+          <w:tblHeader w:val="true"/>
         </w:trPr>
         <w:tc>
           <w:tcPr/>
@@ -5492,13 +5541,13 @@
     </w:p>
     <w:bookmarkEnd w:id="41"/>
     <w:bookmarkEnd w:id="42"/>
-    <w:bookmarkStart w:id="43" w:name="r61-document-presentation"/>
+    <w:bookmarkStart w:id="43" w:name="r62-document-changes"/>
     <w:p>
       <w:pPr>
         <w:pStyle w:val="Heading2"/>
       </w:pPr>
       <w:r>
-        <w:t xml:space="preserve">R61 document presentation</w:t>
+        <w:t xml:space="preserve">R62 document changes</w:t>
       </w:r>
     </w:p>
     <w:p>
@@ -5506,15 +5555,25 @@
         <w:pStyle w:val="FirstParagraph"/>
       </w:pPr>
       <w:r>
-        <w:t xml:space="preserve">New authoring-15 referrals and compliance letters show each item’s actual inspection history and observation notes. A corrected observation displays its date once, with CORRECTED beneath it. Days Outstanding ends at correction; unrelated or carried observations do not create additional visits. Compliance letters retain Abate Yes/No; missing legacy information is labeled Unavailable rather than invented. Issued histories remain frozen.</w:t>
+        <w:t xml:space="preserve">New authoring-16 Referrals for Prosecution, Updates for Case Referral and Compliance Letters print each inspector note under the violation in Corrections Required, as on an Extension, oldest first and with its date, including notes on corrected items. The Inspection History column keeps dates, outcomes, CORRECTED, citations and Days Outstanding, without notes. Long notes continue on the next page; every word prints once. Earlier documents keep notes in the history column.</w:t>
+      </w:r>
+    </w:p>
+    <w:bookmarkEnd w:id="43"/>
+    <w:bookmarkStart w:id="44" w:name="r61-document-presentation"/>
+    <w:p>
+      <w:pPr>
+        <w:pStyle w:val="Heading2"/>
+      </w:pPr>
+      <w:r>
+        <w:t xml:space="preserve">R61 document presentation</w:t>
       </w:r>
     </w:p>
     <w:p>
       <w:pPr>
-        <w:pStyle w:val="BodyText"/>
-      </w:pPr>
-      <w:r>
-        <w:t xml:space="preserve">Citation correction review displays dollars and cents consistently, including assessment components stored as integer cents. It does not recalculate the recorded correction values. Current order language displays 27.05(2)(g)2 without changing its canonical charge identity or pricing.</w:t>
+        <w:pStyle w:val="FirstParagraph"/>
+      </w:pPr>
+      <w:r>
+        <w:t xml:space="preserve">New authoring-15 referrals and compliance letters show each item’s actual inspection history and observation notes. A corrected observation displays its date once, with CORRECTED beneath it. Days Outstanding ends at correction; unrelated or carried observations do not create additional visits. Compliance letters retain Abate Yes/No; missing legacy information is labeled Unavailable rather than invented. Issued histories remain frozen.</w:t>
       </w:r>
     </w:p>
     <w:p>
@@ -5522,7 +5581,7 @@
         <w:pStyle w:val="BodyText"/>
       </w:pPr>
       <w:r>
-        <w:t xml:space="preserve">The Best Interest signer placeholders are separate from document footers. Removing the new Best Interest signer block removes those bubbles. Existing single-page and continuation footer conventions and approved citation forms are retained. Verify the actual PDF and City print settings; incomplete new citation packets are refused instead of silently filed.</w:t>
+        <w:t xml:space="preserve">Citation correction review displays dollars and cents consistently, including assessment components stored as integer cents. It does not recalculate the recorded correction values. Current order language displays 27.05(2)(g)2 without changing its canonical charge identity or pricing.</w:t>
       </w:r>
     </w:p>
     <w:p>
@@ -5530,11 +5589,19 @@
         <w:pStyle w:val="BodyText"/>
       </w:pPr>
       <w:r>
-        <w:t xml:space="preserve">Manual source digest 3d9a9202eadcf036.</w:t>
+        <w:t xml:space="preserve">The Best Interest signer placeholders are separate from document footers. Removing the new Best Interest signer block removes those bubbles. Existing single-page and continuation footer conventions and approved citation forms are retained. Verify the actual PDF and City print settings; incomplete new citation packets are refused instead of silently filed.</w:t>
       </w:r>
     </w:p>
-    <w:bookmarkEnd w:id="43"/>
+    <w:p>
+      <w:pPr>
+        <w:pStyle w:val="BodyText"/>
+      </w:pPr>
+      <w:r>
+        <w:t xml:space="preserve">Manual source digest f385df8157168d34.</w:t>
+      </w:r>
+    </w:p>
     <w:bookmarkEnd w:id="44"/>
+    <w:bookmarkEnd w:id="45"/>
     <w:sectPr>
       <w:headerReference r:id="rId9" w:type="default"/>
       <w:footerReference r:id="rId10" w:type="default"/>
@@ -5778,7 +5845,7 @@
     </w:lvl>
   </w:abstractNum>
   <w:abstractNum w:abstractNumId="990">
-    <w:nsid w:val="0000A990"/>
+    <w:nsid w:val="A990"/>
     <w:multiLevelType w:val="multilevel"/>
     <w:lvl w:ilvl="0">
       <w:numFmt w:val="bullet"/>
@@ -5854,7 +5921,7 @@
     </w:lvl>
   </w:abstractNum>
   <w:abstractNum w:abstractNumId="99411">
-    <w:nsid w:val="00A99411"/>
+    <w:nsid w:val="A99411"/>
     <w:multiLevelType w:val="multilevel"/>
     <w:lvl w:ilvl="0">
       <w:start w:val="1"/>
@@ -5939,7 +6006,7 @@
     </w:lvl>
   </w:abstractNum>
   <w:abstractNum w:abstractNumId="991">
-    <w:nsid w:val="0000A991"/>
+    <w:nsid w:val="A991"/>
     <w:multiLevelType w:val="multilevel"/>
     <w:lvl w:ilvl="0">
       <w:numFmt w:val="bullet"/>
@@ -21451,7 +21518,7 @@
     <w:basedOn w:val="VerbatimChar"/>
     <w:rPr/>
   </w:style>
-  <w:style w:type="character" w:customStyle="1" w:styleId="KeywordTok">
+  <w:style w:customStyle="1" w:styleId="KeywordTok" w:type="character">
     <w:name w:val="KeywordTok"/>
     <w:basedOn w:val="VerbatimChar"/>
     <w:rPr>
@@ -21459,77 +21526,77 @@
       <w:color w:val="007020"/>
     </w:rPr>
   </w:style>
-  <w:style w:type="character" w:customStyle="1" w:styleId="DataTypeTok">
+  <w:style w:customStyle="1" w:styleId="DataTypeTok" w:type="character">
     <w:name w:val="DataTypeTok"/>
     <w:basedOn w:val="VerbatimChar"/>
     <w:rPr>
       <w:color w:val="902000"/>
     </w:rPr>
   </w:style>
-  <w:style w:type="character" w:customStyle="1" w:styleId="DecValTok">
+  <w:style w:customStyle="1" w:styleId="DecValTok" w:type="character">
     <w:name w:val="DecValTok"/>
     <w:basedOn w:val="VerbatimChar"/>
     <w:rPr>
       <w:color w:val="40a070"/>
     </w:rPr>
   </w:style>
-  <w:style w:type="character" w:customStyle="1" w:styleId="BaseNTok">
+  <w:style w:customStyle="1" w:styleId="BaseNTok" w:type="character">
     <w:name w:val="BaseNTok"/>
     <w:basedOn w:val="VerbatimChar"/>
     <w:rPr>
       <w:color w:val="40a070"/>
     </w:rPr>
   </w:style>
-  <w:style w:type="character" w:customStyle="1" w:styleId="FloatTok">
+  <w:style w:customStyle="1" w:styleId="FloatTok" w:type="character">
     <w:name w:val="FloatTok"/>
     <w:basedOn w:val="VerbatimChar"/>
     <w:rPr>
       <w:color w:val="40a070"/>
     </w:rPr>
   </w:style>
-  <w:style w:type="character" w:customStyle="1" w:styleId="ConstantTok">
+  <w:style w:customStyle="1" w:styleId="ConstantTok" w:type="character">
     <w:name w:val="ConstantTok"/>
     <w:basedOn w:val="VerbatimChar"/>
     <w:rPr>
       <w:color w:val="880000"/>
     </w:rPr>
   </w:style>
-  <w:style w:type="character" w:customStyle="1" w:styleId="CharTok">
+  <w:style w:customStyle="1" w:styleId="CharTok" w:type="character">
     <w:name w:val="CharTok"/>
     <w:basedOn w:val="VerbatimChar"/>
     <w:rPr>
       <w:color w:val="4070a0"/>
     </w:rPr>
   </w:style>
-  <w:style w:type="character" w:customStyle="1" w:styleId="SpecialCharTok">
+  <w:style w:customStyle="1" w:styleId="SpecialCharTok" w:type="character">
     <w:name w:val="SpecialCharTok"/>
     <w:basedOn w:val="VerbatimChar"/>
     <w:rPr>
       <w:color w:val="4070a0"/>
     </w:rPr>
   </w:style>
-  <w:style w:type="character" w:customStyle="1" w:styleId="StringTok">
+  <w:style w:customStyle="1" w:styleId="StringTok" w:type="character">
     <w:name w:val="StringTok"/>
     <w:basedOn w:val="VerbatimChar"/>
     <w:rPr>
       <w:color w:val="4070a0"/>
     </w:rPr>
   </w:style>
-  <w:style w:type="character" w:customStyle="1" w:styleId="VerbatimStringTok">
+  <w:style w:customStyle="1" w:styleId="VerbatimStringTok" w:type="character">
     <w:name w:val="VerbatimStringTok"/>
     <w:basedOn w:val="VerbatimChar"/>
     <w:rPr>
       <w:color w:val="4070a0"/>
     </w:rPr>
   </w:style>
-  <w:style w:type="character" w:customStyle="1" w:styleId="SpecialStringTok">
+  <w:style w:customStyle="1" w:styleId="SpecialStringTok" w:type="character">
     <w:name w:val="SpecialStringTok"/>
     <w:basedOn w:val="VerbatimChar"/>
     <w:rPr>
       <w:color w:val="bb6688"/>
     </w:rPr>
   </w:style>
-  <w:style w:type="character" w:customStyle="1" w:styleId="ImportTok">
+  <w:style w:customStyle="1" w:styleId="ImportTok" w:type="character">
     <w:name w:val="ImportTok"/>
     <w:basedOn w:val="VerbatimChar"/>
     <w:rPr>
@@ -21537,7 +21604,7 @@
       <w:color w:val="008000"/>
     </w:rPr>
   </w:style>
-  <w:style w:type="character" w:customStyle="1" w:styleId="CommentTok">
+  <w:style w:customStyle="1" w:styleId="CommentTok" w:type="character">
     <w:name w:val="CommentTok"/>
     <w:basedOn w:val="VerbatimChar"/>
     <w:rPr>
@@ -21545,7 +21612,7 @@
       <w:color w:val="60a0b0"/>
     </w:rPr>
   </w:style>
-  <w:style w:type="character" w:customStyle="1" w:styleId="DocumentationTok">
+  <w:style w:customStyle="1" w:styleId="DocumentationTok" w:type="character">
     <w:name w:val="DocumentationTok"/>
     <w:basedOn w:val="VerbatimChar"/>
     <w:rPr>
@@ -21553,7 +21620,7 @@
       <w:color w:val="ba2121"/>
     </w:rPr>
   </w:style>
-  <w:style w:type="character" w:customStyle="1" w:styleId="AnnotationTok">
+  <w:style w:customStyle="1" w:styleId="AnnotationTok" w:type="character">
     <w:name w:val="AnnotationTok"/>
     <w:basedOn w:val="VerbatimChar"/>
     <w:rPr>
@@ -21562,7 +21629,7 @@
       <w:color w:val="60a0b0"/>
     </w:rPr>
   </w:style>
-  <w:style w:type="character" w:customStyle="1" w:styleId="CommentVarTok">
+  <w:style w:customStyle="1" w:styleId="CommentVarTok" w:type="character">
     <w:name w:val="CommentVarTok"/>
     <w:basedOn w:val="VerbatimChar"/>
     <w:rPr>
@@ -21571,28 +21638,28 @@
       <w:color w:val="60a0b0"/>
     </w:rPr>
   </w:style>
-  <w:style w:type="character" w:customStyle="1" w:styleId="OtherTok">
+  <w:style w:customStyle="1" w:styleId="OtherTok" w:type="character">
     <w:name w:val="OtherTok"/>
     <w:basedOn w:val="VerbatimChar"/>
     <w:rPr>
       <w:color w:val="007020"/>
     </w:rPr>
   </w:style>
-  <w:style w:type="character" w:customStyle="1" w:styleId="FunctionTok">
+  <w:style w:customStyle="1" w:styleId="FunctionTok" w:type="character">
     <w:name w:val="FunctionTok"/>
     <w:basedOn w:val="VerbatimChar"/>
     <w:rPr>
       <w:color w:val="06287e"/>
     </w:rPr>
   </w:style>
-  <w:style w:type="character" w:customStyle="1" w:styleId="VariableTok">
+  <w:style w:customStyle="1" w:styleId="VariableTok" w:type="character">
     <w:name w:val="VariableTok"/>
     <w:basedOn w:val="VerbatimChar"/>
     <w:rPr>
       <w:color w:val="19177c"/>
     </w:rPr>
   </w:style>
-  <w:style w:type="character" w:customStyle="1" w:styleId="ControlFlowTok">
+  <w:style w:customStyle="1" w:styleId="ControlFlowTok" w:type="character">
     <w:name w:val="ControlFlowTok"/>
     <w:basedOn w:val="VerbatimChar"/>
     <w:rPr>
@@ -21600,45 +21667,45 @@
       <w:color w:val="007020"/>
     </w:rPr>
   </w:style>
-  <w:style w:type="character" w:customStyle="1" w:styleId="OperatorTok">
+  <w:style w:customStyle="1" w:styleId="OperatorTok" w:type="character">
     <w:name w:val="OperatorTok"/>
     <w:basedOn w:val="VerbatimChar"/>
     <w:rPr>
       <w:color w:val="666666"/>
     </w:rPr>
   </w:style>
-  <w:style w:type="character" w:customStyle="1" w:styleId="BuiltInTok">
+  <w:style w:customStyle="1" w:styleId="BuiltInTok" w:type="character">
     <w:name w:val="BuiltInTok"/>
     <w:basedOn w:val="VerbatimChar"/>
     <w:rPr>
       <w:color w:val="008000"/>
     </w:rPr>
   </w:style>
-  <w:style w:type="character" w:customStyle="1" w:styleId="ExtensionTok">
+  <w:style w:customStyle="1" w:styleId="ExtensionTok" w:type="character">
     <w:name w:val="ExtensionTok"/>
     <w:basedOn w:val="VerbatimChar"/>
     <w:rPr/>
   </w:style>
-  <w:style w:type="character" w:customStyle="1" w:styleId="PreprocessorTok">
+  <w:style w:customStyle="1" w:styleId="PreprocessorTok" w:type="character">
     <w:name w:val="PreprocessorTok"/>
     <w:basedOn w:val="VerbatimChar"/>
     <w:rPr>
       <w:color w:val="bc7a00"/>
     </w:rPr>
   </w:style>
-  <w:style w:type="character" w:customStyle="1" w:styleId="AttributeTok">
+  <w:style w:customStyle="1" w:styleId="AttributeTok" w:type="character">
     <w:name w:val="AttributeTok"/>
     <w:basedOn w:val="VerbatimChar"/>
     <w:rPr>
       <w:color w:val="7d9029"/>
     </w:rPr>
   </w:style>
-  <w:style w:type="character" w:customStyle="1" w:styleId="RegionMarkerTok">
+  <w:style w:customStyle="1" w:styleId="RegionMarkerTok" w:type="character">
     <w:name w:val="RegionMarkerTok"/>
     <w:basedOn w:val="VerbatimChar"/>
     <w:rPr/>
   </w:style>
-  <w:style w:type="character" w:customStyle="1" w:styleId="InformationTok">
+  <w:style w:customStyle="1" w:styleId="InformationTok" w:type="character">
     <w:name w:val="InformationTok"/>
     <w:basedOn w:val="VerbatimChar"/>
     <w:rPr>
@@ -21647,7 +21714,7 @@
       <w:color w:val="60a0b0"/>
     </w:rPr>
   </w:style>
-  <w:style w:type="character" w:customStyle="1" w:styleId="WarningTok">
+  <w:style w:customStyle="1" w:styleId="WarningTok" w:type="character">
     <w:name w:val="WarningTok"/>
     <w:basedOn w:val="VerbatimChar"/>
     <w:rPr>
@@ -21656,20 +21723,246 @@
       <w:color w:val="60a0b0"/>
     </w:rPr>
   </w:style>
+  <w:style w:customStyle="1" w:styleId="AlertTok" w:type="character">
+    <w:name w:val="AlertTok"/>
+    <w:basedOn w:val="VerbatimChar"/>
+    <w:rPr>
+      <w:b/>
+      <w:color w:val="ff0000"/>
+    </w:rPr>
+  </w:style>
+  <w:style w:customStyle="1" w:styleId="ErrorTok" w:type="character">
+    <w:name w:val="ErrorTok"/>
+    <w:basedOn w:val="VerbatimChar"/>
+    <w:rPr>
+      <w:b/>
+      <w:color w:val="ff0000"/>
+    </w:rPr>
+  </w:style>
+  <w:style w:customStyle="1" w:styleId="NormalTok" w:type="character">
+    <w:name w:val="NormalTok"/>
+    <w:basedOn w:val="VerbatimChar"/>
+    <w:rPr/>
+  </w:style>
+  <w:style w:type="character" w:customStyle="1" w:styleId="KeywordTok">
+    <w:name w:val="KeywordTok"/>
+    <w:basedOn w:val="VerbatimChar"/>
+    <w:rPr>
+      <w:color w:val="007020"/>
+      <w:b/>
+    </w:rPr>
+  </w:style>
+  <w:style w:type="character" w:customStyle="1" w:styleId="DataTypeTok">
+    <w:name w:val="DataTypeTok"/>
+    <w:basedOn w:val="VerbatimChar"/>
+    <w:rPr>
+      <w:color w:val="902000"/>
+    </w:rPr>
+  </w:style>
+  <w:style w:type="character" w:customStyle="1" w:styleId="DecValTok">
+    <w:name w:val="DecValTok"/>
+    <w:basedOn w:val="VerbatimChar"/>
+    <w:rPr>
+      <w:color w:val="40a070"/>
+    </w:rPr>
+  </w:style>
+  <w:style w:type="character" w:customStyle="1" w:styleId="BaseNTok">
+    <w:name w:val="BaseNTok"/>
+    <w:basedOn w:val="VerbatimChar"/>
+    <w:rPr>
+      <w:color w:val="40a070"/>
+    </w:rPr>
+  </w:style>
+  <w:style w:type="character" w:customStyle="1" w:styleId="FloatTok">
+    <w:name w:val="FloatTok"/>
+    <w:basedOn w:val="VerbatimChar"/>
+    <w:rPr>
+      <w:color w:val="40a070"/>
+    </w:rPr>
+  </w:style>
+  <w:style w:type="character" w:customStyle="1" w:styleId="ConstantTok">
+    <w:name w:val="ConstantTok"/>
+    <w:basedOn w:val="VerbatimChar"/>
+    <w:rPr>
+      <w:color w:val="880000"/>
+    </w:rPr>
+  </w:style>
+  <w:style w:type="character" w:customStyle="1" w:styleId="CharTok">
+    <w:name w:val="CharTok"/>
+    <w:basedOn w:val="VerbatimChar"/>
+    <w:rPr>
+      <w:color w:val="4070a0"/>
+    </w:rPr>
+  </w:style>
+  <w:style w:type="character" w:customStyle="1" w:styleId="SpecialCharTok">
+    <w:name w:val="SpecialCharTok"/>
+    <w:basedOn w:val="VerbatimChar"/>
+    <w:rPr>
+      <w:color w:val="4070a0"/>
+    </w:rPr>
+  </w:style>
+  <w:style w:type="character" w:customStyle="1" w:styleId="StringTok">
+    <w:name w:val="StringTok"/>
+    <w:basedOn w:val="VerbatimChar"/>
+    <w:rPr>
+      <w:color w:val="4070a0"/>
+    </w:rPr>
+  </w:style>
+  <w:style w:type="character" w:customStyle="1" w:styleId="VerbatimStringTok">
+    <w:name w:val="VerbatimStringTok"/>
+    <w:basedOn w:val="VerbatimChar"/>
+    <w:rPr>
+      <w:color w:val="4070a0"/>
+    </w:rPr>
+  </w:style>
+  <w:style w:type="character" w:customStyle="1" w:styleId="SpecialStringTok">
+    <w:name w:val="SpecialStringTok"/>
+    <w:basedOn w:val="VerbatimChar"/>
+    <w:rPr>
+      <w:color w:val="bb6688"/>
+    </w:rPr>
+  </w:style>
+  <w:style w:type="character" w:customStyle="1" w:styleId="ImportTok">
+    <w:name w:val="ImportTok"/>
+    <w:basedOn w:val="VerbatimChar"/>
+    <w:rPr>
+      <w:color w:val="008000"/>
+      <w:b/>
+    </w:rPr>
+  </w:style>
+  <w:style w:type="character" w:customStyle="1" w:styleId="CommentTok">
+    <w:name w:val="CommentTok"/>
+    <w:basedOn w:val="VerbatimChar"/>
+    <w:rPr>
+      <w:color w:val="60a0b0"/>
+      <w:i/>
+    </w:rPr>
+  </w:style>
+  <w:style w:type="character" w:customStyle="1" w:styleId="DocumentationTok">
+    <w:name w:val="DocumentationTok"/>
+    <w:basedOn w:val="VerbatimChar"/>
+    <w:rPr>
+      <w:color w:val="ba2121"/>
+      <w:i/>
+    </w:rPr>
+  </w:style>
+  <w:style w:type="character" w:customStyle="1" w:styleId="AnnotationTok">
+    <w:name w:val="AnnotationTok"/>
+    <w:basedOn w:val="VerbatimChar"/>
+    <w:rPr>
+      <w:color w:val="60a0b0"/>
+      <w:b/>
+      <w:i/>
+    </w:rPr>
+  </w:style>
+  <w:style w:type="character" w:customStyle="1" w:styleId="CommentVarTok">
+    <w:name w:val="CommentVarTok"/>
+    <w:basedOn w:val="VerbatimChar"/>
+    <w:rPr>
+      <w:color w:val="60a0b0"/>
+      <w:b/>
+      <w:i/>
+    </w:rPr>
+  </w:style>
+  <w:style w:type="character" w:customStyle="1" w:styleId="OtherTok">
+    <w:name w:val="OtherTok"/>
+    <w:basedOn w:val="VerbatimChar"/>
+    <w:rPr>
+      <w:color w:val="007020"/>
+    </w:rPr>
+  </w:style>
+  <w:style w:type="character" w:customStyle="1" w:styleId="FunctionTok">
+    <w:name w:val="FunctionTok"/>
+    <w:basedOn w:val="VerbatimChar"/>
+    <w:rPr>
+      <w:color w:val="06287e"/>
+    </w:rPr>
+  </w:style>
+  <w:style w:type="character" w:customStyle="1" w:styleId="VariableTok">
+    <w:name w:val="VariableTok"/>
+    <w:basedOn w:val="VerbatimChar"/>
+    <w:rPr>
+      <w:color w:val="19177c"/>
+    </w:rPr>
+  </w:style>
+  <w:style w:type="character" w:customStyle="1" w:styleId="ControlFlowTok">
+    <w:name w:val="ControlFlowTok"/>
+    <w:basedOn w:val="VerbatimChar"/>
+    <w:rPr>
+      <w:color w:val="007020"/>
+      <w:b/>
+    </w:rPr>
+  </w:style>
+  <w:style w:type="character" w:customStyle="1" w:styleId="OperatorTok">
+    <w:name w:val="OperatorTok"/>
+    <w:basedOn w:val="VerbatimChar"/>
+    <w:rPr>
+      <w:color w:val="666666"/>
+    </w:rPr>
+  </w:style>
+  <w:style w:type="character" w:customStyle="1" w:styleId="BuiltInTok">
+    <w:name w:val="BuiltInTok"/>
+    <w:basedOn w:val="VerbatimChar"/>
+    <w:rPr>
+      <w:color w:val="008000"/>
+    </w:rPr>
+  </w:style>
+  <w:style w:type="character" w:customStyle="1" w:styleId="ExtensionTok">
+    <w:name w:val="ExtensionTok"/>
+    <w:basedOn w:val="VerbatimChar"/>
+    <w:rPr/>
+  </w:style>
+  <w:style w:type="character" w:customStyle="1" w:styleId="PreprocessorTok">
+    <w:name w:val="PreprocessorTok"/>
+    <w:basedOn w:val="VerbatimChar"/>
+    <w:rPr>
+      <w:color w:val="bc7a00"/>
+    </w:rPr>
+  </w:style>
+  <w:style w:type="character" w:customStyle="1" w:styleId="AttributeTok">
+    <w:name w:val="AttributeTok"/>
+    <w:basedOn w:val="VerbatimChar"/>
+    <w:rPr>
+      <w:color w:val="7d9029"/>
+    </w:rPr>
+  </w:style>
+  <w:style w:type="character" w:customStyle="1" w:styleId="RegionMarkerTok">
+    <w:name w:val="RegionMarkerTok"/>
+    <w:basedOn w:val="VerbatimChar"/>
+    <w:rPr/>
+  </w:style>
+  <w:style w:type="character" w:customStyle="1" w:styleId="InformationTok">
+    <w:name w:val="InformationTok"/>
+    <w:basedOn w:val="VerbatimChar"/>
+    <w:rPr>
+      <w:color w:val="60a0b0"/>
+      <w:b/>
+      <w:i/>
+    </w:rPr>
+  </w:style>
+  <w:style w:type="character" w:customStyle="1" w:styleId="WarningTok">
+    <w:name w:val="WarningTok"/>
+    <w:basedOn w:val="VerbatimChar"/>
+    <w:rPr>
+      <w:color w:val="60a0b0"/>
+      <w:b/>
+      <w:i/>
+    </w:rPr>
+  </w:style>
   <w:style w:type="character" w:customStyle="1" w:styleId="AlertTok">
     <w:name w:val="AlertTok"/>
     <w:basedOn w:val="VerbatimChar"/>
     <w:rPr>
+      <w:color w:val="ff0000"/>
       <w:b/>
-      <w:color w:val="ff0000"/>
     </w:rPr>
   </w:style>
   <w:style w:type="character" w:customStyle="1" w:styleId="ErrorTok">
     <w:name w:val="ErrorTok"/>
     <w:basedOn w:val="VerbatimChar"/>
     <w:rPr>
+      <w:color w:val="ff0000"/>
       <w:b/>
-      <w:color w:val="ff0000"/>
     </w:rPr>
   </w:style>
   <w:style w:type="character" w:customStyle="1" w:styleId="NormalTok">

</xml_diff>

<commit_message>
docs: clarify historical formats and preserve review navigation
</commit_message>
<xml_diff>
--- a/docs/staff/Program_Instruction_Manual.docx
+++ b/docs/staff/Program_Instruction_Manual.docx
@@ -74,8 +74,8 @@
       </w:pPr>
       <w:r>
         <w:rPr>
+          <w:b/>
           <w:bCs/>
-          <w:b/>
         </w:rPr>
         <w:t xml:space="preserve">Before using operational cases.</w:t>
       </w:r>
@@ -92,8 +92,8 @@
       </w:pPr>
       <w:r>
         <w:rPr>
+          <w:b/>
           <w:bCs/>
-          <w:b/>
         </w:rPr>
         <w:t xml:space="preserve">Start a working day.</w:t>
       </w:r>
@@ -110,8 +110,8 @@
       </w:pPr>
       <w:r>
         <w:rPr>
+          <w:b/>
           <w:bCs/>
-          <w:b/>
         </w:rPr>
         <w:t xml:space="preserve">Prepare work.</w:t>
       </w:r>
@@ -128,8 +128,8 @@
       </w:pPr>
       <w:r>
         <w:rPr>
+          <w:b/>
           <w:bCs/>
-          <w:b/>
         </w:rPr>
         <w:t xml:space="preserve">Finish an action.</w:t>
       </w:r>
@@ -146,8 +146,8 @@
       </w:pPr>
       <w:r>
         <w:rPr>
+          <w:b/>
           <w:bCs/>
-          <w:b/>
         </w:rPr>
         <w:t xml:space="preserve">End a working day.</w:t>
       </w:r>
@@ -164,8 +164,8 @@
       </w:pPr>
       <w:r>
         <w:rPr>
+          <w:b/>
           <w:bCs/>
-          <w:b/>
         </w:rPr>
         <w:t xml:space="preserve">Stop Document Writer.</w:t>
       </w:r>
@@ -190,8 +190,8 @@
       </w:pPr>
       <w:r>
         <w:rPr>
+          <w:b/>
           <w:bCs/>
-          <w:b/>
         </w:rPr>
         <w:t xml:space="preserve">Warnings and errors.</w:t>
       </w:r>
@@ -218,8 +218,8 @@
       </w:pPr>
       <w:r>
         <w:rPr>
+          <w:b/>
           <w:bCs/>
-          <w:b/>
         </w:rPr>
         <w:t xml:space="preserve">Administrator procedure.</w:t>
       </w:r>
@@ -232,11 +232,11 @@
     </w:p>
     <w:p>
       <w:pPr>
+        <w:pStyle w:val="Compact"/>
         <w:numPr>
           <w:ilvl w:val="0"/>
           <w:numId w:val="1001"/>
         </w:numPr>
-        <w:pStyle w:val="Compact"/>
       </w:pPr>
       <w:r>
         <w:t xml:space="preserve">Back up the existing program, case folder, PDF folder, GIS folder, configuration and integrity evidence. Ask every user to save and sync work, then stop the program with Exit Document Writer in Tools &amp; settings. An older version without Exit Document Writer in Tools &amp; settings stops another way: close its command window if it was started with Start Document Writer.bat, otherwise sign out of Windows and back in.</w:t>
@@ -244,11 +244,11 @@
     </w:p>
     <w:p>
       <w:pPr>
+        <w:pStyle w:val="Compact"/>
         <w:numPr>
           <w:ilvl w:val="0"/>
           <w:numId w:val="1001"/>
         </w:numPr>
-        <w:pStyle w:val="Compact"/>
       </w:pPr>
       <w:r>
         <w:t xml:space="preserve">Before extraction, compare the package SHA-256 with the digest obtained independently from the release owner. Use Get-FileHash -Algorithm SHA256 in PowerShell. Keep verified prior packages separately for deliberate IT rollback and test acceptance in isolation.</w:t>
@@ -256,11 +256,11 @@
     </w:p>
     <w:p>
       <w:pPr>
+        <w:pStyle w:val="Compact"/>
         <w:numPr>
           <w:ilvl w:val="0"/>
           <w:numId w:val="1001"/>
         </w:numPr>
-        <w:pStyle w:val="Compact"/>
       </w:pPr>
       <w:r>
         <w:t xml:space="preserve">Place all deploy files and the vendor folder in a division-owned program folder. Preserve operational folders and settings. Grant inspectors read-only program access and grant write access to the release owner only; grant case, PDF and GIS write access as required. Keep these permissions distinct. Restrict administration and independent anchor permissions through IT.</w:t>
@@ -268,11 +268,11 @@
     </w:p>
     <w:p>
       <w:pPr>
+        <w:pStyle w:val="Compact"/>
         <w:numPr>
           <w:ilvl w:val="0"/>
           <w:numId w:val="1001"/>
         </w:numPr>
-        <w:pStyle w:val="Compact"/>
       </w:pPr>
       <w:r>
         <w:t xml:space="preserve">Have IT check the deploy ZIP’s SHA-256 against the value the release owner publishes separately, then run Start Document Writer.bat (the diagnostic launcher) once on each PC from that checked deployment. It installs the local runtime and creates or updates the Document Writer desktop icon; an existing Document Writer shortcut is changed to start without a command window.</w:t>
@@ -280,11 +280,11 @@
     </w:p>
     <w:p>
       <w:pPr>
+        <w:pStyle w:val="Compact"/>
         <w:numPr>
           <w:ilvl w:val="0"/>
           <w:numId w:val="1001"/>
         </w:numPr>
-        <w:pStyle w:val="Compact"/>
       </w:pPr>
       <w:r>
         <w:t xml:space="preserve">Confirm the build and helper versions shown in the install guide. If a message says an older version is still running, stop it as the message explains (Exit Document Writer when it offers one; otherwise close its command window or sign out of Windows), then double-click the Document Writer icon again.</w:t>
@@ -292,11 +292,11 @@
     </w:p>
     <w:p>
       <w:pPr>
+        <w:pStyle w:val="Compact"/>
         <w:numPr>
           <w:ilvl w:val="0"/>
           <w:numId w:val="1001"/>
         </w:numPr>
-        <w:pStyle w:val="Compact"/>
       </w:pPr>
       <w:r>
         <w:t xml:space="preserve">Open Tools &amp; settings → Saved work &amp; connection. Expand Connection checks and technical details, then open connection checks and Storage diagnostics. Confirm the intended shared paths, helper health and permissions. Use Rebuild reporting index in Storage diagnostics when an administrator has confirmed a rebuild is appropriate.</w:t>
@@ -304,11 +304,11 @@
     </w:p>
     <w:p>
       <w:pPr>
+        <w:pStyle w:val="Compact"/>
         <w:numPr>
           <w:ilvl w:val="0"/>
           <w:numId w:val="1001"/>
         </w:numPr>
-        <w:pStyle w:val="Compact"/>
       </w:pPr>
       <w:r>
         <w:t xml:space="preserve">Open Reports → Data and definitions. Review coverage and excluded records. Test an approved synthetic case through save, exact PDF retrieval and recovery before operational use.</w:t>
@@ -320,8 +320,8 @@
       </w:pPr>
       <w:r>
         <w:rPr>
+          <w:b/>
           <w:bCs/>
-          <w:b/>
         </w:rPr>
         <w:t xml:space="preserve">Compatibility.</w:t>
       </w:r>
@@ -338,8 +338,8 @@
       </w:pPr>
       <w:r>
         <w:rPr>
+          <w:b/>
           <w:bCs/>
-          <w:b/>
         </w:rPr>
         <w:t xml:space="preserve">Checked updates.</w:t>
       </w:r>
@@ -356,8 +356,8 @@
       </w:pPr>
       <w:r>
         <w:rPr>
+          <w:b/>
           <w:bCs/>
-          <w:b/>
         </w:rPr>
         <w:t xml:space="preserve">Browser session.</w:t>
       </w:r>
@@ -374,8 +374,8 @@
       </w:pPr>
       <w:r>
         <w:rPr>
+          <w:b/>
           <w:bCs/>
-          <w:b/>
         </w:rPr>
         <w:t xml:space="preserve">After a helper restart.</w:t>
       </w:r>
@@ -392,8 +392,8 @@
       </w:pPr>
       <w:r>
         <w:rPr>
+          <w:b/>
           <w:bCs/>
-          <w:b/>
         </w:rPr>
         <w:t xml:space="preserve">Deliberate rollback.</w:t>
       </w:r>
@@ -436,8 +436,8 @@
       </w:pPr>
       <w:r>
         <w:rPr>
+          <w:b/>
           <w:bCs/>
-          <w:b/>
         </w:rPr>
         <w:t xml:space="preserve">Find and continue a case.</w:t>
       </w:r>
@@ -480,8 +480,8 @@
       </w:pPr>
       <w:r>
         <w:rPr>
+          <w:b/>
           <w:bCs/>
-          <w:b/>
         </w:rPr>
         <w:t xml:space="preserve">Understand the record.</w:t>
       </w:r>
@@ -506,8 +506,8 @@
       </w:pPr>
       <w:r>
         <w:rPr>
+          <w:b/>
           <w:bCs/>
-          <w:b/>
         </w:rPr>
         <w:t xml:space="preserve">Resolve attention states.</w:t>
       </w:r>
@@ -542,8 +542,8 @@
       </w:pPr>
       <w:r>
         <w:rPr>
+          <w:b/>
           <w:bCs/>
-          <w:b/>
         </w:rPr>
         <w:t xml:space="preserve">Direct lookup.</w:t>
       </w:r>
@@ -574,8 +574,8 @@
       </w:r>
       <w:r>
         <w:rPr>
+          <w:b/>
           <w:bCs/>
-          <w:b/>
         </w:rPr>
         <w:t xml:space="preserve">Inspection Type</w:t>
       </w:r>
@@ -590,8 +590,8 @@
       </w:r>
       <w:r>
         <w:rPr>
+          <w:b/>
           <w:bCs/>
-          <w:b/>
         </w:rPr>
         <w:t xml:space="preserve">Inspection Status</w:t>
       </w:r>
@@ -622,16 +622,16 @@
     </w:p>
     <w:p>
       <w:pPr>
+        <w:pStyle w:val="Compact"/>
         <w:numPr>
           <w:ilvl w:val="0"/>
           <w:numId w:val="1002"/>
         </w:numPr>
-        <w:pStyle w:val="Compact"/>
       </w:pPr>
       <w:r>
         <w:rPr>
+          <w:b/>
           <w:bCs/>
-          <w:b/>
         </w:rPr>
         <w:t xml:space="preserve">Initial Inspection</w:t>
       </w:r>
@@ -644,16 +644,16 @@
     </w:p>
     <w:p>
       <w:pPr>
+        <w:pStyle w:val="Compact"/>
         <w:numPr>
           <w:ilvl w:val="0"/>
           <w:numId w:val="1002"/>
         </w:numPr>
-        <w:pStyle w:val="Compact"/>
       </w:pPr>
       <w:r>
         <w:rPr>
+          <w:b/>
           <w:bCs/>
-          <w:b/>
         </w:rPr>
         <w:t xml:space="preserve">Reinspection</w:t>
       </w:r>
@@ -666,16 +666,16 @@
     </w:p>
     <w:p>
       <w:pPr>
+        <w:pStyle w:val="Compact"/>
         <w:numPr>
           <w:ilvl w:val="0"/>
           <w:numId w:val="1002"/>
         </w:numPr>
-        <w:pStyle w:val="Compact"/>
       </w:pPr>
       <w:r>
         <w:rPr>
+          <w:b/>
           <w:bCs/>
-          <w:b/>
         </w:rPr>
         <w:t xml:space="preserve">CA Reinspection</w:t>
       </w:r>
@@ -688,11 +688,11 @@
     </w:p>
     <w:p>
       <w:pPr>
+        <w:pStyle w:val="Compact"/>
         <w:numPr>
           <w:ilvl w:val="0"/>
           <w:numId w:val="1002"/>
         </w:numPr>
-        <w:pStyle w:val="Compact"/>
       </w:pPr>
       <w:r>
         <w:t xml:space="preserve">Any other combination cannot be imported: set the specific result in Accela and retrieve it again.</w:t>
@@ -700,11 +700,11 @@
     </w:p>
     <w:p>
       <w:pPr>
+        <w:pStyle w:val="Compact"/>
         <w:numPr>
           <w:ilvl w:val="0"/>
           <w:numId w:val="1002"/>
         </w:numPr>
-        <w:pStyle w:val="Compact"/>
       </w:pPr>
       <w:r>
         <w:t xml:space="preserve">On a case already referred to the City Attorney, only results that lead to an Update for Case Referral or a Compliance Letter can be imported.</w:t>
@@ -712,11 +712,11 @@
     </w:p>
     <w:p>
       <w:pPr>
+        <w:pStyle w:val="Compact"/>
         <w:numPr>
           <w:ilvl w:val="0"/>
           <w:numId w:val="1002"/>
         </w:numPr>
-        <w:pStyle w:val="Compact"/>
       </w:pPr>
       <w:r>
         <w:t xml:space="preserve">If recorded results contradict the status (for example Compliance with an item not Corrected), the document cannot be issued. Correct the results, or correct the status in Accela and import the same inspection again; the open draft or worksheet is updated without losing your work.</w:t>
@@ -728,8 +728,8 @@
       </w:pPr>
       <w:r>
         <w:rPr>
+          <w:b/>
           <w:bCs/>
-          <w:b/>
         </w:rPr>
         <w:t xml:space="preserve">Review an existing case.</w:t>
       </w:r>
@@ -746,8 +746,8 @@
       </w:pPr>
       <w:r>
         <w:rPr>
+          <w:b/>
           <w:bCs/>
-          <w:b/>
         </w:rPr>
         <w:t xml:space="preserve">Excel alternative.</w:t>
       </w:r>
@@ -772,8 +772,8 @@
       </w:pPr>
       <w:r>
         <w:rPr>
+          <w:b/>
           <w:bCs/>
-          <w:b/>
         </w:rPr>
         <w:t xml:space="preserve">Pause or retry.</w:t>
       </w:r>
@@ -812,11 +812,11 @@
     </w:p>
     <w:p>
       <w:pPr>
+        <w:pStyle w:val="Compact"/>
         <w:numPr>
           <w:ilvl w:val="0"/>
           <w:numId w:val="1003"/>
         </w:numPr>
-        <w:pStyle w:val="Compact"/>
       </w:pPr>
       <w:r>
         <w:t xml:space="preserve">Choose Violation Items at the top of the document. In the Select for this notice picker, find the appropriate selectable order language and select it once. A checkmark means it is already on this notice. Select it again to remove it from the unissued draft. The same library entry cannot be added twice.</w:t>
@@ -824,11 +824,11 @@
     </w:p>
     <w:p>
       <w:pPr>
+        <w:pStyle w:val="Compact"/>
         <w:numPr>
           <w:ilvl w:val="0"/>
           <w:numId w:val="1003"/>
         </w:numPr>
-        <w:pStyle w:val="Compact"/>
       </w:pPr>
       <w:r>
         <w:t xml:space="preserve">Choose Done adding. Review each item’s ordinance, corrective action, location and case-specific details. Outlined fill-in bubbles identify missing details. Click a bubble or focus it and press Enter, enter the factual detail, and review the sentence afterward.</w:t>
@@ -836,11 +836,11 @@
     </w:p>
     <w:p>
       <w:pPr>
+        <w:pStyle w:val="Compact"/>
         <w:numPr>
           <w:ilvl w:val="0"/>
           <w:numId w:val="1003"/>
         </w:numPr>
-        <w:pStyle w:val="Compact"/>
       </w:pPr>
       <w:r>
         <w:t xml:space="preserve">Tick the checkbox beside each due date that shares a deadline (Select item N for a shared due date). In Assign due dates below the document, which counts the selected items, enter the date and choose Apply date to selected items. Use Select all or Clear when appropriate. Repeat for other groups. New items begin without an automatic deadline.</w:t>
@@ -848,11 +848,11 @@
     </w:p>
     <w:p>
       <w:pPr>
+        <w:pStyle w:val="Compact"/>
         <w:numPr>
           <w:ilvl w:val="0"/>
           <w:numId w:val="1003"/>
         </w:numPr>
-        <w:pStyle w:val="Compact"/>
       </w:pPr>
       <w:r>
         <w:t xml:space="preserve">Keep no more than three distinct outstanding-item deadlines under the existing notice rules. A batch that would create a fourth is rejected without changing the items. An invalid individual edit may be saved as work in progress but blocks issuance.</w:t>
@@ -860,11 +860,11 @@
     </w:p>
     <w:p>
       <w:pPr>
+        <w:pStyle w:val="Compact"/>
         <w:numPr>
           <w:ilvl w:val="0"/>
           <w:numId w:val="1003"/>
         </w:numPr>
-        <w:pStyle w:val="Compact"/>
       </w:pPr>
       <w:r>
         <w:t xml:space="preserve">Review the whole document, not only the edited sentence. Check recipients (the Recipients button opens copies, email and registered agent; Done closes it once the entries are valid), contact details, the mailing date, the item order and all warnings. The readiness summary at the top counts required fixes and advisories; Go to first required field jumps to the affected field, and Review (or Open full checklist) opens the Review dialog: checks that must be fixed before issuing, then advisories, or a statement that there are no concerns. Each check links to its field; closing the dialog returns you to where you were.</w:t>
@@ -872,11 +872,11 @@
     </w:p>
     <w:p>
       <w:pPr>
+        <w:pStyle w:val="Compact"/>
         <w:numPr>
           <w:ilvl w:val="0"/>
           <w:numId w:val="1003"/>
         </w:numPr>
-        <w:pStyle w:val="Compact"/>
       </w:pPr>
       <w:r>
         <w:t xml:space="preserve">Choose Save draft &amp; return to Workspace to retain unfinished work, or Issue when ready. After a confirmed shared save, Writer returns to Workspace with the issued case highlighted; if the save is refused or not confirmed, the document stays open. Verify the resulting save state.</w:t>
@@ -888,8 +888,8 @@
       </w:pPr>
       <w:r>
         <w:rPr>
+          <w:b/>
           <w:bCs/>
-          <w:b/>
         </w:rPr>
         <w:t xml:space="preserve">Fill-in details.</w:t>
       </w:r>
@@ -914,8 +914,8 @@
       </w:pPr>
       <w:r>
         <w:rPr>
+          <w:b/>
           <w:bCs/>
-          <w:b/>
         </w:rPr>
         <w:t xml:space="preserve">Initial citations.</w:t>
       </w:r>
@@ -1000,8 +1000,9 @@
       <w:tblPr>
         <w:tblStyle w:val="Table"/>
         <w:tblW w:type="pct" w:w="5000"/>
+        <w:jc w:val="left"/>
+        <w:tblLayout w:type="fixed"/>
         <w:tblLook w:firstRow="1" w:lastRow="0" w:firstColumn="0" w:lastColumn="0" w:noHBand="0" w:noVBand="0" w:val="0020"/>
-        <w:jc w:val="start"/>
       </w:tblPr>
       <w:tblGrid>
         <w:gridCol w:w="3960"/>
@@ -1009,7 +1010,7 @@
       </w:tblGrid>
       <w:tr>
         <w:trPr>
-          <w:tblHeader w:val="true"/>
+          <w:tblHeader w:val="on"/>
         </w:trPr>
         <w:tc>
           <w:tcPr/>
@@ -1189,8 +1190,8 @@
       </w:pPr>
       <w:r>
         <w:rPr>
+          <w:b/>
           <w:bCs/>
-          <w:b/>
         </w:rPr>
         <w:t xml:space="preserve">Review catalog.</w:t>
       </w:r>
@@ -1245,11 +1246,11 @@
     </w:p>
     <w:p>
       <w:pPr>
+        <w:pStyle w:val="Compact"/>
         <w:numPr>
           <w:ilvl w:val="0"/>
           <w:numId w:val="1004"/>
         </w:numPr>
-        <w:pStyle w:val="Compact"/>
       </w:pPr>
       <w:r>
         <w:t xml:space="preserve">Select one actual charged ordinance for each item. An item with several listed sections shows a Charged ordinance select with exactly those sections and nothing chosen; choose the section actually charged (saved drafts show the select unchosen and cannot be issued until a section is chosen). The deposit fields then fill from the configured schedule for the pricing date; changing the choice clears the previous charge’s values and prices the new one. If no single schedule entry applies, a blocking concern explains it rather than guessing an amount. Charging a section that is not listed on the item is a different charge and needs an approved source. Multiple offenses under one ordinance require the appropriate offense selection.</w:t>
@@ -1257,11 +1258,11 @@
     </w:p>
     <w:p>
       <w:pPr>
+        <w:pStyle w:val="Compact"/>
         <w:numPr>
           <w:ilvl w:val="0"/>
           <w:numId w:val="1004"/>
         </w:numPr>
-        <w:pStyle w:val="Compact"/>
       </w:pPr>
       <w:r>
         <w:t xml:space="preserve">Verify the description, citation number, officer or department identifier, issue date, violation date and time, court date and session. Court suggestions are not reservations; use the division’s current court and numbering instructions.</w:t>
@@ -1269,11 +1270,11 @@
     </w:p>
     <w:p>
       <w:pPr>
+        <w:pStyle w:val="Compact"/>
         <w:numPr>
           <w:ilvl w:val="0"/>
           <w:numId w:val="1004"/>
         </w:numPr>
-        <w:pStyle w:val="Compact"/>
       </w:pPr>
       <w:r>
         <w:t xml:space="preserve">Complete any required measurements in that charge card. Conditional or unmapped entries require review; the program must not borrow an unrelated amount.</w:t>
@@ -1281,11 +1282,11 @@
     </w:p>
     <w:p>
       <w:pPr>
+        <w:pStyle w:val="Compact"/>
         <w:numPr>
           <w:ilvl w:val="0"/>
           <w:numId w:val="1004"/>
         </w:numPr>
-        <w:pStyle w:val="Compact"/>
       </w:pPr>
       <w:r>
         <w:t xml:space="preserve">Complete the deposit method and its source. Choose Complete charge after the required fields are valid. Other unfinished charge cards remain unfinished.</w:t>
@@ -1293,11 +1294,11 @@
     </w:p>
     <w:p>
       <w:pPr>
+        <w:pStyle w:val="Compact"/>
         <w:numPr>
           <w:ilvl w:val="0"/>
           <w:numId w:val="1004"/>
         </w:numPr>
-        <w:pStyle w:val="Compact"/>
       </w:pPr>
       <w:r>
         <w:t xml:space="preserve">Review all four court copies for every charge and the complete letter before issuance. Confirm shared pricing/history checks. Changed history or a changed charge may require another deliberate pricing review.</w:t>
@@ -1309,8 +1310,8 @@
       </w:pPr>
       <w:r>
         <w:rPr>
+          <w:b/>
           <w:bCs/>
-          <w:b/>
         </w:rPr>
         <w:t xml:space="preserve">Citation copies.</w:t>
       </w:r>
@@ -1325,8 +1326,9 @@
       <w:tblPr>
         <w:tblStyle w:val="Table"/>
         <w:tblW w:type="pct" w:w="5000"/>
+        <w:jc w:val="left"/>
+        <w:tblLayout w:type="fixed"/>
         <w:tblLook w:firstRow="1" w:lastRow="0" w:firstColumn="0" w:lastColumn="0" w:noHBand="0" w:noVBand="0" w:val="0020"/>
-        <w:jc w:val="start"/>
       </w:tblPr>
       <w:tblGrid>
         <w:gridCol w:w="3960"/>
@@ -1334,7 +1336,7 @@
       </w:tblGrid>
       <w:tr>
         <w:trPr>
-          <w:tblHeader w:val="true"/>
+          <w:tblHeader w:val="on"/>
         </w:trPr>
         <w:tc>
           <w:tcPr/>
@@ -1462,8 +1464,8 @@
       </w:pPr>
       <w:r>
         <w:rPr>
+          <w:b/>
           <w:bCs/>
-          <w:b/>
         </w:rPr>
         <w:t xml:space="preserve">Mandatory appearance.</w:t>
       </w:r>
@@ -1494,11 +1496,11 @@
     </w:p>
     <w:p>
       <w:pPr>
+        <w:pStyle w:val="Compact"/>
         <w:numPr>
           <w:ilvl w:val="0"/>
           <w:numId w:val="1005"/>
         </w:numPr>
-        <w:pStyle w:val="Compact"/>
       </w:pPr>
       <w:r>
         <w:t xml:space="preserve">Import the actual completed snow inspection. Verify parcel/site, respondent, mailing address, inspector, date and time.</w:t>
@@ -1506,11 +1508,11 @@
     </w:p>
     <w:p>
       <w:pPr>
+        <w:pStyle w:val="Compact"/>
         <w:numPr>
           <w:ilvl w:val="0"/>
           <w:numId w:val="1005"/>
         </w:numPr>
-        <w:pStyle w:val="Compact"/>
       </w:pPr>
       <w:r>
         <w:t xml:space="preserve">Enter the accumulation date, a positive decimal depth in inches and the observed condition: snow covered, ice covered, or snow and ice covered. Confirm photographs and select the corner-lot/curb-ramp option when factually applicable.</w:t>
@@ -1518,11 +1520,11 @@
     </w:p>
     <w:p>
       <w:pPr>
+        <w:pStyle w:val="Compact"/>
         <w:numPr>
           <w:ilvl w:val="0"/>
           <w:numId w:val="1005"/>
         </w:numPr>
-        <w:pStyle w:val="Compact"/>
       </w:pPr>
       <w:r>
         <w:t xml:space="preserve">Check the timing message. The supplied rule allows until noon City time on the day after accumulation. An observation before that point is blocked. Use actual facts; never adjust the date or time to pass a check.</w:t>
@@ -1530,11 +1532,11 @@
     </w:p>
     <w:p>
       <w:pPr>
+        <w:pStyle w:val="Compact"/>
         <w:numPr>
           <w:ilvl w:val="0"/>
           <w:numId w:val="1005"/>
         </w:numPr>
-        <w:pStyle w:val="Compact"/>
       </w:pPr>
       <w:r>
         <w:t xml:space="preserve">Review ordinance 10.28, number, description, comment, counted property history, deposit and court session. Refresh citation history if prompted. Missing parcels use the existing normalized address fallback, which requires particular attention to source identity.</w:t>
@@ -1542,11 +1544,11 @@
     </w:p>
     <w:p>
       <w:pPr>
+        <w:pStyle w:val="Compact"/>
         <w:numPr>
           <w:ilvl w:val="0"/>
           <w:numId w:val="1005"/>
         </w:numPr>
-        <w:pStyle w:val="Compact"/>
       </w:pPr>
       <w:r>
         <w:t xml:space="preserve">Review seasonal letter content. After an authorized administrator changes it, choose Refresh seasonal letter and review the new content. Stale shared content prevents issuance until reconciled.</w:t>
@@ -1554,11 +1556,11 @@
     </w:p>
     <w:p>
       <w:pPr>
+        <w:pStyle w:val="Compact"/>
         <w:numPr>
           <w:ilvl w:val="0"/>
           <w:numId w:val="1005"/>
         </w:numPr>
-        <w:pStyle w:val="Compact"/>
       </w:pPr>
       <w:r>
         <w:t xml:space="preserve">Issue, confirm the shared save (Writer returns to Workspace with the case highlighted) and verify the original PDF. The standard authoring-11 packet includes the snow cover and retained language-access continuation plus four MC-2000 copies; a cover may continue onto another page. Do not force a five-page total or remove language to shorten the packet.</w:t>
@@ -1578,8 +1580,8 @@
       </w:pPr>
       <w:r>
         <w:rPr>
+          <w:b/>
           <w:bCs/>
-          <w:b/>
         </w:rPr>
         <w:t xml:space="preserve">Division policy decisions.</w:t>
       </w:r>
@@ -1614,8 +1616,8 @@
       </w:pPr>
       <w:r>
         <w:rPr>
+          <w:b/>
           <w:bCs/>
-          <w:b/>
         </w:rPr>
         <w:t xml:space="preserve">Group due dates on reinspection.</w:t>
       </w:r>
@@ -1640,8 +1642,8 @@
       </w:pPr>
       <w:r>
         <w:rPr>
+          <w:b/>
           <w:bCs/>
-          <w:b/>
         </w:rPr>
         <w:t xml:space="preserve">One item at a time.</w:t>
       </w:r>
@@ -1656,8 +1658,9 @@
       <w:tblPr>
         <w:tblStyle w:val="Table"/>
         <w:tblW w:type="pct" w:w="5000"/>
+        <w:jc w:val="left"/>
+        <w:tblLayout w:type="fixed"/>
         <w:tblLook w:firstRow="1" w:lastRow="0" w:firstColumn="0" w:lastColumn="0" w:noHBand="0" w:noVBand="0" w:val="0020"/>
-        <w:jc w:val="start"/>
       </w:tblPr>
       <w:tblGrid>
         <w:gridCol w:w="3960"/>
@@ -1665,7 +1668,7 @@
       </w:tblGrid>
       <w:tr>
         <w:trPr>
-          <w:tblHeader w:val="true"/>
+          <w:tblHeader w:val="on"/>
         </w:trPr>
         <w:tc>
           <w:tcPr/>
@@ -1833,8 +1836,9 @@
       <w:tblPr>
         <w:tblStyle w:val="Table"/>
         <w:tblW w:type="pct" w:w="5000"/>
+        <w:jc w:val="left"/>
+        <w:tblLayout w:type="fixed"/>
         <w:tblLook w:firstRow="1" w:lastRow="0" w:firstColumn="0" w:lastColumn="0" w:noHBand="0" w:noVBand="0" w:val="0020"/>
-        <w:jc w:val="start"/>
       </w:tblPr>
       <w:tblGrid>
         <w:gridCol w:w="3960"/>
@@ -1842,7 +1846,7 @@
       </w:tblGrid>
       <w:tr>
         <w:trPr>
-          <w:tblHeader w:val="true"/>
+          <w:tblHeader w:val="on"/>
         </w:trPr>
         <w:tc>
           <w:tcPr/>
@@ -2144,8 +2148,8 @@
       </w:pPr>
       <w:r>
         <w:rPr>
+          <w:b/>
           <w:bCs/>
-          <w:b/>
         </w:rPr>
         <w:t xml:space="preserve">Referral and compliance histories.</w:t>
       </w:r>
@@ -2204,8 +2208,8 @@
       </w:pPr>
       <w:r>
         <w:rPr>
+          <w:b/>
           <w:bCs/>
-          <w:b/>
         </w:rPr>
         <w:t xml:space="preserve">Summary Abatement.</w:t>
       </w:r>
@@ -2222,8 +2226,8 @@
       </w:pPr>
       <w:r>
         <w:rPr>
+          <w:b/>
           <w:bCs/>
-          <w:b/>
         </w:rPr>
         <w:t xml:space="preserve">Non-Summary Abatement.</w:t>
       </w:r>
@@ -2240,8 +2244,8 @@
       </w:pPr>
       <w:r>
         <w:rPr>
+          <w:b/>
           <w:bCs/>
-          <w:b/>
         </w:rPr>
         <w:t xml:space="preserve">No Occupancy.</w:t>
       </w:r>
@@ -2258,8 +2262,8 @@
       </w:pPr>
       <w:r>
         <w:rPr>
+          <w:b/>
           <w:bCs/>
-          <w:b/>
         </w:rPr>
         <w:t xml:space="preserve">Best Interest Extension.</w:t>
       </w:r>
@@ -2291,8 +2295,8 @@
       </w:pPr>
       <w:r>
         <w:rPr>
+          <w:b/>
           <w:bCs/>
-          <w:b/>
         </w:rPr>
         <w:t xml:space="preserve">Vacancy Extension.</w:t>
       </w:r>
@@ -2342,8 +2346,8 @@
       </w:pPr>
       <w:r>
         <w:rPr>
+          <w:b/>
           <w:bCs/>
-          <w:b/>
         </w:rPr>
         <w:t xml:space="preserve">Extension layout.</w:t>
       </w:r>
@@ -2386,8 +2390,8 @@
       </w:pPr>
       <w:r>
         <w:rPr>
+          <w:b/>
           <w:bCs/>
-          <w:b/>
         </w:rPr>
         <w:t xml:space="preserve">Issue deliberately.</w:t>
       </w:r>
@@ -2402,8 +2406,9 @@
       <w:tblPr>
         <w:tblStyle w:val="Table"/>
         <w:tblW w:type="pct" w:w="5000"/>
+        <w:jc w:val="left"/>
+        <w:tblLayout w:type="fixed"/>
         <w:tblLook w:firstRow="1" w:lastRow="0" w:firstColumn="0" w:lastColumn="0" w:noHBand="0" w:noVBand="0" w:val="0020"/>
-        <w:jc w:val="start"/>
       </w:tblPr>
       <w:tblGrid>
         <w:gridCol w:w="3960"/>
@@ -2411,7 +2416,7 @@
       </w:tblGrid>
       <w:tr>
         <w:trPr>
-          <w:tblHeader w:val="true"/>
+          <w:tblHeader w:val="on"/>
         </w:trPr>
         <w:tc>
           <w:tcPr/>
@@ -2549,8 +2554,8 @@
       </w:pPr>
       <w:r>
         <w:rPr>
+          <w:b/>
           <w:bCs/>
-          <w:b/>
         </w:rPr>
         <w:t xml:space="preserve">Original PDFs.</w:t>
       </w:r>
@@ -2567,8 +2572,8 @@
       </w:pPr>
       <w:r>
         <w:rPr>
+          <w:b/>
           <w:bCs/>
-          <w:b/>
         </w:rPr>
         <w:t xml:space="preserve">Print and mail.</w:t>
       </w:r>
@@ -2593,8 +2598,8 @@
       </w:pPr>
       <w:r>
         <w:rPr>
+          <w:b/>
           <w:bCs/>
-          <w:b/>
         </w:rPr>
         <w:t xml:space="preserve">Email.</w:t>
       </w:r>
@@ -2611,8 +2616,8 @@
       </w:pPr>
       <w:r>
         <w:rPr>
+          <w:b/>
           <w:bCs/>
-          <w:b/>
         </w:rPr>
         <w:t xml:space="preserve">Outside records.</w:t>
       </w:r>
@@ -2643,11 +2648,11 @@
     </w:p>
     <w:p>
       <w:pPr>
+        <w:pStyle w:val="Compact"/>
         <w:numPr>
           <w:ilvl w:val="0"/>
           <w:numId w:val="1006"/>
         </w:numPr>
-        <w:pStyle w:val="Compact"/>
       </w:pPr>
       <w:r>
         <w:t xml:space="preserve">Open the issued document from case history and choose Correct document.</w:t>
@@ -2655,11 +2660,11 @@
     </w:p>
     <w:p>
       <w:pPr>
+        <w:pStyle w:val="Compact"/>
         <w:numPr>
           <w:ilvl w:val="0"/>
           <w:numId w:val="1006"/>
         </w:numPr>
-        <w:pStyle w:val="Compact"/>
       </w:pPr>
       <w:r>
         <w:t xml:space="preserve">State the recording error and reason. For a citation or referral, record the actual receiving court or City Attorney amendment instructions/reference where required. The program does not issue those instructions for you.</w:t>
@@ -2667,11 +2672,11 @@
     </w:p>
     <w:p>
       <w:pPr>
+        <w:pStyle w:val="Compact"/>
         <w:numPr>
           <w:ilvl w:val="0"/>
           <w:numId w:val="1006"/>
         </w:numPr>
-        <w:pStyle w:val="Compact"/>
       </w:pPr>
       <w:r>
         <w:t xml:space="preserve">Make the permitted correction. Review the before/after comparison, affected case facts and linked worksheet facts. Keep the original document, item, root, visit and citation identities.</w:t>
@@ -2679,11 +2684,11 @@
     </w:p>
     <w:p>
       <w:pPr>
+        <w:pStyle w:val="Compact"/>
         <w:numPr>
           <w:ilvl w:val="0"/>
           <w:numId w:val="1006"/>
         </w:numPr>
-        <w:pStyle w:val="Compact"/>
       </w:pPr>
       <w:r>
         <w:t xml:space="preserve">Review and issue the linked revision. Until its shared save is confirmed, the earlier issued version remains effective in the program.</w:t>
@@ -2691,11 +2696,11 @@
     </w:p>
     <w:p>
       <w:pPr>
+        <w:pStyle w:val="Compact"/>
         <w:numPr>
           <w:ilvl w:val="0"/>
           <w:numId w:val="1006"/>
         </w:numPr>
-        <w:pStyle w:val="Compact"/>
       </w:pPr>
       <w:r>
         <w:t xml:space="preserve">Confirm the correction’s original PDF and complete outside amendment, mailing and recording steps under the actual procedure.</w:t>
@@ -2707,8 +2712,8 @@
       </w:pPr>
       <w:r>
         <w:rPr>
+          <w:b/>
           <w:bCs/>
-          <w:b/>
         </w:rPr>
         <w:t xml:space="preserve">Withdraw an item.</w:t>
       </w:r>
@@ -2725,8 +2730,8 @@
       </w:pPr>
       <w:r>
         <w:rPr>
+          <w:b/>
           <w:bCs/>
-          <w:b/>
         </w:rPr>
         <w:t xml:space="preserve">Correct a visit.</w:t>
       </w:r>
@@ -2743,8 +2748,8 @@
       </w:pPr>
       <w:r>
         <w:rPr>
+          <w:b/>
           <w:bCs/>
-          <w:b/>
         </w:rPr>
         <w:t xml:space="preserve">Citation prices and dates.</w:t>
       </w:r>
@@ -2761,8 +2766,8 @@
       </w:pPr>
       <w:r>
         <w:rPr>
+          <w:b/>
           <w:bCs/>
-          <w:b/>
         </w:rPr>
         <w:t xml:space="preserve">Restrictions and release.</w:t>
       </w:r>
@@ -2803,8 +2808,9 @@
       <w:tblPr>
         <w:tblStyle w:val="Table"/>
         <w:tblW w:type="pct" w:w="5000"/>
+        <w:jc w:val="left"/>
+        <w:tblLayout w:type="fixed"/>
         <w:tblLook w:firstRow="1" w:lastRow="0" w:firstColumn="0" w:lastColumn="0" w:noHBand="0" w:noVBand="0" w:val="0020"/>
-        <w:jc w:val="start"/>
       </w:tblPr>
       <w:tblGrid>
         <w:gridCol w:w="3960"/>
@@ -2812,7 +2818,7 @@
       </w:tblGrid>
       <w:tr>
         <w:trPr>
-          <w:tblHeader w:val="true"/>
+          <w:tblHeader w:val="on"/>
         </w:trPr>
         <w:tc>
           <w:tcPr/>
@@ -2924,8 +2930,8 @@
       </w:pPr>
       <w:r>
         <w:rPr>
+          <w:b/>
           <w:bCs/>
-          <w:b/>
         </w:rPr>
         <w:t xml:space="preserve">Device save failure.</w:t>
       </w:r>
@@ -2942,8 +2948,8 @@
       </w:pPr>
       <w:r>
         <w:rPr>
+          <w:b/>
           <w:bCs/>
-          <w:b/>
         </w:rPr>
         <w:t xml:space="preserve">Uncertain shared save.</w:t>
       </w:r>
@@ -2960,8 +2966,8 @@
       </w:pPr>
       <w:r>
         <w:rPr>
+          <w:b/>
           <w:bCs/>
-          <w:b/>
         </w:rPr>
         <w:t xml:space="preserve">Shared changes.</w:t>
       </w:r>
@@ -2978,8 +2984,8 @@
       </w:pPr>
       <w:r>
         <w:rPr>
+          <w:b/>
           <w:bCs/>
-          <w:b/>
         </w:rPr>
         <w:t xml:space="preserve">PDF exceptions.</w:t>
       </w:r>
@@ -3028,8 +3034,9 @@
       <w:tblPr>
         <w:tblStyle w:val="Table"/>
         <w:tblW w:type="pct" w:w="5000"/>
+        <w:jc w:val="left"/>
+        <w:tblLayout w:type="fixed"/>
         <w:tblLook w:firstRow="1" w:lastRow="0" w:firstColumn="0" w:lastColumn="0" w:noHBand="0" w:noVBand="0" w:val="0020"/>
-        <w:jc w:val="start"/>
       </w:tblPr>
       <w:tblGrid>
         <w:gridCol w:w="3960"/>
@@ -3037,7 +3044,7 @@
       </w:tblGrid>
       <w:tr>
         <w:trPr>
-          <w:tblHeader w:val="true"/>
+          <w:tblHeader w:val="on"/>
         </w:trPr>
         <w:tc>
           <w:tcPr/>
@@ -3227,8 +3234,8 @@
       </w:pPr>
       <w:r>
         <w:rPr>
+          <w:b/>
           <w:bCs/>
-          <w:b/>
         </w:rPr>
         <w:t xml:space="preserve">Recover one case.</w:t>
       </w:r>
@@ -3245,8 +3252,8 @@
       </w:pPr>
       <w:r>
         <w:rPr>
+          <w:b/>
           <w:bCs/>
-          <w:b/>
         </w:rPr>
         <w:t xml:space="preserve">Restore a workspace.</w:t>
       </w:r>
@@ -3263,8 +3270,8 @@
       </w:pPr>
       <w:r>
         <w:rPr>
+          <w:b/>
           <w:bCs/>
-          <w:b/>
         </w:rPr>
         <w:t xml:space="preserve">Change PCs or browser profiles.</w:t>
       </w:r>
@@ -3281,8 +3288,8 @@
       </w:pPr>
       <w:r>
         <w:rPr>
+          <w:b/>
           <w:bCs/>
-          <w:b/>
         </w:rPr>
         <w:t xml:space="preserve">After an update interruption.</w:t>
       </w:r>
@@ -3299,8 +3306,8 @@
       </w:pPr>
       <w:r>
         <w:rPr>
+          <w:b/>
           <w:bCs/>
-          <w:b/>
         </w:rPr>
         <w:t xml:space="preserve">Test recovery.</w:t>
       </w:r>
@@ -3333,8 +3340,9 @@
       <w:tblPr>
         <w:tblStyle w:val="Table"/>
         <w:tblW w:type="pct" w:w="5000"/>
+        <w:jc w:val="left"/>
+        <w:tblLayout w:type="fixed"/>
         <w:tblLook w:firstRow="1" w:lastRow="0" w:firstColumn="0" w:lastColumn="0" w:noHBand="0" w:noVBand="0" w:val="0020"/>
-        <w:jc w:val="start"/>
       </w:tblPr>
       <w:tblGrid>
         <w:gridCol w:w="3960"/>
@@ -3342,7 +3350,7 @@
       </w:tblGrid>
       <w:tr>
         <w:trPr>
-          <w:tblHeader w:val="true"/>
+          <w:tblHeader w:val="on"/>
         </w:trPr>
         <w:tc>
           <w:tcPr/>
@@ -3704,8 +3712,8 @@
       </w:pPr>
       <w:r>
         <w:rPr>
+          <w:b/>
           <w:bCs/>
-          <w:b/>
         </w:rPr>
         <w:t xml:space="preserve">Check coverage first.</w:t>
       </w:r>
@@ -3730,8 +3738,8 @@
       </w:pPr>
       <w:r>
         <w:rPr>
+          <w:b/>
           <w:bCs/>
-          <w:b/>
         </w:rPr>
         <w:t xml:space="preserve">Maps.</w:t>
       </w:r>
@@ -3748,8 +3756,8 @@
       </w:pPr>
       <w:r>
         <w:rPr>
+          <w:b/>
           <w:bCs/>
-          <w:b/>
         </w:rPr>
         <w:t xml:space="preserve">Drill into data.</w:t>
       </w:r>
@@ -3766,8 +3774,8 @@
       </w:pPr>
       <w:r>
         <w:rPr>
+          <w:b/>
           <w:bCs/>
-          <w:b/>
         </w:rPr>
         <w:t xml:space="preserve">Export.</w:t>
       </w:r>
@@ -3784,8 +3792,8 @@
       </w:pPr>
       <w:r>
         <w:rPr>
+          <w:b/>
           <w:bCs/>
-          <w:b/>
         </w:rPr>
         <w:t xml:space="preserve">Deposit schedule.</w:t>
       </w:r>
@@ -3802,8 +3810,8 @@
       </w:pPr>
       <w:r>
         <w:rPr>
+          <w:b/>
           <w:bCs/>
-          <w:b/>
         </w:rPr>
         <w:t xml:space="preserve">Refresh speed.</w:t>
       </w:r>
@@ -3838,8 +3846,8 @@
       </w:pPr>
       <w:r>
         <w:rPr>
+          <w:b/>
           <w:bCs/>
-          <w:b/>
         </w:rPr>
         <w:t xml:space="preserve">Search shared case records.</w:t>
       </w:r>
@@ -3856,8 +3864,8 @@
       </w:pPr>
       <w:r>
         <w:rPr>
+          <w:b/>
           <w:bCs/>
-          <w:b/>
         </w:rPr>
         <w:t xml:space="preserve">Reminders.</w:t>
       </w:r>
@@ -3874,8 +3882,8 @@
       </w:pPr>
       <w:r>
         <w:rPr>
+          <w:b/>
           <w:bCs/>
-          <w:b/>
         </w:rPr>
         <w:t xml:space="preserve">Batch draft due dates.</w:t>
       </w:r>
@@ -3892,8 +3900,8 @@
       </w:pPr>
       <w:r>
         <w:rPr>
+          <w:b/>
           <w:bCs/>
-          <w:b/>
         </w:rPr>
         <w:t xml:space="preserve">Open saved case.</w:t>
       </w:r>
@@ -3910,8 +3918,8 @@
       </w:pPr>
       <w:r>
         <w:rPr>
+          <w:b/>
           <w:bCs/>
-          <w:b/>
         </w:rPr>
         <w:t xml:space="preserve">Display.</w:t>
       </w:r>
@@ -3928,8 +3936,8 @@
       </w:pPr>
       <w:r>
         <w:rPr>
+          <w:b/>
           <w:bCs/>
-          <w:b/>
         </w:rPr>
         <w:t xml:space="preserve">Messages.</w:t>
       </w:r>
@@ -3946,8 +3954,8 @@
       </w:pPr>
       <w:r>
         <w:rPr>
+          <w:b/>
           <w:bCs/>
-          <w:b/>
         </w:rPr>
         <w:t xml:space="preserve">Administrative deposit exceptions.</w:t>
       </w:r>
@@ -3990,8 +3998,8 @@
       </w:pPr>
       <w:r>
         <w:rPr>
+          <w:b/>
           <w:bCs/>
-          <w:b/>
         </w:rPr>
         <w:t xml:space="preserve">Shared folders.</w:t>
       </w:r>
@@ -4008,8 +4016,8 @@
       </w:pPr>
       <w:r>
         <w:rPr>
+          <w:b/>
           <w:bCs/>
-          <w:b/>
         </w:rPr>
         <w:t xml:space="preserve">Protected anchor.</w:t>
       </w:r>
@@ -4026,8 +4034,8 @@
       </w:pPr>
       <w:r>
         <w:rPr>
+          <w:b/>
           <w:bCs/>
-          <w:b/>
         </w:rPr>
         <w:t xml:space="preserve">Record holds.</w:t>
       </w:r>
@@ -4044,8 +4052,8 @@
       </w:pPr>
       <w:r>
         <w:rPr>
+          <w:b/>
           <w:bCs/>
-          <w:b/>
         </w:rPr>
         <w:t xml:space="preserve">Locks.</w:t>
       </w:r>
@@ -4062,8 +4070,8 @@
       </w:pPr>
       <w:r>
         <w:rPr>
+          <w:b/>
           <w:bCs/>
-          <w:b/>
         </w:rPr>
         <w:t xml:space="preserve">Approved connections.</w:t>
       </w:r>
@@ -4080,8 +4088,8 @@
       </w:pPr>
       <w:r>
         <w:rPr>
+          <w:b/>
           <w:bCs/>
-          <w:b/>
         </w:rPr>
         <w:t xml:space="preserve">SQL.</w:t>
       </w:r>
@@ -4098,8 +4106,8 @@
       </w:pPr>
       <w:r>
         <w:rPr>
+          <w:b/>
           <w:bCs/>
-          <w:b/>
         </w:rPr>
         <w:t xml:space="preserve">Policy and catalog.</w:t>
       </w:r>
@@ -4116,8 +4124,8 @@
       </w:pPr>
       <w:r>
         <w:rPr>
+          <w:b/>
           <w:bCs/>
-          <w:b/>
         </w:rPr>
         <w:t xml:space="preserve">Retention.</w:t>
       </w:r>
@@ -4134,8 +4142,8 @@
       </w:pPr>
       <w:r>
         <w:rPr>
+          <w:b/>
           <w:bCs/>
-          <w:b/>
         </w:rPr>
         <w:t xml:space="preserve">Release ownership.</w:t>
       </w:r>
@@ -4168,8 +4176,9 @@
       <w:tblPr>
         <w:tblStyle w:val="Table"/>
         <w:tblW w:type="pct" w:w="5000"/>
+        <w:jc w:val="left"/>
+        <w:tblLayout w:type="fixed"/>
         <w:tblLook w:firstRow="1" w:lastRow="0" w:firstColumn="0" w:lastColumn="0" w:noHBand="0" w:noVBand="0" w:val="0020"/>
-        <w:jc w:val="start"/>
       </w:tblPr>
       <w:tblGrid>
         <w:gridCol w:w="3960"/>
@@ -4177,7 +4186,7 @@
       </w:tblGrid>
       <w:tr>
         <w:trPr>
-          <w:tblHeader w:val="true"/>
+          <w:tblHeader w:val="on"/>
         </w:trPr>
         <w:tc>
           <w:tcPr/>
@@ -4349,8 +4358,8 @@
       </w:pPr>
       <w:r>
         <w:rPr>
+          <w:b/>
           <w:bCs/>
-          <w:b/>
         </w:rPr>
         <w:t xml:space="preserve">Read the whole task.</w:t>
       </w:r>
@@ -4367,8 +4376,8 @@
       </w:pPr>
       <w:r>
         <w:rPr>
+          <w:b/>
           <w:bCs/>
-          <w:b/>
         </w:rPr>
         <w:t xml:space="preserve">Small screens and zoom.</w:t>
       </w:r>
@@ -4385,8 +4394,8 @@
       </w:pPr>
       <w:r>
         <w:rPr>
+          <w:b/>
           <w:bCs/>
-          <w:b/>
         </w:rPr>
         <w:t xml:space="preserve">Display preferences.</w:t>
       </w:r>
@@ -4427,8 +4436,9 @@
       <w:tblPr>
         <w:tblStyle w:val="Table"/>
         <w:tblW w:type="pct" w:w="5000"/>
+        <w:jc w:val="left"/>
+        <w:tblLayout w:type="fixed"/>
         <w:tblLook w:firstRow="1" w:lastRow="0" w:firstColumn="0" w:lastColumn="0" w:noHBand="0" w:noVBand="0" w:val="0020"/>
-        <w:jc w:val="start"/>
       </w:tblPr>
       <w:tblGrid>
         <w:gridCol w:w="3960"/>
@@ -4436,7 +4446,7 @@
       </w:tblGrid>
       <w:tr>
         <w:trPr>
-          <w:tblHeader w:val="true"/>
+          <w:tblHeader w:val="on"/>
         </w:trPr>
         <w:tc>
           <w:tcPr/>
@@ -5183,8 +5193,8 @@
       </w:pPr>
       <w:r>
         <w:rPr>
+          <w:b/>
           <w:bCs/>
-          <w:b/>
         </w:rPr>
         <w:t xml:space="preserve">Import and notice.</w:t>
       </w:r>
@@ -5201,8 +5211,8 @@
       </w:pPr>
       <w:r>
         <w:rPr>
+          <w:b/>
           <w:bCs/>
-          <w:b/>
         </w:rPr>
         <w:t xml:space="preserve">Snow.</w:t>
       </w:r>
@@ -5219,8 +5229,8 @@
       </w:pPr>
       <w:r>
         <w:rPr>
+          <w:b/>
           <w:bCs/>
-          <w:b/>
         </w:rPr>
         <w:t xml:space="preserve">Reinspection.</w:t>
       </w:r>
@@ -5237,8 +5247,8 @@
       </w:pPr>
       <w:r>
         <w:rPr>
+          <w:b/>
           <w:bCs/>
-          <w:b/>
         </w:rPr>
         <w:t xml:space="preserve">Correction and recovery.</w:t>
       </w:r>
@@ -5255,8 +5265,8 @@
       </w:pPr>
       <w:r>
         <w:rPr>
+          <w:b/>
           <w:bCs/>
-          <w:b/>
         </w:rPr>
         <w:t xml:space="preserve">Reports and accessibility.</w:t>
       </w:r>
@@ -5271,8 +5281,9 @@
       <w:tblPr>
         <w:tblStyle w:val="Table"/>
         <w:tblW w:type="pct" w:w="5000"/>
+        <w:jc w:val="left"/>
+        <w:tblLayout w:type="fixed"/>
         <w:tblLook w:firstRow="1" w:lastRow="0" w:firstColumn="0" w:lastColumn="0" w:noHBand="0" w:noVBand="0" w:val="0020"/>
-        <w:jc w:val="start"/>
       </w:tblPr>
       <w:tblGrid>
         <w:gridCol w:w="3960"/>
@@ -5280,7 +5291,7 @@
       </w:tblGrid>
       <w:tr>
         <w:trPr>
-          <w:tblHeader w:val="true"/>
+          <w:tblHeader w:val="on"/>
         </w:trPr>
         <w:tc>
           <w:tcPr/>
@@ -5563,8 +5574,9 @@
       <w:tblPr>
         <w:tblStyle w:val="Table"/>
         <w:tblW w:type="pct" w:w="5000"/>
+        <w:jc w:val="left"/>
+        <w:tblLayout w:type="fixed"/>
         <w:tblLook w:firstRow="1" w:lastRow="0" w:firstColumn="0" w:lastColumn="0" w:noHBand="0" w:noVBand="0" w:val="0020"/>
-        <w:jc w:val="start"/>
       </w:tblPr>
       <w:tblGrid>
         <w:gridCol w:w="2640"/>
@@ -5573,7 +5585,7 @@
       </w:tblGrid>
       <w:tr>
         <w:trPr>
-          <w:tblHeader w:val="true"/>
+          <w:tblHeader w:val="on"/>
         </w:trPr>
         <w:tc>
           <w:tcPr/>
@@ -5759,7 +5771,7 @@
               <w:jc w:val="left"/>
             </w:pPr>
             <w:r>
-              <w:t xml:space="preserve">Not used for extensions</w:t>
+              <w:t xml:space="preserve">New Best Interest and Vacancy Extensions kept authoring 13</w:t>
             </w:r>
           </w:p>
         </w:tc>
@@ -5858,7 +5870,7 @@
         <w:pStyle w:val="BodyText"/>
       </w:pPr>
       <w:r>
-        <w:t xml:space="preserve">Authoring-15 and earlier Vacancy Extensions and authoring-14 and earlier Best Interest Extensions print their supervisory signer after the table. The authoring-11 initial citation packet may have six pages. Retain the original PDF for any document issued under a format an earlier release cannot render.</w:t>
+        <w:t xml:space="preserve">In the aligned table layout, authoring-12–15 Vacancy Extensions and authoring-12–14 Best Interest Extensions print their supervisory signer after the table; authoring-11 and earlier use their historical narrative layout. Ordinary Extensions keep their own stored authoring version; the special-extension column above describes only Best Interest and Vacancy Extensions. The authoring-11 initial citation packet may have six pages. Retain the original PDF for any document issued under a format an earlier release cannot render.</w:t>
       </w:r>
     </w:p>
     <w:p>
@@ -5874,7 +5886,7 @@
         <w:pStyle w:val="BodyText"/>
       </w:pPr>
       <w:r>
-        <w:t xml:space="preserve">Manual source digest 1a9d58e0233a1359.</w:t>
+        <w:t xml:space="preserve">Manual source digest a68d5531bfc7ce72.</w:t>
       </w:r>
     </w:p>
     <w:bookmarkEnd w:id="41"/>
@@ -6123,7 +6135,7 @@
     </w:lvl>
   </w:abstractNum>
   <w:abstractNum w:abstractNumId="990">
-    <w:nsid w:val="A990"/>
+    <w:nsid w:val="0000A990"/>
     <w:multiLevelType w:val="multilevel"/>
     <w:lvl w:ilvl="0">
       <w:numFmt w:val="bullet"/>
@@ -6199,7 +6211,7 @@
     </w:lvl>
   </w:abstractNum>
   <w:abstractNum w:abstractNumId="99411">
-    <w:nsid w:val="A99411"/>
+    <w:nsid w:val="00A99411"/>
     <w:multiLevelType w:val="multilevel"/>
     <w:lvl w:ilvl="0">
       <w:start w:val="1"/>
@@ -6284,7 +6296,7 @@
     </w:lvl>
   </w:abstractNum>
   <w:abstractNum w:abstractNumId="991">
-    <w:nsid w:val="A991"/>
+    <w:nsid w:val="0000A991"/>
     <w:multiLevelType w:val="multilevel"/>
     <w:lvl w:ilvl="0">
       <w:numFmt w:val="bullet"/>
@@ -22248,7 +22260,7 @@
     <w:basedOn w:val="VerbatimChar"/>
     <w:rPr/>
   </w:style>
-  <w:style w:type="character" w:customStyle="1" w:styleId="KeywordTok">
+  <w:style w:customStyle="1" w:styleId="KeywordTok" w:type="character">
     <w:name w:val="KeywordTok"/>
     <w:basedOn w:val="VerbatimChar"/>
     <w:rPr>
@@ -22256,77 +22268,77 @@
       <w:b/>
     </w:rPr>
   </w:style>
-  <w:style w:type="character" w:customStyle="1" w:styleId="DataTypeTok">
+  <w:style w:customStyle="1" w:styleId="DataTypeTok" w:type="character">
     <w:name w:val="DataTypeTok"/>
     <w:basedOn w:val="VerbatimChar"/>
     <w:rPr>
       <w:color w:val="902000"/>
     </w:rPr>
   </w:style>
-  <w:style w:type="character" w:customStyle="1" w:styleId="DecValTok">
+  <w:style w:customStyle="1" w:styleId="DecValTok" w:type="character">
     <w:name w:val="DecValTok"/>
     <w:basedOn w:val="VerbatimChar"/>
     <w:rPr>
       <w:color w:val="40a070"/>
     </w:rPr>
   </w:style>
-  <w:style w:type="character" w:customStyle="1" w:styleId="BaseNTok">
+  <w:style w:customStyle="1" w:styleId="BaseNTok" w:type="character">
     <w:name w:val="BaseNTok"/>
     <w:basedOn w:val="VerbatimChar"/>
     <w:rPr>
       <w:color w:val="40a070"/>
     </w:rPr>
   </w:style>
-  <w:style w:type="character" w:customStyle="1" w:styleId="FloatTok">
+  <w:style w:customStyle="1" w:styleId="FloatTok" w:type="character">
     <w:name w:val="FloatTok"/>
     <w:basedOn w:val="VerbatimChar"/>
     <w:rPr>
       <w:color w:val="40a070"/>
     </w:rPr>
   </w:style>
-  <w:style w:type="character" w:customStyle="1" w:styleId="ConstantTok">
+  <w:style w:customStyle="1" w:styleId="ConstantTok" w:type="character">
     <w:name w:val="ConstantTok"/>
     <w:basedOn w:val="VerbatimChar"/>
     <w:rPr>
       <w:color w:val="880000"/>
     </w:rPr>
   </w:style>
-  <w:style w:type="character" w:customStyle="1" w:styleId="CharTok">
+  <w:style w:customStyle="1" w:styleId="CharTok" w:type="character">
     <w:name w:val="CharTok"/>
     <w:basedOn w:val="VerbatimChar"/>
     <w:rPr>
       <w:color w:val="4070a0"/>
     </w:rPr>
   </w:style>
-  <w:style w:type="character" w:customStyle="1" w:styleId="SpecialCharTok">
+  <w:style w:customStyle="1" w:styleId="SpecialCharTok" w:type="character">
     <w:name w:val="SpecialCharTok"/>
     <w:basedOn w:val="VerbatimChar"/>
     <w:rPr>
       <w:color w:val="4070a0"/>
     </w:rPr>
   </w:style>
-  <w:style w:type="character" w:customStyle="1" w:styleId="StringTok">
+  <w:style w:customStyle="1" w:styleId="StringTok" w:type="character">
     <w:name w:val="StringTok"/>
     <w:basedOn w:val="VerbatimChar"/>
     <w:rPr>
       <w:color w:val="4070a0"/>
     </w:rPr>
   </w:style>
-  <w:style w:type="character" w:customStyle="1" w:styleId="VerbatimStringTok">
+  <w:style w:customStyle="1" w:styleId="VerbatimStringTok" w:type="character">
     <w:name w:val="VerbatimStringTok"/>
     <w:basedOn w:val="VerbatimChar"/>
     <w:rPr>
       <w:color w:val="4070a0"/>
     </w:rPr>
   </w:style>
-  <w:style w:type="character" w:customStyle="1" w:styleId="SpecialStringTok">
+  <w:style w:customStyle="1" w:styleId="SpecialStringTok" w:type="character">
     <w:name w:val="SpecialStringTok"/>
     <w:basedOn w:val="VerbatimChar"/>
     <w:rPr>
       <w:color w:val="bb6688"/>
     </w:rPr>
   </w:style>
-  <w:style w:type="character" w:customStyle="1" w:styleId="ImportTok">
+  <w:style w:customStyle="1" w:styleId="ImportTok" w:type="character">
     <w:name w:val="ImportTok"/>
     <w:basedOn w:val="VerbatimChar"/>
     <w:rPr>
@@ -22334,7 +22346,7 @@
       <w:b/>
     </w:rPr>
   </w:style>
-  <w:style w:type="character" w:customStyle="1" w:styleId="CommentTok">
+  <w:style w:customStyle="1" w:styleId="CommentTok" w:type="character">
     <w:name w:val="CommentTok"/>
     <w:basedOn w:val="VerbatimChar"/>
     <w:rPr>
@@ -22342,7 +22354,7 @@
       <w:i/>
     </w:rPr>
   </w:style>
-  <w:style w:type="character" w:customStyle="1" w:styleId="DocumentationTok">
+  <w:style w:customStyle="1" w:styleId="DocumentationTok" w:type="character">
     <w:name w:val="DocumentationTok"/>
     <w:basedOn w:val="VerbatimChar"/>
     <w:rPr>
@@ -22350,7 +22362,7 @@
       <w:i/>
     </w:rPr>
   </w:style>
-  <w:style w:type="character" w:customStyle="1" w:styleId="AnnotationTok">
+  <w:style w:customStyle="1" w:styleId="AnnotationTok" w:type="character">
     <w:name w:val="AnnotationTok"/>
     <w:basedOn w:val="VerbatimChar"/>
     <w:rPr>
@@ -22359,7 +22371,7 @@
       <w:i/>
     </w:rPr>
   </w:style>
-  <w:style w:type="character" w:customStyle="1" w:styleId="CommentVarTok">
+  <w:style w:customStyle="1" w:styleId="CommentVarTok" w:type="character">
     <w:name w:val="CommentVarTok"/>
     <w:basedOn w:val="VerbatimChar"/>
     <w:rPr>
@@ -22368,28 +22380,28 @@
       <w:i/>
     </w:rPr>
   </w:style>
-  <w:style w:type="character" w:customStyle="1" w:styleId="OtherTok">
+  <w:style w:customStyle="1" w:styleId="OtherTok" w:type="character">
     <w:name w:val="OtherTok"/>
     <w:basedOn w:val="VerbatimChar"/>
     <w:rPr>
       <w:color w:val="007020"/>
     </w:rPr>
   </w:style>
-  <w:style w:type="character" w:customStyle="1" w:styleId="FunctionTok">
+  <w:style w:customStyle="1" w:styleId="FunctionTok" w:type="character">
     <w:name w:val="FunctionTok"/>
     <w:basedOn w:val="VerbatimChar"/>
     <w:rPr>
       <w:color w:val="06287e"/>
     </w:rPr>
   </w:style>
-  <w:style w:type="character" w:customStyle="1" w:styleId="VariableTok">
+  <w:style w:customStyle="1" w:styleId="VariableTok" w:type="character">
     <w:name w:val="VariableTok"/>
     <w:basedOn w:val="VerbatimChar"/>
     <w:rPr>
       <w:color w:val="19177c"/>
     </w:rPr>
   </w:style>
-  <w:style w:type="character" w:customStyle="1" w:styleId="ControlFlowTok">
+  <w:style w:customStyle="1" w:styleId="ControlFlowTok" w:type="character">
     <w:name w:val="ControlFlowTok"/>
     <w:basedOn w:val="VerbatimChar"/>
     <w:rPr>
@@ -22397,45 +22409,45 @@
       <w:b/>
     </w:rPr>
   </w:style>
-  <w:style w:type="character" w:customStyle="1" w:styleId="OperatorTok">
+  <w:style w:customStyle="1" w:styleId="OperatorTok" w:type="character">
     <w:name w:val="OperatorTok"/>
     <w:basedOn w:val="VerbatimChar"/>
     <w:rPr>
       <w:color w:val="666666"/>
     </w:rPr>
   </w:style>
-  <w:style w:type="character" w:customStyle="1" w:styleId="BuiltInTok">
+  <w:style w:customStyle="1" w:styleId="BuiltInTok" w:type="character">
     <w:name w:val="BuiltInTok"/>
     <w:basedOn w:val="VerbatimChar"/>
     <w:rPr>
       <w:color w:val="008000"/>
     </w:rPr>
   </w:style>
-  <w:style w:type="character" w:customStyle="1" w:styleId="ExtensionTok">
+  <w:style w:customStyle="1" w:styleId="ExtensionTok" w:type="character">
     <w:name w:val="ExtensionTok"/>
     <w:basedOn w:val="VerbatimChar"/>
     <w:rPr/>
   </w:style>
-  <w:style w:type="character" w:customStyle="1" w:styleId="PreprocessorTok">
+  <w:style w:customStyle="1" w:styleId="PreprocessorTok" w:type="character">
     <w:name w:val="PreprocessorTok"/>
     <w:basedOn w:val="VerbatimChar"/>
     <w:rPr>
       <w:color w:val="bc7a00"/>
     </w:rPr>
   </w:style>
-  <w:style w:type="character" w:customStyle="1" w:styleId="AttributeTok">
+  <w:style w:customStyle="1" w:styleId="AttributeTok" w:type="character">
     <w:name w:val="AttributeTok"/>
     <w:basedOn w:val="VerbatimChar"/>
     <w:rPr>
       <w:color w:val="7d9029"/>
     </w:rPr>
   </w:style>
-  <w:style w:type="character" w:customStyle="1" w:styleId="RegionMarkerTok">
+  <w:style w:customStyle="1" w:styleId="RegionMarkerTok" w:type="character">
     <w:name w:val="RegionMarkerTok"/>
     <w:basedOn w:val="VerbatimChar"/>
     <w:rPr/>
   </w:style>
-  <w:style w:type="character" w:customStyle="1" w:styleId="InformationTok">
+  <w:style w:customStyle="1" w:styleId="InformationTok" w:type="character">
     <w:name w:val="InformationTok"/>
     <w:basedOn w:val="VerbatimChar"/>
     <w:rPr>
@@ -22444,7 +22456,7 @@
       <w:i/>
     </w:rPr>
   </w:style>
-  <w:style w:type="character" w:customStyle="1" w:styleId="WarningTok">
+  <w:style w:customStyle="1" w:styleId="WarningTok" w:type="character">
     <w:name w:val="WarningTok"/>
     <w:basedOn w:val="VerbatimChar"/>
     <w:rPr>
@@ -22453,20 +22465,246 @@
       <w:i/>
     </w:rPr>
   </w:style>
+  <w:style w:customStyle="1" w:styleId="AlertTok" w:type="character">
+    <w:name w:val="AlertTok"/>
+    <w:basedOn w:val="VerbatimChar"/>
+    <w:rPr>
+      <w:color w:val="ff0000"/>
+      <w:b/>
+    </w:rPr>
+  </w:style>
+  <w:style w:customStyle="1" w:styleId="ErrorTok" w:type="character">
+    <w:name w:val="ErrorTok"/>
+    <w:basedOn w:val="VerbatimChar"/>
+    <w:rPr>
+      <w:color w:val="ff0000"/>
+      <w:b/>
+    </w:rPr>
+  </w:style>
+  <w:style w:customStyle="1" w:styleId="NormalTok" w:type="character">
+    <w:name w:val="NormalTok"/>
+    <w:basedOn w:val="VerbatimChar"/>
+    <w:rPr/>
+  </w:style>
+  <w:style w:type="character" w:customStyle="1" w:styleId="KeywordTok">
+    <w:name w:val="KeywordTok"/>
+    <w:basedOn w:val="VerbatimChar"/>
+    <w:rPr>
+      <w:b/>
+      <w:color w:val="007020"/>
+    </w:rPr>
+  </w:style>
+  <w:style w:type="character" w:customStyle="1" w:styleId="DataTypeTok">
+    <w:name w:val="DataTypeTok"/>
+    <w:basedOn w:val="VerbatimChar"/>
+    <w:rPr>
+      <w:color w:val="902000"/>
+    </w:rPr>
+  </w:style>
+  <w:style w:type="character" w:customStyle="1" w:styleId="DecValTok">
+    <w:name w:val="DecValTok"/>
+    <w:basedOn w:val="VerbatimChar"/>
+    <w:rPr>
+      <w:color w:val="40a070"/>
+    </w:rPr>
+  </w:style>
+  <w:style w:type="character" w:customStyle="1" w:styleId="BaseNTok">
+    <w:name w:val="BaseNTok"/>
+    <w:basedOn w:val="VerbatimChar"/>
+    <w:rPr>
+      <w:color w:val="40a070"/>
+    </w:rPr>
+  </w:style>
+  <w:style w:type="character" w:customStyle="1" w:styleId="FloatTok">
+    <w:name w:val="FloatTok"/>
+    <w:basedOn w:val="VerbatimChar"/>
+    <w:rPr>
+      <w:color w:val="40a070"/>
+    </w:rPr>
+  </w:style>
+  <w:style w:type="character" w:customStyle="1" w:styleId="ConstantTok">
+    <w:name w:val="ConstantTok"/>
+    <w:basedOn w:val="VerbatimChar"/>
+    <w:rPr>
+      <w:color w:val="880000"/>
+    </w:rPr>
+  </w:style>
+  <w:style w:type="character" w:customStyle="1" w:styleId="CharTok">
+    <w:name w:val="CharTok"/>
+    <w:basedOn w:val="VerbatimChar"/>
+    <w:rPr>
+      <w:color w:val="4070a0"/>
+    </w:rPr>
+  </w:style>
+  <w:style w:type="character" w:customStyle="1" w:styleId="SpecialCharTok">
+    <w:name w:val="SpecialCharTok"/>
+    <w:basedOn w:val="VerbatimChar"/>
+    <w:rPr>
+      <w:color w:val="4070a0"/>
+    </w:rPr>
+  </w:style>
+  <w:style w:type="character" w:customStyle="1" w:styleId="StringTok">
+    <w:name w:val="StringTok"/>
+    <w:basedOn w:val="VerbatimChar"/>
+    <w:rPr>
+      <w:color w:val="4070a0"/>
+    </w:rPr>
+  </w:style>
+  <w:style w:type="character" w:customStyle="1" w:styleId="VerbatimStringTok">
+    <w:name w:val="VerbatimStringTok"/>
+    <w:basedOn w:val="VerbatimChar"/>
+    <w:rPr>
+      <w:color w:val="4070a0"/>
+    </w:rPr>
+  </w:style>
+  <w:style w:type="character" w:customStyle="1" w:styleId="SpecialStringTok">
+    <w:name w:val="SpecialStringTok"/>
+    <w:basedOn w:val="VerbatimChar"/>
+    <w:rPr>
+      <w:color w:val="bb6688"/>
+    </w:rPr>
+  </w:style>
+  <w:style w:type="character" w:customStyle="1" w:styleId="ImportTok">
+    <w:name w:val="ImportTok"/>
+    <w:basedOn w:val="VerbatimChar"/>
+    <w:rPr>
+      <w:b/>
+      <w:color w:val="008000"/>
+    </w:rPr>
+  </w:style>
+  <w:style w:type="character" w:customStyle="1" w:styleId="CommentTok">
+    <w:name w:val="CommentTok"/>
+    <w:basedOn w:val="VerbatimChar"/>
+    <w:rPr>
+      <w:i/>
+      <w:color w:val="60a0b0"/>
+    </w:rPr>
+  </w:style>
+  <w:style w:type="character" w:customStyle="1" w:styleId="DocumentationTok">
+    <w:name w:val="DocumentationTok"/>
+    <w:basedOn w:val="VerbatimChar"/>
+    <w:rPr>
+      <w:i/>
+      <w:color w:val="ba2121"/>
+    </w:rPr>
+  </w:style>
+  <w:style w:type="character" w:customStyle="1" w:styleId="AnnotationTok">
+    <w:name w:val="AnnotationTok"/>
+    <w:basedOn w:val="VerbatimChar"/>
+    <w:rPr>
+      <w:b/>
+      <w:i/>
+      <w:color w:val="60a0b0"/>
+    </w:rPr>
+  </w:style>
+  <w:style w:type="character" w:customStyle="1" w:styleId="CommentVarTok">
+    <w:name w:val="CommentVarTok"/>
+    <w:basedOn w:val="VerbatimChar"/>
+    <w:rPr>
+      <w:b/>
+      <w:i/>
+      <w:color w:val="60a0b0"/>
+    </w:rPr>
+  </w:style>
+  <w:style w:type="character" w:customStyle="1" w:styleId="OtherTok">
+    <w:name w:val="OtherTok"/>
+    <w:basedOn w:val="VerbatimChar"/>
+    <w:rPr>
+      <w:color w:val="007020"/>
+    </w:rPr>
+  </w:style>
+  <w:style w:type="character" w:customStyle="1" w:styleId="FunctionTok">
+    <w:name w:val="FunctionTok"/>
+    <w:basedOn w:val="VerbatimChar"/>
+    <w:rPr>
+      <w:color w:val="06287e"/>
+    </w:rPr>
+  </w:style>
+  <w:style w:type="character" w:customStyle="1" w:styleId="VariableTok">
+    <w:name w:val="VariableTok"/>
+    <w:basedOn w:val="VerbatimChar"/>
+    <w:rPr>
+      <w:color w:val="19177c"/>
+    </w:rPr>
+  </w:style>
+  <w:style w:type="character" w:customStyle="1" w:styleId="ControlFlowTok">
+    <w:name w:val="ControlFlowTok"/>
+    <w:basedOn w:val="VerbatimChar"/>
+    <w:rPr>
+      <w:b/>
+      <w:color w:val="007020"/>
+    </w:rPr>
+  </w:style>
+  <w:style w:type="character" w:customStyle="1" w:styleId="OperatorTok">
+    <w:name w:val="OperatorTok"/>
+    <w:basedOn w:val="VerbatimChar"/>
+    <w:rPr>
+      <w:color w:val="666666"/>
+    </w:rPr>
+  </w:style>
+  <w:style w:type="character" w:customStyle="1" w:styleId="BuiltInTok">
+    <w:name w:val="BuiltInTok"/>
+    <w:basedOn w:val="VerbatimChar"/>
+    <w:rPr>
+      <w:color w:val="008000"/>
+    </w:rPr>
+  </w:style>
+  <w:style w:type="character" w:customStyle="1" w:styleId="ExtensionTok">
+    <w:name w:val="ExtensionTok"/>
+    <w:basedOn w:val="VerbatimChar"/>
+    <w:rPr/>
+  </w:style>
+  <w:style w:type="character" w:customStyle="1" w:styleId="PreprocessorTok">
+    <w:name w:val="PreprocessorTok"/>
+    <w:basedOn w:val="VerbatimChar"/>
+    <w:rPr>
+      <w:color w:val="bc7a00"/>
+    </w:rPr>
+  </w:style>
+  <w:style w:type="character" w:customStyle="1" w:styleId="AttributeTok">
+    <w:name w:val="AttributeTok"/>
+    <w:basedOn w:val="VerbatimChar"/>
+    <w:rPr>
+      <w:color w:val="7d9029"/>
+    </w:rPr>
+  </w:style>
+  <w:style w:type="character" w:customStyle="1" w:styleId="RegionMarkerTok">
+    <w:name w:val="RegionMarkerTok"/>
+    <w:basedOn w:val="VerbatimChar"/>
+    <w:rPr/>
+  </w:style>
+  <w:style w:type="character" w:customStyle="1" w:styleId="InformationTok">
+    <w:name w:val="InformationTok"/>
+    <w:basedOn w:val="VerbatimChar"/>
+    <w:rPr>
+      <w:b/>
+      <w:i/>
+      <w:color w:val="60a0b0"/>
+    </w:rPr>
+  </w:style>
+  <w:style w:type="character" w:customStyle="1" w:styleId="WarningTok">
+    <w:name w:val="WarningTok"/>
+    <w:basedOn w:val="VerbatimChar"/>
+    <w:rPr>
+      <w:b/>
+      <w:i/>
+      <w:color w:val="60a0b0"/>
+    </w:rPr>
+  </w:style>
   <w:style w:type="character" w:customStyle="1" w:styleId="AlertTok">
     <w:name w:val="AlertTok"/>
     <w:basedOn w:val="VerbatimChar"/>
     <w:rPr>
+      <w:b/>
       <w:color w:val="ff0000"/>
-      <w:b/>
     </w:rPr>
   </w:style>
   <w:style w:type="character" w:customStyle="1" w:styleId="ErrorTok">
     <w:name w:val="ErrorTok"/>
     <w:basedOn w:val="VerbatimChar"/>
     <w:rPr>
+      <w:b/>
       <w:color w:val="ff0000"/>
-      <w:b/>
     </w:rPr>
   </w:style>
   <w:style w:type="character" w:customStyle="1" w:styleId="NormalTok">

</xml_diff>

<commit_message>
fix(storage): protect startup restoration and align report views
</commit_message>
<xml_diff>
--- a/docs/staff/Program_Instruction_Manual.docx
+++ b/docs/staff/Program_Instruction_Manual.docx
@@ -63,6 +63,59 @@
     <w:p>
       <w:pPr>
         <w:pStyle w:val="FirstParagraph"/>
+      </w:pPr>
+      <w:r>
+        <w:t xml:space="preserve">When Writer opens, wait for</w:t>
+      </w:r>
+      <w:r>
+        <w:t xml:space="preserve"> </w:t>
+      </w:r>
+      <w:r>
+        <w:rPr>
+          <w:b/>
+          <w:bCs/>
+        </w:rPr>
+        <w:t xml:space="preserve">Restoring saved workspace</w:t>
+      </w:r>
+      <w:r>
+        <w:t xml:space="preserve"> </w:t>
+      </w:r>
+      <w:r>
+        <w:t xml:space="preserve">to finish. If</w:t>
+      </w:r>
+      <w:r>
+        <w:t xml:space="preserve"> </w:t>
+      </w:r>
+      <w:r>
+        <w:rPr>
+          <w:b/>
+          <w:bCs/>
+        </w:rPr>
+        <w:t xml:space="preserve">Saved workspace could not be restored</w:t>
+      </w:r>
+      <w:r>
+        <w:t xml:space="preserve"> </w:t>
+      </w:r>
+      <w:r>
+        <w:t xml:space="preserve">appears, editing is paused to protect saved work. Choose</w:t>
+      </w:r>
+      <w:r>
+        <w:t xml:space="preserve"> </w:t>
+      </w:r>
+      <w:r>
+        <w:rPr>
+          <w:b/>
+          <w:bCs/>
+        </w:rPr>
+        <w:t xml:space="preserve">Reload and retry</w:t>
+      </w:r>
+      <w:r>
+        <w:t xml:space="preserve">; if the problem continues, ask IT to check this browser profile and preserve its saved work. Do not clear browser site data to bypass the message.</w:t>
+      </w:r>
+    </w:p>
+    <w:p>
+      <w:pPr>
+        <w:pStyle w:val="BodyText"/>
       </w:pPr>
       <w:r>
         <w:t xml:space="preserve">Document Writer prepares Official Notices, Extensions, Citations, Referrals for Prosecution, Compliance Letters, Summary Abatement Orders, Non-Summary Abatement Orders, No Occupancy documents, Best Interest Extensions and Vacancy Extensions. It retains linked corrections, physical inspection history, private drafts, original PDF receipts and reporting summaries. Referral updates and occupancy releases are modes within their families.</w:t>
@@ -5886,7 +5939,7 @@
         <w:pStyle w:val="BodyText"/>
       </w:pPr>
       <w:r>
-        <w:t xml:space="preserve">Manual source digest a68d5531bfc7ce72.</w:t>
+        <w:t xml:space="preserve">Manual source digest 81146faea163e0ea.</w:t>
       </w:r>
     </w:p>
     <w:bookmarkEnd w:id="41"/>
@@ -22479,6 +22532,232 @@
     <w:rPr>
       <w:color w:val="ff0000"/>
       <w:b/>
+    </w:rPr>
+  </w:style>
+  <w:style w:customStyle="1" w:styleId="NormalTok" w:type="character">
+    <w:name w:val="NormalTok"/>
+    <w:basedOn w:val="VerbatimChar"/>
+    <w:rPr/>
+  </w:style>
+  <w:style w:customStyle="1" w:styleId="KeywordTok" w:type="character">
+    <w:name w:val="KeywordTok"/>
+    <w:basedOn w:val="VerbatimChar"/>
+    <w:rPr>
+      <w:b/>
+      <w:color w:val="007020"/>
+    </w:rPr>
+  </w:style>
+  <w:style w:customStyle="1" w:styleId="DataTypeTok" w:type="character">
+    <w:name w:val="DataTypeTok"/>
+    <w:basedOn w:val="VerbatimChar"/>
+    <w:rPr>
+      <w:color w:val="902000"/>
+    </w:rPr>
+  </w:style>
+  <w:style w:customStyle="1" w:styleId="DecValTok" w:type="character">
+    <w:name w:val="DecValTok"/>
+    <w:basedOn w:val="VerbatimChar"/>
+    <w:rPr>
+      <w:color w:val="40a070"/>
+    </w:rPr>
+  </w:style>
+  <w:style w:customStyle="1" w:styleId="BaseNTok" w:type="character">
+    <w:name w:val="BaseNTok"/>
+    <w:basedOn w:val="VerbatimChar"/>
+    <w:rPr>
+      <w:color w:val="40a070"/>
+    </w:rPr>
+  </w:style>
+  <w:style w:customStyle="1" w:styleId="FloatTok" w:type="character">
+    <w:name w:val="FloatTok"/>
+    <w:basedOn w:val="VerbatimChar"/>
+    <w:rPr>
+      <w:color w:val="40a070"/>
+    </w:rPr>
+  </w:style>
+  <w:style w:customStyle="1" w:styleId="ConstantTok" w:type="character">
+    <w:name w:val="ConstantTok"/>
+    <w:basedOn w:val="VerbatimChar"/>
+    <w:rPr>
+      <w:color w:val="880000"/>
+    </w:rPr>
+  </w:style>
+  <w:style w:customStyle="1" w:styleId="CharTok" w:type="character">
+    <w:name w:val="CharTok"/>
+    <w:basedOn w:val="VerbatimChar"/>
+    <w:rPr>
+      <w:color w:val="4070a0"/>
+    </w:rPr>
+  </w:style>
+  <w:style w:customStyle="1" w:styleId="SpecialCharTok" w:type="character">
+    <w:name w:val="SpecialCharTok"/>
+    <w:basedOn w:val="VerbatimChar"/>
+    <w:rPr>
+      <w:color w:val="4070a0"/>
+    </w:rPr>
+  </w:style>
+  <w:style w:customStyle="1" w:styleId="StringTok" w:type="character">
+    <w:name w:val="StringTok"/>
+    <w:basedOn w:val="VerbatimChar"/>
+    <w:rPr>
+      <w:color w:val="4070a0"/>
+    </w:rPr>
+  </w:style>
+  <w:style w:customStyle="1" w:styleId="VerbatimStringTok" w:type="character">
+    <w:name w:val="VerbatimStringTok"/>
+    <w:basedOn w:val="VerbatimChar"/>
+    <w:rPr>
+      <w:color w:val="4070a0"/>
+    </w:rPr>
+  </w:style>
+  <w:style w:customStyle="1" w:styleId="SpecialStringTok" w:type="character">
+    <w:name w:val="SpecialStringTok"/>
+    <w:basedOn w:val="VerbatimChar"/>
+    <w:rPr>
+      <w:color w:val="bb6688"/>
+    </w:rPr>
+  </w:style>
+  <w:style w:customStyle="1" w:styleId="ImportTok" w:type="character">
+    <w:name w:val="ImportTok"/>
+    <w:basedOn w:val="VerbatimChar"/>
+    <w:rPr>
+      <w:b/>
+      <w:color w:val="008000"/>
+    </w:rPr>
+  </w:style>
+  <w:style w:customStyle="1" w:styleId="CommentTok" w:type="character">
+    <w:name w:val="CommentTok"/>
+    <w:basedOn w:val="VerbatimChar"/>
+    <w:rPr>
+      <w:i/>
+      <w:color w:val="60a0b0"/>
+    </w:rPr>
+  </w:style>
+  <w:style w:customStyle="1" w:styleId="DocumentationTok" w:type="character">
+    <w:name w:val="DocumentationTok"/>
+    <w:basedOn w:val="VerbatimChar"/>
+    <w:rPr>
+      <w:i/>
+      <w:color w:val="ba2121"/>
+    </w:rPr>
+  </w:style>
+  <w:style w:customStyle="1" w:styleId="AnnotationTok" w:type="character">
+    <w:name w:val="AnnotationTok"/>
+    <w:basedOn w:val="VerbatimChar"/>
+    <w:rPr>
+      <w:b/>
+      <w:i/>
+      <w:color w:val="60a0b0"/>
+    </w:rPr>
+  </w:style>
+  <w:style w:customStyle="1" w:styleId="CommentVarTok" w:type="character">
+    <w:name w:val="CommentVarTok"/>
+    <w:basedOn w:val="VerbatimChar"/>
+    <w:rPr>
+      <w:b/>
+      <w:i/>
+      <w:color w:val="60a0b0"/>
+    </w:rPr>
+  </w:style>
+  <w:style w:customStyle="1" w:styleId="OtherTok" w:type="character">
+    <w:name w:val="OtherTok"/>
+    <w:basedOn w:val="VerbatimChar"/>
+    <w:rPr>
+      <w:color w:val="007020"/>
+    </w:rPr>
+  </w:style>
+  <w:style w:customStyle="1" w:styleId="FunctionTok" w:type="character">
+    <w:name w:val="FunctionTok"/>
+    <w:basedOn w:val="VerbatimChar"/>
+    <w:rPr>
+      <w:color w:val="06287e"/>
+    </w:rPr>
+  </w:style>
+  <w:style w:customStyle="1" w:styleId="VariableTok" w:type="character">
+    <w:name w:val="VariableTok"/>
+    <w:basedOn w:val="VerbatimChar"/>
+    <w:rPr>
+      <w:color w:val="19177c"/>
+    </w:rPr>
+  </w:style>
+  <w:style w:customStyle="1" w:styleId="ControlFlowTok" w:type="character">
+    <w:name w:val="ControlFlowTok"/>
+    <w:basedOn w:val="VerbatimChar"/>
+    <w:rPr>
+      <w:b/>
+      <w:color w:val="007020"/>
+    </w:rPr>
+  </w:style>
+  <w:style w:customStyle="1" w:styleId="OperatorTok" w:type="character">
+    <w:name w:val="OperatorTok"/>
+    <w:basedOn w:val="VerbatimChar"/>
+    <w:rPr>
+      <w:color w:val="666666"/>
+    </w:rPr>
+  </w:style>
+  <w:style w:customStyle="1" w:styleId="BuiltInTok" w:type="character">
+    <w:name w:val="BuiltInTok"/>
+    <w:basedOn w:val="VerbatimChar"/>
+    <w:rPr>
+      <w:color w:val="008000"/>
+    </w:rPr>
+  </w:style>
+  <w:style w:customStyle="1" w:styleId="ExtensionTok" w:type="character">
+    <w:name w:val="ExtensionTok"/>
+    <w:basedOn w:val="VerbatimChar"/>
+    <w:rPr/>
+  </w:style>
+  <w:style w:customStyle="1" w:styleId="PreprocessorTok" w:type="character">
+    <w:name w:val="PreprocessorTok"/>
+    <w:basedOn w:val="VerbatimChar"/>
+    <w:rPr>
+      <w:color w:val="bc7a00"/>
+    </w:rPr>
+  </w:style>
+  <w:style w:customStyle="1" w:styleId="AttributeTok" w:type="character">
+    <w:name w:val="AttributeTok"/>
+    <w:basedOn w:val="VerbatimChar"/>
+    <w:rPr>
+      <w:color w:val="7d9029"/>
+    </w:rPr>
+  </w:style>
+  <w:style w:customStyle="1" w:styleId="RegionMarkerTok" w:type="character">
+    <w:name w:val="RegionMarkerTok"/>
+    <w:basedOn w:val="VerbatimChar"/>
+    <w:rPr/>
+  </w:style>
+  <w:style w:customStyle="1" w:styleId="InformationTok" w:type="character">
+    <w:name w:val="InformationTok"/>
+    <w:basedOn w:val="VerbatimChar"/>
+    <w:rPr>
+      <w:b/>
+      <w:i/>
+      <w:color w:val="60a0b0"/>
+    </w:rPr>
+  </w:style>
+  <w:style w:customStyle="1" w:styleId="WarningTok" w:type="character">
+    <w:name w:val="WarningTok"/>
+    <w:basedOn w:val="VerbatimChar"/>
+    <w:rPr>
+      <w:b/>
+      <w:i/>
+      <w:color w:val="60a0b0"/>
+    </w:rPr>
+  </w:style>
+  <w:style w:customStyle="1" w:styleId="AlertTok" w:type="character">
+    <w:name w:val="AlertTok"/>
+    <w:basedOn w:val="VerbatimChar"/>
+    <w:rPr>
+      <w:b/>
+      <w:color w:val="ff0000"/>
+    </w:rPr>
+  </w:style>
+  <w:style w:customStyle="1" w:styleId="ErrorTok" w:type="character">
+    <w:name w:val="ErrorTok"/>
+    <w:basedOn w:val="VerbatimChar"/>
+    <w:rPr>
+      <w:b/>
+      <w:color w:val="ff0000"/>
     </w:rPr>
   </w:style>
   <w:style w:customStyle="1" w:styleId="NormalTok" w:type="character">

</xml_diff>

<commit_message>
release: assign 2026-10-24 R63 (helper 2026.10.24.64, build 64)
First release package since R61. The R62 label (build 63) was a
development identity and was never packaged. Authoring 16, case schema 5,
summary 6 and backup 2 are unchanged.

- version.json, package.json and package-lock.json (tools/sync_version.py)
- manual identity lines; all editions regenerated (tools/build_manual.py)
- developer first-line release tokens; R63-REVIEW.md
- CHANGELOG: R63 release heading over the merged development entries
- ACCEPTANCE-RECORD S63-1, S63-2 (OPEN); PRODUCTION-READINESS note
- DEVELOPMENT-STANDARD records the assignment and the R61 baseline

Co-Authored-By: Claude Opus 5.5 <noreply@anthropic.com>
Claude-Session: https://claude.ai/code/session_01WPJAZGfD47jPUEgCNYYSg7
</commit_message>
<xml_diff>
--- a/docs/staff/Program_Instruction_Manual.docx
+++ b/docs/staff/Program_Instruction_Manual.docx
@@ -32,7 +32,7 @@
         <w:pStyle w:val="BodyText"/>
       </w:pPr>
       <w:r>
-        <w:t xml:space="preserve">Release 2026-10-23 R62 · Helper 2026.10.23.63 · 23 October 2026</w:t>
+        <w:t xml:space="preserve">Release 2026-10-24 R63 · Helper 2026.10.24.64 · 24 October 2026</w:t>
       </w:r>
     </w:p>
     <w:p>
@@ -48,7 +48,7 @@
         <w:pStyle w:val="BodyText"/>
       </w:pPr>
       <w:r>
-        <w:t xml:space="preserve">R62 is a development candidate for City acceptance. Its security checks require the same ordinary document, history and recovery procedures described below. Automated verification does not replace the outstanding City Windows and network tests, staff and assistive technology acceptance, or legal and seasonal policy decisions listed in the carried-forward City acceptance record. New mandatory-appearance citations remain blocked until approved defendant instructions are supplied and integrated. Historical frozen reprints remain available. No live deployment is included in this release.</w:t>
+        <w:t xml:space="preserve">R63 is a release candidate for City acceptance. Its security checks require the same ordinary document, history and recovery procedures described below. Automated verification does not replace the outstanding City Windows and network tests, staff and assistive technology acceptance, or legal and seasonal policy decisions listed in the carried-forward City acceptance record. New mandatory-appearance citations remain blocked until approved defendant instructions are supplied and integrated. Historical frozen reprints remain available. No live deployment is included in this release.</w:t>
       </w:r>
     </w:p>
     <w:bookmarkStart w:id="20" w:name="start-here-and-daily-routine"/>
@@ -72,8 +72,8 @@
       </w:r>
       <w:r>
         <w:rPr>
+          <w:bCs/>
           <w:b/>
-          <w:bCs/>
         </w:rPr>
         <w:t xml:space="preserve">Restoring saved workspace</w:t>
       </w:r>
@@ -88,8 +88,8 @@
       </w:r>
       <w:r>
         <w:rPr>
+          <w:bCs/>
           <w:b/>
-          <w:bCs/>
         </w:rPr>
         <w:t xml:space="preserve">Saved workspace could not be restored</w:t>
       </w:r>
@@ -104,8 +104,8 @@
       </w:r>
       <w:r>
         <w:rPr>
+          <w:bCs/>
           <w:b/>
-          <w:bCs/>
         </w:rPr>
         <w:t xml:space="preserve">Reload and retry</w:t>
       </w:r>
@@ -127,8 +127,8 @@
       </w:pPr>
       <w:r>
         <w:rPr>
+          <w:bCs/>
           <w:b/>
-          <w:bCs/>
         </w:rPr>
         <w:t xml:space="preserve">Before using operational cases.</w:t>
       </w:r>
@@ -145,8 +145,8 @@
       </w:pPr>
       <w:r>
         <w:rPr>
+          <w:bCs/>
           <w:b/>
-          <w:bCs/>
         </w:rPr>
         <w:t xml:space="preserve">Start a working day.</w:t>
       </w:r>
@@ -154,7 +154,7 @@
         <w:t xml:space="preserve"> </w:t>
       </w:r>
       <w:r>
-        <w:t xml:space="preserve">Double-click the Document Writer icon on the desktop. It starts the program without a command window and opens Writer in its own Chrome or Edge window; if Document Writer is already running, the icon opens Writer again. Keep one Writer window open in the same browser profile. Confirm Build 2026-10-23 R62 and helper 2026.10.23.63. Open Workspace and resolve any save confirmation, shared-history or PDF-filing exceptions before creating replacement work. Check pending deadlines and reminders.</w:t>
+        <w:t xml:space="preserve">Double-click the Document Writer icon on the desktop. It starts the program without a command window and opens Writer in its own Chrome or Edge window; if Document Writer is already running, the icon opens Writer again. Keep one Writer window open in the same browser profile. Confirm Build 2026-10-24 R63 and helper 2026.10.24.64. Open Workspace and resolve any save confirmation, shared-history or PDF-filing exceptions before creating replacement work. Check pending deadlines and reminders.</w:t>
       </w:r>
     </w:p>
     <w:p>
@@ -163,8 +163,8 @@
       </w:pPr>
       <w:r>
         <w:rPr>
+          <w:bCs/>
           <w:b/>
-          <w:bCs/>
         </w:rPr>
         <w:t xml:space="preserve">Prepare work.</w:t>
       </w:r>
@@ -181,8 +181,8 @@
       </w:pPr>
       <w:r>
         <w:rPr>
+          <w:bCs/>
           <w:b/>
-          <w:bCs/>
         </w:rPr>
         <w:t xml:space="preserve">Finish an action.</w:t>
       </w:r>
@@ -199,8 +199,8 @@
       </w:pPr>
       <w:r>
         <w:rPr>
+          <w:bCs/>
           <w:b/>
-          <w:bCs/>
         </w:rPr>
         <w:t xml:space="preserve">End a working day.</w:t>
       </w:r>
@@ -217,8 +217,8 @@
       </w:pPr>
       <w:r>
         <w:rPr>
+          <w:bCs/>
           <w:b/>
-          <w:bCs/>
         </w:rPr>
         <w:t xml:space="preserve">Stop Document Writer.</w:t>
       </w:r>
@@ -243,8 +243,8 @@
       </w:pPr>
       <w:r>
         <w:rPr>
+          <w:bCs/>
           <w:b/>
-          <w:bCs/>
         </w:rPr>
         <w:t xml:space="preserve">Warnings and errors.</w:t>
       </w:r>
@@ -271,8 +271,8 @@
       </w:pPr>
       <w:r>
         <w:rPr>
+          <w:bCs/>
           <w:b/>
-          <w:bCs/>
         </w:rPr>
         <w:t xml:space="preserve">Administrator procedure.</w:t>
       </w:r>
@@ -285,11 +285,11 @@
     </w:p>
     <w:p>
       <w:pPr>
-        <w:pStyle w:val="Compact"/>
         <w:numPr>
           <w:ilvl w:val="0"/>
           <w:numId w:val="1001"/>
         </w:numPr>
+        <w:pStyle w:val="Compact"/>
       </w:pPr>
       <w:r>
         <w:t xml:space="preserve">Back up the existing program, case folder, PDF folder, GIS folder, configuration and integrity evidence. Ask every user to save and sync work, then stop the program with Exit Document Writer in Tools &amp; settings. An older version without Exit Document Writer in Tools &amp; settings stops another way: close its command window if it was started with Start Document Writer.bat, otherwise sign out of Windows and back in.</w:t>
@@ -297,11 +297,11 @@
     </w:p>
     <w:p>
       <w:pPr>
-        <w:pStyle w:val="Compact"/>
         <w:numPr>
           <w:ilvl w:val="0"/>
           <w:numId w:val="1001"/>
         </w:numPr>
+        <w:pStyle w:val="Compact"/>
       </w:pPr>
       <w:r>
         <w:t xml:space="preserve">Before extraction, compare the package SHA-256 with the digest obtained independently from the release owner. Use Get-FileHash -Algorithm SHA256 in PowerShell. Keep verified prior packages separately for deliberate IT rollback and test acceptance in isolation.</w:t>
@@ -309,11 +309,11 @@
     </w:p>
     <w:p>
       <w:pPr>
-        <w:pStyle w:val="Compact"/>
         <w:numPr>
           <w:ilvl w:val="0"/>
           <w:numId w:val="1001"/>
         </w:numPr>
+        <w:pStyle w:val="Compact"/>
       </w:pPr>
       <w:r>
         <w:t xml:space="preserve">Place all deploy files and the vendor folder in a division-owned program folder. Preserve operational folders and settings. Grant inspectors read-only program access and grant write access to the release owner only; grant case, PDF and GIS write access as required. Keep these permissions distinct. Restrict administration and independent anchor permissions through IT.</w:t>
@@ -321,11 +321,11 @@
     </w:p>
     <w:p>
       <w:pPr>
-        <w:pStyle w:val="Compact"/>
         <w:numPr>
           <w:ilvl w:val="0"/>
           <w:numId w:val="1001"/>
         </w:numPr>
+        <w:pStyle w:val="Compact"/>
       </w:pPr>
       <w:r>
         <w:t xml:space="preserve">Have IT check the deploy ZIP’s SHA-256 against the value the release owner publishes separately, then run Start Document Writer.bat (the diagnostic launcher) once on each PC from that checked deployment. It installs the local runtime and creates or updates the Document Writer desktop icon; an existing Document Writer shortcut is changed to start without a command window.</w:t>
@@ -333,11 +333,11 @@
     </w:p>
     <w:p>
       <w:pPr>
-        <w:pStyle w:val="Compact"/>
         <w:numPr>
           <w:ilvl w:val="0"/>
           <w:numId w:val="1001"/>
         </w:numPr>
+        <w:pStyle w:val="Compact"/>
       </w:pPr>
       <w:r>
         <w:t xml:space="preserve">Confirm the build and helper versions shown in the install guide. If a message says an older version is still running, stop it as the message explains (Exit Document Writer when it offers one; otherwise close its command window or sign out of Windows), then double-click the Document Writer icon again.</w:t>
@@ -345,11 +345,11 @@
     </w:p>
     <w:p>
       <w:pPr>
-        <w:pStyle w:val="Compact"/>
         <w:numPr>
           <w:ilvl w:val="0"/>
           <w:numId w:val="1001"/>
         </w:numPr>
+        <w:pStyle w:val="Compact"/>
       </w:pPr>
       <w:r>
         <w:t xml:space="preserve">Open Tools &amp; settings → Saved work &amp; connection. Expand Connection checks and technical details, then open connection checks and Storage diagnostics. Confirm the intended shared paths, helper health and permissions. Use Rebuild reporting index in Storage diagnostics when an administrator has confirmed a rebuild is appropriate.</w:t>
@@ -357,11 +357,11 @@
     </w:p>
     <w:p>
       <w:pPr>
-        <w:pStyle w:val="Compact"/>
         <w:numPr>
           <w:ilvl w:val="0"/>
           <w:numId w:val="1001"/>
         </w:numPr>
+        <w:pStyle w:val="Compact"/>
       </w:pPr>
       <w:r>
         <w:t xml:space="preserve">Open Reports → Data and definitions. Review coverage and excluded records. Test an approved synthetic case through save, exact PDF retrieval and recovery before operational use.</w:t>
@@ -373,8 +373,8 @@
       </w:pPr>
       <w:r>
         <w:rPr>
+          <w:bCs/>
           <w:b/>
-          <w:bCs/>
         </w:rPr>
         <w:t xml:space="preserve">Compatibility.</w:t>
       </w:r>
@@ -391,8 +391,8 @@
       </w:pPr>
       <w:r>
         <w:rPr>
+          <w:bCs/>
           <w:b/>
-          <w:bCs/>
         </w:rPr>
         <w:t xml:space="preserve">Checked updates.</w:t>
       </w:r>
@@ -409,8 +409,8 @@
       </w:pPr>
       <w:r>
         <w:rPr>
+          <w:bCs/>
           <w:b/>
-          <w:bCs/>
         </w:rPr>
         <w:t xml:space="preserve">Browser session.</w:t>
       </w:r>
@@ -427,8 +427,8 @@
       </w:pPr>
       <w:r>
         <w:rPr>
+          <w:bCs/>
           <w:b/>
-          <w:bCs/>
         </w:rPr>
         <w:t xml:space="preserve">After a helper restart.</w:t>
       </w:r>
@@ -445,8 +445,8 @@
       </w:pPr>
       <w:r>
         <w:rPr>
+          <w:bCs/>
           <w:b/>
-          <w:bCs/>
         </w:rPr>
         <w:t xml:space="preserve">Deliberate rollback.</w:t>
       </w:r>
@@ -489,8 +489,8 @@
       </w:pPr>
       <w:r>
         <w:rPr>
+          <w:bCs/>
           <w:b/>
-          <w:bCs/>
         </w:rPr>
         <w:t xml:space="preserve">Find and continue a case.</w:t>
       </w:r>
@@ -533,8 +533,8 @@
       </w:pPr>
       <w:r>
         <w:rPr>
+          <w:bCs/>
           <w:b/>
-          <w:bCs/>
         </w:rPr>
         <w:t xml:space="preserve">Understand the record.</w:t>
       </w:r>
@@ -559,8 +559,8 @@
       </w:pPr>
       <w:r>
         <w:rPr>
+          <w:bCs/>
           <w:b/>
-          <w:bCs/>
         </w:rPr>
         <w:t xml:space="preserve">Resolve attention states.</w:t>
       </w:r>
@@ -595,8 +595,8 @@
       </w:pPr>
       <w:r>
         <w:rPr>
+          <w:bCs/>
           <w:b/>
-          <w:bCs/>
         </w:rPr>
         <w:t xml:space="preserve">Direct lookup.</w:t>
       </w:r>
@@ -627,8 +627,8 @@
       </w:r>
       <w:r>
         <w:rPr>
+          <w:bCs/>
           <w:b/>
-          <w:bCs/>
         </w:rPr>
         <w:t xml:space="preserve">Inspection Type</w:t>
       </w:r>
@@ -643,8 +643,8 @@
       </w:r>
       <w:r>
         <w:rPr>
+          <w:bCs/>
           <w:b/>
-          <w:bCs/>
         </w:rPr>
         <w:t xml:space="preserve">Inspection Status</w:t>
       </w:r>
@@ -675,16 +675,16 @@
     </w:p>
     <w:p>
       <w:pPr>
-        <w:pStyle w:val="Compact"/>
         <w:numPr>
           <w:ilvl w:val="0"/>
           <w:numId w:val="1002"/>
         </w:numPr>
+        <w:pStyle w:val="Compact"/>
       </w:pPr>
       <w:r>
         <w:rPr>
+          <w:bCs/>
           <w:b/>
-          <w:bCs/>
         </w:rPr>
         <w:t xml:space="preserve">Initial Inspection</w:t>
       </w:r>
@@ -697,16 +697,16 @@
     </w:p>
     <w:p>
       <w:pPr>
-        <w:pStyle w:val="Compact"/>
         <w:numPr>
           <w:ilvl w:val="0"/>
           <w:numId w:val="1002"/>
         </w:numPr>
+        <w:pStyle w:val="Compact"/>
       </w:pPr>
       <w:r>
         <w:rPr>
+          <w:bCs/>
           <w:b/>
-          <w:bCs/>
         </w:rPr>
         <w:t xml:space="preserve">Reinspection</w:t>
       </w:r>
@@ -719,16 +719,16 @@
     </w:p>
     <w:p>
       <w:pPr>
-        <w:pStyle w:val="Compact"/>
         <w:numPr>
           <w:ilvl w:val="0"/>
           <w:numId w:val="1002"/>
         </w:numPr>
+        <w:pStyle w:val="Compact"/>
       </w:pPr>
       <w:r>
         <w:rPr>
+          <w:bCs/>
           <w:b/>
-          <w:bCs/>
         </w:rPr>
         <w:t xml:space="preserve">CA Reinspection</w:t>
       </w:r>
@@ -741,11 +741,11 @@
     </w:p>
     <w:p>
       <w:pPr>
-        <w:pStyle w:val="Compact"/>
         <w:numPr>
           <w:ilvl w:val="0"/>
           <w:numId w:val="1002"/>
         </w:numPr>
+        <w:pStyle w:val="Compact"/>
       </w:pPr>
       <w:r>
         <w:t xml:space="preserve">Any other combination cannot be imported: set the specific result in Accela and retrieve it again.</w:t>
@@ -753,11 +753,11 @@
     </w:p>
     <w:p>
       <w:pPr>
-        <w:pStyle w:val="Compact"/>
         <w:numPr>
           <w:ilvl w:val="0"/>
           <w:numId w:val="1002"/>
         </w:numPr>
+        <w:pStyle w:val="Compact"/>
       </w:pPr>
       <w:r>
         <w:t xml:space="preserve">On a case already referred to the City Attorney, only results that lead to an Update for Case Referral or a Compliance Letter can be imported.</w:t>
@@ -765,11 +765,11 @@
     </w:p>
     <w:p>
       <w:pPr>
-        <w:pStyle w:val="Compact"/>
         <w:numPr>
           <w:ilvl w:val="0"/>
           <w:numId w:val="1002"/>
         </w:numPr>
+        <w:pStyle w:val="Compact"/>
       </w:pPr>
       <w:r>
         <w:t xml:space="preserve">If recorded results contradict the status (for example Compliance with an item not Corrected), the document cannot be issued. Correct the results, or correct the status in Accela and import the same inspection again; the open draft or worksheet is updated without losing your work.</w:t>
@@ -781,8 +781,8 @@
       </w:pPr>
       <w:r>
         <w:rPr>
+          <w:bCs/>
           <w:b/>
-          <w:bCs/>
         </w:rPr>
         <w:t xml:space="preserve">Review an existing case.</w:t>
       </w:r>
@@ -799,8 +799,8 @@
       </w:pPr>
       <w:r>
         <w:rPr>
+          <w:bCs/>
           <w:b/>
-          <w:bCs/>
         </w:rPr>
         <w:t xml:space="preserve">Excel alternative.</w:t>
       </w:r>
@@ -825,8 +825,8 @@
       </w:pPr>
       <w:r>
         <w:rPr>
+          <w:bCs/>
           <w:b/>
-          <w:bCs/>
         </w:rPr>
         <w:t xml:space="preserve">Pause or retry.</w:t>
       </w:r>
@@ -865,11 +865,11 @@
     </w:p>
     <w:p>
       <w:pPr>
-        <w:pStyle w:val="Compact"/>
         <w:numPr>
           <w:ilvl w:val="0"/>
           <w:numId w:val="1003"/>
         </w:numPr>
+        <w:pStyle w:val="Compact"/>
       </w:pPr>
       <w:r>
         <w:t xml:space="preserve">Choose Violation Items at the top of the document. In the Select for this notice picker, find the appropriate selectable order language and select it once. A checkmark means it is already on this notice. Select it again to remove it from the unissued draft. The same library entry cannot be added twice.</w:t>
@@ -877,11 +877,11 @@
     </w:p>
     <w:p>
       <w:pPr>
-        <w:pStyle w:val="Compact"/>
         <w:numPr>
           <w:ilvl w:val="0"/>
           <w:numId w:val="1003"/>
         </w:numPr>
+        <w:pStyle w:val="Compact"/>
       </w:pPr>
       <w:r>
         <w:t xml:space="preserve">Choose Done adding. Review each item’s ordinance, corrective action, location and case-specific details. Outlined fill-in bubbles identify missing details. Click a bubble or focus it and press Enter, enter the factual detail, and review the sentence afterward.</w:t>
@@ -889,11 +889,11 @@
     </w:p>
     <w:p>
       <w:pPr>
-        <w:pStyle w:val="Compact"/>
         <w:numPr>
           <w:ilvl w:val="0"/>
           <w:numId w:val="1003"/>
         </w:numPr>
+        <w:pStyle w:val="Compact"/>
       </w:pPr>
       <w:r>
         <w:t xml:space="preserve">Tick the checkbox beside each due date that shares a deadline (Select item N for a shared due date). In Assign due dates below the document, which counts the selected items, enter the date and choose Apply date to selected items. Use Select all or Clear when appropriate. Repeat for other groups. New items begin without an automatic deadline.</w:t>
@@ -901,11 +901,11 @@
     </w:p>
     <w:p>
       <w:pPr>
-        <w:pStyle w:val="Compact"/>
         <w:numPr>
           <w:ilvl w:val="0"/>
           <w:numId w:val="1003"/>
         </w:numPr>
+        <w:pStyle w:val="Compact"/>
       </w:pPr>
       <w:r>
         <w:t xml:space="preserve">Keep no more than three distinct outstanding-item deadlines under the existing notice rules. A batch that would create a fourth is rejected without changing the items. An invalid individual edit may be saved as work in progress but blocks issuance.</w:t>
@@ -913,11 +913,11 @@
     </w:p>
     <w:p>
       <w:pPr>
-        <w:pStyle w:val="Compact"/>
         <w:numPr>
           <w:ilvl w:val="0"/>
           <w:numId w:val="1003"/>
         </w:numPr>
+        <w:pStyle w:val="Compact"/>
       </w:pPr>
       <w:r>
         <w:t xml:space="preserve">Review the whole document, not only the edited sentence. Check recipients (the Recipients button opens copies, email and registered agent; Done closes it once the entries are valid), contact details, the mailing date, the item order and all warnings. The readiness summary at the top counts required fixes and advisories; Go to first required field jumps to the affected field, and Review (or Open full checklist) opens the Review dialog: checks that must be fixed before issuing, then advisories, or a statement that there are no concerns. Each check links to its field; closing the dialog returns you to where you were.</w:t>
@@ -925,11 +925,11 @@
     </w:p>
     <w:p>
       <w:pPr>
-        <w:pStyle w:val="Compact"/>
         <w:numPr>
           <w:ilvl w:val="0"/>
           <w:numId w:val="1003"/>
         </w:numPr>
+        <w:pStyle w:val="Compact"/>
       </w:pPr>
       <w:r>
         <w:t xml:space="preserve">Choose Save draft &amp; return to Workspace to retain unfinished work, or Issue when ready. After a confirmed shared save, Writer returns to Workspace with the issued case highlighted; if the save is refused or not confirmed, the document stays open. Verify the resulting save state.</w:t>
@@ -941,8 +941,8 @@
       </w:pPr>
       <w:r>
         <w:rPr>
+          <w:bCs/>
           <w:b/>
-          <w:bCs/>
         </w:rPr>
         <w:t xml:space="preserve">Fill-in details.</w:t>
       </w:r>
@@ -967,8 +967,8 @@
       </w:pPr>
       <w:r>
         <w:rPr>
+          <w:bCs/>
           <w:b/>
-          <w:bCs/>
         </w:rPr>
         <w:t xml:space="preserve">Initial citations.</w:t>
       </w:r>
@@ -1053,9 +1053,8 @@
       <w:tblPr>
         <w:tblStyle w:val="Table"/>
         <w:tblW w:type="pct" w:w="5000"/>
-        <w:jc w:val="left"/>
-        <w:tblLayout w:type="fixed"/>
         <w:tblLook w:firstRow="1" w:lastRow="0" w:firstColumn="0" w:lastColumn="0" w:noHBand="0" w:noVBand="0" w:val="0020"/>
+        <w:jc w:val="start"/>
       </w:tblPr>
       <w:tblGrid>
         <w:gridCol w:w="3960"/>
@@ -1063,7 +1062,7 @@
       </w:tblGrid>
       <w:tr>
         <w:trPr>
-          <w:tblHeader w:val="on"/>
+          <w:tblHeader w:val="true"/>
         </w:trPr>
         <w:tc>
           <w:tcPr/>
@@ -1243,8 +1242,8 @@
       </w:pPr>
       <w:r>
         <w:rPr>
+          <w:bCs/>
           <w:b/>
-          <w:bCs/>
         </w:rPr>
         <w:t xml:space="preserve">Review catalog.</w:t>
       </w:r>
@@ -1299,11 +1298,11 @@
     </w:p>
     <w:p>
       <w:pPr>
-        <w:pStyle w:val="Compact"/>
         <w:numPr>
           <w:ilvl w:val="0"/>
           <w:numId w:val="1004"/>
         </w:numPr>
+        <w:pStyle w:val="Compact"/>
       </w:pPr>
       <w:r>
         <w:t xml:space="preserve">Select one actual charged ordinance for each item. An item with several listed sections shows a Charged ordinance select with exactly those sections and nothing chosen; choose the section actually charged (saved drafts show the select unchosen and cannot be issued until a section is chosen). The deposit fields then fill from the configured schedule for the pricing date; changing the choice clears the previous charge’s values and prices the new one. If no single schedule entry applies, a blocking concern explains it rather than guessing an amount. Charging a section that is not listed on the item is a different charge and needs an approved source. Multiple offenses under one ordinance require the appropriate offense selection.</w:t>
@@ -1311,11 +1310,11 @@
     </w:p>
     <w:p>
       <w:pPr>
-        <w:pStyle w:val="Compact"/>
         <w:numPr>
           <w:ilvl w:val="0"/>
           <w:numId w:val="1004"/>
         </w:numPr>
+        <w:pStyle w:val="Compact"/>
       </w:pPr>
       <w:r>
         <w:t xml:space="preserve">Verify the description, citation number, officer or department identifier, issue date, violation date and time, court date and session. Court suggestions are not reservations; use the division’s current court and numbering instructions.</w:t>
@@ -1323,11 +1322,11 @@
     </w:p>
     <w:p>
       <w:pPr>
-        <w:pStyle w:val="Compact"/>
         <w:numPr>
           <w:ilvl w:val="0"/>
           <w:numId w:val="1004"/>
         </w:numPr>
+        <w:pStyle w:val="Compact"/>
       </w:pPr>
       <w:r>
         <w:t xml:space="preserve">Complete any required measurements in that charge card. Conditional or unmapped entries require review; the program must not borrow an unrelated amount.</w:t>
@@ -1335,11 +1334,11 @@
     </w:p>
     <w:p>
       <w:pPr>
-        <w:pStyle w:val="Compact"/>
         <w:numPr>
           <w:ilvl w:val="0"/>
           <w:numId w:val="1004"/>
         </w:numPr>
+        <w:pStyle w:val="Compact"/>
       </w:pPr>
       <w:r>
         <w:t xml:space="preserve">Complete the deposit method and its source. Choose Complete charge after the required fields are valid. Other unfinished charge cards remain unfinished.</w:t>
@@ -1347,11 +1346,11 @@
     </w:p>
     <w:p>
       <w:pPr>
-        <w:pStyle w:val="Compact"/>
         <w:numPr>
           <w:ilvl w:val="0"/>
           <w:numId w:val="1004"/>
         </w:numPr>
+        <w:pStyle w:val="Compact"/>
       </w:pPr>
       <w:r>
         <w:t xml:space="preserve">Review all four court copies for every charge and the complete letter before issuance. Confirm shared pricing/history checks. Changed history or a changed charge may require another deliberate pricing review.</w:t>
@@ -1363,8 +1362,8 @@
       </w:pPr>
       <w:r>
         <w:rPr>
+          <w:bCs/>
           <w:b/>
-          <w:bCs/>
         </w:rPr>
         <w:t xml:space="preserve">Citation copies.</w:t>
       </w:r>
@@ -1379,9 +1378,8 @@
       <w:tblPr>
         <w:tblStyle w:val="Table"/>
         <w:tblW w:type="pct" w:w="5000"/>
-        <w:jc w:val="left"/>
-        <w:tblLayout w:type="fixed"/>
         <w:tblLook w:firstRow="1" w:lastRow="0" w:firstColumn="0" w:lastColumn="0" w:noHBand="0" w:noVBand="0" w:val="0020"/>
+        <w:jc w:val="start"/>
       </w:tblPr>
       <w:tblGrid>
         <w:gridCol w:w="3960"/>
@@ -1389,7 +1387,7 @@
       </w:tblGrid>
       <w:tr>
         <w:trPr>
-          <w:tblHeader w:val="on"/>
+          <w:tblHeader w:val="true"/>
         </w:trPr>
         <w:tc>
           <w:tcPr/>
@@ -1517,8 +1515,8 @@
       </w:pPr>
       <w:r>
         <w:rPr>
+          <w:bCs/>
           <w:b/>
-          <w:bCs/>
         </w:rPr>
         <w:t xml:space="preserve">Mandatory appearance.</w:t>
       </w:r>
@@ -1549,11 +1547,11 @@
     </w:p>
     <w:p>
       <w:pPr>
-        <w:pStyle w:val="Compact"/>
         <w:numPr>
           <w:ilvl w:val="0"/>
           <w:numId w:val="1005"/>
         </w:numPr>
+        <w:pStyle w:val="Compact"/>
       </w:pPr>
       <w:r>
         <w:t xml:space="preserve">Import the actual completed snow inspection. Verify parcel/site, respondent, mailing address, inspector, date and time.</w:t>
@@ -1561,11 +1559,11 @@
     </w:p>
     <w:p>
       <w:pPr>
-        <w:pStyle w:val="Compact"/>
         <w:numPr>
           <w:ilvl w:val="0"/>
           <w:numId w:val="1005"/>
         </w:numPr>
+        <w:pStyle w:val="Compact"/>
       </w:pPr>
       <w:r>
         <w:t xml:space="preserve">Enter the accumulation date, a positive decimal depth in inches and the observed condition: snow covered, ice covered, or snow and ice covered. Confirm photographs and select the corner-lot/curb-ramp option when factually applicable.</w:t>
@@ -1573,11 +1571,11 @@
     </w:p>
     <w:p>
       <w:pPr>
-        <w:pStyle w:val="Compact"/>
         <w:numPr>
           <w:ilvl w:val="0"/>
           <w:numId w:val="1005"/>
         </w:numPr>
+        <w:pStyle w:val="Compact"/>
       </w:pPr>
       <w:r>
         <w:t xml:space="preserve">Check the timing message. The supplied rule allows until noon City time on the day after accumulation. An observation before that point is blocked. Use actual facts; never adjust the date or time to pass a check.</w:t>
@@ -1585,11 +1583,11 @@
     </w:p>
     <w:p>
       <w:pPr>
-        <w:pStyle w:val="Compact"/>
         <w:numPr>
           <w:ilvl w:val="0"/>
           <w:numId w:val="1005"/>
         </w:numPr>
+        <w:pStyle w:val="Compact"/>
       </w:pPr>
       <w:r>
         <w:t xml:space="preserve">Review ordinance 10.28, number, description, comment, counted property history, deposit and court session. Refresh citation history if prompted. Missing parcels use the existing normalized address fallback, which requires particular attention to source identity.</w:t>
@@ -1597,11 +1595,11 @@
     </w:p>
     <w:p>
       <w:pPr>
-        <w:pStyle w:val="Compact"/>
         <w:numPr>
           <w:ilvl w:val="0"/>
           <w:numId w:val="1005"/>
         </w:numPr>
+        <w:pStyle w:val="Compact"/>
       </w:pPr>
       <w:r>
         <w:t xml:space="preserve">Review seasonal letter content. After an authorized administrator changes it, choose Refresh seasonal letter and review the new content. Stale shared content prevents issuance until reconciled.</w:t>
@@ -1609,11 +1607,11 @@
     </w:p>
     <w:p>
       <w:pPr>
-        <w:pStyle w:val="Compact"/>
         <w:numPr>
           <w:ilvl w:val="0"/>
           <w:numId w:val="1005"/>
         </w:numPr>
+        <w:pStyle w:val="Compact"/>
       </w:pPr>
       <w:r>
         <w:t xml:space="preserve">Issue, confirm the shared save (Writer returns to Workspace with the case highlighted) and verify the original PDF. The standard authoring-11 packet includes the snow cover and retained language-access continuation plus four MC-2000 copies; a cover may continue onto another page. Do not force a five-page total or remove language to shorten the packet.</w:t>
@@ -1633,8 +1631,8 @@
       </w:pPr>
       <w:r>
         <w:rPr>
+          <w:bCs/>
           <w:b/>
-          <w:bCs/>
         </w:rPr>
         <w:t xml:space="preserve">Division policy decisions.</w:t>
       </w:r>
@@ -1669,8 +1667,8 @@
       </w:pPr>
       <w:r>
         <w:rPr>
+          <w:bCs/>
           <w:b/>
-          <w:bCs/>
         </w:rPr>
         <w:t xml:space="preserve">Group due dates on reinspection.</w:t>
       </w:r>
@@ -1695,8 +1693,8 @@
       </w:pPr>
       <w:r>
         <w:rPr>
+          <w:bCs/>
           <w:b/>
-          <w:bCs/>
         </w:rPr>
         <w:t xml:space="preserve">One item at a time.</w:t>
       </w:r>
@@ -1711,9 +1709,8 @@
       <w:tblPr>
         <w:tblStyle w:val="Table"/>
         <w:tblW w:type="pct" w:w="5000"/>
-        <w:jc w:val="left"/>
-        <w:tblLayout w:type="fixed"/>
         <w:tblLook w:firstRow="1" w:lastRow="0" w:firstColumn="0" w:lastColumn="0" w:noHBand="0" w:noVBand="0" w:val="0020"/>
+        <w:jc w:val="start"/>
       </w:tblPr>
       <w:tblGrid>
         <w:gridCol w:w="3960"/>
@@ -1721,7 +1718,7 @@
       </w:tblGrid>
       <w:tr>
         <w:trPr>
-          <w:tblHeader w:val="on"/>
+          <w:tblHeader w:val="true"/>
         </w:trPr>
         <w:tc>
           <w:tcPr/>
@@ -1889,9 +1886,8 @@
       <w:tblPr>
         <w:tblStyle w:val="Table"/>
         <w:tblW w:type="pct" w:w="5000"/>
-        <w:jc w:val="left"/>
-        <w:tblLayout w:type="fixed"/>
         <w:tblLook w:firstRow="1" w:lastRow="0" w:firstColumn="0" w:lastColumn="0" w:noHBand="0" w:noVBand="0" w:val="0020"/>
+        <w:jc w:val="start"/>
       </w:tblPr>
       <w:tblGrid>
         <w:gridCol w:w="3960"/>
@@ -1899,7 +1895,7 @@
       </w:tblGrid>
       <w:tr>
         <w:trPr>
-          <w:tblHeader w:val="on"/>
+          <w:tblHeader w:val="true"/>
         </w:trPr>
         <w:tc>
           <w:tcPr/>
@@ -2201,8 +2197,8 @@
       </w:pPr>
       <w:r>
         <w:rPr>
+          <w:bCs/>
           <w:b/>
-          <w:bCs/>
         </w:rPr>
         <w:t xml:space="preserve">Referral and compliance histories.</w:t>
       </w:r>
@@ -2261,8 +2257,8 @@
       </w:pPr>
       <w:r>
         <w:rPr>
+          <w:bCs/>
           <w:b/>
-          <w:bCs/>
         </w:rPr>
         <w:t xml:space="preserve">Summary Abatement.</w:t>
       </w:r>
@@ -2279,8 +2275,8 @@
       </w:pPr>
       <w:r>
         <w:rPr>
+          <w:bCs/>
           <w:b/>
-          <w:bCs/>
         </w:rPr>
         <w:t xml:space="preserve">Non-Summary Abatement.</w:t>
       </w:r>
@@ -2297,8 +2293,8 @@
       </w:pPr>
       <w:r>
         <w:rPr>
+          <w:bCs/>
           <w:b/>
-          <w:bCs/>
         </w:rPr>
         <w:t xml:space="preserve">No Occupancy.</w:t>
       </w:r>
@@ -2315,8 +2311,8 @@
       </w:pPr>
       <w:r>
         <w:rPr>
+          <w:bCs/>
           <w:b/>
-          <w:bCs/>
         </w:rPr>
         <w:t xml:space="preserve">Best Interest Extension.</w:t>
       </w:r>
@@ -2348,8 +2344,8 @@
       </w:pPr>
       <w:r>
         <w:rPr>
+          <w:bCs/>
           <w:b/>
-          <w:bCs/>
         </w:rPr>
         <w:t xml:space="preserve">Vacancy Extension.</w:t>
       </w:r>
@@ -2399,8 +2395,8 @@
       </w:pPr>
       <w:r>
         <w:rPr>
+          <w:bCs/>
           <w:b/>
-          <w:bCs/>
         </w:rPr>
         <w:t xml:space="preserve">Extension layout.</w:t>
       </w:r>
@@ -2443,8 +2439,8 @@
       </w:pPr>
       <w:r>
         <w:rPr>
+          <w:bCs/>
           <w:b/>
-          <w:bCs/>
         </w:rPr>
         <w:t xml:space="preserve">Issue deliberately.</w:t>
       </w:r>
@@ -2459,9 +2455,8 @@
       <w:tblPr>
         <w:tblStyle w:val="Table"/>
         <w:tblW w:type="pct" w:w="5000"/>
-        <w:jc w:val="left"/>
-        <w:tblLayout w:type="fixed"/>
         <w:tblLook w:firstRow="1" w:lastRow="0" w:firstColumn="0" w:lastColumn="0" w:noHBand="0" w:noVBand="0" w:val="0020"/>
+        <w:jc w:val="start"/>
       </w:tblPr>
       <w:tblGrid>
         <w:gridCol w:w="3960"/>
@@ -2469,7 +2464,7 @@
       </w:tblGrid>
       <w:tr>
         <w:trPr>
-          <w:tblHeader w:val="on"/>
+          <w:tblHeader w:val="true"/>
         </w:trPr>
         <w:tc>
           <w:tcPr/>
@@ -2607,8 +2602,8 @@
       </w:pPr>
       <w:r>
         <w:rPr>
+          <w:bCs/>
           <w:b/>
-          <w:bCs/>
         </w:rPr>
         <w:t xml:space="preserve">Original PDFs.</w:t>
       </w:r>
@@ -2625,8 +2620,8 @@
       </w:pPr>
       <w:r>
         <w:rPr>
+          <w:bCs/>
           <w:b/>
-          <w:bCs/>
         </w:rPr>
         <w:t xml:space="preserve">Print and mail.</w:t>
       </w:r>
@@ -2651,8 +2646,8 @@
       </w:pPr>
       <w:r>
         <w:rPr>
+          <w:bCs/>
           <w:b/>
-          <w:bCs/>
         </w:rPr>
         <w:t xml:space="preserve">Email.</w:t>
       </w:r>
@@ -2669,8 +2664,8 @@
       </w:pPr>
       <w:r>
         <w:rPr>
+          <w:bCs/>
           <w:b/>
-          <w:bCs/>
         </w:rPr>
         <w:t xml:space="preserve">Outside records.</w:t>
       </w:r>
@@ -2701,11 +2696,11 @@
     </w:p>
     <w:p>
       <w:pPr>
-        <w:pStyle w:val="Compact"/>
         <w:numPr>
           <w:ilvl w:val="0"/>
           <w:numId w:val="1006"/>
         </w:numPr>
+        <w:pStyle w:val="Compact"/>
       </w:pPr>
       <w:r>
         <w:t xml:space="preserve">Open the issued document from case history and choose Correct document.</w:t>
@@ -2713,11 +2708,11 @@
     </w:p>
     <w:p>
       <w:pPr>
-        <w:pStyle w:val="Compact"/>
         <w:numPr>
           <w:ilvl w:val="0"/>
           <w:numId w:val="1006"/>
         </w:numPr>
+        <w:pStyle w:val="Compact"/>
       </w:pPr>
       <w:r>
         <w:t xml:space="preserve">State the recording error and reason. For a citation or referral, record the actual receiving court or City Attorney amendment instructions/reference where required. The program does not issue those instructions for you.</w:t>
@@ -2725,11 +2720,11 @@
     </w:p>
     <w:p>
       <w:pPr>
-        <w:pStyle w:val="Compact"/>
         <w:numPr>
           <w:ilvl w:val="0"/>
           <w:numId w:val="1006"/>
         </w:numPr>
+        <w:pStyle w:val="Compact"/>
       </w:pPr>
       <w:r>
         <w:t xml:space="preserve">Make the permitted correction. Review the before/after comparison, affected case facts and linked worksheet facts. Keep the original document, item, root, visit and citation identities.</w:t>
@@ -2737,11 +2732,11 @@
     </w:p>
     <w:p>
       <w:pPr>
-        <w:pStyle w:val="Compact"/>
         <w:numPr>
           <w:ilvl w:val="0"/>
           <w:numId w:val="1006"/>
         </w:numPr>
+        <w:pStyle w:val="Compact"/>
       </w:pPr>
       <w:r>
         <w:t xml:space="preserve">Review and issue the linked revision. Until its shared save is confirmed, the earlier issued version remains effective in the program.</w:t>
@@ -2749,11 +2744,11 @@
     </w:p>
     <w:p>
       <w:pPr>
-        <w:pStyle w:val="Compact"/>
         <w:numPr>
           <w:ilvl w:val="0"/>
           <w:numId w:val="1006"/>
         </w:numPr>
+        <w:pStyle w:val="Compact"/>
       </w:pPr>
       <w:r>
         <w:t xml:space="preserve">Confirm the correction’s original PDF and complete outside amendment, mailing and recording steps under the actual procedure.</w:t>
@@ -2765,8 +2760,8 @@
       </w:pPr>
       <w:r>
         <w:rPr>
+          <w:bCs/>
           <w:b/>
-          <w:bCs/>
         </w:rPr>
         <w:t xml:space="preserve">Withdraw an item.</w:t>
       </w:r>
@@ -2783,8 +2778,8 @@
       </w:pPr>
       <w:r>
         <w:rPr>
+          <w:bCs/>
           <w:b/>
-          <w:bCs/>
         </w:rPr>
         <w:t xml:space="preserve">Correct a visit.</w:t>
       </w:r>
@@ -2801,8 +2796,8 @@
       </w:pPr>
       <w:r>
         <w:rPr>
+          <w:bCs/>
           <w:b/>
-          <w:bCs/>
         </w:rPr>
         <w:t xml:space="preserve">Citation prices and dates.</w:t>
       </w:r>
@@ -2819,8 +2814,8 @@
       </w:pPr>
       <w:r>
         <w:rPr>
+          <w:bCs/>
           <w:b/>
-          <w:bCs/>
         </w:rPr>
         <w:t xml:space="preserve">Restrictions and release.</w:t>
       </w:r>
@@ -2861,9 +2856,8 @@
       <w:tblPr>
         <w:tblStyle w:val="Table"/>
         <w:tblW w:type="pct" w:w="5000"/>
-        <w:jc w:val="left"/>
-        <w:tblLayout w:type="fixed"/>
         <w:tblLook w:firstRow="1" w:lastRow="0" w:firstColumn="0" w:lastColumn="0" w:noHBand="0" w:noVBand="0" w:val="0020"/>
+        <w:jc w:val="start"/>
       </w:tblPr>
       <w:tblGrid>
         <w:gridCol w:w="3960"/>
@@ -2871,7 +2865,7 @@
       </w:tblGrid>
       <w:tr>
         <w:trPr>
-          <w:tblHeader w:val="on"/>
+          <w:tblHeader w:val="true"/>
         </w:trPr>
         <w:tc>
           <w:tcPr/>
@@ -2983,8 +2977,8 @@
       </w:pPr>
       <w:r>
         <w:rPr>
+          <w:bCs/>
           <w:b/>
-          <w:bCs/>
         </w:rPr>
         <w:t xml:space="preserve">Device save failure.</w:t>
       </w:r>
@@ -3001,8 +2995,8 @@
       </w:pPr>
       <w:r>
         <w:rPr>
+          <w:bCs/>
           <w:b/>
-          <w:bCs/>
         </w:rPr>
         <w:t xml:space="preserve">Uncertain shared save.</w:t>
       </w:r>
@@ -3019,8 +3013,8 @@
       </w:pPr>
       <w:r>
         <w:rPr>
+          <w:bCs/>
           <w:b/>
-          <w:bCs/>
         </w:rPr>
         <w:t xml:space="preserve">Shared changes.</w:t>
       </w:r>
@@ -3037,8 +3031,8 @@
       </w:pPr>
       <w:r>
         <w:rPr>
+          <w:bCs/>
           <w:b/>
-          <w:bCs/>
         </w:rPr>
         <w:t xml:space="preserve">PDF exceptions.</w:t>
       </w:r>
@@ -3087,9 +3081,8 @@
       <w:tblPr>
         <w:tblStyle w:val="Table"/>
         <w:tblW w:type="pct" w:w="5000"/>
-        <w:jc w:val="left"/>
-        <w:tblLayout w:type="fixed"/>
         <w:tblLook w:firstRow="1" w:lastRow="0" w:firstColumn="0" w:lastColumn="0" w:noHBand="0" w:noVBand="0" w:val="0020"/>
+        <w:jc w:val="start"/>
       </w:tblPr>
       <w:tblGrid>
         <w:gridCol w:w="3960"/>
@@ -3097,7 +3090,7 @@
       </w:tblGrid>
       <w:tr>
         <w:trPr>
-          <w:tblHeader w:val="on"/>
+          <w:tblHeader w:val="true"/>
         </w:trPr>
         <w:tc>
           <w:tcPr/>
@@ -3287,8 +3280,8 @@
       </w:pPr>
       <w:r>
         <w:rPr>
+          <w:bCs/>
           <w:b/>
-          <w:bCs/>
         </w:rPr>
         <w:t xml:space="preserve">Recover one case.</w:t>
       </w:r>
@@ -3305,8 +3298,8 @@
       </w:pPr>
       <w:r>
         <w:rPr>
+          <w:bCs/>
           <w:b/>
-          <w:bCs/>
         </w:rPr>
         <w:t xml:space="preserve">Restore a workspace.</w:t>
       </w:r>
@@ -3323,8 +3316,8 @@
       </w:pPr>
       <w:r>
         <w:rPr>
+          <w:bCs/>
           <w:b/>
-          <w:bCs/>
         </w:rPr>
         <w:t xml:space="preserve">Change PCs or browser profiles.</w:t>
       </w:r>
@@ -3341,8 +3334,8 @@
       </w:pPr>
       <w:r>
         <w:rPr>
+          <w:bCs/>
           <w:b/>
-          <w:bCs/>
         </w:rPr>
         <w:t xml:space="preserve">After an update interruption.</w:t>
       </w:r>
@@ -3359,8 +3352,8 @@
       </w:pPr>
       <w:r>
         <w:rPr>
+          <w:bCs/>
           <w:b/>
-          <w:bCs/>
         </w:rPr>
         <w:t xml:space="preserve">Test recovery.</w:t>
       </w:r>
@@ -3393,9 +3386,8 @@
       <w:tblPr>
         <w:tblStyle w:val="Table"/>
         <w:tblW w:type="pct" w:w="5000"/>
-        <w:jc w:val="left"/>
-        <w:tblLayout w:type="fixed"/>
         <w:tblLook w:firstRow="1" w:lastRow="0" w:firstColumn="0" w:lastColumn="0" w:noHBand="0" w:noVBand="0" w:val="0020"/>
+        <w:jc w:val="start"/>
       </w:tblPr>
       <w:tblGrid>
         <w:gridCol w:w="3960"/>
@@ -3403,7 +3395,7 @@
       </w:tblGrid>
       <w:tr>
         <w:trPr>
-          <w:tblHeader w:val="on"/>
+          <w:tblHeader w:val="true"/>
         </w:trPr>
         <w:tc>
           <w:tcPr/>
@@ -3765,8 +3757,8 @@
       </w:pPr>
       <w:r>
         <w:rPr>
+          <w:bCs/>
           <w:b/>
-          <w:bCs/>
         </w:rPr>
         <w:t xml:space="preserve">Check coverage first.</w:t>
       </w:r>
@@ -3791,8 +3783,8 @@
       </w:pPr>
       <w:r>
         <w:rPr>
+          <w:bCs/>
           <w:b/>
-          <w:bCs/>
         </w:rPr>
         <w:t xml:space="preserve">Maps.</w:t>
       </w:r>
@@ -3809,8 +3801,8 @@
       </w:pPr>
       <w:r>
         <w:rPr>
+          <w:bCs/>
           <w:b/>
-          <w:bCs/>
         </w:rPr>
         <w:t xml:space="preserve">Drill into data.</w:t>
       </w:r>
@@ -3827,8 +3819,8 @@
       </w:pPr>
       <w:r>
         <w:rPr>
+          <w:bCs/>
           <w:b/>
-          <w:bCs/>
         </w:rPr>
         <w:t xml:space="preserve">Export.</w:t>
       </w:r>
@@ -3845,8 +3837,8 @@
       </w:pPr>
       <w:r>
         <w:rPr>
+          <w:bCs/>
           <w:b/>
-          <w:bCs/>
         </w:rPr>
         <w:t xml:space="preserve">Deposit schedule.</w:t>
       </w:r>
@@ -3863,8 +3855,8 @@
       </w:pPr>
       <w:r>
         <w:rPr>
+          <w:bCs/>
           <w:b/>
-          <w:bCs/>
         </w:rPr>
         <w:t xml:space="preserve">Refresh speed.</w:t>
       </w:r>
@@ -3899,8 +3891,8 @@
       </w:pPr>
       <w:r>
         <w:rPr>
+          <w:bCs/>
           <w:b/>
-          <w:bCs/>
         </w:rPr>
         <w:t xml:space="preserve">Search shared case records.</w:t>
       </w:r>
@@ -3917,8 +3909,8 @@
       </w:pPr>
       <w:r>
         <w:rPr>
+          <w:bCs/>
           <w:b/>
-          <w:bCs/>
         </w:rPr>
         <w:t xml:space="preserve">Reminders.</w:t>
       </w:r>
@@ -3935,8 +3927,8 @@
       </w:pPr>
       <w:r>
         <w:rPr>
+          <w:bCs/>
           <w:b/>
-          <w:bCs/>
         </w:rPr>
         <w:t xml:space="preserve">Batch draft due dates.</w:t>
       </w:r>
@@ -3953,8 +3945,8 @@
       </w:pPr>
       <w:r>
         <w:rPr>
+          <w:bCs/>
           <w:b/>
-          <w:bCs/>
         </w:rPr>
         <w:t xml:space="preserve">Open saved case.</w:t>
       </w:r>
@@ -3971,8 +3963,8 @@
       </w:pPr>
       <w:r>
         <w:rPr>
+          <w:bCs/>
           <w:b/>
-          <w:bCs/>
         </w:rPr>
         <w:t xml:space="preserve">Display.</w:t>
       </w:r>
@@ -3989,8 +3981,8 @@
       </w:pPr>
       <w:r>
         <w:rPr>
+          <w:bCs/>
           <w:b/>
-          <w:bCs/>
         </w:rPr>
         <w:t xml:space="preserve">Messages.</w:t>
       </w:r>
@@ -4007,8 +3999,8 @@
       </w:pPr>
       <w:r>
         <w:rPr>
+          <w:bCs/>
           <w:b/>
-          <w:bCs/>
         </w:rPr>
         <w:t xml:space="preserve">Administrative deposit exceptions.</w:t>
       </w:r>
@@ -4051,8 +4043,8 @@
       </w:pPr>
       <w:r>
         <w:rPr>
+          <w:bCs/>
           <w:b/>
-          <w:bCs/>
         </w:rPr>
         <w:t xml:space="preserve">Shared folders.</w:t>
       </w:r>
@@ -4069,8 +4061,8 @@
       </w:pPr>
       <w:r>
         <w:rPr>
+          <w:bCs/>
           <w:b/>
-          <w:bCs/>
         </w:rPr>
         <w:t xml:space="preserve">Protected anchor.</w:t>
       </w:r>
@@ -4087,8 +4079,8 @@
       </w:pPr>
       <w:r>
         <w:rPr>
+          <w:bCs/>
           <w:b/>
-          <w:bCs/>
         </w:rPr>
         <w:t xml:space="preserve">Record holds.</w:t>
       </w:r>
@@ -4105,8 +4097,8 @@
       </w:pPr>
       <w:r>
         <w:rPr>
+          <w:bCs/>
           <w:b/>
-          <w:bCs/>
         </w:rPr>
         <w:t xml:space="preserve">Locks.</w:t>
       </w:r>
@@ -4123,8 +4115,8 @@
       </w:pPr>
       <w:r>
         <w:rPr>
+          <w:bCs/>
           <w:b/>
-          <w:bCs/>
         </w:rPr>
         <w:t xml:space="preserve">Approved connections.</w:t>
       </w:r>
@@ -4141,8 +4133,8 @@
       </w:pPr>
       <w:r>
         <w:rPr>
+          <w:bCs/>
           <w:b/>
-          <w:bCs/>
         </w:rPr>
         <w:t xml:space="preserve">SQL.</w:t>
       </w:r>
@@ -4159,8 +4151,8 @@
       </w:pPr>
       <w:r>
         <w:rPr>
+          <w:bCs/>
           <w:b/>
-          <w:bCs/>
         </w:rPr>
         <w:t xml:space="preserve">Policy and catalog.</w:t>
       </w:r>
@@ -4177,8 +4169,8 @@
       </w:pPr>
       <w:r>
         <w:rPr>
+          <w:bCs/>
           <w:b/>
-          <w:bCs/>
         </w:rPr>
         <w:t xml:space="preserve">Retention.</w:t>
       </w:r>
@@ -4195,8 +4187,8 @@
       </w:pPr>
       <w:r>
         <w:rPr>
+          <w:bCs/>
           <w:b/>
-          <w:bCs/>
         </w:rPr>
         <w:t xml:space="preserve">Release ownership.</w:t>
       </w:r>
@@ -4229,9 +4221,8 @@
       <w:tblPr>
         <w:tblStyle w:val="Table"/>
         <w:tblW w:type="pct" w:w="5000"/>
-        <w:jc w:val="left"/>
-        <w:tblLayout w:type="fixed"/>
         <w:tblLook w:firstRow="1" w:lastRow="0" w:firstColumn="0" w:lastColumn="0" w:noHBand="0" w:noVBand="0" w:val="0020"/>
+        <w:jc w:val="start"/>
       </w:tblPr>
       <w:tblGrid>
         <w:gridCol w:w="3960"/>
@@ -4239,7 +4230,7 @@
       </w:tblGrid>
       <w:tr>
         <w:trPr>
-          <w:tblHeader w:val="on"/>
+          <w:tblHeader w:val="true"/>
         </w:trPr>
         <w:tc>
           <w:tcPr/>
@@ -4411,8 +4402,8 @@
       </w:pPr>
       <w:r>
         <w:rPr>
+          <w:bCs/>
           <w:b/>
-          <w:bCs/>
         </w:rPr>
         <w:t xml:space="preserve">Read the whole task.</w:t>
       </w:r>
@@ -4429,8 +4420,8 @@
       </w:pPr>
       <w:r>
         <w:rPr>
+          <w:bCs/>
           <w:b/>
-          <w:bCs/>
         </w:rPr>
         <w:t xml:space="preserve">Small screens and zoom.</w:t>
       </w:r>
@@ -4447,8 +4438,8 @@
       </w:pPr>
       <w:r>
         <w:rPr>
+          <w:bCs/>
           <w:b/>
-          <w:bCs/>
         </w:rPr>
         <w:t xml:space="preserve">Display preferences.</w:t>
       </w:r>
@@ -4489,9 +4480,8 @@
       <w:tblPr>
         <w:tblStyle w:val="Table"/>
         <w:tblW w:type="pct" w:w="5000"/>
-        <w:jc w:val="left"/>
-        <w:tblLayout w:type="fixed"/>
         <w:tblLook w:firstRow="1" w:lastRow="0" w:firstColumn="0" w:lastColumn="0" w:noHBand="0" w:noVBand="0" w:val="0020"/>
+        <w:jc w:val="start"/>
       </w:tblPr>
       <w:tblGrid>
         <w:gridCol w:w="3960"/>
@@ -4499,7 +4489,7 @@
       </w:tblGrid>
       <w:tr>
         <w:trPr>
-          <w:tblHeader w:val="on"/>
+          <w:tblHeader w:val="true"/>
         </w:trPr>
         <w:tc>
           <w:tcPr/>
@@ -5246,8 +5236,8 @@
       </w:pPr>
       <w:r>
         <w:rPr>
+          <w:bCs/>
           <w:b/>
-          <w:bCs/>
         </w:rPr>
         <w:t xml:space="preserve">Import and notice.</w:t>
       </w:r>
@@ -5264,8 +5254,8 @@
       </w:pPr>
       <w:r>
         <w:rPr>
+          <w:bCs/>
           <w:b/>
-          <w:bCs/>
         </w:rPr>
         <w:t xml:space="preserve">Snow.</w:t>
       </w:r>
@@ -5282,8 +5272,8 @@
       </w:pPr>
       <w:r>
         <w:rPr>
+          <w:bCs/>
           <w:b/>
-          <w:bCs/>
         </w:rPr>
         <w:t xml:space="preserve">Reinspection.</w:t>
       </w:r>
@@ -5300,8 +5290,8 @@
       </w:pPr>
       <w:r>
         <w:rPr>
+          <w:bCs/>
           <w:b/>
-          <w:bCs/>
         </w:rPr>
         <w:t xml:space="preserve">Correction and recovery.</w:t>
       </w:r>
@@ -5318,8 +5308,8 @@
       </w:pPr>
       <w:r>
         <w:rPr>
+          <w:bCs/>
           <w:b/>
-          <w:bCs/>
         </w:rPr>
         <w:t xml:space="preserve">Reports and accessibility.</w:t>
       </w:r>
@@ -5334,9 +5324,8 @@
       <w:tblPr>
         <w:tblStyle w:val="Table"/>
         <w:tblW w:type="pct" w:w="5000"/>
-        <w:jc w:val="left"/>
-        <w:tblLayout w:type="fixed"/>
         <w:tblLook w:firstRow="1" w:lastRow="0" w:firstColumn="0" w:lastColumn="0" w:noHBand="0" w:noVBand="0" w:val="0020"/>
+        <w:jc w:val="start"/>
       </w:tblPr>
       <w:tblGrid>
         <w:gridCol w:w="3960"/>
@@ -5344,7 +5333,7 @@
       </w:tblGrid>
       <w:tr>
         <w:trPr>
-          <w:tblHeader w:val="on"/>
+          <w:tblHeader w:val="true"/>
         </w:trPr>
         <w:tc>
           <w:tcPr/>
@@ -5627,9 +5616,8 @@
       <w:tblPr>
         <w:tblStyle w:val="Table"/>
         <w:tblW w:type="pct" w:w="5000"/>
-        <w:jc w:val="left"/>
-        <w:tblLayout w:type="fixed"/>
         <w:tblLook w:firstRow="1" w:lastRow="0" w:firstColumn="0" w:lastColumn="0" w:noHBand="0" w:noVBand="0" w:val="0020"/>
+        <w:jc w:val="start"/>
       </w:tblPr>
       <w:tblGrid>
         <w:gridCol w:w="2640"/>
@@ -5638,7 +5626,7 @@
       </w:tblGrid>
       <w:tr>
         <w:trPr>
-          <w:tblHeader w:val="on"/>
+          <w:tblHeader w:val="true"/>
         </w:trPr>
         <w:tc>
           <w:tcPr/>
@@ -5939,7 +5927,7 @@
         <w:pStyle w:val="BodyText"/>
       </w:pPr>
       <w:r>
-        <w:t xml:space="preserve">Manual source digest 81146faea163e0ea.</w:t>
+        <w:t xml:space="preserve">Manual source digest ea8942b76c252e4c.</w:t>
       </w:r>
     </w:p>
     <w:bookmarkEnd w:id="41"/>
@@ -6188,7 +6176,7 @@
     </w:lvl>
   </w:abstractNum>
   <w:abstractNum w:abstractNumId="990">
-    <w:nsid w:val="0000A990"/>
+    <w:nsid w:val="A990"/>
     <w:multiLevelType w:val="multilevel"/>
     <w:lvl w:ilvl="0">
       <w:numFmt w:val="bullet"/>
@@ -6264,7 +6252,7 @@
     </w:lvl>
   </w:abstractNum>
   <w:abstractNum w:abstractNumId="99411">
-    <w:nsid w:val="00A99411"/>
+    <w:nsid w:val="A99411"/>
     <w:multiLevelType w:val="multilevel"/>
     <w:lvl w:ilvl="0">
       <w:start w:val="1"/>
@@ -6349,7 +6337,7 @@
     </w:lvl>
   </w:abstractNum>
   <w:abstractNum w:abstractNumId="991">
-    <w:nsid w:val="0000A991"/>
+    <w:nsid w:val="A991"/>
     <w:multiLevelType w:val="multilevel"/>
     <w:lvl w:ilvl="0">
       <w:numFmt w:val="bullet"/>
@@ -22765,7 +22753,7 @@
     <w:basedOn w:val="VerbatimChar"/>
     <w:rPr/>
   </w:style>
-  <w:style w:type="character" w:customStyle="1" w:styleId="KeywordTok">
+  <w:style w:customStyle="1" w:styleId="KeywordTok" w:type="character">
     <w:name w:val="KeywordTok"/>
     <w:basedOn w:val="VerbatimChar"/>
     <w:rPr>
@@ -22773,77 +22761,77 @@
       <w:color w:val="007020"/>
     </w:rPr>
   </w:style>
-  <w:style w:type="character" w:customStyle="1" w:styleId="DataTypeTok">
+  <w:style w:customStyle="1" w:styleId="DataTypeTok" w:type="character">
     <w:name w:val="DataTypeTok"/>
     <w:basedOn w:val="VerbatimChar"/>
     <w:rPr>
       <w:color w:val="902000"/>
     </w:rPr>
   </w:style>
-  <w:style w:type="character" w:customStyle="1" w:styleId="DecValTok">
+  <w:style w:customStyle="1" w:styleId="DecValTok" w:type="character">
     <w:name w:val="DecValTok"/>
     <w:basedOn w:val="VerbatimChar"/>
     <w:rPr>
       <w:color w:val="40a070"/>
     </w:rPr>
   </w:style>
-  <w:style w:type="character" w:customStyle="1" w:styleId="BaseNTok">
+  <w:style w:customStyle="1" w:styleId="BaseNTok" w:type="character">
     <w:name w:val="BaseNTok"/>
     <w:basedOn w:val="VerbatimChar"/>
     <w:rPr>
       <w:color w:val="40a070"/>
     </w:rPr>
   </w:style>
-  <w:style w:type="character" w:customStyle="1" w:styleId="FloatTok">
+  <w:style w:customStyle="1" w:styleId="FloatTok" w:type="character">
     <w:name w:val="FloatTok"/>
     <w:basedOn w:val="VerbatimChar"/>
     <w:rPr>
       <w:color w:val="40a070"/>
     </w:rPr>
   </w:style>
-  <w:style w:type="character" w:customStyle="1" w:styleId="ConstantTok">
+  <w:style w:customStyle="1" w:styleId="ConstantTok" w:type="character">
     <w:name w:val="ConstantTok"/>
     <w:basedOn w:val="VerbatimChar"/>
     <w:rPr>
       <w:color w:val="880000"/>
     </w:rPr>
   </w:style>
-  <w:style w:type="character" w:customStyle="1" w:styleId="CharTok">
+  <w:style w:customStyle="1" w:styleId="CharTok" w:type="character">
     <w:name w:val="CharTok"/>
     <w:basedOn w:val="VerbatimChar"/>
     <w:rPr>
       <w:color w:val="4070a0"/>
     </w:rPr>
   </w:style>
-  <w:style w:type="character" w:customStyle="1" w:styleId="SpecialCharTok">
+  <w:style w:customStyle="1" w:styleId="SpecialCharTok" w:type="character">
     <w:name w:val="SpecialCharTok"/>
     <w:basedOn w:val="VerbatimChar"/>
     <w:rPr>
       <w:color w:val="4070a0"/>
     </w:rPr>
   </w:style>
-  <w:style w:type="character" w:customStyle="1" w:styleId="StringTok">
+  <w:style w:customStyle="1" w:styleId="StringTok" w:type="character">
     <w:name w:val="StringTok"/>
     <w:basedOn w:val="VerbatimChar"/>
     <w:rPr>
       <w:color w:val="4070a0"/>
     </w:rPr>
   </w:style>
-  <w:style w:type="character" w:customStyle="1" w:styleId="VerbatimStringTok">
+  <w:style w:customStyle="1" w:styleId="VerbatimStringTok" w:type="character">
     <w:name w:val="VerbatimStringTok"/>
     <w:basedOn w:val="VerbatimChar"/>
     <w:rPr>
       <w:color w:val="4070a0"/>
     </w:rPr>
   </w:style>
-  <w:style w:type="character" w:customStyle="1" w:styleId="SpecialStringTok">
+  <w:style w:customStyle="1" w:styleId="SpecialStringTok" w:type="character">
     <w:name w:val="SpecialStringTok"/>
     <w:basedOn w:val="VerbatimChar"/>
     <w:rPr>
       <w:color w:val="bb6688"/>
     </w:rPr>
   </w:style>
-  <w:style w:type="character" w:customStyle="1" w:styleId="ImportTok">
+  <w:style w:customStyle="1" w:styleId="ImportTok" w:type="character">
     <w:name w:val="ImportTok"/>
     <w:basedOn w:val="VerbatimChar"/>
     <w:rPr>
@@ -22851,7 +22839,7 @@
       <w:color w:val="008000"/>
     </w:rPr>
   </w:style>
-  <w:style w:type="character" w:customStyle="1" w:styleId="CommentTok">
+  <w:style w:customStyle="1" w:styleId="CommentTok" w:type="character">
     <w:name w:val="CommentTok"/>
     <w:basedOn w:val="VerbatimChar"/>
     <w:rPr>
@@ -22859,7 +22847,7 @@
       <w:color w:val="60a0b0"/>
     </w:rPr>
   </w:style>
-  <w:style w:type="character" w:customStyle="1" w:styleId="DocumentationTok">
+  <w:style w:customStyle="1" w:styleId="DocumentationTok" w:type="character">
     <w:name w:val="DocumentationTok"/>
     <w:basedOn w:val="VerbatimChar"/>
     <w:rPr>
@@ -22867,7 +22855,7 @@
       <w:color w:val="ba2121"/>
     </w:rPr>
   </w:style>
-  <w:style w:type="character" w:customStyle="1" w:styleId="AnnotationTok">
+  <w:style w:customStyle="1" w:styleId="AnnotationTok" w:type="character">
     <w:name w:val="AnnotationTok"/>
     <w:basedOn w:val="VerbatimChar"/>
     <w:rPr>
@@ -22876,7 +22864,7 @@
       <w:color w:val="60a0b0"/>
     </w:rPr>
   </w:style>
-  <w:style w:type="character" w:customStyle="1" w:styleId="CommentVarTok">
+  <w:style w:customStyle="1" w:styleId="CommentVarTok" w:type="character">
     <w:name w:val="CommentVarTok"/>
     <w:basedOn w:val="VerbatimChar"/>
     <w:rPr>
@@ -22885,28 +22873,28 @@
       <w:color w:val="60a0b0"/>
     </w:rPr>
   </w:style>
-  <w:style w:type="character" w:customStyle="1" w:styleId="OtherTok">
+  <w:style w:customStyle="1" w:styleId="OtherTok" w:type="character">
     <w:name w:val="OtherTok"/>
     <w:basedOn w:val="VerbatimChar"/>
     <w:rPr>
       <w:color w:val="007020"/>
     </w:rPr>
   </w:style>
-  <w:style w:type="character" w:customStyle="1" w:styleId="FunctionTok">
+  <w:style w:customStyle="1" w:styleId="FunctionTok" w:type="character">
     <w:name w:val="FunctionTok"/>
     <w:basedOn w:val="VerbatimChar"/>
     <w:rPr>
       <w:color w:val="06287e"/>
     </w:rPr>
   </w:style>
-  <w:style w:type="character" w:customStyle="1" w:styleId="VariableTok">
+  <w:style w:customStyle="1" w:styleId="VariableTok" w:type="character">
     <w:name w:val="VariableTok"/>
     <w:basedOn w:val="VerbatimChar"/>
     <w:rPr>
       <w:color w:val="19177c"/>
     </w:rPr>
   </w:style>
-  <w:style w:type="character" w:customStyle="1" w:styleId="ControlFlowTok">
+  <w:style w:customStyle="1" w:styleId="ControlFlowTok" w:type="character">
     <w:name w:val="ControlFlowTok"/>
     <w:basedOn w:val="VerbatimChar"/>
     <w:rPr>
@@ -22914,45 +22902,45 @@
       <w:color w:val="007020"/>
     </w:rPr>
   </w:style>
-  <w:style w:type="character" w:customStyle="1" w:styleId="OperatorTok">
+  <w:style w:customStyle="1" w:styleId="OperatorTok" w:type="character">
     <w:name w:val="OperatorTok"/>
     <w:basedOn w:val="VerbatimChar"/>
     <w:rPr>
       <w:color w:val="666666"/>
     </w:rPr>
   </w:style>
-  <w:style w:type="character" w:customStyle="1" w:styleId="BuiltInTok">
+  <w:style w:customStyle="1" w:styleId="BuiltInTok" w:type="character">
     <w:name w:val="BuiltInTok"/>
     <w:basedOn w:val="VerbatimChar"/>
     <w:rPr>
       <w:color w:val="008000"/>
     </w:rPr>
   </w:style>
-  <w:style w:type="character" w:customStyle="1" w:styleId="ExtensionTok">
+  <w:style w:customStyle="1" w:styleId="ExtensionTok" w:type="character">
     <w:name w:val="ExtensionTok"/>
     <w:basedOn w:val="VerbatimChar"/>
     <w:rPr/>
   </w:style>
-  <w:style w:type="character" w:customStyle="1" w:styleId="PreprocessorTok">
+  <w:style w:customStyle="1" w:styleId="PreprocessorTok" w:type="character">
     <w:name w:val="PreprocessorTok"/>
     <w:basedOn w:val="VerbatimChar"/>
     <w:rPr>
       <w:color w:val="bc7a00"/>
     </w:rPr>
   </w:style>
-  <w:style w:type="character" w:customStyle="1" w:styleId="AttributeTok">
+  <w:style w:customStyle="1" w:styleId="AttributeTok" w:type="character">
     <w:name w:val="AttributeTok"/>
     <w:basedOn w:val="VerbatimChar"/>
     <w:rPr>
       <w:color w:val="7d9029"/>
     </w:rPr>
   </w:style>
-  <w:style w:type="character" w:customStyle="1" w:styleId="RegionMarkerTok">
+  <w:style w:customStyle="1" w:styleId="RegionMarkerTok" w:type="character">
     <w:name w:val="RegionMarkerTok"/>
     <w:basedOn w:val="VerbatimChar"/>
     <w:rPr/>
   </w:style>
-  <w:style w:type="character" w:customStyle="1" w:styleId="InformationTok">
+  <w:style w:customStyle="1" w:styleId="InformationTok" w:type="character">
     <w:name w:val="InformationTok"/>
     <w:basedOn w:val="VerbatimChar"/>
     <w:rPr>
@@ -22961,7 +22949,7 @@
       <w:color w:val="60a0b0"/>
     </w:rPr>
   </w:style>
-  <w:style w:type="character" w:customStyle="1" w:styleId="WarningTok">
+  <w:style w:customStyle="1" w:styleId="WarningTok" w:type="character">
     <w:name w:val="WarningTok"/>
     <w:basedOn w:val="VerbatimChar"/>
     <w:rPr>
@@ -22970,20 +22958,246 @@
       <w:color w:val="60a0b0"/>
     </w:rPr>
   </w:style>
+  <w:style w:customStyle="1" w:styleId="AlertTok" w:type="character">
+    <w:name w:val="AlertTok"/>
+    <w:basedOn w:val="VerbatimChar"/>
+    <w:rPr>
+      <w:b/>
+      <w:color w:val="ff0000"/>
+    </w:rPr>
+  </w:style>
+  <w:style w:customStyle="1" w:styleId="ErrorTok" w:type="character">
+    <w:name w:val="ErrorTok"/>
+    <w:basedOn w:val="VerbatimChar"/>
+    <w:rPr>
+      <w:b/>
+      <w:color w:val="ff0000"/>
+    </w:rPr>
+  </w:style>
+  <w:style w:customStyle="1" w:styleId="NormalTok" w:type="character">
+    <w:name w:val="NormalTok"/>
+    <w:basedOn w:val="VerbatimChar"/>
+    <w:rPr/>
+  </w:style>
+  <w:style w:type="character" w:customStyle="1" w:styleId="KeywordTok">
+    <w:name w:val="KeywordTok"/>
+    <w:basedOn w:val="VerbatimChar"/>
+    <w:rPr>
+      <w:color w:val="007020"/>
+      <w:b/>
+    </w:rPr>
+  </w:style>
+  <w:style w:type="character" w:customStyle="1" w:styleId="DataTypeTok">
+    <w:name w:val="DataTypeTok"/>
+    <w:basedOn w:val="VerbatimChar"/>
+    <w:rPr>
+      <w:color w:val="902000"/>
+    </w:rPr>
+  </w:style>
+  <w:style w:type="character" w:customStyle="1" w:styleId="DecValTok">
+    <w:name w:val="DecValTok"/>
+    <w:basedOn w:val="VerbatimChar"/>
+    <w:rPr>
+      <w:color w:val="40a070"/>
+    </w:rPr>
+  </w:style>
+  <w:style w:type="character" w:customStyle="1" w:styleId="BaseNTok">
+    <w:name w:val="BaseNTok"/>
+    <w:basedOn w:val="VerbatimChar"/>
+    <w:rPr>
+      <w:color w:val="40a070"/>
+    </w:rPr>
+  </w:style>
+  <w:style w:type="character" w:customStyle="1" w:styleId="FloatTok">
+    <w:name w:val="FloatTok"/>
+    <w:basedOn w:val="VerbatimChar"/>
+    <w:rPr>
+      <w:color w:val="40a070"/>
+    </w:rPr>
+  </w:style>
+  <w:style w:type="character" w:customStyle="1" w:styleId="ConstantTok">
+    <w:name w:val="ConstantTok"/>
+    <w:basedOn w:val="VerbatimChar"/>
+    <w:rPr>
+      <w:color w:val="880000"/>
+    </w:rPr>
+  </w:style>
+  <w:style w:type="character" w:customStyle="1" w:styleId="CharTok">
+    <w:name w:val="CharTok"/>
+    <w:basedOn w:val="VerbatimChar"/>
+    <w:rPr>
+      <w:color w:val="4070a0"/>
+    </w:rPr>
+  </w:style>
+  <w:style w:type="character" w:customStyle="1" w:styleId="SpecialCharTok">
+    <w:name w:val="SpecialCharTok"/>
+    <w:basedOn w:val="VerbatimChar"/>
+    <w:rPr>
+      <w:color w:val="4070a0"/>
+    </w:rPr>
+  </w:style>
+  <w:style w:type="character" w:customStyle="1" w:styleId="StringTok">
+    <w:name w:val="StringTok"/>
+    <w:basedOn w:val="VerbatimChar"/>
+    <w:rPr>
+      <w:color w:val="4070a0"/>
+    </w:rPr>
+  </w:style>
+  <w:style w:type="character" w:customStyle="1" w:styleId="VerbatimStringTok">
+    <w:name w:val="VerbatimStringTok"/>
+    <w:basedOn w:val="VerbatimChar"/>
+    <w:rPr>
+      <w:color w:val="4070a0"/>
+    </w:rPr>
+  </w:style>
+  <w:style w:type="character" w:customStyle="1" w:styleId="SpecialStringTok">
+    <w:name w:val="SpecialStringTok"/>
+    <w:basedOn w:val="VerbatimChar"/>
+    <w:rPr>
+      <w:color w:val="bb6688"/>
+    </w:rPr>
+  </w:style>
+  <w:style w:type="character" w:customStyle="1" w:styleId="ImportTok">
+    <w:name w:val="ImportTok"/>
+    <w:basedOn w:val="VerbatimChar"/>
+    <w:rPr>
+      <w:color w:val="008000"/>
+      <w:b/>
+    </w:rPr>
+  </w:style>
+  <w:style w:type="character" w:customStyle="1" w:styleId="CommentTok">
+    <w:name w:val="CommentTok"/>
+    <w:basedOn w:val="VerbatimChar"/>
+    <w:rPr>
+      <w:color w:val="60a0b0"/>
+      <w:i/>
+    </w:rPr>
+  </w:style>
+  <w:style w:type="character" w:customStyle="1" w:styleId="DocumentationTok">
+    <w:name w:val="DocumentationTok"/>
+    <w:basedOn w:val="VerbatimChar"/>
+    <w:rPr>
+      <w:color w:val="ba2121"/>
+      <w:i/>
+    </w:rPr>
+  </w:style>
+  <w:style w:type="character" w:customStyle="1" w:styleId="AnnotationTok">
+    <w:name w:val="AnnotationTok"/>
+    <w:basedOn w:val="VerbatimChar"/>
+    <w:rPr>
+      <w:color w:val="60a0b0"/>
+      <w:b/>
+      <w:i/>
+    </w:rPr>
+  </w:style>
+  <w:style w:type="character" w:customStyle="1" w:styleId="CommentVarTok">
+    <w:name w:val="CommentVarTok"/>
+    <w:basedOn w:val="VerbatimChar"/>
+    <w:rPr>
+      <w:color w:val="60a0b0"/>
+      <w:b/>
+      <w:i/>
+    </w:rPr>
+  </w:style>
+  <w:style w:type="character" w:customStyle="1" w:styleId="OtherTok">
+    <w:name w:val="OtherTok"/>
+    <w:basedOn w:val="VerbatimChar"/>
+    <w:rPr>
+      <w:color w:val="007020"/>
+    </w:rPr>
+  </w:style>
+  <w:style w:type="character" w:customStyle="1" w:styleId="FunctionTok">
+    <w:name w:val="FunctionTok"/>
+    <w:basedOn w:val="VerbatimChar"/>
+    <w:rPr>
+      <w:color w:val="06287e"/>
+    </w:rPr>
+  </w:style>
+  <w:style w:type="character" w:customStyle="1" w:styleId="VariableTok">
+    <w:name w:val="VariableTok"/>
+    <w:basedOn w:val="VerbatimChar"/>
+    <w:rPr>
+      <w:color w:val="19177c"/>
+    </w:rPr>
+  </w:style>
+  <w:style w:type="character" w:customStyle="1" w:styleId="ControlFlowTok">
+    <w:name w:val="ControlFlowTok"/>
+    <w:basedOn w:val="VerbatimChar"/>
+    <w:rPr>
+      <w:color w:val="007020"/>
+      <w:b/>
+    </w:rPr>
+  </w:style>
+  <w:style w:type="character" w:customStyle="1" w:styleId="OperatorTok">
+    <w:name w:val="OperatorTok"/>
+    <w:basedOn w:val="VerbatimChar"/>
+    <w:rPr>
+      <w:color w:val="666666"/>
+    </w:rPr>
+  </w:style>
+  <w:style w:type="character" w:customStyle="1" w:styleId="BuiltInTok">
+    <w:name w:val="BuiltInTok"/>
+    <w:basedOn w:val="VerbatimChar"/>
+    <w:rPr>
+      <w:color w:val="008000"/>
+    </w:rPr>
+  </w:style>
+  <w:style w:type="character" w:customStyle="1" w:styleId="ExtensionTok">
+    <w:name w:val="ExtensionTok"/>
+    <w:basedOn w:val="VerbatimChar"/>
+    <w:rPr/>
+  </w:style>
+  <w:style w:type="character" w:customStyle="1" w:styleId="PreprocessorTok">
+    <w:name w:val="PreprocessorTok"/>
+    <w:basedOn w:val="VerbatimChar"/>
+    <w:rPr>
+      <w:color w:val="bc7a00"/>
+    </w:rPr>
+  </w:style>
+  <w:style w:type="character" w:customStyle="1" w:styleId="AttributeTok">
+    <w:name w:val="AttributeTok"/>
+    <w:basedOn w:val="VerbatimChar"/>
+    <w:rPr>
+      <w:color w:val="7d9029"/>
+    </w:rPr>
+  </w:style>
+  <w:style w:type="character" w:customStyle="1" w:styleId="RegionMarkerTok">
+    <w:name w:val="RegionMarkerTok"/>
+    <w:basedOn w:val="VerbatimChar"/>
+    <w:rPr/>
+  </w:style>
+  <w:style w:type="character" w:customStyle="1" w:styleId="InformationTok">
+    <w:name w:val="InformationTok"/>
+    <w:basedOn w:val="VerbatimChar"/>
+    <w:rPr>
+      <w:color w:val="60a0b0"/>
+      <w:b/>
+      <w:i/>
+    </w:rPr>
+  </w:style>
+  <w:style w:type="character" w:customStyle="1" w:styleId="WarningTok">
+    <w:name w:val="WarningTok"/>
+    <w:basedOn w:val="VerbatimChar"/>
+    <w:rPr>
+      <w:color w:val="60a0b0"/>
+      <w:b/>
+      <w:i/>
+    </w:rPr>
+  </w:style>
   <w:style w:type="character" w:customStyle="1" w:styleId="AlertTok">
     <w:name w:val="AlertTok"/>
     <w:basedOn w:val="VerbatimChar"/>
     <w:rPr>
+      <w:color w:val="ff0000"/>
       <w:b/>
-      <w:color w:val="ff0000"/>
     </w:rPr>
   </w:style>
   <w:style w:type="character" w:customStyle="1" w:styleId="ErrorTok">
     <w:name w:val="ErrorTok"/>
     <w:basedOn w:val="VerbatimChar"/>
     <w:rPr>
+      <w:color w:val="ff0000"/>
       <w:b/>
-      <w:color w:val="ff0000"/>
     </w:rPr>
   </w:style>
   <w:style w:type="character" w:customStyle="1" w:styleId="NormalTok">

</xml_diff>

<commit_message>
release: assign 2026-10-30 R64 (helper 2026.10.30.65, build 65)
Release package after the maintainability plan, the bug-scan repairs and the
interface clarifications. Authoring 16, case schema 5, summary 6 and backup 2
are unchanged.

- version.json, package.json and package-lock.json (tools/sync_version.py)
- manual identity lines; all editions regenerated (tools/build_manual.py)
- developer first-line release tokens; R64-REVIEW.md
- CHANGELOG: R64 release heading over the merged development entries
- ACCEPTANCE-RECORD S64-1 to S64-4 (OPEN); PRODUCTION-READINESS note
- DEVELOPMENT-STANDARD records the assignment

Co-Authored-By: Claude Sonnet 5.5 <noreply@anthropic.com>
Claude-Session: https://claude.ai/code/session_01WPJAZGfD47jPUEgCNYYSg7
</commit_message>
<xml_diff>
--- a/docs/staff/Program_Instruction_Manual.docx
+++ b/docs/staff/Program_Instruction_Manual.docx
@@ -32,7 +32,7 @@
         <w:pStyle w:val="BodyText"/>
       </w:pPr>
       <w:r>
-        <w:t xml:space="preserve">Release 2026-10-24 R63 · Helper 2026.10.24.64 · 24 October 2026</w:t>
+        <w:t xml:space="preserve">Release 2026-10-30 R64 · Helper 2026.10.30.65 · 30 October 2026</w:t>
       </w:r>
     </w:p>
     <w:p>
@@ -48,7 +48,7 @@
         <w:pStyle w:val="BodyText"/>
       </w:pPr>
       <w:r>
-        <w:t xml:space="preserve">R63 is a release candidate for City acceptance. Its security checks require the same ordinary document, history and recovery procedures described below. Automated verification does not replace the outstanding City Windows and network tests, staff and assistive technology acceptance, or legal and seasonal policy decisions listed in the carried-forward City acceptance record. New mandatory-appearance citations remain blocked until approved defendant instructions are supplied and integrated. Historical frozen reprints remain available. No live deployment is included in this release.</w:t>
+        <w:t xml:space="preserve">R64 is a release candidate for City acceptance. Its security checks require the same ordinary document, history and recovery procedures described below. Automated verification does not replace the outstanding City Windows and network tests, staff and assistive technology acceptance, or legal and seasonal policy decisions listed in the carried-forward City acceptance record. New mandatory-appearance citations remain blocked until approved defendant instructions are supplied and integrated. Historical frozen reprints remain available. No live deployment is included in this release.</w:t>
       </w:r>
     </w:p>
     <w:bookmarkStart w:id="20" w:name="start-here-and-daily-routine"/>
@@ -5927,7 +5927,7 @@
         <w:pStyle w:val="BodyText"/>
       </w:pPr>
       <w:r>
-        <w:t xml:space="preserve">Manual source digest ea8942b76c252e4c.</w:t>
+        <w:t xml:space="preserve">Manual source digest d105d1316311d704.</w:t>
       </w:r>
     </w:p>
     <w:bookmarkEnd w:id="41"/>
@@ -22972,6 +22972,232 @@
     <w:rPr>
       <w:b/>
       <w:color w:val="ff0000"/>
+    </w:rPr>
+  </w:style>
+  <w:style w:customStyle="1" w:styleId="NormalTok" w:type="character">
+    <w:name w:val="NormalTok"/>
+    <w:basedOn w:val="VerbatimChar"/>
+    <w:rPr/>
+  </w:style>
+  <w:style w:customStyle="1" w:styleId="KeywordTok" w:type="character">
+    <w:name w:val="KeywordTok"/>
+    <w:basedOn w:val="VerbatimChar"/>
+    <w:rPr>
+      <w:color w:val="007020"/>
+      <w:b/>
+    </w:rPr>
+  </w:style>
+  <w:style w:customStyle="1" w:styleId="DataTypeTok" w:type="character">
+    <w:name w:val="DataTypeTok"/>
+    <w:basedOn w:val="VerbatimChar"/>
+    <w:rPr>
+      <w:color w:val="902000"/>
+    </w:rPr>
+  </w:style>
+  <w:style w:customStyle="1" w:styleId="DecValTok" w:type="character">
+    <w:name w:val="DecValTok"/>
+    <w:basedOn w:val="VerbatimChar"/>
+    <w:rPr>
+      <w:color w:val="40a070"/>
+    </w:rPr>
+  </w:style>
+  <w:style w:customStyle="1" w:styleId="BaseNTok" w:type="character">
+    <w:name w:val="BaseNTok"/>
+    <w:basedOn w:val="VerbatimChar"/>
+    <w:rPr>
+      <w:color w:val="40a070"/>
+    </w:rPr>
+  </w:style>
+  <w:style w:customStyle="1" w:styleId="FloatTok" w:type="character">
+    <w:name w:val="FloatTok"/>
+    <w:basedOn w:val="VerbatimChar"/>
+    <w:rPr>
+      <w:color w:val="40a070"/>
+    </w:rPr>
+  </w:style>
+  <w:style w:customStyle="1" w:styleId="ConstantTok" w:type="character">
+    <w:name w:val="ConstantTok"/>
+    <w:basedOn w:val="VerbatimChar"/>
+    <w:rPr>
+      <w:color w:val="880000"/>
+    </w:rPr>
+  </w:style>
+  <w:style w:customStyle="1" w:styleId="CharTok" w:type="character">
+    <w:name w:val="CharTok"/>
+    <w:basedOn w:val="VerbatimChar"/>
+    <w:rPr>
+      <w:color w:val="4070a0"/>
+    </w:rPr>
+  </w:style>
+  <w:style w:customStyle="1" w:styleId="SpecialCharTok" w:type="character">
+    <w:name w:val="SpecialCharTok"/>
+    <w:basedOn w:val="VerbatimChar"/>
+    <w:rPr>
+      <w:color w:val="4070a0"/>
+    </w:rPr>
+  </w:style>
+  <w:style w:customStyle="1" w:styleId="StringTok" w:type="character">
+    <w:name w:val="StringTok"/>
+    <w:basedOn w:val="VerbatimChar"/>
+    <w:rPr>
+      <w:color w:val="4070a0"/>
+    </w:rPr>
+  </w:style>
+  <w:style w:customStyle="1" w:styleId="VerbatimStringTok" w:type="character">
+    <w:name w:val="VerbatimStringTok"/>
+    <w:basedOn w:val="VerbatimChar"/>
+    <w:rPr>
+      <w:color w:val="4070a0"/>
+    </w:rPr>
+  </w:style>
+  <w:style w:customStyle="1" w:styleId="SpecialStringTok" w:type="character">
+    <w:name w:val="SpecialStringTok"/>
+    <w:basedOn w:val="VerbatimChar"/>
+    <w:rPr>
+      <w:color w:val="bb6688"/>
+    </w:rPr>
+  </w:style>
+  <w:style w:customStyle="1" w:styleId="ImportTok" w:type="character">
+    <w:name w:val="ImportTok"/>
+    <w:basedOn w:val="VerbatimChar"/>
+    <w:rPr>
+      <w:color w:val="008000"/>
+      <w:b/>
+    </w:rPr>
+  </w:style>
+  <w:style w:customStyle="1" w:styleId="CommentTok" w:type="character">
+    <w:name w:val="CommentTok"/>
+    <w:basedOn w:val="VerbatimChar"/>
+    <w:rPr>
+      <w:color w:val="60a0b0"/>
+      <w:i/>
+    </w:rPr>
+  </w:style>
+  <w:style w:customStyle="1" w:styleId="DocumentationTok" w:type="character">
+    <w:name w:val="DocumentationTok"/>
+    <w:basedOn w:val="VerbatimChar"/>
+    <w:rPr>
+      <w:color w:val="ba2121"/>
+      <w:i/>
+    </w:rPr>
+  </w:style>
+  <w:style w:customStyle="1" w:styleId="AnnotationTok" w:type="character">
+    <w:name w:val="AnnotationTok"/>
+    <w:basedOn w:val="VerbatimChar"/>
+    <w:rPr>
+      <w:color w:val="60a0b0"/>
+      <w:b/>
+      <w:i/>
+    </w:rPr>
+  </w:style>
+  <w:style w:customStyle="1" w:styleId="CommentVarTok" w:type="character">
+    <w:name w:val="CommentVarTok"/>
+    <w:basedOn w:val="VerbatimChar"/>
+    <w:rPr>
+      <w:color w:val="60a0b0"/>
+      <w:b/>
+      <w:i/>
+    </w:rPr>
+  </w:style>
+  <w:style w:customStyle="1" w:styleId="OtherTok" w:type="character">
+    <w:name w:val="OtherTok"/>
+    <w:basedOn w:val="VerbatimChar"/>
+    <w:rPr>
+      <w:color w:val="007020"/>
+    </w:rPr>
+  </w:style>
+  <w:style w:customStyle="1" w:styleId="FunctionTok" w:type="character">
+    <w:name w:val="FunctionTok"/>
+    <w:basedOn w:val="VerbatimChar"/>
+    <w:rPr>
+      <w:color w:val="06287e"/>
+    </w:rPr>
+  </w:style>
+  <w:style w:customStyle="1" w:styleId="VariableTok" w:type="character">
+    <w:name w:val="VariableTok"/>
+    <w:basedOn w:val="VerbatimChar"/>
+    <w:rPr>
+      <w:color w:val="19177c"/>
+    </w:rPr>
+  </w:style>
+  <w:style w:customStyle="1" w:styleId="ControlFlowTok" w:type="character">
+    <w:name w:val="ControlFlowTok"/>
+    <w:basedOn w:val="VerbatimChar"/>
+    <w:rPr>
+      <w:color w:val="007020"/>
+      <w:b/>
+    </w:rPr>
+  </w:style>
+  <w:style w:customStyle="1" w:styleId="OperatorTok" w:type="character">
+    <w:name w:val="OperatorTok"/>
+    <w:basedOn w:val="VerbatimChar"/>
+    <w:rPr>
+      <w:color w:val="666666"/>
+    </w:rPr>
+  </w:style>
+  <w:style w:customStyle="1" w:styleId="BuiltInTok" w:type="character">
+    <w:name w:val="BuiltInTok"/>
+    <w:basedOn w:val="VerbatimChar"/>
+    <w:rPr>
+      <w:color w:val="008000"/>
+    </w:rPr>
+  </w:style>
+  <w:style w:customStyle="1" w:styleId="ExtensionTok" w:type="character">
+    <w:name w:val="ExtensionTok"/>
+    <w:basedOn w:val="VerbatimChar"/>
+    <w:rPr/>
+  </w:style>
+  <w:style w:customStyle="1" w:styleId="PreprocessorTok" w:type="character">
+    <w:name w:val="PreprocessorTok"/>
+    <w:basedOn w:val="VerbatimChar"/>
+    <w:rPr>
+      <w:color w:val="bc7a00"/>
+    </w:rPr>
+  </w:style>
+  <w:style w:customStyle="1" w:styleId="AttributeTok" w:type="character">
+    <w:name w:val="AttributeTok"/>
+    <w:basedOn w:val="VerbatimChar"/>
+    <w:rPr>
+      <w:color w:val="7d9029"/>
+    </w:rPr>
+  </w:style>
+  <w:style w:customStyle="1" w:styleId="RegionMarkerTok" w:type="character">
+    <w:name w:val="RegionMarkerTok"/>
+    <w:basedOn w:val="VerbatimChar"/>
+    <w:rPr/>
+  </w:style>
+  <w:style w:customStyle="1" w:styleId="InformationTok" w:type="character">
+    <w:name w:val="InformationTok"/>
+    <w:basedOn w:val="VerbatimChar"/>
+    <w:rPr>
+      <w:color w:val="60a0b0"/>
+      <w:b/>
+      <w:i/>
+    </w:rPr>
+  </w:style>
+  <w:style w:customStyle="1" w:styleId="WarningTok" w:type="character">
+    <w:name w:val="WarningTok"/>
+    <w:basedOn w:val="VerbatimChar"/>
+    <w:rPr>
+      <w:color w:val="60a0b0"/>
+      <w:b/>
+      <w:i/>
+    </w:rPr>
+  </w:style>
+  <w:style w:customStyle="1" w:styleId="AlertTok" w:type="character">
+    <w:name w:val="AlertTok"/>
+    <w:basedOn w:val="VerbatimChar"/>
+    <w:rPr>
+      <w:color w:val="ff0000"/>
+      <w:b/>
+    </w:rPr>
+  </w:style>
+  <w:style w:customStyle="1" w:styleId="ErrorTok" w:type="character">
+    <w:name w:val="ErrorTok"/>
+    <w:basedOn w:val="VerbatimChar"/>
+    <w:rPr>
+      <w:color w:val="ff0000"/>
+      <w:b/>
     </w:rPr>
   </w:style>
   <w:style w:customStyle="1" w:styleId="NormalTok" w:type="character">

</xml_diff>

<commit_message>
feat(agents): distinguish the queue's filing button and add an agent guide
The Workspace queue button that opens an issued document with an unfiled PDF
was labelled "File issued PDF", the same as the button inside the document
that files it. It now reads "Open document to file PDF". Adds
docs/agents/README.md describing how automation can run and drive the program
today, what it must not do, and the known gaps. The retained queue original is
compared with exactly that one label change; no other assertion changed.

Co-Authored-By: Claude Sonnet 5.5 <noreply@anthropic.com>
Claude-Session: https://claude.ai/code/session_01WPJAZGfD47jPUEgCNYYSg7
</commit_message>
<xml_diff>
--- a/docs/staff/Program_Instruction_Manual.docx
+++ b/docs/staff/Program_Instruction_Manual.docx
@@ -2564,7 +2564,7 @@
               <w:jc w:val="left"/>
             </w:pPr>
             <w:r>
-              <w:t xml:space="preserve">Open the issued action and File issued PDF or review its original filing status</w:t>
+              <w:t xml:space="preserve">Use Open document to file PDF, then File issued PDF in the document, or review its original filing status</w:t>
             </w:r>
           </w:p>
         </w:tc>
@@ -5927,7 +5927,7 @@
         <w:pStyle w:val="BodyText"/>
       </w:pPr>
       <w:r>
-        <w:t xml:space="preserve">Manual source digest d105d1316311d704.</w:t>
+        <w:t xml:space="preserve">Manual source digest 6e5b6811782c9300.</w:t>
       </w:r>
     </w:p>
     <w:bookmarkEnd w:id="41"/>
@@ -22972,6 +22972,458 @@
     <w:rPr>
       <w:b/>
       <w:color w:val="ff0000"/>
+    </w:rPr>
+  </w:style>
+  <w:style w:customStyle="1" w:styleId="NormalTok" w:type="character">
+    <w:name w:val="NormalTok"/>
+    <w:basedOn w:val="VerbatimChar"/>
+    <w:rPr/>
+  </w:style>
+  <w:style w:customStyle="1" w:styleId="KeywordTok" w:type="character">
+    <w:name w:val="KeywordTok"/>
+    <w:basedOn w:val="VerbatimChar"/>
+    <w:rPr>
+      <w:color w:val="007020"/>
+      <w:b/>
+    </w:rPr>
+  </w:style>
+  <w:style w:customStyle="1" w:styleId="DataTypeTok" w:type="character">
+    <w:name w:val="DataTypeTok"/>
+    <w:basedOn w:val="VerbatimChar"/>
+    <w:rPr>
+      <w:color w:val="902000"/>
+    </w:rPr>
+  </w:style>
+  <w:style w:customStyle="1" w:styleId="DecValTok" w:type="character">
+    <w:name w:val="DecValTok"/>
+    <w:basedOn w:val="VerbatimChar"/>
+    <w:rPr>
+      <w:color w:val="40a070"/>
+    </w:rPr>
+  </w:style>
+  <w:style w:customStyle="1" w:styleId="BaseNTok" w:type="character">
+    <w:name w:val="BaseNTok"/>
+    <w:basedOn w:val="VerbatimChar"/>
+    <w:rPr>
+      <w:color w:val="40a070"/>
+    </w:rPr>
+  </w:style>
+  <w:style w:customStyle="1" w:styleId="FloatTok" w:type="character">
+    <w:name w:val="FloatTok"/>
+    <w:basedOn w:val="VerbatimChar"/>
+    <w:rPr>
+      <w:color w:val="40a070"/>
+    </w:rPr>
+  </w:style>
+  <w:style w:customStyle="1" w:styleId="ConstantTok" w:type="character">
+    <w:name w:val="ConstantTok"/>
+    <w:basedOn w:val="VerbatimChar"/>
+    <w:rPr>
+      <w:color w:val="880000"/>
+    </w:rPr>
+  </w:style>
+  <w:style w:customStyle="1" w:styleId="CharTok" w:type="character">
+    <w:name w:val="CharTok"/>
+    <w:basedOn w:val="VerbatimChar"/>
+    <w:rPr>
+      <w:color w:val="4070a0"/>
+    </w:rPr>
+  </w:style>
+  <w:style w:customStyle="1" w:styleId="SpecialCharTok" w:type="character">
+    <w:name w:val="SpecialCharTok"/>
+    <w:basedOn w:val="VerbatimChar"/>
+    <w:rPr>
+      <w:color w:val="4070a0"/>
+    </w:rPr>
+  </w:style>
+  <w:style w:customStyle="1" w:styleId="StringTok" w:type="character">
+    <w:name w:val="StringTok"/>
+    <w:basedOn w:val="VerbatimChar"/>
+    <w:rPr>
+      <w:color w:val="4070a0"/>
+    </w:rPr>
+  </w:style>
+  <w:style w:customStyle="1" w:styleId="VerbatimStringTok" w:type="character">
+    <w:name w:val="VerbatimStringTok"/>
+    <w:basedOn w:val="VerbatimChar"/>
+    <w:rPr>
+      <w:color w:val="4070a0"/>
+    </w:rPr>
+  </w:style>
+  <w:style w:customStyle="1" w:styleId="SpecialStringTok" w:type="character">
+    <w:name w:val="SpecialStringTok"/>
+    <w:basedOn w:val="VerbatimChar"/>
+    <w:rPr>
+      <w:color w:val="bb6688"/>
+    </w:rPr>
+  </w:style>
+  <w:style w:customStyle="1" w:styleId="ImportTok" w:type="character">
+    <w:name w:val="ImportTok"/>
+    <w:basedOn w:val="VerbatimChar"/>
+    <w:rPr>
+      <w:color w:val="008000"/>
+      <w:b/>
+    </w:rPr>
+  </w:style>
+  <w:style w:customStyle="1" w:styleId="CommentTok" w:type="character">
+    <w:name w:val="CommentTok"/>
+    <w:basedOn w:val="VerbatimChar"/>
+    <w:rPr>
+      <w:color w:val="60a0b0"/>
+      <w:i/>
+    </w:rPr>
+  </w:style>
+  <w:style w:customStyle="1" w:styleId="DocumentationTok" w:type="character">
+    <w:name w:val="DocumentationTok"/>
+    <w:basedOn w:val="VerbatimChar"/>
+    <w:rPr>
+      <w:color w:val="ba2121"/>
+      <w:i/>
+    </w:rPr>
+  </w:style>
+  <w:style w:customStyle="1" w:styleId="AnnotationTok" w:type="character">
+    <w:name w:val="AnnotationTok"/>
+    <w:basedOn w:val="VerbatimChar"/>
+    <w:rPr>
+      <w:color w:val="60a0b0"/>
+      <w:b/>
+      <w:i/>
+    </w:rPr>
+  </w:style>
+  <w:style w:customStyle="1" w:styleId="CommentVarTok" w:type="character">
+    <w:name w:val="CommentVarTok"/>
+    <w:basedOn w:val="VerbatimChar"/>
+    <w:rPr>
+      <w:color w:val="60a0b0"/>
+      <w:b/>
+      <w:i/>
+    </w:rPr>
+  </w:style>
+  <w:style w:customStyle="1" w:styleId="OtherTok" w:type="character">
+    <w:name w:val="OtherTok"/>
+    <w:basedOn w:val="VerbatimChar"/>
+    <w:rPr>
+      <w:color w:val="007020"/>
+    </w:rPr>
+  </w:style>
+  <w:style w:customStyle="1" w:styleId="FunctionTok" w:type="character">
+    <w:name w:val="FunctionTok"/>
+    <w:basedOn w:val="VerbatimChar"/>
+    <w:rPr>
+      <w:color w:val="06287e"/>
+    </w:rPr>
+  </w:style>
+  <w:style w:customStyle="1" w:styleId="VariableTok" w:type="character">
+    <w:name w:val="VariableTok"/>
+    <w:basedOn w:val="VerbatimChar"/>
+    <w:rPr>
+      <w:color w:val="19177c"/>
+    </w:rPr>
+  </w:style>
+  <w:style w:customStyle="1" w:styleId="ControlFlowTok" w:type="character">
+    <w:name w:val="ControlFlowTok"/>
+    <w:basedOn w:val="VerbatimChar"/>
+    <w:rPr>
+      <w:color w:val="007020"/>
+      <w:b/>
+    </w:rPr>
+  </w:style>
+  <w:style w:customStyle="1" w:styleId="OperatorTok" w:type="character">
+    <w:name w:val="OperatorTok"/>
+    <w:basedOn w:val="VerbatimChar"/>
+    <w:rPr>
+      <w:color w:val="666666"/>
+    </w:rPr>
+  </w:style>
+  <w:style w:customStyle="1" w:styleId="BuiltInTok" w:type="character">
+    <w:name w:val="BuiltInTok"/>
+    <w:basedOn w:val="VerbatimChar"/>
+    <w:rPr>
+      <w:color w:val="008000"/>
+    </w:rPr>
+  </w:style>
+  <w:style w:customStyle="1" w:styleId="ExtensionTok" w:type="character">
+    <w:name w:val="ExtensionTok"/>
+    <w:basedOn w:val="VerbatimChar"/>
+    <w:rPr/>
+  </w:style>
+  <w:style w:customStyle="1" w:styleId="PreprocessorTok" w:type="character">
+    <w:name w:val="PreprocessorTok"/>
+    <w:basedOn w:val="VerbatimChar"/>
+    <w:rPr>
+      <w:color w:val="bc7a00"/>
+    </w:rPr>
+  </w:style>
+  <w:style w:customStyle="1" w:styleId="AttributeTok" w:type="character">
+    <w:name w:val="AttributeTok"/>
+    <w:basedOn w:val="VerbatimChar"/>
+    <w:rPr>
+      <w:color w:val="7d9029"/>
+    </w:rPr>
+  </w:style>
+  <w:style w:customStyle="1" w:styleId="RegionMarkerTok" w:type="character">
+    <w:name w:val="RegionMarkerTok"/>
+    <w:basedOn w:val="VerbatimChar"/>
+    <w:rPr/>
+  </w:style>
+  <w:style w:customStyle="1" w:styleId="InformationTok" w:type="character">
+    <w:name w:val="InformationTok"/>
+    <w:basedOn w:val="VerbatimChar"/>
+    <w:rPr>
+      <w:color w:val="60a0b0"/>
+      <w:b/>
+      <w:i/>
+    </w:rPr>
+  </w:style>
+  <w:style w:customStyle="1" w:styleId="WarningTok" w:type="character">
+    <w:name w:val="WarningTok"/>
+    <w:basedOn w:val="VerbatimChar"/>
+    <w:rPr>
+      <w:color w:val="60a0b0"/>
+      <w:b/>
+      <w:i/>
+    </w:rPr>
+  </w:style>
+  <w:style w:customStyle="1" w:styleId="AlertTok" w:type="character">
+    <w:name w:val="AlertTok"/>
+    <w:basedOn w:val="VerbatimChar"/>
+    <w:rPr>
+      <w:color w:val="ff0000"/>
+      <w:b/>
+    </w:rPr>
+  </w:style>
+  <w:style w:customStyle="1" w:styleId="ErrorTok" w:type="character">
+    <w:name w:val="ErrorTok"/>
+    <w:basedOn w:val="VerbatimChar"/>
+    <w:rPr>
+      <w:color w:val="ff0000"/>
+      <w:b/>
+    </w:rPr>
+  </w:style>
+  <w:style w:customStyle="1" w:styleId="NormalTok" w:type="character">
+    <w:name w:val="NormalTok"/>
+    <w:basedOn w:val="VerbatimChar"/>
+    <w:rPr/>
+  </w:style>
+  <w:style w:customStyle="1" w:styleId="KeywordTok" w:type="character">
+    <w:name w:val="KeywordTok"/>
+    <w:basedOn w:val="VerbatimChar"/>
+    <w:rPr>
+      <w:color w:val="007020"/>
+      <w:b/>
+    </w:rPr>
+  </w:style>
+  <w:style w:customStyle="1" w:styleId="DataTypeTok" w:type="character">
+    <w:name w:val="DataTypeTok"/>
+    <w:basedOn w:val="VerbatimChar"/>
+    <w:rPr>
+      <w:color w:val="902000"/>
+    </w:rPr>
+  </w:style>
+  <w:style w:customStyle="1" w:styleId="DecValTok" w:type="character">
+    <w:name w:val="DecValTok"/>
+    <w:basedOn w:val="VerbatimChar"/>
+    <w:rPr>
+      <w:color w:val="40a070"/>
+    </w:rPr>
+  </w:style>
+  <w:style w:customStyle="1" w:styleId="BaseNTok" w:type="character">
+    <w:name w:val="BaseNTok"/>
+    <w:basedOn w:val="VerbatimChar"/>
+    <w:rPr>
+      <w:color w:val="40a070"/>
+    </w:rPr>
+  </w:style>
+  <w:style w:customStyle="1" w:styleId="FloatTok" w:type="character">
+    <w:name w:val="FloatTok"/>
+    <w:basedOn w:val="VerbatimChar"/>
+    <w:rPr>
+      <w:color w:val="40a070"/>
+    </w:rPr>
+  </w:style>
+  <w:style w:customStyle="1" w:styleId="ConstantTok" w:type="character">
+    <w:name w:val="ConstantTok"/>
+    <w:basedOn w:val="VerbatimChar"/>
+    <w:rPr>
+      <w:color w:val="880000"/>
+    </w:rPr>
+  </w:style>
+  <w:style w:customStyle="1" w:styleId="CharTok" w:type="character">
+    <w:name w:val="CharTok"/>
+    <w:basedOn w:val="VerbatimChar"/>
+    <w:rPr>
+      <w:color w:val="4070a0"/>
+    </w:rPr>
+  </w:style>
+  <w:style w:customStyle="1" w:styleId="SpecialCharTok" w:type="character">
+    <w:name w:val="SpecialCharTok"/>
+    <w:basedOn w:val="VerbatimChar"/>
+    <w:rPr>
+      <w:color w:val="4070a0"/>
+    </w:rPr>
+  </w:style>
+  <w:style w:customStyle="1" w:styleId="StringTok" w:type="character">
+    <w:name w:val="StringTok"/>
+    <w:basedOn w:val="VerbatimChar"/>
+    <w:rPr>
+      <w:color w:val="4070a0"/>
+    </w:rPr>
+  </w:style>
+  <w:style w:customStyle="1" w:styleId="VerbatimStringTok" w:type="character">
+    <w:name w:val="VerbatimStringTok"/>
+    <w:basedOn w:val="VerbatimChar"/>
+    <w:rPr>
+      <w:color w:val="4070a0"/>
+    </w:rPr>
+  </w:style>
+  <w:style w:customStyle="1" w:styleId="SpecialStringTok" w:type="character">
+    <w:name w:val="SpecialStringTok"/>
+    <w:basedOn w:val="VerbatimChar"/>
+    <w:rPr>
+      <w:color w:val="bb6688"/>
+    </w:rPr>
+  </w:style>
+  <w:style w:customStyle="1" w:styleId="ImportTok" w:type="character">
+    <w:name w:val="ImportTok"/>
+    <w:basedOn w:val="VerbatimChar"/>
+    <w:rPr>
+      <w:color w:val="008000"/>
+      <w:b/>
+    </w:rPr>
+  </w:style>
+  <w:style w:customStyle="1" w:styleId="CommentTok" w:type="character">
+    <w:name w:val="CommentTok"/>
+    <w:basedOn w:val="VerbatimChar"/>
+    <w:rPr>
+      <w:color w:val="60a0b0"/>
+      <w:i/>
+    </w:rPr>
+  </w:style>
+  <w:style w:customStyle="1" w:styleId="DocumentationTok" w:type="character">
+    <w:name w:val="DocumentationTok"/>
+    <w:basedOn w:val="VerbatimChar"/>
+    <w:rPr>
+      <w:color w:val="ba2121"/>
+      <w:i/>
+    </w:rPr>
+  </w:style>
+  <w:style w:customStyle="1" w:styleId="AnnotationTok" w:type="character">
+    <w:name w:val="AnnotationTok"/>
+    <w:basedOn w:val="VerbatimChar"/>
+    <w:rPr>
+      <w:color w:val="60a0b0"/>
+      <w:b/>
+      <w:i/>
+    </w:rPr>
+  </w:style>
+  <w:style w:customStyle="1" w:styleId="CommentVarTok" w:type="character">
+    <w:name w:val="CommentVarTok"/>
+    <w:basedOn w:val="VerbatimChar"/>
+    <w:rPr>
+      <w:color w:val="60a0b0"/>
+      <w:b/>
+      <w:i/>
+    </w:rPr>
+  </w:style>
+  <w:style w:customStyle="1" w:styleId="OtherTok" w:type="character">
+    <w:name w:val="OtherTok"/>
+    <w:basedOn w:val="VerbatimChar"/>
+    <w:rPr>
+      <w:color w:val="007020"/>
+    </w:rPr>
+  </w:style>
+  <w:style w:customStyle="1" w:styleId="FunctionTok" w:type="character">
+    <w:name w:val="FunctionTok"/>
+    <w:basedOn w:val="VerbatimChar"/>
+    <w:rPr>
+      <w:color w:val="06287e"/>
+    </w:rPr>
+  </w:style>
+  <w:style w:customStyle="1" w:styleId="VariableTok" w:type="character">
+    <w:name w:val="VariableTok"/>
+    <w:basedOn w:val="VerbatimChar"/>
+    <w:rPr>
+      <w:color w:val="19177c"/>
+    </w:rPr>
+  </w:style>
+  <w:style w:customStyle="1" w:styleId="ControlFlowTok" w:type="character">
+    <w:name w:val="ControlFlowTok"/>
+    <w:basedOn w:val="VerbatimChar"/>
+    <w:rPr>
+      <w:color w:val="007020"/>
+      <w:b/>
+    </w:rPr>
+  </w:style>
+  <w:style w:customStyle="1" w:styleId="OperatorTok" w:type="character">
+    <w:name w:val="OperatorTok"/>
+    <w:basedOn w:val="VerbatimChar"/>
+    <w:rPr>
+      <w:color w:val="666666"/>
+    </w:rPr>
+  </w:style>
+  <w:style w:customStyle="1" w:styleId="BuiltInTok" w:type="character">
+    <w:name w:val="BuiltInTok"/>
+    <w:basedOn w:val="VerbatimChar"/>
+    <w:rPr>
+      <w:color w:val="008000"/>
+    </w:rPr>
+  </w:style>
+  <w:style w:customStyle="1" w:styleId="ExtensionTok" w:type="character">
+    <w:name w:val="ExtensionTok"/>
+    <w:basedOn w:val="VerbatimChar"/>
+    <w:rPr/>
+  </w:style>
+  <w:style w:customStyle="1" w:styleId="PreprocessorTok" w:type="character">
+    <w:name w:val="PreprocessorTok"/>
+    <w:basedOn w:val="VerbatimChar"/>
+    <w:rPr>
+      <w:color w:val="bc7a00"/>
+    </w:rPr>
+  </w:style>
+  <w:style w:customStyle="1" w:styleId="AttributeTok" w:type="character">
+    <w:name w:val="AttributeTok"/>
+    <w:basedOn w:val="VerbatimChar"/>
+    <w:rPr>
+      <w:color w:val="7d9029"/>
+    </w:rPr>
+  </w:style>
+  <w:style w:customStyle="1" w:styleId="RegionMarkerTok" w:type="character">
+    <w:name w:val="RegionMarkerTok"/>
+    <w:basedOn w:val="VerbatimChar"/>
+    <w:rPr/>
+  </w:style>
+  <w:style w:customStyle="1" w:styleId="InformationTok" w:type="character">
+    <w:name w:val="InformationTok"/>
+    <w:basedOn w:val="VerbatimChar"/>
+    <w:rPr>
+      <w:color w:val="60a0b0"/>
+      <w:b/>
+      <w:i/>
+    </w:rPr>
+  </w:style>
+  <w:style w:customStyle="1" w:styleId="WarningTok" w:type="character">
+    <w:name w:val="WarningTok"/>
+    <w:basedOn w:val="VerbatimChar"/>
+    <w:rPr>
+      <w:color w:val="60a0b0"/>
+      <w:b/>
+      <w:i/>
+    </w:rPr>
+  </w:style>
+  <w:style w:customStyle="1" w:styleId="AlertTok" w:type="character">
+    <w:name w:val="AlertTok"/>
+    <w:basedOn w:val="VerbatimChar"/>
+    <w:rPr>
+      <w:color w:val="ff0000"/>
+      <w:b/>
+    </w:rPr>
+  </w:style>
+  <w:style w:customStyle="1" w:styleId="ErrorTok" w:type="character">
+    <w:name w:val="ErrorTok"/>
+    <w:basedOn w:val="VerbatimChar"/>
+    <w:rPr>
+      <w:color w:val="ff0000"/>
+      <w:b/>
     </w:rPr>
   </w:style>
   <w:style w:customStyle="1" w:styleId="NormalTok" w:type="character">

</xml_diff>

<commit_message>
feat(cases): open cases by inspector in the shared-case search
Choosing an inspector in Search shared case records lists that inspector's open
cases from the verified Reporting Index summaries (GET /cases/by-inspector,
read-only), with an Unassigned or former inspector choice and a plain note when
case files could not be included. Selecting a case prompts to import a new
inspection result and opens Import inspection with the case number ready;
an import already awaiting review is continued, and one for a different case
must be finished first. Staff guide and manual updated.

Co-Authored-By: Claude Sonnet 5.5 <noreply@anthropic.com>
Claude-Session: https://claude.ai/code/session_01WPJAZGfD47jPUEgCNYYSg7
</commit_message>
<xml_diff>
--- a/docs/staff/Program_Instruction_Manual.docx
+++ b/docs/staff/Program_Instruction_Manual.docx
@@ -3901,6 +3901,24 @@
       </w:r>
       <w:r>
         <w:t xml:space="preserve">Use the shared search, also in Workspace’s Start or find case work area, when a case is not loaded in Workspace. Review identity and open it through the existing shared-history checks. A search result does not override a conflict, active draft or unreadable record.</w:t>
+      </w:r>
+    </w:p>
+    <w:p>
+      <w:pPr>
+        <w:pStyle w:val="BodyText"/>
+      </w:pPr>
+      <w:r>
+        <w:rPr>
+          <w:bCs/>
+          <w:b/>
+        </w:rPr>
+        <w:t xml:space="preserve">Open cases by inspector.</w:t>
+      </w:r>
+      <w:r>
+        <w:t xml:space="preserve"> </w:t>
+      </w:r>
+      <w:r>
+        <w:t xml:space="preserve">In the same Search shared case records window, choose an inspector under Open cases by inspector and select Show open cases. The list shows that inspector’s cases that are not closed or withdrawn, soonest deadline first, using the same rule as the Open cases report. A case belongs to the inspector assigned on the case; Unassigned or former inspector lists cases with no assigned inspector or one who is not on the division’s list. If some case files were left out because their summary is missing, out of date or unreadable, the list says how many and may be incomplete. Select Continue case beside a case: Writer asks you to import a new inspection result to continue it. Import inspection opens with that case number ready; select Find Accela inspection to look it up. If an inspection for that case is already imported and waiting, you can continue with it instead. If an import for a different case is waiting, finish or cancel it first. Open case without importing opens the case as before. Nothing is imported, issued or changed until you complete the import steps yourself.</w:t>
       </w:r>
     </w:p>
     <w:p>
@@ -5927,7 +5945,7 @@
         <w:pStyle w:val="BodyText"/>
       </w:pPr>
       <w:r>
-        <w:t xml:space="preserve">Manual source digest d105d1316311d704.</w:t>
+        <w:t xml:space="preserve">Manual source digest 31fd9d91c44091b0.</w:t>
       </w:r>
     </w:p>
     <w:bookmarkEnd w:id="41"/>
@@ -22972,6 +22990,232 @@
     <w:rPr>
       <w:b/>
       <w:color w:val="ff0000"/>
+    </w:rPr>
+  </w:style>
+  <w:style w:customStyle="1" w:styleId="NormalTok" w:type="character">
+    <w:name w:val="NormalTok"/>
+    <w:basedOn w:val="VerbatimChar"/>
+    <w:rPr/>
+  </w:style>
+  <w:style w:customStyle="1" w:styleId="KeywordTok" w:type="character">
+    <w:name w:val="KeywordTok"/>
+    <w:basedOn w:val="VerbatimChar"/>
+    <w:rPr>
+      <w:color w:val="007020"/>
+      <w:b/>
+    </w:rPr>
+  </w:style>
+  <w:style w:customStyle="1" w:styleId="DataTypeTok" w:type="character">
+    <w:name w:val="DataTypeTok"/>
+    <w:basedOn w:val="VerbatimChar"/>
+    <w:rPr>
+      <w:color w:val="902000"/>
+    </w:rPr>
+  </w:style>
+  <w:style w:customStyle="1" w:styleId="DecValTok" w:type="character">
+    <w:name w:val="DecValTok"/>
+    <w:basedOn w:val="VerbatimChar"/>
+    <w:rPr>
+      <w:color w:val="40a070"/>
+    </w:rPr>
+  </w:style>
+  <w:style w:customStyle="1" w:styleId="BaseNTok" w:type="character">
+    <w:name w:val="BaseNTok"/>
+    <w:basedOn w:val="VerbatimChar"/>
+    <w:rPr>
+      <w:color w:val="40a070"/>
+    </w:rPr>
+  </w:style>
+  <w:style w:customStyle="1" w:styleId="FloatTok" w:type="character">
+    <w:name w:val="FloatTok"/>
+    <w:basedOn w:val="VerbatimChar"/>
+    <w:rPr>
+      <w:color w:val="40a070"/>
+    </w:rPr>
+  </w:style>
+  <w:style w:customStyle="1" w:styleId="ConstantTok" w:type="character">
+    <w:name w:val="ConstantTok"/>
+    <w:basedOn w:val="VerbatimChar"/>
+    <w:rPr>
+      <w:color w:val="880000"/>
+    </w:rPr>
+  </w:style>
+  <w:style w:customStyle="1" w:styleId="CharTok" w:type="character">
+    <w:name w:val="CharTok"/>
+    <w:basedOn w:val="VerbatimChar"/>
+    <w:rPr>
+      <w:color w:val="4070a0"/>
+    </w:rPr>
+  </w:style>
+  <w:style w:customStyle="1" w:styleId="SpecialCharTok" w:type="character">
+    <w:name w:val="SpecialCharTok"/>
+    <w:basedOn w:val="VerbatimChar"/>
+    <w:rPr>
+      <w:color w:val="4070a0"/>
+    </w:rPr>
+  </w:style>
+  <w:style w:customStyle="1" w:styleId="StringTok" w:type="character">
+    <w:name w:val="StringTok"/>
+    <w:basedOn w:val="VerbatimChar"/>
+    <w:rPr>
+      <w:color w:val="4070a0"/>
+    </w:rPr>
+  </w:style>
+  <w:style w:customStyle="1" w:styleId="VerbatimStringTok" w:type="character">
+    <w:name w:val="VerbatimStringTok"/>
+    <w:basedOn w:val="VerbatimChar"/>
+    <w:rPr>
+      <w:color w:val="4070a0"/>
+    </w:rPr>
+  </w:style>
+  <w:style w:customStyle="1" w:styleId="SpecialStringTok" w:type="character">
+    <w:name w:val="SpecialStringTok"/>
+    <w:basedOn w:val="VerbatimChar"/>
+    <w:rPr>
+      <w:color w:val="bb6688"/>
+    </w:rPr>
+  </w:style>
+  <w:style w:customStyle="1" w:styleId="ImportTok" w:type="character">
+    <w:name w:val="ImportTok"/>
+    <w:basedOn w:val="VerbatimChar"/>
+    <w:rPr>
+      <w:color w:val="008000"/>
+      <w:b/>
+    </w:rPr>
+  </w:style>
+  <w:style w:customStyle="1" w:styleId="CommentTok" w:type="character">
+    <w:name w:val="CommentTok"/>
+    <w:basedOn w:val="VerbatimChar"/>
+    <w:rPr>
+      <w:color w:val="60a0b0"/>
+      <w:i/>
+    </w:rPr>
+  </w:style>
+  <w:style w:customStyle="1" w:styleId="DocumentationTok" w:type="character">
+    <w:name w:val="DocumentationTok"/>
+    <w:basedOn w:val="VerbatimChar"/>
+    <w:rPr>
+      <w:color w:val="ba2121"/>
+      <w:i/>
+    </w:rPr>
+  </w:style>
+  <w:style w:customStyle="1" w:styleId="AnnotationTok" w:type="character">
+    <w:name w:val="AnnotationTok"/>
+    <w:basedOn w:val="VerbatimChar"/>
+    <w:rPr>
+      <w:color w:val="60a0b0"/>
+      <w:b/>
+      <w:i/>
+    </w:rPr>
+  </w:style>
+  <w:style w:customStyle="1" w:styleId="CommentVarTok" w:type="character">
+    <w:name w:val="CommentVarTok"/>
+    <w:basedOn w:val="VerbatimChar"/>
+    <w:rPr>
+      <w:color w:val="60a0b0"/>
+      <w:b/>
+      <w:i/>
+    </w:rPr>
+  </w:style>
+  <w:style w:customStyle="1" w:styleId="OtherTok" w:type="character">
+    <w:name w:val="OtherTok"/>
+    <w:basedOn w:val="VerbatimChar"/>
+    <w:rPr>
+      <w:color w:val="007020"/>
+    </w:rPr>
+  </w:style>
+  <w:style w:customStyle="1" w:styleId="FunctionTok" w:type="character">
+    <w:name w:val="FunctionTok"/>
+    <w:basedOn w:val="VerbatimChar"/>
+    <w:rPr>
+      <w:color w:val="06287e"/>
+    </w:rPr>
+  </w:style>
+  <w:style w:customStyle="1" w:styleId="VariableTok" w:type="character">
+    <w:name w:val="VariableTok"/>
+    <w:basedOn w:val="VerbatimChar"/>
+    <w:rPr>
+      <w:color w:val="19177c"/>
+    </w:rPr>
+  </w:style>
+  <w:style w:customStyle="1" w:styleId="ControlFlowTok" w:type="character">
+    <w:name w:val="ControlFlowTok"/>
+    <w:basedOn w:val="VerbatimChar"/>
+    <w:rPr>
+      <w:color w:val="007020"/>
+      <w:b/>
+    </w:rPr>
+  </w:style>
+  <w:style w:customStyle="1" w:styleId="OperatorTok" w:type="character">
+    <w:name w:val="OperatorTok"/>
+    <w:basedOn w:val="VerbatimChar"/>
+    <w:rPr>
+      <w:color w:val="666666"/>
+    </w:rPr>
+  </w:style>
+  <w:style w:customStyle="1" w:styleId="BuiltInTok" w:type="character">
+    <w:name w:val="BuiltInTok"/>
+    <w:basedOn w:val="VerbatimChar"/>
+    <w:rPr>
+      <w:color w:val="008000"/>
+    </w:rPr>
+  </w:style>
+  <w:style w:customStyle="1" w:styleId="ExtensionTok" w:type="character">
+    <w:name w:val="ExtensionTok"/>
+    <w:basedOn w:val="VerbatimChar"/>
+    <w:rPr/>
+  </w:style>
+  <w:style w:customStyle="1" w:styleId="PreprocessorTok" w:type="character">
+    <w:name w:val="PreprocessorTok"/>
+    <w:basedOn w:val="VerbatimChar"/>
+    <w:rPr>
+      <w:color w:val="bc7a00"/>
+    </w:rPr>
+  </w:style>
+  <w:style w:customStyle="1" w:styleId="AttributeTok" w:type="character">
+    <w:name w:val="AttributeTok"/>
+    <w:basedOn w:val="VerbatimChar"/>
+    <w:rPr>
+      <w:color w:val="7d9029"/>
+    </w:rPr>
+  </w:style>
+  <w:style w:customStyle="1" w:styleId="RegionMarkerTok" w:type="character">
+    <w:name w:val="RegionMarkerTok"/>
+    <w:basedOn w:val="VerbatimChar"/>
+    <w:rPr/>
+  </w:style>
+  <w:style w:customStyle="1" w:styleId="InformationTok" w:type="character">
+    <w:name w:val="InformationTok"/>
+    <w:basedOn w:val="VerbatimChar"/>
+    <w:rPr>
+      <w:color w:val="60a0b0"/>
+      <w:b/>
+      <w:i/>
+    </w:rPr>
+  </w:style>
+  <w:style w:customStyle="1" w:styleId="WarningTok" w:type="character">
+    <w:name w:val="WarningTok"/>
+    <w:basedOn w:val="VerbatimChar"/>
+    <w:rPr>
+      <w:color w:val="60a0b0"/>
+      <w:b/>
+      <w:i/>
+    </w:rPr>
+  </w:style>
+  <w:style w:customStyle="1" w:styleId="AlertTok" w:type="character">
+    <w:name w:val="AlertTok"/>
+    <w:basedOn w:val="VerbatimChar"/>
+    <w:rPr>
+      <w:color w:val="ff0000"/>
+      <w:b/>
+    </w:rPr>
+  </w:style>
+  <w:style w:customStyle="1" w:styleId="ErrorTok" w:type="character">
+    <w:name w:val="ErrorTok"/>
+    <w:basedOn w:val="VerbatimChar"/>
+    <w:rPr>
+      <w:color w:val="ff0000"/>
+      <w:b/>
     </w:rPr>
   </w:style>
   <w:style w:customStyle="1" w:styleId="NormalTok" w:type="character">

</xml_diff>

<commit_message>
feat(agents): distinguish the queue's filing button and add an agent guide (#361)
The Workspace queue button that opens an issued document with an unfiled PDF
was labelled "File issued PDF", the same as the button inside the document
that files it. It now reads "Open document to file PDF". Adds
docs/agents/README.md describing how automation can run and drive the program
today, what it must not do, and the known gaps. The retained queue original is
compared with exactly that one label change; no other assertion changed.


Claude-Session: https://claude.ai/code/session_01WPJAZGfD47jPUEgCNYYSg7

Co-authored-by: Claude <noreply@anthropic.com>
</commit_message>
<xml_diff>
--- a/docs/staff/Program_Instruction_Manual.docx
+++ b/docs/staff/Program_Instruction_Manual.docx
@@ -2564,7 +2564,7 @@
               <w:jc w:val="left"/>
             </w:pPr>
             <w:r>
-              <w:t xml:space="preserve">Open the issued action and File issued PDF or review its original filing status</w:t>
+              <w:t xml:space="preserve">Use Open document to file PDF, then File issued PDF in the document, or review its original filing status</w:t>
             </w:r>
           </w:p>
         </w:tc>
@@ -5927,7 +5927,7 @@
         <w:pStyle w:val="BodyText"/>
       </w:pPr>
       <w:r>
-        <w:t xml:space="preserve">Manual source digest d105d1316311d704.</w:t>
+        <w:t xml:space="preserve">Manual source digest 6e5b6811782c9300.</w:t>
       </w:r>
     </w:p>
     <w:bookmarkEnd w:id="41"/>
@@ -22972,6 +22972,458 @@
     <w:rPr>
       <w:b/>
       <w:color w:val="ff0000"/>
+    </w:rPr>
+  </w:style>
+  <w:style w:customStyle="1" w:styleId="NormalTok" w:type="character">
+    <w:name w:val="NormalTok"/>
+    <w:basedOn w:val="VerbatimChar"/>
+    <w:rPr/>
+  </w:style>
+  <w:style w:customStyle="1" w:styleId="KeywordTok" w:type="character">
+    <w:name w:val="KeywordTok"/>
+    <w:basedOn w:val="VerbatimChar"/>
+    <w:rPr>
+      <w:color w:val="007020"/>
+      <w:b/>
+    </w:rPr>
+  </w:style>
+  <w:style w:customStyle="1" w:styleId="DataTypeTok" w:type="character">
+    <w:name w:val="DataTypeTok"/>
+    <w:basedOn w:val="VerbatimChar"/>
+    <w:rPr>
+      <w:color w:val="902000"/>
+    </w:rPr>
+  </w:style>
+  <w:style w:customStyle="1" w:styleId="DecValTok" w:type="character">
+    <w:name w:val="DecValTok"/>
+    <w:basedOn w:val="VerbatimChar"/>
+    <w:rPr>
+      <w:color w:val="40a070"/>
+    </w:rPr>
+  </w:style>
+  <w:style w:customStyle="1" w:styleId="BaseNTok" w:type="character">
+    <w:name w:val="BaseNTok"/>
+    <w:basedOn w:val="VerbatimChar"/>
+    <w:rPr>
+      <w:color w:val="40a070"/>
+    </w:rPr>
+  </w:style>
+  <w:style w:customStyle="1" w:styleId="FloatTok" w:type="character">
+    <w:name w:val="FloatTok"/>
+    <w:basedOn w:val="VerbatimChar"/>
+    <w:rPr>
+      <w:color w:val="40a070"/>
+    </w:rPr>
+  </w:style>
+  <w:style w:customStyle="1" w:styleId="ConstantTok" w:type="character">
+    <w:name w:val="ConstantTok"/>
+    <w:basedOn w:val="VerbatimChar"/>
+    <w:rPr>
+      <w:color w:val="880000"/>
+    </w:rPr>
+  </w:style>
+  <w:style w:customStyle="1" w:styleId="CharTok" w:type="character">
+    <w:name w:val="CharTok"/>
+    <w:basedOn w:val="VerbatimChar"/>
+    <w:rPr>
+      <w:color w:val="4070a0"/>
+    </w:rPr>
+  </w:style>
+  <w:style w:customStyle="1" w:styleId="SpecialCharTok" w:type="character">
+    <w:name w:val="SpecialCharTok"/>
+    <w:basedOn w:val="VerbatimChar"/>
+    <w:rPr>
+      <w:color w:val="4070a0"/>
+    </w:rPr>
+  </w:style>
+  <w:style w:customStyle="1" w:styleId="StringTok" w:type="character">
+    <w:name w:val="StringTok"/>
+    <w:basedOn w:val="VerbatimChar"/>
+    <w:rPr>
+      <w:color w:val="4070a0"/>
+    </w:rPr>
+  </w:style>
+  <w:style w:customStyle="1" w:styleId="VerbatimStringTok" w:type="character">
+    <w:name w:val="VerbatimStringTok"/>
+    <w:basedOn w:val="VerbatimChar"/>
+    <w:rPr>
+      <w:color w:val="4070a0"/>
+    </w:rPr>
+  </w:style>
+  <w:style w:customStyle="1" w:styleId="SpecialStringTok" w:type="character">
+    <w:name w:val="SpecialStringTok"/>
+    <w:basedOn w:val="VerbatimChar"/>
+    <w:rPr>
+      <w:color w:val="bb6688"/>
+    </w:rPr>
+  </w:style>
+  <w:style w:customStyle="1" w:styleId="ImportTok" w:type="character">
+    <w:name w:val="ImportTok"/>
+    <w:basedOn w:val="VerbatimChar"/>
+    <w:rPr>
+      <w:color w:val="008000"/>
+      <w:b/>
+    </w:rPr>
+  </w:style>
+  <w:style w:customStyle="1" w:styleId="CommentTok" w:type="character">
+    <w:name w:val="CommentTok"/>
+    <w:basedOn w:val="VerbatimChar"/>
+    <w:rPr>
+      <w:color w:val="60a0b0"/>
+      <w:i/>
+    </w:rPr>
+  </w:style>
+  <w:style w:customStyle="1" w:styleId="DocumentationTok" w:type="character">
+    <w:name w:val="DocumentationTok"/>
+    <w:basedOn w:val="VerbatimChar"/>
+    <w:rPr>
+      <w:color w:val="ba2121"/>
+      <w:i/>
+    </w:rPr>
+  </w:style>
+  <w:style w:customStyle="1" w:styleId="AnnotationTok" w:type="character">
+    <w:name w:val="AnnotationTok"/>
+    <w:basedOn w:val="VerbatimChar"/>
+    <w:rPr>
+      <w:color w:val="60a0b0"/>
+      <w:b/>
+      <w:i/>
+    </w:rPr>
+  </w:style>
+  <w:style w:customStyle="1" w:styleId="CommentVarTok" w:type="character">
+    <w:name w:val="CommentVarTok"/>
+    <w:basedOn w:val="VerbatimChar"/>
+    <w:rPr>
+      <w:color w:val="60a0b0"/>
+      <w:b/>
+      <w:i/>
+    </w:rPr>
+  </w:style>
+  <w:style w:customStyle="1" w:styleId="OtherTok" w:type="character">
+    <w:name w:val="OtherTok"/>
+    <w:basedOn w:val="VerbatimChar"/>
+    <w:rPr>
+      <w:color w:val="007020"/>
+    </w:rPr>
+  </w:style>
+  <w:style w:customStyle="1" w:styleId="FunctionTok" w:type="character">
+    <w:name w:val="FunctionTok"/>
+    <w:basedOn w:val="VerbatimChar"/>
+    <w:rPr>
+      <w:color w:val="06287e"/>
+    </w:rPr>
+  </w:style>
+  <w:style w:customStyle="1" w:styleId="VariableTok" w:type="character">
+    <w:name w:val="VariableTok"/>
+    <w:basedOn w:val="VerbatimChar"/>
+    <w:rPr>
+      <w:color w:val="19177c"/>
+    </w:rPr>
+  </w:style>
+  <w:style w:customStyle="1" w:styleId="ControlFlowTok" w:type="character">
+    <w:name w:val="ControlFlowTok"/>
+    <w:basedOn w:val="VerbatimChar"/>
+    <w:rPr>
+      <w:color w:val="007020"/>
+      <w:b/>
+    </w:rPr>
+  </w:style>
+  <w:style w:customStyle="1" w:styleId="OperatorTok" w:type="character">
+    <w:name w:val="OperatorTok"/>
+    <w:basedOn w:val="VerbatimChar"/>
+    <w:rPr>
+      <w:color w:val="666666"/>
+    </w:rPr>
+  </w:style>
+  <w:style w:customStyle="1" w:styleId="BuiltInTok" w:type="character">
+    <w:name w:val="BuiltInTok"/>
+    <w:basedOn w:val="VerbatimChar"/>
+    <w:rPr>
+      <w:color w:val="008000"/>
+    </w:rPr>
+  </w:style>
+  <w:style w:customStyle="1" w:styleId="ExtensionTok" w:type="character">
+    <w:name w:val="ExtensionTok"/>
+    <w:basedOn w:val="VerbatimChar"/>
+    <w:rPr/>
+  </w:style>
+  <w:style w:customStyle="1" w:styleId="PreprocessorTok" w:type="character">
+    <w:name w:val="PreprocessorTok"/>
+    <w:basedOn w:val="VerbatimChar"/>
+    <w:rPr>
+      <w:color w:val="bc7a00"/>
+    </w:rPr>
+  </w:style>
+  <w:style w:customStyle="1" w:styleId="AttributeTok" w:type="character">
+    <w:name w:val="AttributeTok"/>
+    <w:basedOn w:val="VerbatimChar"/>
+    <w:rPr>
+      <w:color w:val="7d9029"/>
+    </w:rPr>
+  </w:style>
+  <w:style w:customStyle="1" w:styleId="RegionMarkerTok" w:type="character">
+    <w:name w:val="RegionMarkerTok"/>
+    <w:basedOn w:val="VerbatimChar"/>
+    <w:rPr/>
+  </w:style>
+  <w:style w:customStyle="1" w:styleId="InformationTok" w:type="character">
+    <w:name w:val="InformationTok"/>
+    <w:basedOn w:val="VerbatimChar"/>
+    <w:rPr>
+      <w:color w:val="60a0b0"/>
+      <w:b/>
+      <w:i/>
+    </w:rPr>
+  </w:style>
+  <w:style w:customStyle="1" w:styleId="WarningTok" w:type="character">
+    <w:name w:val="WarningTok"/>
+    <w:basedOn w:val="VerbatimChar"/>
+    <w:rPr>
+      <w:color w:val="60a0b0"/>
+      <w:b/>
+      <w:i/>
+    </w:rPr>
+  </w:style>
+  <w:style w:customStyle="1" w:styleId="AlertTok" w:type="character">
+    <w:name w:val="AlertTok"/>
+    <w:basedOn w:val="VerbatimChar"/>
+    <w:rPr>
+      <w:color w:val="ff0000"/>
+      <w:b/>
+    </w:rPr>
+  </w:style>
+  <w:style w:customStyle="1" w:styleId="ErrorTok" w:type="character">
+    <w:name w:val="ErrorTok"/>
+    <w:basedOn w:val="VerbatimChar"/>
+    <w:rPr>
+      <w:color w:val="ff0000"/>
+      <w:b/>
+    </w:rPr>
+  </w:style>
+  <w:style w:customStyle="1" w:styleId="NormalTok" w:type="character">
+    <w:name w:val="NormalTok"/>
+    <w:basedOn w:val="VerbatimChar"/>
+    <w:rPr/>
+  </w:style>
+  <w:style w:customStyle="1" w:styleId="KeywordTok" w:type="character">
+    <w:name w:val="KeywordTok"/>
+    <w:basedOn w:val="VerbatimChar"/>
+    <w:rPr>
+      <w:color w:val="007020"/>
+      <w:b/>
+    </w:rPr>
+  </w:style>
+  <w:style w:customStyle="1" w:styleId="DataTypeTok" w:type="character">
+    <w:name w:val="DataTypeTok"/>
+    <w:basedOn w:val="VerbatimChar"/>
+    <w:rPr>
+      <w:color w:val="902000"/>
+    </w:rPr>
+  </w:style>
+  <w:style w:customStyle="1" w:styleId="DecValTok" w:type="character">
+    <w:name w:val="DecValTok"/>
+    <w:basedOn w:val="VerbatimChar"/>
+    <w:rPr>
+      <w:color w:val="40a070"/>
+    </w:rPr>
+  </w:style>
+  <w:style w:customStyle="1" w:styleId="BaseNTok" w:type="character">
+    <w:name w:val="BaseNTok"/>
+    <w:basedOn w:val="VerbatimChar"/>
+    <w:rPr>
+      <w:color w:val="40a070"/>
+    </w:rPr>
+  </w:style>
+  <w:style w:customStyle="1" w:styleId="FloatTok" w:type="character">
+    <w:name w:val="FloatTok"/>
+    <w:basedOn w:val="VerbatimChar"/>
+    <w:rPr>
+      <w:color w:val="40a070"/>
+    </w:rPr>
+  </w:style>
+  <w:style w:customStyle="1" w:styleId="ConstantTok" w:type="character">
+    <w:name w:val="ConstantTok"/>
+    <w:basedOn w:val="VerbatimChar"/>
+    <w:rPr>
+      <w:color w:val="880000"/>
+    </w:rPr>
+  </w:style>
+  <w:style w:customStyle="1" w:styleId="CharTok" w:type="character">
+    <w:name w:val="CharTok"/>
+    <w:basedOn w:val="VerbatimChar"/>
+    <w:rPr>
+      <w:color w:val="4070a0"/>
+    </w:rPr>
+  </w:style>
+  <w:style w:customStyle="1" w:styleId="SpecialCharTok" w:type="character">
+    <w:name w:val="SpecialCharTok"/>
+    <w:basedOn w:val="VerbatimChar"/>
+    <w:rPr>
+      <w:color w:val="4070a0"/>
+    </w:rPr>
+  </w:style>
+  <w:style w:customStyle="1" w:styleId="StringTok" w:type="character">
+    <w:name w:val="StringTok"/>
+    <w:basedOn w:val="VerbatimChar"/>
+    <w:rPr>
+      <w:color w:val="4070a0"/>
+    </w:rPr>
+  </w:style>
+  <w:style w:customStyle="1" w:styleId="VerbatimStringTok" w:type="character">
+    <w:name w:val="VerbatimStringTok"/>
+    <w:basedOn w:val="VerbatimChar"/>
+    <w:rPr>
+      <w:color w:val="4070a0"/>
+    </w:rPr>
+  </w:style>
+  <w:style w:customStyle="1" w:styleId="SpecialStringTok" w:type="character">
+    <w:name w:val="SpecialStringTok"/>
+    <w:basedOn w:val="VerbatimChar"/>
+    <w:rPr>
+      <w:color w:val="bb6688"/>
+    </w:rPr>
+  </w:style>
+  <w:style w:customStyle="1" w:styleId="ImportTok" w:type="character">
+    <w:name w:val="ImportTok"/>
+    <w:basedOn w:val="VerbatimChar"/>
+    <w:rPr>
+      <w:color w:val="008000"/>
+      <w:b/>
+    </w:rPr>
+  </w:style>
+  <w:style w:customStyle="1" w:styleId="CommentTok" w:type="character">
+    <w:name w:val="CommentTok"/>
+    <w:basedOn w:val="VerbatimChar"/>
+    <w:rPr>
+      <w:color w:val="60a0b0"/>
+      <w:i/>
+    </w:rPr>
+  </w:style>
+  <w:style w:customStyle="1" w:styleId="DocumentationTok" w:type="character">
+    <w:name w:val="DocumentationTok"/>
+    <w:basedOn w:val="VerbatimChar"/>
+    <w:rPr>
+      <w:color w:val="ba2121"/>
+      <w:i/>
+    </w:rPr>
+  </w:style>
+  <w:style w:customStyle="1" w:styleId="AnnotationTok" w:type="character">
+    <w:name w:val="AnnotationTok"/>
+    <w:basedOn w:val="VerbatimChar"/>
+    <w:rPr>
+      <w:color w:val="60a0b0"/>
+      <w:b/>
+      <w:i/>
+    </w:rPr>
+  </w:style>
+  <w:style w:customStyle="1" w:styleId="CommentVarTok" w:type="character">
+    <w:name w:val="CommentVarTok"/>
+    <w:basedOn w:val="VerbatimChar"/>
+    <w:rPr>
+      <w:color w:val="60a0b0"/>
+      <w:b/>
+      <w:i/>
+    </w:rPr>
+  </w:style>
+  <w:style w:customStyle="1" w:styleId="OtherTok" w:type="character">
+    <w:name w:val="OtherTok"/>
+    <w:basedOn w:val="VerbatimChar"/>
+    <w:rPr>
+      <w:color w:val="007020"/>
+    </w:rPr>
+  </w:style>
+  <w:style w:customStyle="1" w:styleId="FunctionTok" w:type="character">
+    <w:name w:val="FunctionTok"/>
+    <w:basedOn w:val="VerbatimChar"/>
+    <w:rPr>
+      <w:color w:val="06287e"/>
+    </w:rPr>
+  </w:style>
+  <w:style w:customStyle="1" w:styleId="VariableTok" w:type="character">
+    <w:name w:val="VariableTok"/>
+    <w:basedOn w:val="VerbatimChar"/>
+    <w:rPr>
+      <w:color w:val="19177c"/>
+    </w:rPr>
+  </w:style>
+  <w:style w:customStyle="1" w:styleId="ControlFlowTok" w:type="character">
+    <w:name w:val="ControlFlowTok"/>
+    <w:basedOn w:val="VerbatimChar"/>
+    <w:rPr>
+      <w:color w:val="007020"/>
+      <w:b/>
+    </w:rPr>
+  </w:style>
+  <w:style w:customStyle="1" w:styleId="OperatorTok" w:type="character">
+    <w:name w:val="OperatorTok"/>
+    <w:basedOn w:val="VerbatimChar"/>
+    <w:rPr>
+      <w:color w:val="666666"/>
+    </w:rPr>
+  </w:style>
+  <w:style w:customStyle="1" w:styleId="BuiltInTok" w:type="character">
+    <w:name w:val="BuiltInTok"/>
+    <w:basedOn w:val="VerbatimChar"/>
+    <w:rPr>
+      <w:color w:val="008000"/>
+    </w:rPr>
+  </w:style>
+  <w:style w:customStyle="1" w:styleId="ExtensionTok" w:type="character">
+    <w:name w:val="ExtensionTok"/>
+    <w:basedOn w:val="VerbatimChar"/>
+    <w:rPr/>
+  </w:style>
+  <w:style w:customStyle="1" w:styleId="PreprocessorTok" w:type="character">
+    <w:name w:val="PreprocessorTok"/>
+    <w:basedOn w:val="VerbatimChar"/>
+    <w:rPr>
+      <w:color w:val="bc7a00"/>
+    </w:rPr>
+  </w:style>
+  <w:style w:customStyle="1" w:styleId="AttributeTok" w:type="character">
+    <w:name w:val="AttributeTok"/>
+    <w:basedOn w:val="VerbatimChar"/>
+    <w:rPr>
+      <w:color w:val="7d9029"/>
+    </w:rPr>
+  </w:style>
+  <w:style w:customStyle="1" w:styleId="RegionMarkerTok" w:type="character">
+    <w:name w:val="RegionMarkerTok"/>
+    <w:basedOn w:val="VerbatimChar"/>
+    <w:rPr/>
+  </w:style>
+  <w:style w:customStyle="1" w:styleId="InformationTok" w:type="character">
+    <w:name w:val="InformationTok"/>
+    <w:basedOn w:val="VerbatimChar"/>
+    <w:rPr>
+      <w:color w:val="60a0b0"/>
+      <w:b/>
+      <w:i/>
+    </w:rPr>
+  </w:style>
+  <w:style w:customStyle="1" w:styleId="WarningTok" w:type="character">
+    <w:name w:val="WarningTok"/>
+    <w:basedOn w:val="VerbatimChar"/>
+    <w:rPr>
+      <w:color w:val="60a0b0"/>
+      <w:b/>
+      <w:i/>
+    </w:rPr>
+  </w:style>
+  <w:style w:customStyle="1" w:styleId="AlertTok" w:type="character">
+    <w:name w:val="AlertTok"/>
+    <w:basedOn w:val="VerbatimChar"/>
+    <w:rPr>
+      <w:color w:val="ff0000"/>
+      <w:b/>
+    </w:rPr>
+  </w:style>
+  <w:style w:customStyle="1" w:styleId="ErrorTok" w:type="character">
+    <w:name w:val="ErrorTok"/>
+    <w:basedOn w:val="VerbatimChar"/>
+    <w:rPr>
+      <w:color w:val="ff0000"/>
+      <w:b/>
     </w:rPr>
   </w:style>
   <w:style w:customStyle="1" w:styleId="NormalTok" w:type="character">

</xml_diff>

<commit_message>
feat(documents): Reinspection Notice documentation, helper tests and acceptance items
Staff guides and manual, domain rules, acceptance record (development items
DV-1 to DV-3), helper rule tests and test index.

Co-Authored-By: Claude Sonnet 5.5 <noreply@anthropic.com>
Claude-Session: https://claude.ai/code/session_01WPJAZGfD47jPUEgCNYYSg7
</commit_message>
<xml_diff>
--- a/docs/staff/Program_Instruction_Manual.docx
+++ b/docs/staff/Program_Instruction_Manual.docx
@@ -612,7 +612,7 @@
         <w:pStyle w:val="BodyText"/>
       </w:pPr>
       <w:r>
-        <w:t xml:space="preserve">Select an eligible unused inspection with an actual date and supported type. If several results qualify, choose explicitly: each result shows its Inspection type, Date (with time), Inspector and Status, and the one you choose is highlighted. Scheduled, Pending, Completed, Inspection, No Violation, Reinspection and No Fee Reinspection results, Initial Inspection results with No Entry, Assist inspections, undated rows and inspections already used on the case are not listed. An inspection already recorded on any document or visit of the case, including drafts, withdrawn and corrected documents, counts as used; re-importing the inspection of an unfinished draft or worksheet still refreshes it. Any other type and status combination is listed under Not available for import, greyed with its reason, and cannot be selected. When nothing can be listed, the review explains which kinds of rows the report returned. A result status is not proof that this program issued a document; shared records independently prevent inspection reuse.</w:t>
+        <w:t xml:space="preserve">Select an eligible unused inspection with an actual date and supported type. If several results qualify, choose explicitly: each result shows its Inspection type, Date (with time), Inspector and Status, and the one you choose is highlighted. Scheduled, Pending, Completed, Inspection and No Violation results, Reinspection and No Fee Reinspection results on any inspection type other than a Reinspection, Initial Inspection results with No Entry, Assist inspections, undated rows and inspections already used on the case are not listed. An inspection already recorded on any document or visit of the case, including drafts, withdrawn and corrected documents, counts as used; re-importing the inspection of an unfinished draft or worksheet still refreshes it. Any other type and status combination is listed under Not available for import, greyed with its reason, and cannot be selected. When nothing can be listed, the review explains which kinds of rows the report returned. A result status is not proof that this program issued a document; shared records independently prevent inspection reuse.</w:t>
       </w:r>
     </w:p>
     <w:p>
@@ -714,7 +714,7 @@
         <w:t xml:space="preserve"> </w:t>
       </w:r>
       <w:r>
-        <w:t xml:space="preserve">needs an existing case. CA Referral or City Attorney Referral → Referral for Prosecution (the case’s first referral); Compliance → Compliance Letter (every item Corrected); Citation → Citation (at least one item cited); Extension Processing or No Fee Extension Processing → choose Extension, Best Interest Extension or Vacancy Extension; No Occupancy or No Fee No Occupancy → No Occupancy. On a snow case, Citation records the next snow event.</w:t>
+        <w:t xml:space="preserve">needs an existing case. CA Referral or City Attorney Referral → Referral for Prosecution (the case’s first referral); Compliance → Compliance Letter (every item Corrected); Citation → Citation (at least one item cited); Extension Processing or No Fee Extension Processing → choose Extension, Best Interest Extension or Vacancy Extension; No Occupancy or No Fee No Occupancy → No Occupancy; Reinspection or No Fee Reinspection → Reinspection Notice (the item list is updated and every due date stays as assigned). On a snow case, Citation records the next snow event.</w:t>
       </w:r>
     </w:p>
     <w:p>
@@ -2182,6 +2182,32 @@
           </w:p>
         </w:tc>
       </w:tr>
+      <w:tr>
+        <w:tc>
+          <w:tcPr/>
+          <w:p>
+            <w:pPr>
+              <w:pStyle w:val="Compact"/>
+              <w:jc w:val="left"/>
+            </w:pPr>
+            <w:r>
+              <w:t xml:space="preserve">Reinspection Notice</w:t>
+            </w:r>
+          </w:p>
+        </w:tc>
+        <w:tc>
+          <w:tcPr/>
+          <w:p>
+            <w:pPr>
+              <w:pStyle w:val="Compact"/>
+              <w:jc w:val="left"/>
+            </w:pPr>
+            <w:r>
+              <w:t xml:space="preserve">An updated item list after a Reinspection or No Fee Reinspection result, with every due date unchanged</w:t>
+            </w:r>
+          </w:p>
+        </w:tc>
+      </w:tr>
     </w:tbl>
     <w:p>
       <w:pPr>
@@ -2387,6 +2413,39 @@
       </w:r>
       <w:r>
         <w:t xml:space="preserve">). The affected-item checkboxes, safety confirmation and basis, extension request reference, verified vacancy basis, approved continuing conditions, expiration / review model, sale / transfer wording, short-notice procedure and the Authority, wording and signer review are removed, as is the signer block. Renewal requires a new action. Apartment scope preserves common-area duties. Earlier Vacancy Extensions reprint unchanged.</w:t>
+      </w:r>
+    </w:p>
+    <w:p>
+      <w:pPr>
+        <w:pStyle w:val="BodyText"/>
+      </w:pPr>
+      <w:r>
+        <w:rPr>
+          <w:bCs/>
+          <w:b/>
+        </w:rPr>
+        <w:t xml:space="preserve">Reinspection Notice.</w:t>
+      </w:r>
+      <w:r>
+        <w:t xml:space="preserve"> </w:t>
+      </w:r>
+      <w:r>
+        <w:t xml:space="preserve">Import an eligible unused inspection of type Reinspection whose result is Reinspection or No Fee Reinspection. The worksheet records the item results as usual, and the document created from the Accela status is the Reinspection Notice, headed</w:t>
+      </w:r>
+      <w:r>
+        <w:t xml:space="preserve"> </w:t>
+      </w:r>
+      <w:r>
+        <w:t xml:space="preserve">“</w:t>
+      </w:r>
+      <w:r>
+        <w:t xml:space="preserve">REINSPECTION - Building Inspection Official Notice</w:t>
+      </w:r>
+      <w:r>
+        <w:t xml:space="preserve">”</w:t>
+      </w:r>
+      <w:r>
+        <w:t xml:space="preserve">. Its wording is the same for both results. Items you marked Corrected print ruled through with the date you confirmed them, and the rest are listed as outstanding. The Reinspection Notice never changes a due date: every item prints the due date it already had, the dates cannot be edited on it, and a date that has already passed prints as assigned. It needs at least one outstanding item (a Compliance Letter closes a case with none) and cannot be written on a case that is with the City Attorney. The case status becomes Reinspection while the case stays open, in Workspace and in Reports.</w:t>
       </w:r>
     </w:p>
     <w:p>
@@ -4719,7 +4778,7 @@
               <w:jc w:val="left"/>
             </w:pPr>
             <w:r>
-              <w:t xml:space="preserve">Open Source and import details and read the result status. Eligibility depends on both Inspection Type and Inspection Status. Scheduled, Pending, Completed, Inspection, No Violation, Reinspection and No Fee Reinspection results, Initial Inspection results with No Entry, Assist inspections, undated rows and inspections already used on the case are not listed. Other combinations are listed as not available with their reason; use the type/status rules in section 4. If valid results are absent, use the complete current installation and retrieve the case again. An already used result requires Continue existing case</w:t>
+              <w:t xml:space="preserve">Open Source and import details and read the result status. Eligibility depends on both Inspection Type and Inspection Status. Scheduled, Pending, Completed, Inspection and No Violation results, Reinspection and No Fee Reinspection results on any inspection type other than a Reinspection, Initial Inspection results with No Entry, Assist inspections, undated rows and inspections already used on the case are not listed. Other combinations are listed as not available with their reason; use the type/status rules in section 4. If valid results are absent, use the complete current installation and retrieve the case again. An already used result requires Continue existing case</w:t>
             </w:r>
           </w:p>
         </w:tc>
@@ -5927,7 +5986,7 @@
         <w:pStyle w:val="BodyText"/>
       </w:pPr>
       <w:r>
-        <w:t xml:space="preserve">Manual source digest 6e5b6811782c9300.</w:t>
+        <w:t xml:space="preserve">Manual source digest 2f26c9239882e418.</w:t>
       </w:r>
     </w:p>
     <w:bookmarkEnd w:id="41"/>
@@ -22972,6 +23031,232 @@
     <w:rPr>
       <w:b/>
       <w:color w:val="ff0000"/>
+    </w:rPr>
+  </w:style>
+  <w:style w:customStyle="1" w:styleId="NormalTok" w:type="character">
+    <w:name w:val="NormalTok"/>
+    <w:basedOn w:val="VerbatimChar"/>
+    <w:rPr/>
+  </w:style>
+  <w:style w:customStyle="1" w:styleId="KeywordTok" w:type="character">
+    <w:name w:val="KeywordTok"/>
+    <w:basedOn w:val="VerbatimChar"/>
+    <w:rPr>
+      <w:color w:val="007020"/>
+      <w:b/>
+    </w:rPr>
+  </w:style>
+  <w:style w:customStyle="1" w:styleId="DataTypeTok" w:type="character">
+    <w:name w:val="DataTypeTok"/>
+    <w:basedOn w:val="VerbatimChar"/>
+    <w:rPr>
+      <w:color w:val="902000"/>
+    </w:rPr>
+  </w:style>
+  <w:style w:customStyle="1" w:styleId="DecValTok" w:type="character">
+    <w:name w:val="DecValTok"/>
+    <w:basedOn w:val="VerbatimChar"/>
+    <w:rPr>
+      <w:color w:val="40a070"/>
+    </w:rPr>
+  </w:style>
+  <w:style w:customStyle="1" w:styleId="BaseNTok" w:type="character">
+    <w:name w:val="BaseNTok"/>
+    <w:basedOn w:val="VerbatimChar"/>
+    <w:rPr>
+      <w:color w:val="40a070"/>
+    </w:rPr>
+  </w:style>
+  <w:style w:customStyle="1" w:styleId="FloatTok" w:type="character">
+    <w:name w:val="FloatTok"/>
+    <w:basedOn w:val="VerbatimChar"/>
+    <w:rPr>
+      <w:color w:val="40a070"/>
+    </w:rPr>
+  </w:style>
+  <w:style w:customStyle="1" w:styleId="ConstantTok" w:type="character">
+    <w:name w:val="ConstantTok"/>
+    <w:basedOn w:val="VerbatimChar"/>
+    <w:rPr>
+      <w:color w:val="880000"/>
+    </w:rPr>
+  </w:style>
+  <w:style w:customStyle="1" w:styleId="CharTok" w:type="character">
+    <w:name w:val="CharTok"/>
+    <w:basedOn w:val="VerbatimChar"/>
+    <w:rPr>
+      <w:color w:val="4070a0"/>
+    </w:rPr>
+  </w:style>
+  <w:style w:customStyle="1" w:styleId="SpecialCharTok" w:type="character">
+    <w:name w:val="SpecialCharTok"/>
+    <w:basedOn w:val="VerbatimChar"/>
+    <w:rPr>
+      <w:color w:val="4070a0"/>
+    </w:rPr>
+  </w:style>
+  <w:style w:customStyle="1" w:styleId="StringTok" w:type="character">
+    <w:name w:val="StringTok"/>
+    <w:basedOn w:val="VerbatimChar"/>
+    <w:rPr>
+      <w:color w:val="4070a0"/>
+    </w:rPr>
+  </w:style>
+  <w:style w:customStyle="1" w:styleId="VerbatimStringTok" w:type="character">
+    <w:name w:val="VerbatimStringTok"/>
+    <w:basedOn w:val="VerbatimChar"/>
+    <w:rPr>
+      <w:color w:val="4070a0"/>
+    </w:rPr>
+  </w:style>
+  <w:style w:customStyle="1" w:styleId="SpecialStringTok" w:type="character">
+    <w:name w:val="SpecialStringTok"/>
+    <w:basedOn w:val="VerbatimChar"/>
+    <w:rPr>
+      <w:color w:val="bb6688"/>
+    </w:rPr>
+  </w:style>
+  <w:style w:customStyle="1" w:styleId="ImportTok" w:type="character">
+    <w:name w:val="ImportTok"/>
+    <w:basedOn w:val="VerbatimChar"/>
+    <w:rPr>
+      <w:color w:val="008000"/>
+      <w:b/>
+    </w:rPr>
+  </w:style>
+  <w:style w:customStyle="1" w:styleId="CommentTok" w:type="character">
+    <w:name w:val="CommentTok"/>
+    <w:basedOn w:val="VerbatimChar"/>
+    <w:rPr>
+      <w:color w:val="60a0b0"/>
+      <w:i/>
+    </w:rPr>
+  </w:style>
+  <w:style w:customStyle="1" w:styleId="DocumentationTok" w:type="character">
+    <w:name w:val="DocumentationTok"/>
+    <w:basedOn w:val="VerbatimChar"/>
+    <w:rPr>
+      <w:color w:val="ba2121"/>
+      <w:i/>
+    </w:rPr>
+  </w:style>
+  <w:style w:customStyle="1" w:styleId="AnnotationTok" w:type="character">
+    <w:name w:val="AnnotationTok"/>
+    <w:basedOn w:val="VerbatimChar"/>
+    <w:rPr>
+      <w:color w:val="60a0b0"/>
+      <w:b/>
+      <w:i/>
+    </w:rPr>
+  </w:style>
+  <w:style w:customStyle="1" w:styleId="CommentVarTok" w:type="character">
+    <w:name w:val="CommentVarTok"/>
+    <w:basedOn w:val="VerbatimChar"/>
+    <w:rPr>
+      <w:color w:val="60a0b0"/>
+      <w:b/>
+      <w:i/>
+    </w:rPr>
+  </w:style>
+  <w:style w:customStyle="1" w:styleId="OtherTok" w:type="character">
+    <w:name w:val="OtherTok"/>
+    <w:basedOn w:val="VerbatimChar"/>
+    <w:rPr>
+      <w:color w:val="007020"/>
+    </w:rPr>
+  </w:style>
+  <w:style w:customStyle="1" w:styleId="FunctionTok" w:type="character">
+    <w:name w:val="FunctionTok"/>
+    <w:basedOn w:val="VerbatimChar"/>
+    <w:rPr>
+      <w:color w:val="06287e"/>
+    </w:rPr>
+  </w:style>
+  <w:style w:customStyle="1" w:styleId="VariableTok" w:type="character">
+    <w:name w:val="VariableTok"/>
+    <w:basedOn w:val="VerbatimChar"/>
+    <w:rPr>
+      <w:color w:val="19177c"/>
+    </w:rPr>
+  </w:style>
+  <w:style w:customStyle="1" w:styleId="ControlFlowTok" w:type="character">
+    <w:name w:val="ControlFlowTok"/>
+    <w:basedOn w:val="VerbatimChar"/>
+    <w:rPr>
+      <w:color w:val="007020"/>
+      <w:b/>
+    </w:rPr>
+  </w:style>
+  <w:style w:customStyle="1" w:styleId="OperatorTok" w:type="character">
+    <w:name w:val="OperatorTok"/>
+    <w:basedOn w:val="VerbatimChar"/>
+    <w:rPr>
+      <w:color w:val="666666"/>
+    </w:rPr>
+  </w:style>
+  <w:style w:customStyle="1" w:styleId="BuiltInTok" w:type="character">
+    <w:name w:val="BuiltInTok"/>
+    <w:basedOn w:val="VerbatimChar"/>
+    <w:rPr>
+      <w:color w:val="008000"/>
+    </w:rPr>
+  </w:style>
+  <w:style w:customStyle="1" w:styleId="ExtensionTok" w:type="character">
+    <w:name w:val="ExtensionTok"/>
+    <w:basedOn w:val="VerbatimChar"/>
+    <w:rPr/>
+  </w:style>
+  <w:style w:customStyle="1" w:styleId="PreprocessorTok" w:type="character">
+    <w:name w:val="PreprocessorTok"/>
+    <w:basedOn w:val="VerbatimChar"/>
+    <w:rPr>
+      <w:color w:val="bc7a00"/>
+    </w:rPr>
+  </w:style>
+  <w:style w:customStyle="1" w:styleId="AttributeTok" w:type="character">
+    <w:name w:val="AttributeTok"/>
+    <w:basedOn w:val="VerbatimChar"/>
+    <w:rPr>
+      <w:color w:val="7d9029"/>
+    </w:rPr>
+  </w:style>
+  <w:style w:customStyle="1" w:styleId="RegionMarkerTok" w:type="character">
+    <w:name w:val="RegionMarkerTok"/>
+    <w:basedOn w:val="VerbatimChar"/>
+    <w:rPr/>
+  </w:style>
+  <w:style w:customStyle="1" w:styleId="InformationTok" w:type="character">
+    <w:name w:val="InformationTok"/>
+    <w:basedOn w:val="VerbatimChar"/>
+    <w:rPr>
+      <w:color w:val="60a0b0"/>
+      <w:b/>
+      <w:i/>
+    </w:rPr>
+  </w:style>
+  <w:style w:customStyle="1" w:styleId="WarningTok" w:type="character">
+    <w:name w:val="WarningTok"/>
+    <w:basedOn w:val="VerbatimChar"/>
+    <w:rPr>
+      <w:color w:val="60a0b0"/>
+      <w:b/>
+      <w:i/>
+    </w:rPr>
+  </w:style>
+  <w:style w:customStyle="1" w:styleId="AlertTok" w:type="character">
+    <w:name w:val="AlertTok"/>
+    <w:basedOn w:val="VerbatimChar"/>
+    <w:rPr>
+      <w:color w:val="ff0000"/>
+      <w:b/>
+    </w:rPr>
+  </w:style>
+  <w:style w:customStyle="1" w:styleId="ErrorTok" w:type="character">
+    <w:name w:val="ErrorTok"/>
+    <w:basedOn w:val="VerbatimChar"/>
+    <w:rPr>
+      <w:color w:val="ff0000"/>
+      <w:b/>
     </w:rPr>
   </w:style>
   <w:style w:customStyle="1" w:styleId="NormalTok" w:type="character">

</xml_diff>

<commit_message>
fix(ui): explain missing Chrome for PDF filing and unavailable Correct, and resume a reinspection from case details
From the round 5 user-testing review. File issued PDF now says that PDF filing
needs Chrome or Edge when the helper found none; filing at issue adds no second
message. Document actions states the existing eligibility reason when Correct
and Withdraw are not offered. Case details offer Continue reinspection beside
Discard reinspection draft. Retained-original comparisons accept exactly these
changes; nothing else changed.

Co-Authored-By: Claude Sonnet 5.5 <noreply@anthropic.com>
Claude-Session: https://claude.ai/code/session_01WPJAZGfD47jPUEgCNYYSg7
</commit_message>
<xml_diff>
--- a/docs/staff/Program_Instruction_Manual.docx
+++ b/docs/staff/Program_Instruction_Manual.docx
@@ -1684,7 +1684,7 @@
         <w:pStyle w:val="BodyText"/>
       </w:pPr>
       <w:r>
-        <w:t xml:space="preserve">Open Reinspect from the case or import an eligible unused completed reinspection. Enter the actual physical inspection date and time and the responsible inspector. Review all items, which shows every item, is the entry view. Carried compliance and withdrawn items remain visible and cannot be casually reset. Progress covers active items; withdrawn items are listed separately.</w:t>
+        <w:t xml:space="preserve">Open Reinspect from the case or import an eligible unused completed reinspection. To return to an unfinished worksheet, use Continue reinspection in the case details (beside Discard reinspection draft) or the case’s main action in Workspace. Enter the actual physical inspection date and time and the responsible inspector. Review all items, which shows every item, is the entry view. Carried compliance and withdrawn items remain visible and cannot be casually reset. Progress covers active items; withdrawn items are listed separately.</w:t>
       </w:r>
     </w:p>
     <w:p>
@@ -2682,6 +2682,24 @@
           <w:bCs/>
           <w:b/>
         </w:rPr>
+        <w:t xml:space="preserve">No Chrome or Edge.</w:t>
+      </w:r>
+      <w:r>
+        <w:t xml:space="preserve"> </w:t>
+      </w:r>
+      <w:r>
+        <w:t xml:space="preserve">PDF production needs Chrome or Microsoft Edge on the computer. If the helper did not find one, File issued PDF says so; ask IT to install it and use File issued PDF again. The issued case record is not affected.</w:t>
+      </w:r>
+    </w:p>
+    <w:p>
+      <w:pPr>
+        <w:pStyle w:val="BodyText"/>
+      </w:pPr>
+      <w:r>
+        <w:rPr>
+          <w:bCs/>
+          <w:b/>
+        </w:rPr>
         <w:t xml:space="preserve">Print and mail.</w:t>
       </w:r>
       <w:r>
@@ -2829,6 +2847,24 @@
       </w:r>
       <w:r>
         <w:t xml:space="preserve">Within correction, select withdrawal for an item entered in error and record a specific reason. Its original number remains. It is excluded from compliance credit. Do not delete it or label it corrected to remove it from the count.</w:t>
+      </w:r>
+    </w:p>
+    <w:p>
+      <w:pPr>
+        <w:pStyle w:val="BodyText"/>
+      </w:pPr>
+      <w:r>
+        <w:rPr>
+          <w:bCs/>
+          <w:b/>
+        </w:rPr>
+        <w:t xml:space="preserve">When Correct and Withdraw are missing.</w:t>
+      </w:r>
+      <w:r>
+        <w:t xml:space="preserve"> </w:t>
+      </w:r>
+      <w:r>
+        <w:t xml:space="preserve">Open Document actions on the issued document. If Correct document and Withdraw are not offered, the same place states why (for example, an unfinished worksheet or document draft must be finished or discarded first, or a later document depends on this one). Resolve what it names and the buttons return.</w:t>
       </w:r>
     </w:p>
     <w:p>
@@ -6004,7 +6040,7 @@
         <w:pStyle w:val="BodyText"/>
       </w:pPr>
       <w:r>
-        <w:t xml:space="preserve">Manual source digest 333e54a7626f7945.</w:t>
+        <w:t xml:space="preserve">Manual source digest cb2218d3816b9242.</w:t>
       </w:r>
     </w:p>
     <w:bookmarkEnd w:id="41"/>
@@ -23049,6 +23085,232 @@
     <w:rPr>
       <w:b/>
       <w:color w:val="ff0000"/>
+    </w:rPr>
+  </w:style>
+  <w:style w:customStyle="1" w:styleId="NormalTok" w:type="character">
+    <w:name w:val="NormalTok"/>
+    <w:basedOn w:val="VerbatimChar"/>
+    <w:rPr/>
+  </w:style>
+  <w:style w:customStyle="1" w:styleId="KeywordTok" w:type="character">
+    <w:name w:val="KeywordTok"/>
+    <w:basedOn w:val="VerbatimChar"/>
+    <w:rPr>
+      <w:color w:val="007020"/>
+      <w:b/>
+    </w:rPr>
+  </w:style>
+  <w:style w:customStyle="1" w:styleId="DataTypeTok" w:type="character">
+    <w:name w:val="DataTypeTok"/>
+    <w:basedOn w:val="VerbatimChar"/>
+    <w:rPr>
+      <w:color w:val="902000"/>
+    </w:rPr>
+  </w:style>
+  <w:style w:customStyle="1" w:styleId="DecValTok" w:type="character">
+    <w:name w:val="DecValTok"/>
+    <w:basedOn w:val="VerbatimChar"/>
+    <w:rPr>
+      <w:color w:val="40a070"/>
+    </w:rPr>
+  </w:style>
+  <w:style w:customStyle="1" w:styleId="BaseNTok" w:type="character">
+    <w:name w:val="BaseNTok"/>
+    <w:basedOn w:val="VerbatimChar"/>
+    <w:rPr>
+      <w:color w:val="40a070"/>
+    </w:rPr>
+  </w:style>
+  <w:style w:customStyle="1" w:styleId="FloatTok" w:type="character">
+    <w:name w:val="FloatTok"/>
+    <w:basedOn w:val="VerbatimChar"/>
+    <w:rPr>
+      <w:color w:val="40a070"/>
+    </w:rPr>
+  </w:style>
+  <w:style w:customStyle="1" w:styleId="ConstantTok" w:type="character">
+    <w:name w:val="ConstantTok"/>
+    <w:basedOn w:val="VerbatimChar"/>
+    <w:rPr>
+      <w:color w:val="880000"/>
+    </w:rPr>
+  </w:style>
+  <w:style w:customStyle="1" w:styleId="CharTok" w:type="character">
+    <w:name w:val="CharTok"/>
+    <w:basedOn w:val="VerbatimChar"/>
+    <w:rPr>
+      <w:color w:val="4070a0"/>
+    </w:rPr>
+  </w:style>
+  <w:style w:customStyle="1" w:styleId="SpecialCharTok" w:type="character">
+    <w:name w:val="SpecialCharTok"/>
+    <w:basedOn w:val="VerbatimChar"/>
+    <w:rPr>
+      <w:color w:val="4070a0"/>
+    </w:rPr>
+  </w:style>
+  <w:style w:customStyle="1" w:styleId="StringTok" w:type="character">
+    <w:name w:val="StringTok"/>
+    <w:basedOn w:val="VerbatimChar"/>
+    <w:rPr>
+      <w:color w:val="4070a0"/>
+    </w:rPr>
+  </w:style>
+  <w:style w:customStyle="1" w:styleId="VerbatimStringTok" w:type="character">
+    <w:name w:val="VerbatimStringTok"/>
+    <w:basedOn w:val="VerbatimChar"/>
+    <w:rPr>
+      <w:color w:val="4070a0"/>
+    </w:rPr>
+  </w:style>
+  <w:style w:customStyle="1" w:styleId="SpecialStringTok" w:type="character">
+    <w:name w:val="SpecialStringTok"/>
+    <w:basedOn w:val="VerbatimChar"/>
+    <w:rPr>
+      <w:color w:val="bb6688"/>
+    </w:rPr>
+  </w:style>
+  <w:style w:customStyle="1" w:styleId="ImportTok" w:type="character">
+    <w:name w:val="ImportTok"/>
+    <w:basedOn w:val="VerbatimChar"/>
+    <w:rPr>
+      <w:color w:val="008000"/>
+      <w:b/>
+    </w:rPr>
+  </w:style>
+  <w:style w:customStyle="1" w:styleId="CommentTok" w:type="character">
+    <w:name w:val="CommentTok"/>
+    <w:basedOn w:val="VerbatimChar"/>
+    <w:rPr>
+      <w:color w:val="60a0b0"/>
+      <w:i/>
+    </w:rPr>
+  </w:style>
+  <w:style w:customStyle="1" w:styleId="DocumentationTok" w:type="character">
+    <w:name w:val="DocumentationTok"/>
+    <w:basedOn w:val="VerbatimChar"/>
+    <w:rPr>
+      <w:color w:val="ba2121"/>
+      <w:i/>
+    </w:rPr>
+  </w:style>
+  <w:style w:customStyle="1" w:styleId="AnnotationTok" w:type="character">
+    <w:name w:val="AnnotationTok"/>
+    <w:basedOn w:val="VerbatimChar"/>
+    <w:rPr>
+      <w:color w:val="60a0b0"/>
+      <w:b/>
+      <w:i/>
+    </w:rPr>
+  </w:style>
+  <w:style w:customStyle="1" w:styleId="CommentVarTok" w:type="character">
+    <w:name w:val="CommentVarTok"/>
+    <w:basedOn w:val="VerbatimChar"/>
+    <w:rPr>
+      <w:color w:val="60a0b0"/>
+      <w:b/>
+      <w:i/>
+    </w:rPr>
+  </w:style>
+  <w:style w:customStyle="1" w:styleId="OtherTok" w:type="character">
+    <w:name w:val="OtherTok"/>
+    <w:basedOn w:val="VerbatimChar"/>
+    <w:rPr>
+      <w:color w:val="007020"/>
+    </w:rPr>
+  </w:style>
+  <w:style w:customStyle="1" w:styleId="FunctionTok" w:type="character">
+    <w:name w:val="FunctionTok"/>
+    <w:basedOn w:val="VerbatimChar"/>
+    <w:rPr>
+      <w:color w:val="06287e"/>
+    </w:rPr>
+  </w:style>
+  <w:style w:customStyle="1" w:styleId="VariableTok" w:type="character">
+    <w:name w:val="VariableTok"/>
+    <w:basedOn w:val="VerbatimChar"/>
+    <w:rPr>
+      <w:color w:val="19177c"/>
+    </w:rPr>
+  </w:style>
+  <w:style w:customStyle="1" w:styleId="ControlFlowTok" w:type="character">
+    <w:name w:val="ControlFlowTok"/>
+    <w:basedOn w:val="VerbatimChar"/>
+    <w:rPr>
+      <w:color w:val="007020"/>
+      <w:b/>
+    </w:rPr>
+  </w:style>
+  <w:style w:customStyle="1" w:styleId="OperatorTok" w:type="character">
+    <w:name w:val="OperatorTok"/>
+    <w:basedOn w:val="VerbatimChar"/>
+    <w:rPr>
+      <w:color w:val="666666"/>
+    </w:rPr>
+  </w:style>
+  <w:style w:customStyle="1" w:styleId="BuiltInTok" w:type="character">
+    <w:name w:val="BuiltInTok"/>
+    <w:basedOn w:val="VerbatimChar"/>
+    <w:rPr>
+      <w:color w:val="008000"/>
+    </w:rPr>
+  </w:style>
+  <w:style w:customStyle="1" w:styleId="ExtensionTok" w:type="character">
+    <w:name w:val="ExtensionTok"/>
+    <w:basedOn w:val="VerbatimChar"/>
+    <w:rPr/>
+  </w:style>
+  <w:style w:customStyle="1" w:styleId="PreprocessorTok" w:type="character">
+    <w:name w:val="PreprocessorTok"/>
+    <w:basedOn w:val="VerbatimChar"/>
+    <w:rPr>
+      <w:color w:val="bc7a00"/>
+    </w:rPr>
+  </w:style>
+  <w:style w:customStyle="1" w:styleId="AttributeTok" w:type="character">
+    <w:name w:val="AttributeTok"/>
+    <w:basedOn w:val="VerbatimChar"/>
+    <w:rPr>
+      <w:color w:val="7d9029"/>
+    </w:rPr>
+  </w:style>
+  <w:style w:customStyle="1" w:styleId="RegionMarkerTok" w:type="character">
+    <w:name w:val="RegionMarkerTok"/>
+    <w:basedOn w:val="VerbatimChar"/>
+    <w:rPr/>
+  </w:style>
+  <w:style w:customStyle="1" w:styleId="InformationTok" w:type="character">
+    <w:name w:val="InformationTok"/>
+    <w:basedOn w:val="VerbatimChar"/>
+    <w:rPr>
+      <w:color w:val="60a0b0"/>
+      <w:b/>
+      <w:i/>
+    </w:rPr>
+  </w:style>
+  <w:style w:customStyle="1" w:styleId="WarningTok" w:type="character">
+    <w:name w:val="WarningTok"/>
+    <w:basedOn w:val="VerbatimChar"/>
+    <w:rPr>
+      <w:color w:val="60a0b0"/>
+      <w:b/>
+      <w:i/>
+    </w:rPr>
+  </w:style>
+  <w:style w:customStyle="1" w:styleId="AlertTok" w:type="character">
+    <w:name w:val="AlertTok"/>
+    <w:basedOn w:val="VerbatimChar"/>
+    <w:rPr>
+      <w:color w:val="ff0000"/>
+      <w:b/>
+    </w:rPr>
+  </w:style>
+  <w:style w:customStyle="1" w:styleId="ErrorTok" w:type="character">
+    <w:name w:val="ErrorTok"/>
+    <w:basedOn w:val="VerbatimChar"/>
+    <w:rPr>
+      <w:color w:val="ff0000"/>
+      <w:b/>
     </w:rPr>
   </w:style>
   <w:style w:customStyle="1" w:styleId="NormalTok" w:type="character">

</xml_diff>

<commit_message>
fix(ui): explain missing Chrome for PDF filing and unavailable Correct, and resume a reinspection from case details (#367)
From the round 5 user-testing review. File issued PDF now says that PDF filing
needs Chrome or Edge when the helper found none; filing at issue adds no second
message. Document actions states the existing eligibility reason when Correct
and Withdraw are not offered. Case details offer Continue reinspection beside
Discard reinspection draft. Retained-original comparisons accept exactly these
changes; nothing else changed.


Claude-Session: https://claude.ai/code/session_01WPJAZGfD47jPUEgCNYYSg7

Co-authored-by: Claude <noreply@anthropic.com>
</commit_message>
<xml_diff>
--- a/docs/staff/Program_Instruction_Manual.docx
+++ b/docs/staff/Program_Instruction_Manual.docx
@@ -1684,7 +1684,7 @@
         <w:pStyle w:val="BodyText"/>
       </w:pPr>
       <w:r>
-        <w:t xml:space="preserve">Open Reinspect from the case or import an eligible unused completed reinspection. Enter the actual physical inspection date and time and the responsible inspector. Review all items, which shows every item, is the entry view. Carried compliance and withdrawn items remain visible and cannot be casually reset. Progress covers active items; withdrawn items are listed separately.</w:t>
+        <w:t xml:space="preserve">Open Reinspect from the case or import an eligible unused completed reinspection. To return to an unfinished worksheet, use Continue reinspection in the case details (beside Discard reinspection draft) or the case’s main action in Workspace. Enter the actual physical inspection date and time and the responsible inspector. Review all items, which shows every item, is the entry view. Carried compliance and withdrawn items remain visible and cannot be casually reset. Progress covers active items; withdrawn items are listed separately.</w:t>
       </w:r>
     </w:p>
     <w:p>
@@ -2682,6 +2682,24 @@
           <w:bCs/>
           <w:b/>
         </w:rPr>
+        <w:t xml:space="preserve">No Chrome or Edge.</w:t>
+      </w:r>
+      <w:r>
+        <w:t xml:space="preserve"> </w:t>
+      </w:r>
+      <w:r>
+        <w:t xml:space="preserve">PDF production needs Chrome or Microsoft Edge on the computer. If the helper did not find one, File issued PDF says so; ask IT to install it and use File issued PDF again. The issued case record is not affected.</w:t>
+      </w:r>
+    </w:p>
+    <w:p>
+      <w:pPr>
+        <w:pStyle w:val="BodyText"/>
+      </w:pPr>
+      <w:r>
+        <w:rPr>
+          <w:bCs/>
+          <w:b/>
+        </w:rPr>
         <w:t xml:space="preserve">Print and mail.</w:t>
       </w:r>
       <w:r>
@@ -2829,6 +2847,24 @@
       </w:r>
       <w:r>
         <w:t xml:space="preserve">Within correction, select withdrawal for an item entered in error and record a specific reason. Its original number remains. It is excluded from compliance credit. Do not delete it or label it corrected to remove it from the count.</w:t>
+      </w:r>
+    </w:p>
+    <w:p>
+      <w:pPr>
+        <w:pStyle w:val="BodyText"/>
+      </w:pPr>
+      <w:r>
+        <w:rPr>
+          <w:bCs/>
+          <w:b/>
+        </w:rPr>
+        <w:t xml:space="preserve">When Correct and Withdraw are missing.</w:t>
+      </w:r>
+      <w:r>
+        <w:t xml:space="preserve"> </w:t>
+      </w:r>
+      <w:r>
+        <w:t xml:space="preserve">Open Document actions on the issued document. If Correct document and Withdraw are not offered, the same place states why (for example, an unfinished worksheet or document draft must be finished or discarded first, or a later document depends on this one). Resolve what it names and the buttons return.</w:t>
       </w:r>
     </w:p>
     <w:p>
@@ -6004,7 +6040,7 @@
         <w:pStyle w:val="BodyText"/>
       </w:pPr>
       <w:r>
-        <w:t xml:space="preserve">Manual source digest 333e54a7626f7945.</w:t>
+        <w:t xml:space="preserve">Manual source digest cb2218d3816b9242.</w:t>
       </w:r>
     </w:p>
     <w:bookmarkEnd w:id="41"/>
@@ -23049,6 +23085,232 @@
     <w:rPr>
       <w:b/>
       <w:color w:val="ff0000"/>
+    </w:rPr>
+  </w:style>
+  <w:style w:customStyle="1" w:styleId="NormalTok" w:type="character">
+    <w:name w:val="NormalTok"/>
+    <w:basedOn w:val="VerbatimChar"/>
+    <w:rPr/>
+  </w:style>
+  <w:style w:customStyle="1" w:styleId="KeywordTok" w:type="character">
+    <w:name w:val="KeywordTok"/>
+    <w:basedOn w:val="VerbatimChar"/>
+    <w:rPr>
+      <w:color w:val="007020"/>
+      <w:b/>
+    </w:rPr>
+  </w:style>
+  <w:style w:customStyle="1" w:styleId="DataTypeTok" w:type="character">
+    <w:name w:val="DataTypeTok"/>
+    <w:basedOn w:val="VerbatimChar"/>
+    <w:rPr>
+      <w:color w:val="902000"/>
+    </w:rPr>
+  </w:style>
+  <w:style w:customStyle="1" w:styleId="DecValTok" w:type="character">
+    <w:name w:val="DecValTok"/>
+    <w:basedOn w:val="VerbatimChar"/>
+    <w:rPr>
+      <w:color w:val="40a070"/>
+    </w:rPr>
+  </w:style>
+  <w:style w:customStyle="1" w:styleId="BaseNTok" w:type="character">
+    <w:name w:val="BaseNTok"/>
+    <w:basedOn w:val="VerbatimChar"/>
+    <w:rPr>
+      <w:color w:val="40a070"/>
+    </w:rPr>
+  </w:style>
+  <w:style w:customStyle="1" w:styleId="FloatTok" w:type="character">
+    <w:name w:val="FloatTok"/>
+    <w:basedOn w:val="VerbatimChar"/>
+    <w:rPr>
+      <w:color w:val="40a070"/>
+    </w:rPr>
+  </w:style>
+  <w:style w:customStyle="1" w:styleId="ConstantTok" w:type="character">
+    <w:name w:val="ConstantTok"/>
+    <w:basedOn w:val="VerbatimChar"/>
+    <w:rPr>
+      <w:color w:val="880000"/>
+    </w:rPr>
+  </w:style>
+  <w:style w:customStyle="1" w:styleId="CharTok" w:type="character">
+    <w:name w:val="CharTok"/>
+    <w:basedOn w:val="VerbatimChar"/>
+    <w:rPr>
+      <w:color w:val="4070a0"/>
+    </w:rPr>
+  </w:style>
+  <w:style w:customStyle="1" w:styleId="SpecialCharTok" w:type="character">
+    <w:name w:val="SpecialCharTok"/>
+    <w:basedOn w:val="VerbatimChar"/>
+    <w:rPr>
+      <w:color w:val="4070a0"/>
+    </w:rPr>
+  </w:style>
+  <w:style w:customStyle="1" w:styleId="StringTok" w:type="character">
+    <w:name w:val="StringTok"/>
+    <w:basedOn w:val="VerbatimChar"/>
+    <w:rPr>
+      <w:color w:val="4070a0"/>
+    </w:rPr>
+  </w:style>
+  <w:style w:customStyle="1" w:styleId="VerbatimStringTok" w:type="character">
+    <w:name w:val="VerbatimStringTok"/>
+    <w:basedOn w:val="VerbatimChar"/>
+    <w:rPr>
+      <w:color w:val="4070a0"/>
+    </w:rPr>
+  </w:style>
+  <w:style w:customStyle="1" w:styleId="SpecialStringTok" w:type="character">
+    <w:name w:val="SpecialStringTok"/>
+    <w:basedOn w:val="VerbatimChar"/>
+    <w:rPr>
+      <w:color w:val="bb6688"/>
+    </w:rPr>
+  </w:style>
+  <w:style w:customStyle="1" w:styleId="ImportTok" w:type="character">
+    <w:name w:val="ImportTok"/>
+    <w:basedOn w:val="VerbatimChar"/>
+    <w:rPr>
+      <w:color w:val="008000"/>
+      <w:b/>
+    </w:rPr>
+  </w:style>
+  <w:style w:customStyle="1" w:styleId="CommentTok" w:type="character">
+    <w:name w:val="CommentTok"/>
+    <w:basedOn w:val="VerbatimChar"/>
+    <w:rPr>
+      <w:color w:val="60a0b0"/>
+      <w:i/>
+    </w:rPr>
+  </w:style>
+  <w:style w:customStyle="1" w:styleId="DocumentationTok" w:type="character">
+    <w:name w:val="DocumentationTok"/>
+    <w:basedOn w:val="VerbatimChar"/>
+    <w:rPr>
+      <w:color w:val="ba2121"/>
+      <w:i/>
+    </w:rPr>
+  </w:style>
+  <w:style w:customStyle="1" w:styleId="AnnotationTok" w:type="character">
+    <w:name w:val="AnnotationTok"/>
+    <w:basedOn w:val="VerbatimChar"/>
+    <w:rPr>
+      <w:color w:val="60a0b0"/>
+      <w:b/>
+      <w:i/>
+    </w:rPr>
+  </w:style>
+  <w:style w:customStyle="1" w:styleId="CommentVarTok" w:type="character">
+    <w:name w:val="CommentVarTok"/>
+    <w:basedOn w:val="VerbatimChar"/>
+    <w:rPr>
+      <w:color w:val="60a0b0"/>
+      <w:b/>
+      <w:i/>
+    </w:rPr>
+  </w:style>
+  <w:style w:customStyle="1" w:styleId="OtherTok" w:type="character">
+    <w:name w:val="OtherTok"/>
+    <w:basedOn w:val="VerbatimChar"/>
+    <w:rPr>
+      <w:color w:val="007020"/>
+    </w:rPr>
+  </w:style>
+  <w:style w:customStyle="1" w:styleId="FunctionTok" w:type="character">
+    <w:name w:val="FunctionTok"/>
+    <w:basedOn w:val="VerbatimChar"/>
+    <w:rPr>
+      <w:color w:val="06287e"/>
+    </w:rPr>
+  </w:style>
+  <w:style w:customStyle="1" w:styleId="VariableTok" w:type="character">
+    <w:name w:val="VariableTok"/>
+    <w:basedOn w:val="VerbatimChar"/>
+    <w:rPr>
+      <w:color w:val="19177c"/>
+    </w:rPr>
+  </w:style>
+  <w:style w:customStyle="1" w:styleId="ControlFlowTok" w:type="character">
+    <w:name w:val="ControlFlowTok"/>
+    <w:basedOn w:val="VerbatimChar"/>
+    <w:rPr>
+      <w:color w:val="007020"/>
+      <w:b/>
+    </w:rPr>
+  </w:style>
+  <w:style w:customStyle="1" w:styleId="OperatorTok" w:type="character">
+    <w:name w:val="OperatorTok"/>
+    <w:basedOn w:val="VerbatimChar"/>
+    <w:rPr>
+      <w:color w:val="666666"/>
+    </w:rPr>
+  </w:style>
+  <w:style w:customStyle="1" w:styleId="BuiltInTok" w:type="character">
+    <w:name w:val="BuiltInTok"/>
+    <w:basedOn w:val="VerbatimChar"/>
+    <w:rPr>
+      <w:color w:val="008000"/>
+    </w:rPr>
+  </w:style>
+  <w:style w:customStyle="1" w:styleId="ExtensionTok" w:type="character">
+    <w:name w:val="ExtensionTok"/>
+    <w:basedOn w:val="VerbatimChar"/>
+    <w:rPr/>
+  </w:style>
+  <w:style w:customStyle="1" w:styleId="PreprocessorTok" w:type="character">
+    <w:name w:val="PreprocessorTok"/>
+    <w:basedOn w:val="VerbatimChar"/>
+    <w:rPr>
+      <w:color w:val="bc7a00"/>
+    </w:rPr>
+  </w:style>
+  <w:style w:customStyle="1" w:styleId="AttributeTok" w:type="character">
+    <w:name w:val="AttributeTok"/>
+    <w:basedOn w:val="VerbatimChar"/>
+    <w:rPr>
+      <w:color w:val="7d9029"/>
+    </w:rPr>
+  </w:style>
+  <w:style w:customStyle="1" w:styleId="RegionMarkerTok" w:type="character">
+    <w:name w:val="RegionMarkerTok"/>
+    <w:basedOn w:val="VerbatimChar"/>
+    <w:rPr/>
+  </w:style>
+  <w:style w:customStyle="1" w:styleId="InformationTok" w:type="character">
+    <w:name w:val="InformationTok"/>
+    <w:basedOn w:val="VerbatimChar"/>
+    <w:rPr>
+      <w:color w:val="60a0b0"/>
+      <w:b/>
+      <w:i/>
+    </w:rPr>
+  </w:style>
+  <w:style w:customStyle="1" w:styleId="WarningTok" w:type="character">
+    <w:name w:val="WarningTok"/>
+    <w:basedOn w:val="VerbatimChar"/>
+    <w:rPr>
+      <w:color w:val="60a0b0"/>
+      <w:b/>
+      <w:i/>
+    </w:rPr>
+  </w:style>
+  <w:style w:customStyle="1" w:styleId="AlertTok" w:type="character">
+    <w:name w:val="AlertTok"/>
+    <w:basedOn w:val="VerbatimChar"/>
+    <w:rPr>
+      <w:color w:val="ff0000"/>
+      <w:b/>
+    </w:rPr>
+  </w:style>
+  <w:style w:customStyle="1" w:styleId="ErrorTok" w:type="character">
+    <w:name w:val="ErrorTok"/>
+    <w:basedOn w:val="VerbatimChar"/>
+    <w:rPr>
+      <w:color w:val="ff0000"/>
+      <w:b/>
     </w:rPr>
   </w:style>
   <w:style w:customStyle="1" w:styleId="NormalTok" w:type="character">

</xml_diff>

<commit_message>
feat(contacts): browser test, staff guide, manual, domain rules and acceptance items for the Violator contact
Co-Authored-By: Claude Sonnet 5.5 <noreply@anthropic.com>
Claude-Session: https://claude.ai/code/session_01WPJAZGfD47jPUEgCNYYSg7
</commit_message>
<xml_diff>
--- a/docs/staff/Program_Instruction_Manual.docx
+++ b/docs/staff/Program_Instruction_Manual.docx
@@ -920,7 +920,7 @@
         <w:pStyle w:val="Compact"/>
       </w:pPr>
       <w:r>
-        <w:t xml:space="preserve">Review the whole document, not only the edited sentence. Check recipients (the Recipients button opens copies, email and registered agent; Done closes it once the entries are valid), contact details, the mailing date, the item order and all warnings. The readiness summary at the top counts required fixes and advisories; Go to first required field jumps to the affected field, and Review (or Open full checklist) opens the Review dialog: checks that must be fixed before issuing, then advisories, or a statement that there are no concerns. Each check links to its field; closing the dialog returns you to where you were.</w:t>
+        <w:t xml:space="preserve">Review the whole document, not only the edited sentence. Check recipients (the Recipients button opens copies, email and registered agent; Done closes it once the entries are valid), contact details, the mailing date, the item order and all warnings. The readiness summary at the top counts required fixes and advisories; Go to first required field jumps to the affected field, and Review (or Open full checklist) opens the Review dialog: checks that must be fixed before issuing, then advisories, or a statement that there are no concerns. Each check links to its field; closing the dialog returns you to where you were. A copy can be changed to the type Violator when the person who is responsible for the violation is not the property owner: that person replaces the owner as the main contact in the mailing address block and as the defendant on any citation, and repeat offenses are counted against that person’s address. The owner is still copied under CC unless you clear Also copy the property owner (this choice is kept for the case). A case has one Violator, and a snow removal case always uses the owner. The mailing block is read-only while a Violator is set; change it in Recipients. Install the release that includes this feature on every PC before using it, because earlier releases print the Violator as an ordinary copy.</w:t>
       </w:r>
     </w:p>
     <w:p>
@@ -6040,7 +6040,7 @@
         <w:pStyle w:val="BodyText"/>
       </w:pPr>
       <w:r>
-        <w:t xml:space="preserve">Manual source digest cb2218d3816b9242.</w:t>
+        <w:t xml:space="preserve">Manual source digest f65a4103ce59ab94.</w:t>
       </w:r>
     </w:p>
     <w:bookmarkEnd w:id="41"/>
@@ -23085,6 +23085,232 @@
     <w:rPr>
       <w:b/>
       <w:color w:val="ff0000"/>
+    </w:rPr>
+  </w:style>
+  <w:style w:customStyle="1" w:styleId="NormalTok" w:type="character">
+    <w:name w:val="NormalTok"/>
+    <w:basedOn w:val="VerbatimChar"/>
+    <w:rPr/>
+  </w:style>
+  <w:style w:customStyle="1" w:styleId="KeywordTok" w:type="character">
+    <w:name w:val="KeywordTok"/>
+    <w:basedOn w:val="VerbatimChar"/>
+    <w:rPr>
+      <w:color w:val="007020"/>
+      <w:b/>
+    </w:rPr>
+  </w:style>
+  <w:style w:customStyle="1" w:styleId="DataTypeTok" w:type="character">
+    <w:name w:val="DataTypeTok"/>
+    <w:basedOn w:val="VerbatimChar"/>
+    <w:rPr>
+      <w:color w:val="902000"/>
+    </w:rPr>
+  </w:style>
+  <w:style w:customStyle="1" w:styleId="DecValTok" w:type="character">
+    <w:name w:val="DecValTok"/>
+    <w:basedOn w:val="VerbatimChar"/>
+    <w:rPr>
+      <w:color w:val="40a070"/>
+    </w:rPr>
+  </w:style>
+  <w:style w:customStyle="1" w:styleId="BaseNTok" w:type="character">
+    <w:name w:val="BaseNTok"/>
+    <w:basedOn w:val="VerbatimChar"/>
+    <w:rPr>
+      <w:color w:val="40a070"/>
+    </w:rPr>
+  </w:style>
+  <w:style w:customStyle="1" w:styleId="FloatTok" w:type="character">
+    <w:name w:val="FloatTok"/>
+    <w:basedOn w:val="VerbatimChar"/>
+    <w:rPr>
+      <w:color w:val="40a070"/>
+    </w:rPr>
+  </w:style>
+  <w:style w:customStyle="1" w:styleId="ConstantTok" w:type="character">
+    <w:name w:val="ConstantTok"/>
+    <w:basedOn w:val="VerbatimChar"/>
+    <w:rPr>
+      <w:color w:val="880000"/>
+    </w:rPr>
+  </w:style>
+  <w:style w:customStyle="1" w:styleId="CharTok" w:type="character">
+    <w:name w:val="CharTok"/>
+    <w:basedOn w:val="VerbatimChar"/>
+    <w:rPr>
+      <w:color w:val="4070a0"/>
+    </w:rPr>
+  </w:style>
+  <w:style w:customStyle="1" w:styleId="SpecialCharTok" w:type="character">
+    <w:name w:val="SpecialCharTok"/>
+    <w:basedOn w:val="VerbatimChar"/>
+    <w:rPr>
+      <w:color w:val="4070a0"/>
+    </w:rPr>
+  </w:style>
+  <w:style w:customStyle="1" w:styleId="StringTok" w:type="character">
+    <w:name w:val="StringTok"/>
+    <w:basedOn w:val="VerbatimChar"/>
+    <w:rPr>
+      <w:color w:val="4070a0"/>
+    </w:rPr>
+  </w:style>
+  <w:style w:customStyle="1" w:styleId="VerbatimStringTok" w:type="character">
+    <w:name w:val="VerbatimStringTok"/>
+    <w:basedOn w:val="VerbatimChar"/>
+    <w:rPr>
+      <w:color w:val="4070a0"/>
+    </w:rPr>
+  </w:style>
+  <w:style w:customStyle="1" w:styleId="SpecialStringTok" w:type="character">
+    <w:name w:val="SpecialStringTok"/>
+    <w:basedOn w:val="VerbatimChar"/>
+    <w:rPr>
+      <w:color w:val="bb6688"/>
+    </w:rPr>
+  </w:style>
+  <w:style w:customStyle="1" w:styleId="ImportTok" w:type="character">
+    <w:name w:val="ImportTok"/>
+    <w:basedOn w:val="VerbatimChar"/>
+    <w:rPr>
+      <w:color w:val="008000"/>
+      <w:b/>
+    </w:rPr>
+  </w:style>
+  <w:style w:customStyle="1" w:styleId="CommentTok" w:type="character">
+    <w:name w:val="CommentTok"/>
+    <w:basedOn w:val="VerbatimChar"/>
+    <w:rPr>
+      <w:color w:val="60a0b0"/>
+      <w:i/>
+    </w:rPr>
+  </w:style>
+  <w:style w:customStyle="1" w:styleId="DocumentationTok" w:type="character">
+    <w:name w:val="DocumentationTok"/>
+    <w:basedOn w:val="VerbatimChar"/>
+    <w:rPr>
+      <w:color w:val="ba2121"/>
+      <w:i/>
+    </w:rPr>
+  </w:style>
+  <w:style w:customStyle="1" w:styleId="AnnotationTok" w:type="character">
+    <w:name w:val="AnnotationTok"/>
+    <w:basedOn w:val="VerbatimChar"/>
+    <w:rPr>
+      <w:color w:val="60a0b0"/>
+      <w:b/>
+      <w:i/>
+    </w:rPr>
+  </w:style>
+  <w:style w:customStyle="1" w:styleId="CommentVarTok" w:type="character">
+    <w:name w:val="CommentVarTok"/>
+    <w:basedOn w:val="VerbatimChar"/>
+    <w:rPr>
+      <w:color w:val="60a0b0"/>
+      <w:b/>
+      <w:i/>
+    </w:rPr>
+  </w:style>
+  <w:style w:customStyle="1" w:styleId="OtherTok" w:type="character">
+    <w:name w:val="OtherTok"/>
+    <w:basedOn w:val="VerbatimChar"/>
+    <w:rPr>
+      <w:color w:val="007020"/>
+    </w:rPr>
+  </w:style>
+  <w:style w:customStyle="1" w:styleId="FunctionTok" w:type="character">
+    <w:name w:val="FunctionTok"/>
+    <w:basedOn w:val="VerbatimChar"/>
+    <w:rPr>
+      <w:color w:val="06287e"/>
+    </w:rPr>
+  </w:style>
+  <w:style w:customStyle="1" w:styleId="VariableTok" w:type="character">
+    <w:name w:val="VariableTok"/>
+    <w:basedOn w:val="VerbatimChar"/>
+    <w:rPr>
+      <w:color w:val="19177c"/>
+    </w:rPr>
+  </w:style>
+  <w:style w:customStyle="1" w:styleId="ControlFlowTok" w:type="character">
+    <w:name w:val="ControlFlowTok"/>
+    <w:basedOn w:val="VerbatimChar"/>
+    <w:rPr>
+      <w:color w:val="007020"/>
+      <w:b/>
+    </w:rPr>
+  </w:style>
+  <w:style w:customStyle="1" w:styleId="OperatorTok" w:type="character">
+    <w:name w:val="OperatorTok"/>
+    <w:basedOn w:val="VerbatimChar"/>
+    <w:rPr>
+      <w:color w:val="666666"/>
+    </w:rPr>
+  </w:style>
+  <w:style w:customStyle="1" w:styleId="BuiltInTok" w:type="character">
+    <w:name w:val="BuiltInTok"/>
+    <w:basedOn w:val="VerbatimChar"/>
+    <w:rPr>
+      <w:color w:val="008000"/>
+    </w:rPr>
+  </w:style>
+  <w:style w:customStyle="1" w:styleId="ExtensionTok" w:type="character">
+    <w:name w:val="ExtensionTok"/>
+    <w:basedOn w:val="VerbatimChar"/>
+    <w:rPr/>
+  </w:style>
+  <w:style w:customStyle="1" w:styleId="PreprocessorTok" w:type="character">
+    <w:name w:val="PreprocessorTok"/>
+    <w:basedOn w:val="VerbatimChar"/>
+    <w:rPr>
+      <w:color w:val="bc7a00"/>
+    </w:rPr>
+  </w:style>
+  <w:style w:customStyle="1" w:styleId="AttributeTok" w:type="character">
+    <w:name w:val="AttributeTok"/>
+    <w:basedOn w:val="VerbatimChar"/>
+    <w:rPr>
+      <w:color w:val="7d9029"/>
+    </w:rPr>
+  </w:style>
+  <w:style w:customStyle="1" w:styleId="RegionMarkerTok" w:type="character">
+    <w:name w:val="RegionMarkerTok"/>
+    <w:basedOn w:val="VerbatimChar"/>
+    <w:rPr/>
+  </w:style>
+  <w:style w:customStyle="1" w:styleId="InformationTok" w:type="character">
+    <w:name w:val="InformationTok"/>
+    <w:basedOn w:val="VerbatimChar"/>
+    <w:rPr>
+      <w:color w:val="60a0b0"/>
+      <w:b/>
+      <w:i/>
+    </w:rPr>
+  </w:style>
+  <w:style w:customStyle="1" w:styleId="WarningTok" w:type="character">
+    <w:name w:val="WarningTok"/>
+    <w:basedOn w:val="VerbatimChar"/>
+    <w:rPr>
+      <w:color w:val="60a0b0"/>
+      <w:b/>
+      <w:i/>
+    </w:rPr>
+  </w:style>
+  <w:style w:customStyle="1" w:styleId="AlertTok" w:type="character">
+    <w:name w:val="AlertTok"/>
+    <w:basedOn w:val="VerbatimChar"/>
+    <w:rPr>
+      <w:color w:val="ff0000"/>
+      <w:b/>
+    </w:rPr>
+  </w:style>
+  <w:style w:customStyle="1" w:styleId="ErrorTok" w:type="character">
+    <w:name w:val="ErrorTok"/>
+    <w:basedOn w:val="VerbatimChar"/>
+    <w:rPr>
+      <w:color w:val="ff0000"/>
+      <w:b/>
     </w:rPr>
   </w:style>
   <w:style w:customStyle="1" w:styleId="NormalTok" w:type="character">

</xml_diff>

<commit_message>
docs(citations): state that property-counted charges still count repeats by property
A clean-clone test of SVIO-2 showed that a site-window charge (for example
erosion control 37.07) prices a second case at a different property as a
first offense even under the same Violator, because the helper and Writer
match those windows on the site and only time windows on the defendant key.
That is the existing rule; the staff guide, manual, domain rules and the SVIO-2
acceptance item said repeats follow the Violator's address without the
exception. Wording only; no behavior, schema or identity change.

Co-Authored-By: Claude Sonnet 5.5 <noreply@anthropic.com>
Claude-Session: https://claude.ai/code/session_01WPJAZGfD47jPUEgCNYYSg7
</commit_message>
<xml_diff>
--- a/docs/staff/Program_Instruction_Manual.docx
+++ b/docs/staff/Program_Instruction_Manual.docx
@@ -938,7 +938,7 @@
         <w:pStyle w:val="Compact"/>
       </w:pPr>
       <w:r>
-        <w:t xml:space="preserve">Review the whole document, not only the edited sentence. Check recipients (the Recipients button opens copies, email and registered agent; Done closes it once the entries are valid), contact details, the mailing date, the item order and all warnings. The readiness summary at the top counts required fixes and advisories; Go to first required field jumps to the affected field, and Review (or Open full checklist) opens the Review dialog: checks that must be fixed before issuing, then advisories, or a statement that there are no concerns. Each check links to its field; closing the dialog returns you to where you were. A copy can be changed to the type Violator when the person who is responsible for the violation is not the property owner: that person replaces the owner as the main contact in the mailing address block and as the defendant on any citation, and repeat offenses are counted against that person’s address. The owner is still copied under CC unless you clear Also copy the property owner (this choice is kept for the case). A case has one Violator, and a snow removal case always uses the owner. The mailing block is read-only while a Violator is set; change it in Recipients. Install the release that includes this feature on every PC before using it, because earlier releases print the Violator as an ordinary copy.</w:t>
+        <w:t xml:space="preserve">Review the whole document, not only the edited sentence. Check recipients (the Recipients button opens copies, email and registered agent; Done closes it once the entries are valid), contact details, the mailing date, the item order and all warnings. The readiness summary at the top counts required fixes and advisories; Go to first required field jumps to the affected field, and Review (or Open full checklist) opens the Review dialog: checks that must be fixed before issuing, then advisories, or a statement that there are no concerns. Each check links to its field; closing the dialog returns you to where you were. A copy can be changed to the type Violator when the person who is responsible for the violation is not the property owner: that person replaces the owner as the main contact in the mailing address block and as the defendant on any citation, and repeat offenses are counted against that person’s address, except for charges counted by property, such as erosion control under MGO chapter 37, where the repeat count still follows the property. The owner is still copied under CC unless you clear Also copy the property owner (this choice is kept for the case). A case has one Violator, and a snow removal case always uses the owner. The mailing block is read-only while a Violator is set; change it in Recipients. Install the release that includes this feature on every PC before using it, because earlier releases print the Violator as an ordinary copy.</w:t>
       </w:r>
     </w:p>
     <w:p>
@@ -6066,7 +6066,7 @@
         <w:pStyle w:val="BodyText"/>
       </w:pPr>
       <w:r>
-        <w:t xml:space="preserve">Manual source digest 617c679bb064cfea.</w:t>
+        <w:t xml:space="preserve">Manual source digest ccd54334bb8a5051.</w:t>
       </w:r>
     </w:p>
     <w:bookmarkEnd w:id="41"/>
@@ -23111,6 +23111,232 @@
     <w:rPr>
       <w:b/>
       <w:color w:val="ff0000"/>
+    </w:rPr>
+  </w:style>
+  <w:style w:customStyle="1" w:styleId="NormalTok" w:type="character">
+    <w:name w:val="NormalTok"/>
+    <w:basedOn w:val="VerbatimChar"/>
+    <w:rPr/>
+  </w:style>
+  <w:style w:customStyle="1" w:styleId="KeywordTok" w:type="character">
+    <w:name w:val="KeywordTok"/>
+    <w:basedOn w:val="VerbatimChar"/>
+    <w:rPr>
+      <w:color w:val="007020"/>
+      <w:b/>
+    </w:rPr>
+  </w:style>
+  <w:style w:customStyle="1" w:styleId="DataTypeTok" w:type="character">
+    <w:name w:val="DataTypeTok"/>
+    <w:basedOn w:val="VerbatimChar"/>
+    <w:rPr>
+      <w:color w:val="902000"/>
+    </w:rPr>
+  </w:style>
+  <w:style w:customStyle="1" w:styleId="DecValTok" w:type="character">
+    <w:name w:val="DecValTok"/>
+    <w:basedOn w:val="VerbatimChar"/>
+    <w:rPr>
+      <w:color w:val="40a070"/>
+    </w:rPr>
+  </w:style>
+  <w:style w:customStyle="1" w:styleId="BaseNTok" w:type="character">
+    <w:name w:val="BaseNTok"/>
+    <w:basedOn w:val="VerbatimChar"/>
+    <w:rPr>
+      <w:color w:val="40a070"/>
+    </w:rPr>
+  </w:style>
+  <w:style w:customStyle="1" w:styleId="FloatTok" w:type="character">
+    <w:name w:val="FloatTok"/>
+    <w:basedOn w:val="VerbatimChar"/>
+    <w:rPr>
+      <w:color w:val="40a070"/>
+    </w:rPr>
+  </w:style>
+  <w:style w:customStyle="1" w:styleId="ConstantTok" w:type="character">
+    <w:name w:val="ConstantTok"/>
+    <w:basedOn w:val="VerbatimChar"/>
+    <w:rPr>
+      <w:color w:val="880000"/>
+    </w:rPr>
+  </w:style>
+  <w:style w:customStyle="1" w:styleId="CharTok" w:type="character">
+    <w:name w:val="CharTok"/>
+    <w:basedOn w:val="VerbatimChar"/>
+    <w:rPr>
+      <w:color w:val="4070a0"/>
+    </w:rPr>
+  </w:style>
+  <w:style w:customStyle="1" w:styleId="SpecialCharTok" w:type="character">
+    <w:name w:val="SpecialCharTok"/>
+    <w:basedOn w:val="VerbatimChar"/>
+    <w:rPr>
+      <w:color w:val="4070a0"/>
+    </w:rPr>
+  </w:style>
+  <w:style w:customStyle="1" w:styleId="StringTok" w:type="character">
+    <w:name w:val="StringTok"/>
+    <w:basedOn w:val="VerbatimChar"/>
+    <w:rPr>
+      <w:color w:val="4070a0"/>
+    </w:rPr>
+  </w:style>
+  <w:style w:customStyle="1" w:styleId="VerbatimStringTok" w:type="character">
+    <w:name w:val="VerbatimStringTok"/>
+    <w:basedOn w:val="VerbatimChar"/>
+    <w:rPr>
+      <w:color w:val="4070a0"/>
+    </w:rPr>
+  </w:style>
+  <w:style w:customStyle="1" w:styleId="SpecialStringTok" w:type="character">
+    <w:name w:val="SpecialStringTok"/>
+    <w:basedOn w:val="VerbatimChar"/>
+    <w:rPr>
+      <w:color w:val="bb6688"/>
+    </w:rPr>
+  </w:style>
+  <w:style w:customStyle="1" w:styleId="ImportTok" w:type="character">
+    <w:name w:val="ImportTok"/>
+    <w:basedOn w:val="VerbatimChar"/>
+    <w:rPr>
+      <w:color w:val="008000"/>
+      <w:b/>
+    </w:rPr>
+  </w:style>
+  <w:style w:customStyle="1" w:styleId="CommentTok" w:type="character">
+    <w:name w:val="CommentTok"/>
+    <w:basedOn w:val="VerbatimChar"/>
+    <w:rPr>
+      <w:color w:val="60a0b0"/>
+      <w:i/>
+    </w:rPr>
+  </w:style>
+  <w:style w:customStyle="1" w:styleId="DocumentationTok" w:type="character">
+    <w:name w:val="DocumentationTok"/>
+    <w:basedOn w:val="VerbatimChar"/>
+    <w:rPr>
+      <w:color w:val="ba2121"/>
+      <w:i/>
+    </w:rPr>
+  </w:style>
+  <w:style w:customStyle="1" w:styleId="AnnotationTok" w:type="character">
+    <w:name w:val="AnnotationTok"/>
+    <w:basedOn w:val="VerbatimChar"/>
+    <w:rPr>
+      <w:color w:val="60a0b0"/>
+      <w:b/>
+      <w:i/>
+    </w:rPr>
+  </w:style>
+  <w:style w:customStyle="1" w:styleId="CommentVarTok" w:type="character">
+    <w:name w:val="CommentVarTok"/>
+    <w:basedOn w:val="VerbatimChar"/>
+    <w:rPr>
+      <w:color w:val="60a0b0"/>
+      <w:b/>
+      <w:i/>
+    </w:rPr>
+  </w:style>
+  <w:style w:customStyle="1" w:styleId="OtherTok" w:type="character">
+    <w:name w:val="OtherTok"/>
+    <w:basedOn w:val="VerbatimChar"/>
+    <w:rPr>
+      <w:color w:val="007020"/>
+    </w:rPr>
+  </w:style>
+  <w:style w:customStyle="1" w:styleId="FunctionTok" w:type="character">
+    <w:name w:val="FunctionTok"/>
+    <w:basedOn w:val="VerbatimChar"/>
+    <w:rPr>
+      <w:color w:val="06287e"/>
+    </w:rPr>
+  </w:style>
+  <w:style w:customStyle="1" w:styleId="VariableTok" w:type="character">
+    <w:name w:val="VariableTok"/>
+    <w:basedOn w:val="VerbatimChar"/>
+    <w:rPr>
+      <w:color w:val="19177c"/>
+    </w:rPr>
+  </w:style>
+  <w:style w:customStyle="1" w:styleId="ControlFlowTok" w:type="character">
+    <w:name w:val="ControlFlowTok"/>
+    <w:basedOn w:val="VerbatimChar"/>
+    <w:rPr>
+      <w:color w:val="007020"/>
+      <w:b/>
+    </w:rPr>
+  </w:style>
+  <w:style w:customStyle="1" w:styleId="OperatorTok" w:type="character">
+    <w:name w:val="OperatorTok"/>
+    <w:basedOn w:val="VerbatimChar"/>
+    <w:rPr>
+      <w:color w:val="666666"/>
+    </w:rPr>
+  </w:style>
+  <w:style w:customStyle="1" w:styleId="BuiltInTok" w:type="character">
+    <w:name w:val="BuiltInTok"/>
+    <w:basedOn w:val="VerbatimChar"/>
+    <w:rPr>
+      <w:color w:val="008000"/>
+    </w:rPr>
+  </w:style>
+  <w:style w:customStyle="1" w:styleId="ExtensionTok" w:type="character">
+    <w:name w:val="ExtensionTok"/>
+    <w:basedOn w:val="VerbatimChar"/>
+    <w:rPr/>
+  </w:style>
+  <w:style w:customStyle="1" w:styleId="PreprocessorTok" w:type="character">
+    <w:name w:val="PreprocessorTok"/>
+    <w:basedOn w:val="VerbatimChar"/>
+    <w:rPr>
+      <w:color w:val="bc7a00"/>
+    </w:rPr>
+  </w:style>
+  <w:style w:customStyle="1" w:styleId="AttributeTok" w:type="character">
+    <w:name w:val="AttributeTok"/>
+    <w:basedOn w:val="VerbatimChar"/>
+    <w:rPr>
+      <w:color w:val="7d9029"/>
+    </w:rPr>
+  </w:style>
+  <w:style w:customStyle="1" w:styleId="RegionMarkerTok" w:type="character">
+    <w:name w:val="RegionMarkerTok"/>
+    <w:basedOn w:val="VerbatimChar"/>
+    <w:rPr/>
+  </w:style>
+  <w:style w:customStyle="1" w:styleId="InformationTok" w:type="character">
+    <w:name w:val="InformationTok"/>
+    <w:basedOn w:val="VerbatimChar"/>
+    <w:rPr>
+      <w:color w:val="60a0b0"/>
+      <w:b/>
+      <w:i/>
+    </w:rPr>
+  </w:style>
+  <w:style w:customStyle="1" w:styleId="WarningTok" w:type="character">
+    <w:name w:val="WarningTok"/>
+    <w:basedOn w:val="VerbatimChar"/>
+    <w:rPr>
+      <w:color w:val="60a0b0"/>
+      <w:b/>
+      <w:i/>
+    </w:rPr>
+  </w:style>
+  <w:style w:customStyle="1" w:styleId="AlertTok" w:type="character">
+    <w:name w:val="AlertTok"/>
+    <w:basedOn w:val="VerbatimChar"/>
+    <w:rPr>
+      <w:color w:val="ff0000"/>
+      <w:b/>
+    </w:rPr>
+  </w:style>
+  <w:style w:customStyle="1" w:styleId="ErrorTok" w:type="character">
+    <w:name w:val="ErrorTok"/>
+    <w:basedOn w:val="VerbatimChar"/>
+    <w:rPr>
+      <w:color w:val="ff0000"/>
+      <w:b/>
     </w:rPr>
   </w:style>
   <w:style w:customStyle="1" w:styleId="NormalTok" w:type="character">

</xml_diff>

<commit_message>
fix(contacts): drop a completely blank Violator row when Recipients is closed
At the owner's direction (2026-11-01) a Violator row with no name, street or
city is dropped on Done, as a blank ordinary copy is ignored, instead of
refusing Done. A partly filled Violator row is still refused with a message
naming the Violator, and the readiness check still reports a blank one left in
a saved draft. Records the owner's confirmation that a correction cannot add
new items and that a case that exists only as an unissued draft is not listed
in Open cases by inspector. No schema, identity or helper change.

Co-Authored-By: Claude Sonnet 5.5 <noreply@anthropic.com>
Claude-Session: https://claude.ai/code/session_01WPJAZGfD47jPUEgCNYYSg7
</commit_message>
<xml_diff>
--- a/docs/staff/Program_Instruction_Manual.docx
+++ b/docs/staff/Program_Instruction_Manual.docx
@@ -938,7 +938,7 @@
         <w:pStyle w:val="Compact"/>
       </w:pPr>
       <w:r>
-        <w:t xml:space="preserve">Review the whole document, not only the edited sentence. Check recipients (the Recipients button opens copies, email and registered agent; Done closes it once the entries are valid), contact details, the mailing date, the item order and all warnings. The readiness summary at the top counts required fixes and advisories; Go to first required field jumps to the affected field, and Review (or Open full checklist) opens the Review dialog: checks that must be fixed before issuing, then advisories, or a statement that there are no concerns. Each check links to its field; closing the dialog returns you to where you were. A copy can be changed to the type Violator when the person who is responsible for the violation is not the property owner: that person replaces the owner as the main contact in the mailing address block and as the defendant on any citation, and repeat offenses are counted against that person’s address. The owner is still copied under CC unless you clear Also copy the property owner (this choice is kept for the case). A case has one Violator, and a snow removal case always uses the owner. The mailing block is read-only while a Violator is set; change it in Recipients. Install the release that includes this feature on every PC before using it, because earlier releases print the Violator as an ordinary copy.</w:t>
+        <w:t xml:space="preserve">Review the whole document, not only the edited sentence. Check recipients (the Recipients button opens copies, email and registered agent; Done closes it once the entries are valid), contact details, the mailing date, the item order and all warnings. The readiness summary at the top counts required fixes and advisories; Go to first required field jumps to the affected field, and Review (or Open full checklist) opens the Review dialog: checks that must be fixed before issuing, then advisories, or a statement that there are no concerns. Each check links to its field; closing the dialog returns you to where you were. A copy can be changed to the type Violator when the person who is responsible for the violation is not the property owner: that person replaces the owner as the main contact in the mailing address block and as the defendant on any citation, and repeat offenses are counted against that person’s address. The owner is still copied under CC unless you clear Also copy the property owner (this choice is kept for the case). A case has one Violator, and a snow removal case always uses the owner. A Violator row left completely empty is dropped when you close Recipients and the owner is the main contact again; one with only part of the name and address filled in must be completed first. The mailing block is read-only while a Violator is set; change it in Recipients. Install the release that includes this feature on every PC before using it, because earlier releases print the Violator as an ordinary copy.</w:t>
       </w:r>
     </w:p>
     <w:p>
@@ -6066,7 +6066,7 @@
         <w:pStyle w:val="BodyText"/>
       </w:pPr>
       <w:r>
-        <w:t xml:space="preserve">Manual source digest 617c679bb064cfea.</w:t>
+        <w:t xml:space="preserve">Manual source digest 37c526c4c03ad5b8.</w:t>
       </w:r>
     </w:p>
     <w:bookmarkEnd w:id="41"/>
@@ -23111,6 +23111,232 @@
     <w:rPr>
       <w:b/>
       <w:color w:val="ff0000"/>
+    </w:rPr>
+  </w:style>
+  <w:style w:customStyle="1" w:styleId="NormalTok" w:type="character">
+    <w:name w:val="NormalTok"/>
+    <w:basedOn w:val="VerbatimChar"/>
+    <w:rPr/>
+  </w:style>
+  <w:style w:customStyle="1" w:styleId="KeywordTok" w:type="character">
+    <w:name w:val="KeywordTok"/>
+    <w:basedOn w:val="VerbatimChar"/>
+    <w:rPr>
+      <w:color w:val="007020"/>
+      <w:b/>
+    </w:rPr>
+  </w:style>
+  <w:style w:customStyle="1" w:styleId="DataTypeTok" w:type="character">
+    <w:name w:val="DataTypeTok"/>
+    <w:basedOn w:val="VerbatimChar"/>
+    <w:rPr>
+      <w:color w:val="902000"/>
+    </w:rPr>
+  </w:style>
+  <w:style w:customStyle="1" w:styleId="DecValTok" w:type="character">
+    <w:name w:val="DecValTok"/>
+    <w:basedOn w:val="VerbatimChar"/>
+    <w:rPr>
+      <w:color w:val="40a070"/>
+    </w:rPr>
+  </w:style>
+  <w:style w:customStyle="1" w:styleId="BaseNTok" w:type="character">
+    <w:name w:val="BaseNTok"/>
+    <w:basedOn w:val="VerbatimChar"/>
+    <w:rPr>
+      <w:color w:val="40a070"/>
+    </w:rPr>
+  </w:style>
+  <w:style w:customStyle="1" w:styleId="FloatTok" w:type="character">
+    <w:name w:val="FloatTok"/>
+    <w:basedOn w:val="VerbatimChar"/>
+    <w:rPr>
+      <w:color w:val="40a070"/>
+    </w:rPr>
+  </w:style>
+  <w:style w:customStyle="1" w:styleId="ConstantTok" w:type="character">
+    <w:name w:val="ConstantTok"/>
+    <w:basedOn w:val="VerbatimChar"/>
+    <w:rPr>
+      <w:color w:val="880000"/>
+    </w:rPr>
+  </w:style>
+  <w:style w:customStyle="1" w:styleId="CharTok" w:type="character">
+    <w:name w:val="CharTok"/>
+    <w:basedOn w:val="VerbatimChar"/>
+    <w:rPr>
+      <w:color w:val="4070a0"/>
+    </w:rPr>
+  </w:style>
+  <w:style w:customStyle="1" w:styleId="SpecialCharTok" w:type="character">
+    <w:name w:val="SpecialCharTok"/>
+    <w:basedOn w:val="VerbatimChar"/>
+    <w:rPr>
+      <w:color w:val="4070a0"/>
+    </w:rPr>
+  </w:style>
+  <w:style w:customStyle="1" w:styleId="StringTok" w:type="character">
+    <w:name w:val="StringTok"/>
+    <w:basedOn w:val="VerbatimChar"/>
+    <w:rPr>
+      <w:color w:val="4070a0"/>
+    </w:rPr>
+  </w:style>
+  <w:style w:customStyle="1" w:styleId="VerbatimStringTok" w:type="character">
+    <w:name w:val="VerbatimStringTok"/>
+    <w:basedOn w:val="VerbatimChar"/>
+    <w:rPr>
+      <w:color w:val="4070a0"/>
+    </w:rPr>
+  </w:style>
+  <w:style w:customStyle="1" w:styleId="SpecialStringTok" w:type="character">
+    <w:name w:val="SpecialStringTok"/>
+    <w:basedOn w:val="VerbatimChar"/>
+    <w:rPr>
+      <w:color w:val="bb6688"/>
+    </w:rPr>
+  </w:style>
+  <w:style w:customStyle="1" w:styleId="ImportTok" w:type="character">
+    <w:name w:val="ImportTok"/>
+    <w:basedOn w:val="VerbatimChar"/>
+    <w:rPr>
+      <w:color w:val="008000"/>
+      <w:b/>
+    </w:rPr>
+  </w:style>
+  <w:style w:customStyle="1" w:styleId="CommentTok" w:type="character">
+    <w:name w:val="CommentTok"/>
+    <w:basedOn w:val="VerbatimChar"/>
+    <w:rPr>
+      <w:color w:val="60a0b0"/>
+      <w:i/>
+    </w:rPr>
+  </w:style>
+  <w:style w:customStyle="1" w:styleId="DocumentationTok" w:type="character">
+    <w:name w:val="DocumentationTok"/>
+    <w:basedOn w:val="VerbatimChar"/>
+    <w:rPr>
+      <w:color w:val="ba2121"/>
+      <w:i/>
+    </w:rPr>
+  </w:style>
+  <w:style w:customStyle="1" w:styleId="AnnotationTok" w:type="character">
+    <w:name w:val="AnnotationTok"/>
+    <w:basedOn w:val="VerbatimChar"/>
+    <w:rPr>
+      <w:color w:val="60a0b0"/>
+      <w:b/>
+      <w:i/>
+    </w:rPr>
+  </w:style>
+  <w:style w:customStyle="1" w:styleId="CommentVarTok" w:type="character">
+    <w:name w:val="CommentVarTok"/>
+    <w:basedOn w:val="VerbatimChar"/>
+    <w:rPr>
+      <w:color w:val="60a0b0"/>
+      <w:b/>
+      <w:i/>
+    </w:rPr>
+  </w:style>
+  <w:style w:customStyle="1" w:styleId="OtherTok" w:type="character">
+    <w:name w:val="OtherTok"/>
+    <w:basedOn w:val="VerbatimChar"/>
+    <w:rPr>
+      <w:color w:val="007020"/>
+    </w:rPr>
+  </w:style>
+  <w:style w:customStyle="1" w:styleId="FunctionTok" w:type="character">
+    <w:name w:val="FunctionTok"/>
+    <w:basedOn w:val="VerbatimChar"/>
+    <w:rPr>
+      <w:color w:val="06287e"/>
+    </w:rPr>
+  </w:style>
+  <w:style w:customStyle="1" w:styleId="VariableTok" w:type="character">
+    <w:name w:val="VariableTok"/>
+    <w:basedOn w:val="VerbatimChar"/>
+    <w:rPr>
+      <w:color w:val="19177c"/>
+    </w:rPr>
+  </w:style>
+  <w:style w:customStyle="1" w:styleId="ControlFlowTok" w:type="character">
+    <w:name w:val="ControlFlowTok"/>
+    <w:basedOn w:val="VerbatimChar"/>
+    <w:rPr>
+      <w:color w:val="007020"/>
+      <w:b/>
+    </w:rPr>
+  </w:style>
+  <w:style w:customStyle="1" w:styleId="OperatorTok" w:type="character">
+    <w:name w:val="OperatorTok"/>
+    <w:basedOn w:val="VerbatimChar"/>
+    <w:rPr>
+      <w:color w:val="666666"/>
+    </w:rPr>
+  </w:style>
+  <w:style w:customStyle="1" w:styleId="BuiltInTok" w:type="character">
+    <w:name w:val="BuiltInTok"/>
+    <w:basedOn w:val="VerbatimChar"/>
+    <w:rPr>
+      <w:color w:val="008000"/>
+    </w:rPr>
+  </w:style>
+  <w:style w:customStyle="1" w:styleId="ExtensionTok" w:type="character">
+    <w:name w:val="ExtensionTok"/>
+    <w:basedOn w:val="VerbatimChar"/>
+    <w:rPr/>
+  </w:style>
+  <w:style w:customStyle="1" w:styleId="PreprocessorTok" w:type="character">
+    <w:name w:val="PreprocessorTok"/>
+    <w:basedOn w:val="VerbatimChar"/>
+    <w:rPr>
+      <w:color w:val="bc7a00"/>
+    </w:rPr>
+  </w:style>
+  <w:style w:customStyle="1" w:styleId="AttributeTok" w:type="character">
+    <w:name w:val="AttributeTok"/>
+    <w:basedOn w:val="VerbatimChar"/>
+    <w:rPr>
+      <w:color w:val="7d9029"/>
+    </w:rPr>
+  </w:style>
+  <w:style w:customStyle="1" w:styleId="RegionMarkerTok" w:type="character">
+    <w:name w:val="RegionMarkerTok"/>
+    <w:basedOn w:val="VerbatimChar"/>
+    <w:rPr/>
+  </w:style>
+  <w:style w:customStyle="1" w:styleId="InformationTok" w:type="character">
+    <w:name w:val="InformationTok"/>
+    <w:basedOn w:val="VerbatimChar"/>
+    <w:rPr>
+      <w:color w:val="60a0b0"/>
+      <w:b/>
+      <w:i/>
+    </w:rPr>
+  </w:style>
+  <w:style w:customStyle="1" w:styleId="WarningTok" w:type="character">
+    <w:name w:val="WarningTok"/>
+    <w:basedOn w:val="VerbatimChar"/>
+    <w:rPr>
+      <w:color w:val="60a0b0"/>
+      <w:b/>
+      <w:i/>
+    </w:rPr>
+  </w:style>
+  <w:style w:customStyle="1" w:styleId="AlertTok" w:type="character">
+    <w:name w:val="AlertTok"/>
+    <w:basedOn w:val="VerbatimChar"/>
+    <w:rPr>
+      <w:color w:val="ff0000"/>
+      <w:b/>
+    </w:rPr>
+  </w:style>
+  <w:style w:customStyle="1" w:styleId="ErrorTok" w:type="character">
+    <w:name w:val="ErrorTok"/>
+    <w:basedOn w:val="VerbatimChar"/>
+    <w:rPr>
+      <w:color w:val="ff0000"/>
+      <w:b/>
     </w:rPr>
   </w:style>
   <w:style w:customStyle="1" w:styleId="NormalTok" w:type="character">

</xml_diff>

<commit_message>
fix(language): open Browse language and the picker on Approved and standard
At the owner's direction (2026-11-01) both screens default to Approved and
standard instead of Approved language. The bundled language the owner approved
for selection has no recorded catalog review yet, so it was reachable only by
switching scope. Approved language remains a narrower choice, and the catalog
review screen still opens on Needs review. The on-screen sentence, staff guide,
program manual (regenerated), domain rules and acceptance record say so. The
order-language browser test asserts the new default and that erosion language
is listed at it.

The frozen language screen reference text changes in one sentence ("Approved
and standard language is shown by default") because the owner changed the rule
it pinned; nothing else in it changed.

Co-Authored-By: Claude Sonnet 5.5 <noreply@anthropic.com>
Claude-Session: https://claude.ai/code/session_01WPJAZGfD47jPUEgCNYYSg7
</commit_message>
<xml_diff>
--- a/docs/staff/Program_Instruction_Manual.docx
+++ b/docs/staff/Program_Instruction_Manual.docx
@@ -1020,7 +1020,7 @@
         <w:pStyle w:val="FirstParagraph"/>
       </w:pPr>
       <w:r>
-        <w:t xml:space="preserve">Order language (Browse language) and the Select for this notice picker use Approved language by default. Search ordinary words, a title, an ordinance or a catalog identifier across checklists. Multiple terms narrow the results. Trash, garbage, rubbish and refuse are related search terms; handrail, railing and banister are also related.</w:t>
+        <w:t xml:space="preserve">Order language (Browse language) and the Select for this notice picker use Approved and standard by default (owner decision 2026-11-01), so bundled language that the owner approved for selection but the division has not yet reviewed is listed. Search ordinary words, a title, an ordinance or a catalog identifier across checklists. Multiple terms narrow the results. Trash, garbage, rubbish and refuse are related search terms; handrail, railing and banister are also related.</w:t>
       </w:r>
     </w:p>
     <w:p>
@@ -1128,7 +1128,7 @@
               <w:jc w:val="left"/>
             </w:pPr>
             <w:r>
-              <w:t xml:space="preserve">Formally recorded approved entries; the default discovery scope</w:t>
+              <w:t xml:space="preserve">Entries with a formally recorded approved review; a narrower scope</w:t>
             </w:r>
           </w:p>
         </w:tc>
@@ -1154,7 +1154,7 @@
               <w:jc w:val="left"/>
             </w:pPr>
             <w:r>
-              <w:t xml:space="preserve">Deliberate broader scope; standard entries retain selection eligibility but have no recorded formal approval</w:t>
+              <w:t xml:space="preserve">The default discovery scope: approved entries plus standard entries, which keep selection eligibility but have no recorded formal review</w:t>
             </w:r>
           </w:p>
         </w:tc>
@@ -5054,7 +5054,7 @@
               <w:jc w:val="left"/>
             </w:pPr>
             <w:r>
-              <w:t xml:space="preserve">No Approved language results</w:t>
+              <w:t xml:space="preserve">No language results</w:t>
             </w:r>
           </w:p>
         </w:tc>
@@ -5066,7 +5066,7 @@
               <w:jc w:val="left"/>
             </w:pPr>
             <w:r>
-              <w:t xml:space="preserve">Clear search; check review status. Use Approved and standard only deliberately under division policy</w:t>
+              <w:t xml:space="preserve">Clear search; check the status scope. Approved language shows only entries with a recorded formal review, so switch to Approved and standard if you chose the narrower scope</w:t>
             </w:r>
           </w:p>
         </w:tc>
@@ -6066,7 +6066,7 @@
         <w:pStyle w:val="BodyText"/>
       </w:pPr>
       <w:r>
-        <w:t xml:space="preserve">Manual source digest f1a3892f36be9c7d.</w:t>
+        <w:t xml:space="preserve">Manual source digest 12a1b34f77ab815d.</w:t>
       </w:r>
     </w:p>
     <w:bookmarkEnd w:id="41"/>
@@ -23111,6 +23111,232 @@
     <w:rPr>
       <w:b/>
       <w:color w:val="ff0000"/>
+    </w:rPr>
+  </w:style>
+  <w:style w:customStyle="1" w:styleId="NormalTok" w:type="character">
+    <w:name w:val="NormalTok"/>
+    <w:basedOn w:val="VerbatimChar"/>
+    <w:rPr/>
+  </w:style>
+  <w:style w:customStyle="1" w:styleId="KeywordTok" w:type="character">
+    <w:name w:val="KeywordTok"/>
+    <w:basedOn w:val="VerbatimChar"/>
+    <w:rPr>
+      <w:color w:val="007020"/>
+      <w:b/>
+    </w:rPr>
+  </w:style>
+  <w:style w:customStyle="1" w:styleId="DataTypeTok" w:type="character">
+    <w:name w:val="DataTypeTok"/>
+    <w:basedOn w:val="VerbatimChar"/>
+    <w:rPr>
+      <w:color w:val="902000"/>
+    </w:rPr>
+  </w:style>
+  <w:style w:customStyle="1" w:styleId="DecValTok" w:type="character">
+    <w:name w:val="DecValTok"/>
+    <w:basedOn w:val="VerbatimChar"/>
+    <w:rPr>
+      <w:color w:val="40a070"/>
+    </w:rPr>
+  </w:style>
+  <w:style w:customStyle="1" w:styleId="BaseNTok" w:type="character">
+    <w:name w:val="BaseNTok"/>
+    <w:basedOn w:val="VerbatimChar"/>
+    <w:rPr>
+      <w:color w:val="40a070"/>
+    </w:rPr>
+  </w:style>
+  <w:style w:customStyle="1" w:styleId="FloatTok" w:type="character">
+    <w:name w:val="FloatTok"/>
+    <w:basedOn w:val="VerbatimChar"/>
+    <w:rPr>
+      <w:color w:val="40a070"/>
+    </w:rPr>
+  </w:style>
+  <w:style w:customStyle="1" w:styleId="ConstantTok" w:type="character">
+    <w:name w:val="ConstantTok"/>
+    <w:basedOn w:val="VerbatimChar"/>
+    <w:rPr>
+      <w:color w:val="880000"/>
+    </w:rPr>
+  </w:style>
+  <w:style w:customStyle="1" w:styleId="CharTok" w:type="character">
+    <w:name w:val="CharTok"/>
+    <w:basedOn w:val="VerbatimChar"/>
+    <w:rPr>
+      <w:color w:val="4070a0"/>
+    </w:rPr>
+  </w:style>
+  <w:style w:customStyle="1" w:styleId="SpecialCharTok" w:type="character">
+    <w:name w:val="SpecialCharTok"/>
+    <w:basedOn w:val="VerbatimChar"/>
+    <w:rPr>
+      <w:color w:val="4070a0"/>
+    </w:rPr>
+  </w:style>
+  <w:style w:customStyle="1" w:styleId="StringTok" w:type="character">
+    <w:name w:val="StringTok"/>
+    <w:basedOn w:val="VerbatimChar"/>
+    <w:rPr>
+      <w:color w:val="4070a0"/>
+    </w:rPr>
+  </w:style>
+  <w:style w:customStyle="1" w:styleId="VerbatimStringTok" w:type="character">
+    <w:name w:val="VerbatimStringTok"/>
+    <w:basedOn w:val="VerbatimChar"/>
+    <w:rPr>
+      <w:color w:val="4070a0"/>
+    </w:rPr>
+  </w:style>
+  <w:style w:customStyle="1" w:styleId="SpecialStringTok" w:type="character">
+    <w:name w:val="SpecialStringTok"/>
+    <w:basedOn w:val="VerbatimChar"/>
+    <w:rPr>
+      <w:color w:val="bb6688"/>
+    </w:rPr>
+  </w:style>
+  <w:style w:customStyle="1" w:styleId="ImportTok" w:type="character">
+    <w:name w:val="ImportTok"/>
+    <w:basedOn w:val="VerbatimChar"/>
+    <w:rPr>
+      <w:color w:val="008000"/>
+      <w:b/>
+    </w:rPr>
+  </w:style>
+  <w:style w:customStyle="1" w:styleId="CommentTok" w:type="character">
+    <w:name w:val="CommentTok"/>
+    <w:basedOn w:val="VerbatimChar"/>
+    <w:rPr>
+      <w:color w:val="60a0b0"/>
+      <w:i/>
+    </w:rPr>
+  </w:style>
+  <w:style w:customStyle="1" w:styleId="DocumentationTok" w:type="character">
+    <w:name w:val="DocumentationTok"/>
+    <w:basedOn w:val="VerbatimChar"/>
+    <w:rPr>
+      <w:color w:val="ba2121"/>
+      <w:i/>
+    </w:rPr>
+  </w:style>
+  <w:style w:customStyle="1" w:styleId="AnnotationTok" w:type="character">
+    <w:name w:val="AnnotationTok"/>
+    <w:basedOn w:val="VerbatimChar"/>
+    <w:rPr>
+      <w:color w:val="60a0b0"/>
+      <w:b/>
+      <w:i/>
+    </w:rPr>
+  </w:style>
+  <w:style w:customStyle="1" w:styleId="CommentVarTok" w:type="character">
+    <w:name w:val="CommentVarTok"/>
+    <w:basedOn w:val="VerbatimChar"/>
+    <w:rPr>
+      <w:color w:val="60a0b0"/>
+      <w:b/>
+      <w:i/>
+    </w:rPr>
+  </w:style>
+  <w:style w:customStyle="1" w:styleId="OtherTok" w:type="character">
+    <w:name w:val="OtherTok"/>
+    <w:basedOn w:val="VerbatimChar"/>
+    <w:rPr>
+      <w:color w:val="007020"/>
+    </w:rPr>
+  </w:style>
+  <w:style w:customStyle="1" w:styleId="FunctionTok" w:type="character">
+    <w:name w:val="FunctionTok"/>
+    <w:basedOn w:val="VerbatimChar"/>
+    <w:rPr>
+      <w:color w:val="06287e"/>
+    </w:rPr>
+  </w:style>
+  <w:style w:customStyle="1" w:styleId="VariableTok" w:type="character">
+    <w:name w:val="VariableTok"/>
+    <w:basedOn w:val="VerbatimChar"/>
+    <w:rPr>
+      <w:color w:val="19177c"/>
+    </w:rPr>
+  </w:style>
+  <w:style w:customStyle="1" w:styleId="ControlFlowTok" w:type="character">
+    <w:name w:val="ControlFlowTok"/>
+    <w:basedOn w:val="VerbatimChar"/>
+    <w:rPr>
+      <w:color w:val="007020"/>
+      <w:b/>
+    </w:rPr>
+  </w:style>
+  <w:style w:customStyle="1" w:styleId="OperatorTok" w:type="character">
+    <w:name w:val="OperatorTok"/>
+    <w:basedOn w:val="VerbatimChar"/>
+    <w:rPr>
+      <w:color w:val="666666"/>
+    </w:rPr>
+  </w:style>
+  <w:style w:customStyle="1" w:styleId="BuiltInTok" w:type="character">
+    <w:name w:val="BuiltInTok"/>
+    <w:basedOn w:val="VerbatimChar"/>
+    <w:rPr>
+      <w:color w:val="008000"/>
+    </w:rPr>
+  </w:style>
+  <w:style w:customStyle="1" w:styleId="ExtensionTok" w:type="character">
+    <w:name w:val="ExtensionTok"/>
+    <w:basedOn w:val="VerbatimChar"/>
+    <w:rPr/>
+  </w:style>
+  <w:style w:customStyle="1" w:styleId="PreprocessorTok" w:type="character">
+    <w:name w:val="PreprocessorTok"/>
+    <w:basedOn w:val="VerbatimChar"/>
+    <w:rPr>
+      <w:color w:val="bc7a00"/>
+    </w:rPr>
+  </w:style>
+  <w:style w:customStyle="1" w:styleId="AttributeTok" w:type="character">
+    <w:name w:val="AttributeTok"/>
+    <w:basedOn w:val="VerbatimChar"/>
+    <w:rPr>
+      <w:color w:val="7d9029"/>
+    </w:rPr>
+  </w:style>
+  <w:style w:customStyle="1" w:styleId="RegionMarkerTok" w:type="character">
+    <w:name w:val="RegionMarkerTok"/>
+    <w:basedOn w:val="VerbatimChar"/>
+    <w:rPr/>
+  </w:style>
+  <w:style w:customStyle="1" w:styleId="InformationTok" w:type="character">
+    <w:name w:val="InformationTok"/>
+    <w:basedOn w:val="VerbatimChar"/>
+    <w:rPr>
+      <w:color w:val="60a0b0"/>
+      <w:b/>
+      <w:i/>
+    </w:rPr>
+  </w:style>
+  <w:style w:customStyle="1" w:styleId="WarningTok" w:type="character">
+    <w:name w:val="WarningTok"/>
+    <w:basedOn w:val="VerbatimChar"/>
+    <w:rPr>
+      <w:color w:val="60a0b0"/>
+      <w:b/>
+      <w:i/>
+    </w:rPr>
+  </w:style>
+  <w:style w:customStyle="1" w:styleId="AlertTok" w:type="character">
+    <w:name w:val="AlertTok"/>
+    <w:basedOn w:val="VerbatimChar"/>
+    <w:rPr>
+      <w:color w:val="ff0000"/>
+      <w:b/>
+    </w:rPr>
+  </w:style>
+  <w:style w:customStyle="1" w:styleId="ErrorTok" w:type="character">
+    <w:name w:val="ErrorTok"/>
+    <w:basedOn w:val="VerbatimChar"/>
+    <w:rPr>
+      <w:color w:val="ff0000"/>
+      <w:b/>
     </w:rPr>
   </w:style>
   <w:style w:customStyle="1" w:styleId="NormalTok" w:type="character">

</xml_diff>

<commit_message>
feat(import): show only the requested columns and rename Find Case Inspections
At the owner's direction the open-case list shows the case number, address,
description and the latest inspection's type, status and date, and the search
covers case number, address and description only (the owner, case status,
opened date and parcel are no longer shown or searched). The case-number
lookup button and heading are renamed from Find Accela inspection to Find Case
Inspections; the function is unchanged. The label in the tests, the frozen
import-screen reference and the staff guides and manual (regenerated) follows.

Co-Authored-By: Claude Sonnet 5.5 <noreply@anthropic.com>
Claude-Session: https://claude.ai/code/session_01WPJAZGfD47jPUEgCNYYSg7
</commit_message>
<xml_diff>
--- a/docs/staff/Program_Instruction_Manual.docx
+++ b/docs/staff/Program_Instruction_Manual.docx
@@ -622,7 +622,7 @@
         <w:t xml:space="preserve"> </w:t>
       </w:r>
       <w:r>
-        <w:t xml:space="preserve">In Workspace choose Import inspection, enter the complete case number and choose Find Accela inspection or press Enter. The Windows helper runs the supplied read-only SQL query with the signed-in Windows account. Inspectors do not enter SQL, passwords or server settings. The initial default server is sqlelam; IT can set the approved database and server in shared Case Lookup/settings.json.</w:t>
+        <w:t xml:space="preserve">In Workspace choose Import inspection, enter the complete case number and choose Find Case Inspections or press Enter. The Windows helper runs the supplied read-only SQL query with the signed-in Windows account. Inspectors do not enter SQL, passwords or server settings. The initial default server is sqlelam; IT can set the approved database and server in shared Case Lookup/settings.json.</w:t>
       </w:r>
     </w:p>
     <w:p>
@@ -852,7 +852,7 @@
         <w:t xml:space="preserve"> </w:t>
       </w:r>
       <w:r>
-        <w:t xml:space="preserve">Save draft &amp; return to Workspace retains the lookup or review on this device. A retained review is a snapshot with its retrieval time; use Find Accela inspection again for fresh information. Cancel lookup suppresses its result. A failed or empty lookup preserves prior work. If the shared case changed, review the refreshed comparison and confirm again. A delayed earlier result must not replace the current case or reopen Import after navigation.</w:t>
+        <w:t xml:space="preserve">Save draft &amp; return to Workspace retains the lookup or review on this device. A retained review is a snapshot with its retrieval time; use Find Case Inspections again for fresh information. Cancel lookup suppresses its result. A failed or empty lookup preserves prior work. If the shared case changed, review the refreshed comparison and confirm again. A delayed earlier result must not replace the current case or reopen Import after navigation.</w:t>
       </w:r>
     </w:p>
     <w:p>
@@ -4039,7 +4039,7 @@
         <w:t xml:space="preserve"> </w:t>
       </w:r>
       <w:r>
-        <w:t xml:space="preserve">In the same Search shared case records window, choose an inspector under Open cases by inspector and select Show open cases. The list shows that inspector’s cases that are not closed or withdrawn, soonest deadline first, using the same rule as the Open cases report. A case belongs to the inspector assigned on the case; Unassigned or former inspector lists cases with no assigned inspector or one who is not on the division’s list. If some case files were left out because their summary is missing, out of date or unreadable, the list says how many and may be incomplete. Select Continue case beside a case: Writer asks you to import a new inspection result to continue it. Import inspection opens with that case number ready; select Find Accela inspection to look it up. If an inspection for that case is already imported and waiting, you can continue with it instead. If an import for a different case is waiting, finish or cancel it first. Open case without importing opens the case as before. Nothing is imported, issued or changed until you complete the import steps yourself.</w:t>
+        <w:t xml:space="preserve">In the same Search shared case records window, choose an inspector under Open cases by inspector and select Show open cases. The list shows that inspector’s cases that are not closed or withdrawn, soonest deadline first, using the same rule as the Open cases report. A case belongs to the inspector assigned on the case; Unassigned or former inspector lists cases with no assigned inspector or one who is not on the division’s list. If some case files were left out because their summary is missing, out of date or unreadable, the list says how many and may be incomplete. Select Continue case beside a case: Writer asks you to import a new inspection result to continue it. Import inspection opens with that case number ready; select Find Case Inspections to look it up. If an inspection for that case is already imported and waiting, you can continue with it instead. If an import for a different case is waiting, finish or cancel it first. Open case without importing opens the case as before. Nothing is imported, issued or changed until you complete the import steps yourself.</w:t>
       </w:r>
     </w:p>
     <w:p>
@@ -6066,7 +6066,7 @@
         <w:pStyle w:val="BodyText"/>
       </w:pPr>
       <w:r>
-        <w:t xml:space="preserve">Manual source digest 12a1b34f77ab815d.</w:t>
+        <w:t xml:space="preserve">Manual source digest 2dcdd7afa4712642.</w:t>
       </w:r>
     </w:p>
     <w:bookmarkEnd w:id="41"/>
@@ -23111,6 +23111,232 @@
     <w:rPr>
       <w:b/>
       <w:color w:val="ff0000"/>
+    </w:rPr>
+  </w:style>
+  <w:style w:customStyle="1" w:styleId="NormalTok" w:type="character">
+    <w:name w:val="NormalTok"/>
+    <w:basedOn w:val="VerbatimChar"/>
+    <w:rPr/>
+  </w:style>
+  <w:style w:customStyle="1" w:styleId="KeywordTok" w:type="character">
+    <w:name w:val="KeywordTok"/>
+    <w:basedOn w:val="VerbatimChar"/>
+    <w:rPr>
+      <w:color w:val="007020"/>
+      <w:b/>
+    </w:rPr>
+  </w:style>
+  <w:style w:customStyle="1" w:styleId="DataTypeTok" w:type="character">
+    <w:name w:val="DataTypeTok"/>
+    <w:basedOn w:val="VerbatimChar"/>
+    <w:rPr>
+      <w:color w:val="902000"/>
+    </w:rPr>
+  </w:style>
+  <w:style w:customStyle="1" w:styleId="DecValTok" w:type="character">
+    <w:name w:val="DecValTok"/>
+    <w:basedOn w:val="VerbatimChar"/>
+    <w:rPr>
+      <w:color w:val="40a070"/>
+    </w:rPr>
+  </w:style>
+  <w:style w:customStyle="1" w:styleId="BaseNTok" w:type="character">
+    <w:name w:val="BaseNTok"/>
+    <w:basedOn w:val="VerbatimChar"/>
+    <w:rPr>
+      <w:color w:val="40a070"/>
+    </w:rPr>
+  </w:style>
+  <w:style w:customStyle="1" w:styleId="FloatTok" w:type="character">
+    <w:name w:val="FloatTok"/>
+    <w:basedOn w:val="VerbatimChar"/>
+    <w:rPr>
+      <w:color w:val="40a070"/>
+    </w:rPr>
+  </w:style>
+  <w:style w:customStyle="1" w:styleId="ConstantTok" w:type="character">
+    <w:name w:val="ConstantTok"/>
+    <w:basedOn w:val="VerbatimChar"/>
+    <w:rPr>
+      <w:color w:val="880000"/>
+    </w:rPr>
+  </w:style>
+  <w:style w:customStyle="1" w:styleId="CharTok" w:type="character">
+    <w:name w:val="CharTok"/>
+    <w:basedOn w:val="VerbatimChar"/>
+    <w:rPr>
+      <w:color w:val="4070a0"/>
+    </w:rPr>
+  </w:style>
+  <w:style w:customStyle="1" w:styleId="SpecialCharTok" w:type="character">
+    <w:name w:val="SpecialCharTok"/>
+    <w:basedOn w:val="VerbatimChar"/>
+    <w:rPr>
+      <w:color w:val="4070a0"/>
+    </w:rPr>
+  </w:style>
+  <w:style w:customStyle="1" w:styleId="StringTok" w:type="character">
+    <w:name w:val="StringTok"/>
+    <w:basedOn w:val="VerbatimChar"/>
+    <w:rPr>
+      <w:color w:val="4070a0"/>
+    </w:rPr>
+  </w:style>
+  <w:style w:customStyle="1" w:styleId="VerbatimStringTok" w:type="character">
+    <w:name w:val="VerbatimStringTok"/>
+    <w:basedOn w:val="VerbatimChar"/>
+    <w:rPr>
+      <w:color w:val="4070a0"/>
+    </w:rPr>
+  </w:style>
+  <w:style w:customStyle="1" w:styleId="SpecialStringTok" w:type="character">
+    <w:name w:val="SpecialStringTok"/>
+    <w:basedOn w:val="VerbatimChar"/>
+    <w:rPr>
+      <w:color w:val="bb6688"/>
+    </w:rPr>
+  </w:style>
+  <w:style w:customStyle="1" w:styleId="ImportTok" w:type="character">
+    <w:name w:val="ImportTok"/>
+    <w:basedOn w:val="VerbatimChar"/>
+    <w:rPr>
+      <w:color w:val="008000"/>
+      <w:b/>
+    </w:rPr>
+  </w:style>
+  <w:style w:customStyle="1" w:styleId="CommentTok" w:type="character">
+    <w:name w:val="CommentTok"/>
+    <w:basedOn w:val="VerbatimChar"/>
+    <w:rPr>
+      <w:color w:val="60a0b0"/>
+      <w:i/>
+    </w:rPr>
+  </w:style>
+  <w:style w:customStyle="1" w:styleId="DocumentationTok" w:type="character">
+    <w:name w:val="DocumentationTok"/>
+    <w:basedOn w:val="VerbatimChar"/>
+    <w:rPr>
+      <w:color w:val="ba2121"/>
+      <w:i/>
+    </w:rPr>
+  </w:style>
+  <w:style w:customStyle="1" w:styleId="AnnotationTok" w:type="character">
+    <w:name w:val="AnnotationTok"/>
+    <w:basedOn w:val="VerbatimChar"/>
+    <w:rPr>
+      <w:color w:val="60a0b0"/>
+      <w:b/>
+      <w:i/>
+    </w:rPr>
+  </w:style>
+  <w:style w:customStyle="1" w:styleId="CommentVarTok" w:type="character">
+    <w:name w:val="CommentVarTok"/>
+    <w:basedOn w:val="VerbatimChar"/>
+    <w:rPr>
+      <w:color w:val="60a0b0"/>
+      <w:b/>
+      <w:i/>
+    </w:rPr>
+  </w:style>
+  <w:style w:customStyle="1" w:styleId="OtherTok" w:type="character">
+    <w:name w:val="OtherTok"/>
+    <w:basedOn w:val="VerbatimChar"/>
+    <w:rPr>
+      <w:color w:val="007020"/>
+    </w:rPr>
+  </w:style>
+  <w:style w:customStyle="1" w:styleId="FunctionTok" w:type="character">
+    <w:name w:val="FunctionTok"/>
+    <w:basedOn w:val="VerbatimChar"/>
+    <w:rPr>
+      <w:color w:val="06287e"/>
+    </w:rPr>
+  </w:style>
+  <w:style w:customStyle="1" w:styleId="VariableTok" w:type="character">
+    <w:name w:val="VariableTok"/>
+    <w:basedOn w:val="VerbatimChar"/>
+    <w:rPr>
+      <w:color w:val="19177c"/>
+    </w:rPr>
+  </w:style>
+  <w:style w:customStyle="1" w:styleId="ControlFlowTok" w:type="character">
+    <w:name w:val="ControlFlowTok"/>
+    <w:basedOn w:val="VerbatimChar"/>
+    <w:rPr>
+      <w:color w:val="007020"/>
+      <w:b/>
+    </w:rPr>
+  </w:style>
+  <w:style w:customStyle="1" w:styleId="OperatorTok" w:type="character">
+    <w:name w:val="OperatorTok"/>
+    <w:basedOn w:val="VerbatimChar"/>
+    <w:rPr>
+      <w:color w:val="666666"/>
+    </w:rPr>
+  </w:style>
+  <w:style w:customStyle="1" w:styleId="BuiltInTok" w:type="character">
+    <w:name w:val="BuiltInTok"/>
+    <w:basedOn w:val="VerbatimChar"/>
+    <w:rPr>
+      <w:color w:val="008000"/>
+    </w:rPr>
+  </w:style>
+  <w:style w:customStyle="1" w:styleId="ExtensionTok" w:type="character">
+    <w:name w:val="ExtensionTok"/>
+    <w:basedOn w:val="VerbatimChar"/>
+    <w:rPr/>
+  </w:style>
+  <w:style w:customStyle="1" w:styleId="PreprocessorTok" w:type="character">
+    <w:name w:val="PreprocessorTok"/>
+    <w:basedOn w:val="VerbatimChar"/>
+    <w:rPr>
+      <w:color w:val="bc7a00"/>
+    </w:rPr>
+  </w:style>
+  <w:style w:customStyle="1" w:styleId="AttributeTok" w:type="character">
+    <w:name w:val="AttributeTok"/>
+    <w:basedOn w:val="VerbatimChar"/>
+    <w:rPr>
+      <w:color w:val="7d9029"/>
+    </w:rPr>
+  </w:style>
+  <w:style w:customStyle="1" w:styleId="RegionMarkerTok" w:type="character">
+    <w:name w:val="RegionMarkerTok"/>
+    <w:basedOn w:val="VerbatimChar"/>
+    <w:rPr/>
+  </w:style>
+  <w:style w:customStyle="1" w:styleId="InformationTok" w:type="character">
+    <w:name w:val="InformationTok"/>
+    <w:basedOn w:val="VerbatimChar"/>
+    <w:rPr>
+      <w:color w:val="60a0b0"/>
+      <w:b/>
+      <w:i/>
+    </w:rPr>
+  </w:style>
+  <w:style w:customStyle="1" w:styleId="WarningTok" w:type="character">
+    <w:name w:val="WarningTok"/>
+    <w:basedOn w:val="VerbatimChar"/>
+    <w:rPr>
+      <w:color w:val="60a0b0"/>
+      <w:b/>
+      <w:i/>
+    </w:rPr>
+  </w:style>
+  <w:style w:customStyle="1" w:styleId="AlertTok" w:type="character">
+    <w:name w:val="AlertTok"/>
+    <w:basedOn w:val="VerbatimChar"/>
+    <w:rPr>
+      <w:color w:val="ff0000"/>
+      <w:b/>
+    </w:rPr>
+  </w:style>
+  <w:style w:customStyle="1" w:styleId="ErrorTok" w:type="character">
+    <w:name w:val="ErrorTok"/>
+    <w:basedOn w:val="VerbatimChar"/>
+    <w:rPr>
+      <w:color w:val="ff0000"/>
+      <w:b/>
     </w:rPr>
   </w:style>
   <w:style w:customStyle="1" w:styleId="NormalTok" w:type="character">

</xml_diff>

<commit_message>
docs(import): describe the open-case list and add its City acceptance checks
Staff guide and program manual explain choosing an inspector, searching the list
and Import. The acceptance record adds OCL-1 to OCL-7 (real-server load,
permissions, run time and counts, the Compliance status rule, the exclusion file,
the import hand-off, failure messages and the guard rails). Records the owner's
decision to keep the Excel/CSV import until those pass.

Co-Authored-By: Claude Sonnet 5.5 <noreply@anthropic.com>
Claude-Session: https://claude.ai/code/session_01WPJAZGfD47jPUEgCNYYSg7
</commit_message>
<xml_diff>
--- a/docs/staff/Program_Instruction_Manual.docx
+++ b/docs/staff/Program_Instruction_Manual.docx
@@ -610,6 +610,24 @@
     <w:p>
       <w:pPr>
         <w:pStyle w:val="FirstParagraph"/>
+      </w:pPr>
+      <w:r>
+        <w:rPr>
+          <w:bCs/>
+          <w:b/>
+        </w:rPr>
+        <w:t xml:space="preserve">Open cases by inspector.</w:t>
+      </w:r>
+      <w:r>
+        <w:t xml:space="preserve"> </w:t>
+      </w:r>
+      <w:r>
+        <w:t xml:space="preserve">Import inspection opens with an Open cases by inspector card above the case-number lookup. Choose an inspector, then Show open cases. The list shows each open enforcement case with its case number, address, description and the latest inspection’s type, status and date; type in the search box to narrow it by case number, address or description, and use Refresh to load it again (the time it was loaded is shown). Choose Import on a case: Document Writer puts that case number in the lookup box and runs Find Case Inspections for it, so everything after that works exactly as for a typed case number. Import is unavailable while a lookup is running or while another import is waiting for review below (finish or cancel it first). If the list cannot load, a plain message says why (for example your Windows account cannot read the case database, or the City network timed out) with Try again. The list is not saved and is loaded fresh each time you open the program. The case-number lookup below the list remains for any case that is not on it.</w:t>
+      </w:r>
+    </w:p>
+    <w:p>
+      <w:pPr>
+        <w:pStyle w:val="BodyText"/>
       </w:pPr>
       <w:r>
         <w:rPr>
@@ -6066,7 +6084,7 @@
         <w:pStyle w:val="BodyText"/>
       </w:pPr>
       <w:r>
-        <w:t xml:space="preserve">Manual source digest 2dcdd7afa4712642.</w:t>
+        <w:t xml:space="preserve">Manual source digest c41494368afe0100.</w:t>
       </w:r>
     </w:p>
     <w:bookmarkEnd w:id="41"/>
@@ -23111,6 +23129,232 @@
     <w:rPr>
       <w:b/>
       <w:color w:val="ff0000"/>
+    </w:rPr>
+  </w:style>
+  <w:style w:customStyle="1" w:styleId="NormalTok" w:type="character">
+    <w:name w:val="NormalTok"/>
+    <w:basedOn w:val="VerbatimChar"/>
+    <w:rPr/>
+  </w:style>
+  <w:style w:customStyle="1" w:styleId="KeywordTok" w:type="character">
+    <w:name w:val="KeywordTok"/>
+    <w:basedOn w:val="VerbatimChar"/>
+    <w:rPr>
+      <w:color w:val="007020"/>
+      <w:b/>
+    </w:rPr>
+  </w:style>
+  <w:style w:customStyle="1" w:styleId="DataTypeTok" w:type="character">
+    <w:name w:val="DataTypeTok"/>
+    <w:basedOn w:val="VerbatimChar"/>
+    <w:rPr>
+      <w:color w:val="902000"/>
+    </w:rPr>
+  </w:style>
+  <w:style w:customStyle="1" w:styleId="DecValTok" w:type="character">
+    <w:name w:val="DecValTok"/>
+    <w:basedOn w:val="VerbatimChar"/>
+    <w:rPr>
+      <w:color w:val="40a070"/>
+    </w:rPr>
+  </w:style>
+  <w:style w:customStyle="1" w:styleId="BaseNTok" w:type="character">
+    <w:name w:val="BaseNTok"/>
+    <w:basedOn w:val="VerbatimChar"/>
+    <w:rPr>
+      <w:color w:val="40a070"/>
+    </w:rPr>
+  </w:style>
+  <w:style w:customStyle="1" w:styleId="FloatTok" w:type="character">
+    <w:name w:val="FloatTok"/>
+    <w:basedOn w:val="VerbatimChar"/>
+    <w:rPr>
+      <w:color w:val="40a070"/>
+    </w:rPr>
+  </w:style>
+  <w:style w:customStyle="1" w:styleId="ConstantTok" w:type="character">
+    <w:name w:val="ConstantTok"/>
+    <w:basedOn w:val="VerbatimChar"/>
+    <w:rPr>
+      <w:color w:val="880000"/>
+    </w:rPr>
+  </w:style>
+  <w:style w:customStyle="1" w:styleId="CharTok" w:type="character">
+    <w:name w:val="CharTok"/>
+    <w:basedOn w:val="VerbatimChar"/>
+    <w:rPr>
+      <w:color w:val="4070a0"/>
+    </w:rPr>
+  </w:style>
+  <w:style w:customStyle="1" w:styleId="SpecialCharTok" w:type="character">
+    <w:name w:val="SpecialCharTok"/>
+    <w:basedOn w:val="VerbatimChar"/>
+    <w:rPr>
+      <w:color w:val="4070a0"/>
+    </w:rPr>
+  </w:style>
+  <w:style w:customStyle="1" w:styleId="StringTok" w:type="character">
+    <w:name w:val="StringTok"/>
+    <w:basedOn w:val="VerbatimChar"/>
+    <w:rPr>
+      <w:color w:val="4070a0"/>
+    </w:rPr>
+  </w:style>
+  <w:style w:customStyle="1" w:styleId="VerbatimStringTok" w:type="character">
+    <w:name w:val="VerbatimStringTok"/>
+    <w:basedOn w:val="VerbatimChar"/>
+    <w:rPr>
+      <w:color w:val="4070a0"/>
+    </w:rPr>
+  </w:style>
+  <w:style w:customStyle="1" w:styleId="SpecialStringTok" w:type="character">
+    <w:name w:val="SpecialStringTok"/>
+    <w:basedOn w:val="VerbatimChar"/>
+    <w:rPr>
+      <w:color w:val="bb6688"/>
+    </w:rPr>
+  </w:style>
+  <w:style w:customStyle="1" w:styleId="ImportTok" w:type="character">
+    <w:name w:val="ImportTok"/>
+    <w:basedOn w:val="VerbatimChar"/>
+    <w:rPr>
+      <w:color w:val="008000"/>
+      <w:b/>
+    </w:rPr>
+  </w:style>
+  <w:style w:customStyle="1" w:styleId="CommentTok" w:type="character">
+    <w:name w:val="CommentTok"/>
+    <w:basedOn w:val="VerbatimChar"/>
+    <w:rPr>
+      <w:color w:val="60a0b0"/>
+      <w:i/>
+    </w:rPr>
+  </w:style>
+  <w:style w:customStyle="1" w:styleId="DocumentationTok" w:type="character">
+    <w:name w:val="DocumentationTok"/>
+    <w:basedOn w:val="VerbatimChar"/>
+    <w:rPr>
+      <w:color w:val="ba2121"/>
+      <w:i/>
+    </w:rPr>
+  </w:style>
+  <w:style w:customStyle="1" w:styleId="AnnotationTok" w:type="character">
+    <w:name w:val="AnnotationTok"/>
+    <w:basedOn w:val="VerbatimChar"/>
+    <w:rPr>
+      <w:color w:val="60a0b0"/>
+      <w:b/>
+      <w:i/>
+    </w:rPr>
+  </w:style>
+  <w:style w:customStyle="1" w:styleId="CommentVarTok" w:type="character">
+    <w:name w:val="CommentVarTok"/>
+    <w:basedOn w:val="VerbatimChar"/>
+    <w:rPr>
+      <w:color w:val="60a0b0"/>
+      <w:b/>
+      <w:i/>
+    </w:rPr>
+  </w:style>
+  <w:style w:customStyle="1" w:styleId="OtherTok" w:type="character">
+    <w:name w:val="OtherTok"/>
+    <w:basedOn w:val="VerbatimChar"/>
+    <w:rPr>
+      <w:color w:val="007020"/>
+    </w:rPr>
+  </w:style>
+  <w:style w:customStyle="1" w:styleId="FunctionTok" w:type="character">
+    <w:name w:val="FunctionTok"/>
+    <w:basedOn w:val="VerbatimChar"/>
+    <w:rPr>
+      <w:color w:val="06287e"/>
+    </w:rPr>
+  </w:style>
+  <w:style w:customStyle="1" w:styleId="VariableTok" w:type="character">
+    <w:name w:val="VariableTok"/>
+    <w:basedOn w:val="VerbatimChar"/>
+    <w:rPr>
+      <w:color w:val="19177c"/>
+    </w:rPr>
+  </w:style>
+  <w:style w:customStyle="1" w:styleId="ControlFlowTok" w:type="character">
+    <w:name w:val="ControlFlowTok"/>
+    <w:basedOn w:val="VerbatimChar"/>
+    <w:rPr>
+      <w:color w:val="007020"/>
+      <w:b/>
+    </w:rPr>
+  </w:style>
+  <w:style w:customStyle="1" w:styleId="OperatorTok" w:type="character">
+    <w:name w:val="OperatorTok"/>
+    <w:basedOn w:val="VerbatimChar"/>
+    <w:rPr>
+      <w:color w:val="666666"/>
+    </w:rPr>
+  </w:style>
+  <w:style w:customStyle="1" w:styleId="BuiltInTok" w:type="character">
+    <w:name w:val="BuiltInTok"/>
+    <w:basedOn w:val="VerbatimChar"/>
+    <w:rPr>
+      <w:color w:val="008000"/>
+    </w:rPr>
+  </w:style>
+  <w:style w:customStyle="1" w:styleId="ExtensionTok" w:type="character">
+    <w:name w:val="ExtensionTok"/>
+    <w:basedOn w:val="VerbatimChar"/>
+    <w:rPr/>
+  </w:style>
+  <w:style w:customStyle="1" w:styleId="PreprocessorTok" w:type="character">
+    <w:name w:val="PreprocessorTok"/>
+    <w:basedOn w:val="VerbatimChar"/>
+    <w:rPr>
+      <w:color w:val="bc7a00"/>
+    </w:rPr>
+  </w:style>
+  <w:style w:customStyle="1" w:styleId="AttributeTok" w:type="character">
+    <w:name w:val="AttributeTok"/>
+    <w:basedOn w:val="VerbatimChar"/>
+    <w:rPr>
+      <w:color w:val="7d9029"/>
+    </w:rPr>
+  </w:style>
+  <w:style w:customStyle="1" w:styleId="RegionMarkerTok" w:type="character">
+    <w:name w:val="RegionMarkerTok"/>
+    <w:basedOn w:val="VerbatimChar"/>
+    <w:rPr/>
+  </w:style>
+  <w:style w:customStyle="1" w:styleId="InformationTok" w:type="character">
+    <w:name w:val="InformationTok"/>
+    <w:basedOn w:val="VerbatimChar"/>
+    <w:rPr>
+      <w:color w:val="60a0b0"/>
+      <w:b/>
+      <w:i/>
+    </w:rPr>
+  </w:style>
+  <w:style w:customStyle="1" w:styleId="WarningTok" w:type="character">
+    <w:name w:val="WarningTok"/>
+    <w:basedOn w:val="VerbatimChar"/>
+    <w:rPr>
+      <w:color w:val="60a0b0"/>
+      <w:b/>
+      <w:i/>
+    </w:rPr>
+  </w:style>
+  <w:style w:customStyle="1" w:styleId="AlertTok" w:type="character">
+    <w:name w:val="AlertTok"/>
+    <w:basedOn w:val="VerbatimChar"/>
+    <w:rPr>
+      <w:color w:val="ff0000"/>
+      <w:b/>
+    </w:rPr>
+  </w:style>
+  <w:style w:customStyle="1" w:styleId="ErrorTok" w:type="character">
+    <w:name w:val="ErrorTok"/>
+    <w:basedOn w:val="VerbatimChar"/>
+    <w:rPr>
+      <w:color w:val="ff0000"/>
+      <w:b/>
     </w:rPr>
   </w:style>
   <w:style w:customStyle="1" w:styleId="NormalTok" w:type="character">

</xml_diff>